<commit_message>
Clarify practical use in explanatory note
</commit_message>
<xml_diff>
--- a/docs/Пояснительная_записка_RTT_tennis_predictor_updated_v14.docx
+++ b/docs/Пояснительная_записка_RTT_tennis_predictor_updated_v14.docx
@@ -2345,45 +2345,47 @@
       </w:r>
     </w:p>
     <w:p>
+      <w:pPr/>
       <w:r>
-        <w:t>Практический сценарий — открыть контрольную панель, обновить данные при необходимости, выбрать двух игроков и дату матча, после чего получить вероятность победы, сводку по каждому игроку и объяснение факторов прогноза.</w:t>
+        <w:t>Разработанная модель может применяться как аналитический инструмент в юниорском и любительском теннисе, где официального рейтинга часто недостаточно для полной оценки текущей силы игрока. Практическая ценность решения состоит не в автоматическом принятии решения, а в предоставлении дополнительной вероятностной оценки и объяснимых факторов, которые помогают тренеру, спортсмену или аналитику интерпретировать предстоящий матч.</w:t>
       </w:r>
     </w:p>
     <w:p>
       <w:pPr>
-        <w:pStyle w:val="ListNumber"/>
+        <w:pStyle w:val="ListBullet"/>
       </w:pPr>
       <w:r>
-        <w:t>Проверить свежесть данных и при необходимости запустить Run full pipeline.</w:t>
+        <w:t>Тренерская подготовка к матчу: модель помогает оценить относительную силу соперника, сравнить игроков по ELO, рейтингу, форме, опыту, отдыху и результатам против общих соперников.</w:t>
       </w:r>
     </w:p>
     <w:p>
       <w:pPr>
-        <w:pStyle w:val="ListNumber"/>
+        <w:pStyle w:val="ListBullet"/>
       </w:pPr>
       <w:r>
-        <w:t>После обучения или обновления bundle нажать Reload bundle.</w:t>
+        <w:t>Планирование турниров и календаря: прогнозы могут использоваться для предварительной оценки сложности сетки, ожидаемого уровня соперников и целесообразности участия в конкретных соревнованиях.</w:t>
       </w:r>
     </w:p>
     <w:p>
       <w:pPr>
-        <w:pStyle w:val="ListNumber"/>
+        <w:pStyle w:val="ListBullet"/>
       </w:pPr>
       <w:r>
-        <w:t>Выбрать Player 1, Player 2, дату и возрастной контекст турнира.</w:t>
+        <w:t>Мониторинг развития игрока: динамика ELO, рейтинговых очков, места в рейтинге и формы позволяет отслеживать прогресс не только через официальный рейтинг, но и через качество фактических матчевых результатов.</w:t>
       </w:r>
     </w:p>
     <w:p>
       <w:pPr>
-        <w:pStyle w:val="ListNumber"/>
+        <w:pStyle w:val="ListBullet"/>
       </w:pPr>
       <w:r>
-        <w:t>Нажать Predict match и изучить вероятность, профили игроков, графики и вклад факторов.</w:t>
+        <w:t>Выявление расхождений между официальным рейтингом и фактической игровой силой: модель подсвечивает случаи, когда игрок может быть недооценен или переоценен рейтингом из-за малого числа турниров, недавних результатов или силы предыдущих соперников.</w:t>
       </w:r>
     </w:p>
     <w:p>
+      <w:pPr/>
       <w:r>
-        <w:t>Проект может использоваться как учебный аналитический инструмент: для сравнения игроков, проверки гипотез о рейтинге и форме, оценки влияния ELO и выявления матчей, где официальный рейтинг не полностью объясняет ожидаемый результат.</w:t>
+        <w:t>В рамках дипломного проекта модель следует рассматривать как прототип системы поддержки аналитических решений. Итоговый прогноз не заменяет экспертную оценку тренера и не предназначен для ставок; он показывает, как методы машинного обучения могут расширить традиционный анализ спортивных результатов.</w:t>
       </w:r>
     </w:p>
     <w:p>

</xml_diff>

<commit_message>
Rewrite dataset quality section in note
</commit_message>
<xml_diff>
--- a/docs/Пояснительная_записка_RTT_tennis_predictor_updated_v14.docx
+++ b/docs/Пояснительная_записка_RTT_tennis_predictor_updated_v14.docx
@@ -86,7 +86,7 @@
           <w:sz w:val="36"/>
           <w:lang w:val="ru-RU"/>
         </w:rPr>
-        <w:t>«</w:t>
+        <w:t>«Машинное обучение: фундаментальные</w:t>
       </w:r>
       <w:r>
         <w:rPr>
@@ -94,7 +94,7 @@
           <w:sz w:val="36"/>
           <w:lang w:val="ru-RU"/>
         </w:rPr>
-        <w:t>Машинное обучение: фундаментальные</w:t>
+        <w:br/>
       </w:r>
       <w:r>
         <w:rPr>
@@ -102,23 +102,7 @@
           <w:sz w:val="36"/>
           <w:lang w:val="ru-RU"/>
         </w:rPr>
-        <w:br/>
-      </w:r>
-      <w:r>
-        <w:rPr>
-          <w:b/>
-          <w:sz w:val="36"/>
-          <w:lang w:val="ru-RU"/>
-        </w:rPr>
-        <w:t>инструменты и практики</w:t>
-      </w:r>
-      <w:r>
-        <w:rPr>
-          <w:b/>
-          <w:sz w:val="36"/>
-          <w:lang w:val="ru-RU"/>
-        </w:rPr>
-        <w:t>»</w:t>
+        <w:t>инструменты и практики»</w:t>
       </w:r>
     </w:p>
     <w:p>
@@ -182,7 +166,7 @@
           <w:szCs w:val="24"/>
           <w:lang w:val="ru-RU"/>
         </w:rPr>
-        <w:t>предиктивная модель вероятности</w:t>
+        <w:t>П</w:t>
       </w:r>
       <w:r>
         <w:rPr>
@@ -191,7 +175,7 @@
           <w:szCs w:val="24"/>
           <w:lang w:val="ru-RU"/>
         </w:rPr>
-        <w:br/>
+        <w:t>редиктивная модель вероятности</w:t>
       </w:r>
       <w:r>
         <w:rPr>
@@ -200,7 +184,25 @@
           <w:szCs w:val="24"/>
           <w:lang w:val="ru-RU"/>
         </w:rPr>
+        <w:br/>
+      </w:r>
+      <w:r>
+        <w:rPr>
+          <w:b/>
+          <w:sz w:val="28"/>
+          <w:szCs w:val="24"/>
+          <w:lang w:val="ru-RU"/>
+        </w:rPr>
         <w:t>исхода матчей Российского теннисного тура</w:t>
+      </w:r>
+      <w:r>
+        <w:rPr>
+          <w:b/>
+          <w:sz w:val="28"/>
+          <w:szCs w:val="24"/>
+          <w:lang w:val="ru-RU"/>
+        </w:rPr>
+        <w:t xml:space="preserve"> (РТТ)</w:t>
       </w:r>
     </w:p>
     <w:p>
@@ -326,6 +328,12 @@
     <w:sdt>
       <w:sdtPr>
         <w:rPr>
+          <w:rFonts w:ascii="Times New Roman" w:eastAsiaTheme="minorEastAsia" w:hAnsi="Times New Roman" w:cstheme="minorBidi"/>
+          <w:b w:val="0"/>
+          <w:bCs w:val="0"/>
+          <w:color w:val="auto"/>
+          <w:sz w:val="24"/>
+          <w:szCs w:val="22"/>
           <w:lang w:val="ru-RU"/>
         </w:rPr>
         <w:id w:val="-999803919"/>
@@ -336,10 +344,6 @@
       </w:sdtPr>
       <w:sdtEndPr>
         <w:rPr>
-          <w:rFonts w:ascii="Times New Roman" w:eastAsiaTheme="minorEastAsia" w:hAnsi="Times New Roman" w:cstheme="minorBidi"/>
-          <w:color w:val="auto"/>
-          <w:sz w:val="24"/>
-          <w:szCs w:val="22"/>
           <w:lang w:val="en-US"/>
         </w:rPr>
       </w:sdtEndPr>
@@ -379,7 +383,7 @@
           <w:r>
             <w:fldChar w:fldCharType="separate"/>
           </w:r>
-          <w:hyperlink w:anchor="_Toc229494422" w:history="1">
+          <w:hyperlink w:anchor="_Toc229495215" w:history="1">
             <w:r>
               <w:rPr>
                 <w:rStyle w:val="aff8"/>
@@ -407,7 +411,7 @@
                 <w:noProof/>
                 <w:webHidden/>
               </w:rPr>
-              <w:instrText xml:space="preserve"> PAGEREF _Toc229494422 \h </w:instrText>
+              <w:instrText xml:space="preserve"> PAGEREF _Toc229495215 \h </w:instrText>
             </w:r>
             <w:r>
               <w:rPr>
@@ -453,7 +457,7 @@
               <w14:ligatures w14:val="standardContextual"/>
             </w:rPr>
           </w:pPr>
-          <w:hyperlink w:anchor="_Toc229494423" w:history="1">
+          <w:hyperlink w:anchor="_Toc229495216" w:history="1">
             <w:r>
               <w:rPr>
                 <w:rStyle w:val="aff8"/>
@@ -481,7 +485,7 @@
                 <w:noProof/>
                 <w:webHidden/>
               </w:rPr>
-              <w:instrText xml:space="preserve"> PAGEREF _Toc229494423 \h </w:instrText>
+              <w:instrText xml:space="preserve"> PAGEREF _Toc229495216 \h </w:instrText>
             </w:r>
             <w:r>
               <w:rPr>
@@ -527,7 +531,7 @@
               <w14:ligatures w14:val="standardContextual"/>
             </w:rPr>
           </w:pPr>
-          <w:hyperlink w:anchor="_Toc229494424" w:history="1">
+          <w:hyperlink w:anchor="_Toc229495217" w:history="1">
             <w:r>
               <w:rPr>
                 <w:rStyle w:val="aff8"/>
@@ -555,7 +559,7 @@
                 <w:noProof/>
                 <w:webHidden/>
               </w:rPr>
-              <w:instrText xml:space="preserve"> PAGEREF _Toc229494424 \h </w:instrText>
+              <w:instrText xml:space="preserve"> PAGEREF _Toc229495217 \h </w:instrText>
             </w:r>
             <w:r>
               <w:rPr>
@@ -601,7 +605,7 @@
               <w14:ligatures w14:val="standardContextual"/>
             </w:rPr>
           </w:pPr>
-          <w:hyperlink w:anchor="_Toc229494425" w:history="1">
+          <w:hyperlink w:anchor="_Toc229495218" w:history="1">
             <w:r>
               <w:rPr>
                 <w:rStyle w:val="aff8"/>
@@ -629,7 +633,7 @@
                 <w:noProof/>
                 <w:webHidden/>
               </w:rPr>
-              <w:instrText xml:space="preserve"> PAGEREF _Toc229494425 \h </w:instrText>
+              <w:instrText xml:space="preserve"> PAGEREF _Toc229495218 \h </w:instrText>
             </w:r>
             <w:r>
               <w:rPr>
@@ -649,7 +653,7 @@
                 <w:noProof/>
                 <w:webHidden/>
               </w:rPr>
-              <w:t>4</w:t>
+              <w:t>5</w:t>
             </w:r>
             <w:r>
               <w:rPr>
@@ -675,7 +679,7 @@
               <w14:ligatures w14:val="standardContextual"/>
             </w:rPr>
           </w:pPr>
-          <w:hyperlink w:anchor="_Toc229494426" w:history="1">
+          <w:hyperlink w:anchor="_Toc229495219" w:history="1">
             <w:r>
               <w:rPr>
                 <w:rStyle w:val="aff8"/>
@@ -703,7 +707,7 @@
                 <w:noProof/>
                 <w:webHidden/>
               </w:rPr>
-              <w:instrText xml:space="preserve"> PAGEREF _Toc229494426 \h </w:instrText>
+              <w:instrText xml:space="preserve"> PAGEREF _Toc229495219 \h </w:instrText>
             </w:r>
             <w:r>
               <w:rPr>
@@ -749,7 +753,7 @@
               <w14:ligatures w14:val="standardContextual"/>
             </w:rPr>
           </w:pPr>
-          <w:hyperlink w:anchor="_Toc229494427" w:history="1">
+          <w:hyperlink w:anchor="_Toc229495220" w:history="1">
             <w:r>
               <w:rPr>
                 <w:rStyle w:val="aff8"/>
@@ -777,7 +781,7 @@
                 <w:noProof/>
                 <w:webHidden/>
               </w:rPr>
-              <w:instrText xml:space="preserve"> PAGEREF _Toc229494427 \h </w:instrText>
+              <w:instrText xml:space="preserve"> PAGEREF _Toc229495220 \h </w:instrText>
             </w:r>
             <w:r>
               <w:rPr>
@@ -823,7 +827,7 @@
               <w14:ligatures w14:val="standardContextual"/>
             </w:rPr>
           </w:pPr>
-          <w:hyperlink w:anchor="_Toc229494428" w:history="1">
+          <w:hyperlink w:anchor="_Toc229495221" w:history="1">
             <w:r>
               <w:rPr>
                 <w:rStyle w:val="aff8"/>
@@ -851,7 +855,7 @@
                 <w:noProof/>
                 <w:webHidden/>
               </w:rPr>
-              <w:instrText xml:space="preserve"> PAGEREF _Toc229494428 \h </w:instrText>
+              <w:instrText xml:space="preserve"> PAGEREF _Toc229495221 \h </w:instrText>
             </w:r>
             <w:r>
               <w:rPr>
@@ -897,7 +901,7 @@
               <w14:ligatures w14:val="standardContextual"/>
             </w:rPr>
           </w:pPr>
-          <w:hyperlink w:anchor="_Toc229494429" w:history="1">
+          <w:hyperlink w:anchor="_Toc229495222" w:history="1">
             <w:r>
               <w:rPr>
                 <w:rStyle w:val="aff8"/>
@@ -925,7 +929,7 @@
                 <w:noProof/>
                 <w:webHidden/>
               </w:rPr>
-              <w:instrText xml:space="preserve"> PAGEREF _Toc229494429 \h </w:instrText>
+              <w:instrText xml:space="preserve"> PAGEREF _Toc229495222 \h </w:instrText>
             </w:r>
             <w:r>
               <w:rPr>
@@ -971,7 +975,7 @@
               <w14:ligatures w14:val="standardContextual"/>
             </w:rPr>
           </w:pPr>
-          <w:hyperlink w:anchor="_Toc229494430" w:history="1">
+          <w:hyperlink w:anchor="_Toc229495223" w:history="1">
             <w:r>
               <w:rPr>
                 <w:rStyle w:val="aff8"/>
@@ -998,7 +1002,7 @@
                 <w:noProof/>
                 <w:webHidden/>
               </w:rPr>
-              <w:instrText xml:space="preserve"> PAGEREF _Toc229494430 \h </w:instrText>
+              <w:instrText xml:space="preserve"> PAGEREF _Toc229495223 \h </w:instrText>
             </w:r>
             <w:r>
               <w:rPr>
@@ -1044,7 +1048,7 @@
               <w14:ligatures w14:val="standardContextual"/>
             </w:rPr>
           </w:pPr>
-          <w:hyperlink w:anchor="_Toc229494431" w:history="1">
+          <w:hyperlink w:anchor="_Toc229495224" w:history="1">
             <w:r>
               <w:rPr>
                 <w:rStyle w:val="aff8"/>
@@ -1072,7 +1076,7 @@
                 <w:noProof/>
                 <w:webHidden/>
               </w:rPr>
-              <w:instrText xml:space="preserve"> PAGEREF _Toc229494431 \h </w:instrText>
+              <w:instrText xml:space="preserve"> PAGEREF _Toc229495224 \h </w:instrText>
             </w:r>
             <w:r>
               <w:rPr>
@@ -1118,7 +1122,7 @@
               <w14:ligatures w14:val="standardContextual"/>
             </w:rPr>
           </w:pPr>
-          <w:hyperlink w:anchor="_Toc229494432" w:history="1">
+          <w:hyperlink w:anchor="_Toc229495225" w:history="1">
             <w:r>
               <w:rPr>
                 <w:rStyle w:val="aff8"/>
@@ -1145,7 +1149,7 @@
                 <w:noProof/>
                 <w:webHidden/>
               </w:rPr>
-              <w:instrText xml:space="preserve"> PAGEREF _Toc229494432 \h </w:instrText>
+              <w:instrText xml:space="preserve"> PAGEREF _Toc229495225 \h </w:instrText>
             </w:r>
             <w:r>
               <w:rPr>
@@ -1165,7 +1169,7 @@
                 <w:noProof/>
                 <w:webHidden/>
               </w:rPr>
-              <w:t>9</w:t>
+              <w:t>10</w:t>
             </w:r>
             <w:r>
               <w:rPr>
@@ -1208,7 +1212,7 @@
           <w:lang w:val="ru-RU"/>
         </w:rPr>
       </w:pPr>
-      <w:bookmarkStart w:id="0" w:name="_Toc229494422"/>
+      <w:bookmarkStart w:id="0" w:name="_Toc229495215"/>
       <w:r>
         <w:rPr>
           <w:lang w:val="ru-RU"/>
@@ -1277,7 +1281,19 @@
         <w:rPr>
           <w:lang w:val="ru-RU"/>
         </w:rPr>
-        <w:t>Предметная область проекта — женские одиночные турниры РТТ в возрастных категориях до 17 лет, до 19 лет и взрослые, с фокусом на выбранные фильтры календаря РТТ.</w:t>
+        <w:t xml:space="preserve">Предметная область проекта — женские одиночные турниры РТТ в возрастных категориях </w:t>
+      </w:r>
+      <w:r>
+        <w:rPr>
+          <w:lang w:val="ru-RU"/>
+        </w:rPr>
+        <w:t xml:space="preserve">до 15 лет, </w:t>
+      </w:r>
+      <w:r>
+        <w:rPr>
+          <w:lang w:val="ru-RU"/>
+        </w:rPr>
+        <w:t>до 17 лет, до 19 лет и взрослые, с фокусом на выбранные фильтры календаря РТТ.</w:t>
       </w:r>
     </w:p>
     <w:p>
@@ -1288,7 +1304,7 @@
           <w:lang w:val="ru-RU"/>
         </w:rPr>
       </w:pPr>
-      <w:bookmarkStart w:id="1" w:name="_Toc229494423"/>
+      <w:bookmarkStart w:id="1" w:name="_Toc229495216"/>
       <w:r>
         <w:rPr>
           <w:lang w:val="ru-RU"/>
@@ -1298,152 +1314,456 @@
       <w:bookmarkEnd w:id="1"/>
     </w:p>
     <w:p>
-      <w:pPr/>
-      <w:r>
-        <w:t>Функционал проекта можно описать как полный цикл построения прикладной ML-системы: от автоматизированного получения данных с сайта РТТ до интерактивного прогноза по конкретной паре игроков. Важно, что проект не ограничивается обучением модели на готовой таблице, а включает все ключевые этапы подготовки данных и контроля качества результата.</w:t>
+      <w:pPr>
+        <w:jc w:val="both"/>
+        <w:rPr>
+          <w:lang w:val="ru-RU"/>
+        </w:rPr>
+      </w:pPr>
+      <w:r>
+        <w:rPr>
+          <w:lang w:val="ru-RU"/>
+        </w:rPr>
+        <w:t xml:space="preserve">Функционал проекта можно описать как полный цикл построения прикладной </w:t>
+      </w:r>
+      <w:r>
+        <w:t>ML</w:t>
+      </w:r>
+      <w:r>
+        <w:rPr>
+          <w:lang w:val="ru-RU"/>
+        </w:rPr>
+        <w:t>-системы: от автоматизированного получения данных с сайта РТТ до интерактивного прогноза по конкретной паре игроков.</w:t>
+      </w:r>
+    </w:p>
+    <w:p>
+      <w:pPr>
+        <w:jc w:val="both"/>
+        <w:rPr>
+          <w:lang w:val="ru-RU"/>
+        </w:rPr>
+      </w:pPr>
+      <w:r>
+        <w:rPr>
+          <w:lang w:val="ru-RU"/>
+        </w:rPr>
+        <w:t>Важно, что проект не ограничивается обучением модели на готовой таблице, а включает все ключевые этапы подготовки данных и контроля качества результата</w:t>
+      </w:r>
+      <w:r>
+        <w:rPr>
+          <w:lang w:val="ru-RU"/>
+        </w:rPr>
+        <w:t>:</w:t>
       </w:r>
     </w:p>
     <w:p>
       <w:pPr>
         <w:pStyle w:val="a0"/>
+        <w:jc w:val="both"/>
+        <w:rPr>
+          <w:lang w:val="ru-RU"/>
+        </w:rPr>
       </w:pPr>
       <w:r>
-        <w:t>Автоматизированный сбор данных с сайта РТТ. Реализованы скрипты для обновления календаря турниров, получения уникальных идентификаторов турниров, загрузки деталей турниров, скачивания страниц матчей и парсинга официальных рейтингов по датам классификации и возрастным категориям.</w:t>
+        <w:rPr>
+          <w:lang w:val="ru-RU"/>
+        </w:rPr>
+        <w:t>Автоматизированный сбор данных с сайта РТТ.</w:t>
       </w:r>
     </w:p>
     <w:p>
       <w:pPr>
         <w:pStyle w:val="a0"/>
+        <w:numPr>
+          <w:ilvl w:val="0"/>
+          <w:numId w:val="0"/>
+        </w:numPr>
+        <w:ind w:left="360"/>
+        <w:jc w:val="both"/>
+        <w:rPr>
+          <w:lang w:val="ru-RU"/>
+        </w:rPr>
       </w:pPr>
       <w:r>
-        <w:t>Предобработка и объединение данных. Сырые HTML-страницы и рейтинговые таблицы приводятся к единому формату: очищаются даты и счет матчей, нормализуются имена игроков, выполняется сопоставление с РНИ, удаляются дубли, отбрасываются некорректные строки и формируется итоговый датасет для моделирования.</w:t>
+        <w:rPr>
+          <w:lang w:val="ru-RU"/>
+        </w:rPr>
+        <w:t xml:space="preserve">Реализованы скрипты для </w:t>
+      </w:r>
+      <w:r>
+        <w:rPr>
+          <w:lang w:val="ru-RU"/>
+        </w:rPr>
+        <w:t>парсинга</w:t>
+      </w:r>
+      <w:r>
+        <w:rPr>
+          <w:lang w:val="ru-RU"/>
+        </w:rPr>
+        <w:t xml:space="preserve"> календаря турниров, получения уникальных идентификаторов турниров, загрузки деталей турниров, скачивания страниц матчей и парсинга официальных рейтингов по датам классификации и возрастным категориям.</w:t>
       </w:r>
     </w:p>
     <w:p>
       <w:pPr>
         <w:pStyle w:val="a0"/>
+        <w:jc w:val="both"/>
+        <w:rPr>
+          <w:lang w:val="ru-RU"/>
+        </w:rPr>
       </w:pPr>
       <w:r>
-        <w:t>Фича-инжиниринг. Для каждого матча рассчитываются признаки, доступные только до его начала: официальный рейтинг, рейтинговые очки, скорректированные очки на зачётный турнир, ELO, опыт, форма, отдых, личные встречи, сила предыдущих соперников и результаты против общих соперников.</w:t>
+        <w:rPr>
+          <w:lang w:val="ru-RU"/>
+        </w:rPr>
+        <w:t>Предобработка и объединение данных.</w:t>
       </w:r>
     </w:p>
     <w:p>
       <w:pPr>
         <w:pStyle w:val="a0"/>
+        <w:numPr>
+          <w:ilvl w:val="0"/>
+          <w:numId w:val="0"/>
+        </w:numPr>
+        <w:ind w:left="360"/>
+        <w:jc w:val="both"/>
+        <w:rPr>
+          <w:lang w:val="ru-RU"/>
+        </w:rPr>
       </w:pPr>
       <w:r>
-        <w:t>Обучение и выбор лучшей модели. Проект сравнивает простые baseline-подходы с основными ML-моделями на полном наборе признаков: Gradient Boosting, CatBoost и Random Forest. Выбор итоговой модели основан на метриках вероятностного прогноза на временном test split, прежде всего LogLoss и Brier score.</w:t>
+        <w:rPr>
+          <w:lang w:val="ru-RU"/>
+        </w:rPr>
+        <w:t xml:space="preserve">Сырые </w:t>
+      </w:r>
+      <w:r>
+        <w:t>HTML</w:t>
+      </w:r>
+      <w:r>
+        <w:rPr>
+          <w:lang w:val="ru-RU"/>
+        </w:rPr>
+        <w:t>-страницы и рейтинговые таблицы приводятся к единому формату: очищаются даты и счет матчей, нормализуются имена игроков, выполняется сопоставление с РНИ, удаляются дубли, отбрасываются некорректные строки и формируется итоговый датасет для моделирования.</w:t>
       </w:r>
     </w:p>
     <w:p>
       <w:pPr>
         <w:pStyle w:val="a0"/>
+        <w:jc w:val="both"/>
+        <w:rPr>
+          <w:lang w:val="ru-RU"/>
+        </w:rPr>
       </w:pPr>
       <w:r>
-        <w:t>Блок прогноза конкретного матча. Для выбранных игроков модель возвращает вероятность победы, а также аналитику по каждому игроку и по самому прогнозу: текущий рейтинг и ELO, историю формы, отдых, графики динамики показателей и таблицу факторов, которые сильнее всего повлияли на итоговую вероятность.</w:t>
+        <w:rPr>
+          <w:lang w:val="ru-RU"/>
+        </w:rPr>
+        <w:t>Фича-инжиниринг.</w:t>
+      </w:r>
+    </w:p>
+    <w:p>
+      <w:pPr>
+        <w:pStyle w:val="a0"/>
+        <w:numPr>
+          <w:ilvl w:val="0"/>
+          <w:numId w:val="0"/>
+        </w:numPr>
+        <w:ind w:left="360"/>
+        <w:jc w:val="both"/>
+        <w:rPr>
+          <w:lang w:val="ru-RU"/>
+        </w:rPr>
+      </w:pPr>
+      <w:r>
+        <w:rPr>
+          <w:lang w:val="ru-RU"/>
+        </w:rPr>
+        <w:t xml:space="preserve">Для каждого матча рассчитываются признаки, доступные только до его начала: официальный рейтинг, рейтинговые очки, скорректированные очки на зачётный турнир, </w:t>
+      </w:r>
+      <w:r>
+        <w:t>ELO</w:t>
+      </w:r>
+      <w:r>
+        <w:rPr>
+          <w:lang w:val="ru-RU"/>
+        </w:rPr>
+        <w:t>, опыт, форма, отдых, личные встречи, сила предыдущих соперников и результаты против общих соперников.</w:t>
+      </w:r>
+    </w:p>
+    <w:p>
+      <w:pPr>
+        <w:pStyle w:val="a0"/>
+        <w:jc w:val="both"/>
+        <w:rPr>
+          <w:lang w:val="ru-RU"/>
+        </w:rPr>
+      </w:pPr>
+      <w:r>
+        <w:rPr>
+          <w:lang w:val="ru-RU"/>
+        </w:rPr>
+        <w:t>Обучение и выбор лучшей модели.</w:t>
+      </w:r>
+    </w:p>
+    <w:p>
+      <w:pPr>
+        <w:pStyle w:val="a0"/>
+        <w:numPr>
+          <w:ilvl w:val="0"/>
+          <w:numId w:val="0"/>
+        </w:numPr>
+        <w:ind w:left="360"/>
+        <w:jc w:val="both"/>
+        <w:rPr>
+          <w:lang w:val="ru-RU"/>
+        </w:rPr>
+      </w:pPr>
+      <w:r>
+        <w:rPr>
+          <w:lang w:val="ru-RU"/>
+        </w:rPr>
+        <w:t>В п</w:t>
+      </w:r>
+      <w:r>
+        <w:rPr>
+          <w:lang w:val="ru-RU"/>
+        </w:rPr>
+        <w:t>роект</w:t>
+      </w:r>
+      <w:r>
+        <w:rPr>
+          <w:lang w:val="ru-RU"/>
+        </w:rPr>
+        <w:t>е</w:t>
+      </w:r>
+      <w:r>
+        <w:rPr>
+          <w:lang w:val="ru-RU"/>
+        </w:rPr>
+        <w:t xml:space="preserve"> </w:t>
+      </w:r>
+      <w:r>
+        <w:rPr>
+          <w:lang w:val="ru-RU"/>
+        </w:rPr>
+        <w:t>сравниваются</w:t>
+      </w:r>
+      <w:r>
+        <w:rPr>
+          <w:lang w:val="ru-RU"/>
+        </w:rPr>
+        <w:t xml:space="preserve"> простые </w:t>
+      </w:r>
+      <w:r>
+        <w:t>baseline</w:t>
+      </w:r>
+      <w:r>
+        <w:rPr>
+          <w:lang w:val="ru-RU"/>
+        </w:rPr>
+        <w:t xml:space="preserve">-подходы с основными </w:t>
+      </w:r>
+      <w:r>
+        <w:t>ML</w:t>
+      </w:r>
+      <w:r>
+        <w:rPr>
+          <w:lang w:val="ru-RU"/>
+        </w:rPr>
+        <w:t xml:space="preserve">-моделями на полном наборе признаков: </w:t>
+      </w:r>
+      <w:r>
+        <w:t>Gradient</w:t>
+      </w:r>
+      <w:r>
+        <w:rPr>
+          <w:lang w:val="ru-RU"/>
+        </w:rPr>
+        <w:t xml:space="preserve"> </w:t>
+      </w:r>
+      <w:r>
+        <w:t>Boosting</w:t>
+      </w:r>
+      <w:r>
+        <w:rPr>
+          <w:lang w:val="ru-RU"/>
+        </w:rPr>
+        <w:t xml:space="preserve">, </w:t>
+      </w:r>
+      <w:proofErr w:type="spellStart"/>
+      <w:r>
+        <w:t>CatBoost</w:t>
+      </w:r>
+      <w:proofErr w:type="spellEnd"/>
+      <w:r>
+        <w:rPr>
+          <w:lang w:val="ru-RU"/>
+        </w:rPr>
+        <w:t xml:space="preserve"> и </w:t>
+      </w:r>
+      <w:r>
+        <w:t>Random</w:t>
+      </w:r>
+      <w:r>
+        <w:rPr>
+          <w:lang w:val="ru-RU"/>
+        </w:rPr>
+        <w:t xml:space="preserve"> </w:t>
+      </w:r>
+      <w:r>
+        <w:t>Forest</w:t>
+      </w:r>
+      <w:r>
+        <w:rPr>
+          <w:lang w:val="ru-RU"/>
+        </w:rPr>
+        <w:t xml:space="preserve">. Выбор итоговой модели основан на метриках вероятностного прогноза на временном </w:t>
+      </w:r>
+      <w:r>
+        <w:t>test</w:t>
+      </w:r>
+      <w:r>
+        <w:rPr>
+          <w:lang w:val="ru-RU"/>
+        </w:rPr>
+        <w:t xml:space="preserve"> </w:t>
+      </w:r>
+      <w:r>
+        <w:t>split</w:t>
+      </w:r>
+      <w:r>
+        <w:rPr>
+          <w:lang w:val="ru-RU"/>
+        </w:rPr>
+        <w:t xml:space="preserve">, прежде всего </w:t>
+      </w:r>
+      <w:proofErr w:type="spellStart"/>
+      <w:r>
+        <w:t>LogLoss</w:t>
+      </w:r>
+      <w:proofErr w:type="spellEnd"/>
+      <w:r>
+        <w:rPr>
+          <w:lang w:val="ru-RU"/>
+        </w:rPr>
+        <w:t xml:space="preserve"> и </w:t>
+      </w:r>
+      <w:r>
+        <w:t>Brier</w:t>
+      </w:r>
+      <w:r>
+        <w:rPr>
+          <w:lang w:val="ru-RU"/>
+        </w:rPr>
+        <w:t xml:space="preserve"> </w:t>
+      </w:r>
+      <w:r>
+        <w:t>score</w:t>
+      </w:r>
+      <w:r>
+        <w:rPr>
+          <w:lang w:val="ru-RU"/>
+        </w:rPr>
+        <w:t>.</w:t>
+      </w:r>
+    </w:p>
+    <w:p>
+      <w:pPr>
+        <w:pStyle w:val="a0"/>
+        <w:jc w:val="both"/>
+        <w:rPr>
+          <w:lang w:val="ru-RU"/>
+        </w:rPr>
+      </w:pPr>
+      <w:r>
+        <w:rPr>
+          <w:lang w:val="ru-RU"/>
+        </w:rPr>
+        <w:lastRenderedPageBreak/>
+        <w:t>Блок прогноза конкретного матча.</w:t>
+      </w:r>
+    </w:p>
+    <w:p>
+      <w:pPr>
+        <w:pStyle w:val="a0"/>
+        <w:numPr>
+          <w:ilvl w:val="0"/>
+          <w:numId w:val="0"/>
+        </w:numPr>
+        <w:ind w:left="360"/>
+        <w:jc w:val="both"/>
+        <w:rPr>
+          <w:lang w:val="ru-RU"/>
+        </w:rPr>
+      </w:pPr>
+      <w:r>
+        <w:rPr>
+          <w:lang w:val="ru-RU"/>
+        </w:rPr>
+        <w:t xml:space="preserve">Для выбранных игроков модель возвращает вероятность победы, а также аналитику по каждому игроку и по самому прогнозу: текущий рейтинг и </w:t>
+      </w:r>
+      <w:r>
+        <w:t>ELO</w:t>
+      </w:r>
+      <w:r>
+        <w:rPr>
+          <w:lang w:val="ru-RU"/>
+        </w:rPr>
+        <w:t>, историю формы, отдых, графики динамики показателей и таблицу факторов, которые сильнее всего повлияли на итоговую вероятность.</w:t>
+      </w:r>
+    </w:p>
+    <w:p>
+      <w:pPr>
+        <w:pStyle w:val="a0"/>
+        <w:numPr>
+          <w:ilvl w:val="0"/>
+          <w:numId w:val="0"/>
+        </w:numPr>
+        <w:ind w:left="360"/>
+        <w:jc w:val="both"/>
+        <w:rPr>
+          <w:lang w:val="ru-RU"/>
+        </w:rPr>
+      </w:pPr>
+      <w:r>
+        <w:rPr>
+          <w:lang w:val="ru-RU"/>
+        </w:rPr>
+        <w:t xml:space="preserve">Важно отметить, что для прогноза конкретного матча используется отдельный инстанс модели, обученный на всех доступных данных, включая самые последние матчи, которые для целей оценки качества моделей попадали только в </w:t>
+      </w:r>
+      <w:r>
+        <w:t>test</w:t>
+      </w:r>
+      <w:r>
+        <w:rPr>
+          <w:lang w:val="ru-RU"/>
+        </w:rPr>
+        <w:t xml:space="preserve"> </w:t>
+      </w:r>
+      <w:r>
+        <w:rPr>
+          <w:lang w:val="ru-RU"/>
+        </w:rPr>
+        <w:t>выборку.</w:t>
       </w:r>
     </w:p>
     <w:p>
       <w:pPr>
         <w:pStyle w:val="1"/>
+        <w:spacing w:after="240"/>
         <w:rPr>
           <w:lang w:val="ru-RU"/>
         </w:rPr>
       </w:pPr>
-      <w:bookmarkStart w:id="2" w:name="_Toc229494424"/>
-      <w:r>
-        <w:rPr>
-          <w:lang w:val="ru-RU"/>
-        </w:rPr>
-        <w:lastRenderedPageBreak/>
+      <w:bookmarkStart w:id="2" w:name="_Toc229495217"/>
+      <w:r>
+        <w:rPr>
+          <w:lang w:val="ru-RU"/>
+        </w:rPr>
         <w:t>3. Данные и качество подготовки датасета</w:t>
       </w:r>
       <w:bookmarkEnd w:id="2"/>
-    </w:p>
-    <w:p>
-      <w:pPr>
-        <w:rPr>
-          <w:lang w:val="ru-RU"/>
-        </w:rPr>
-      </w:pPr>
-      <w:r>
-        <w:rPr>
-          <w:lang w:val="ru-RU"/>
-        </w:rPr>
-        <w:t xml:space="preserve">Финальный датасет хранится в </w:t>
-      </w:r>
-      <w:r>
-        <w:t>assembled</w:t>
-      </w:r>
-      <w:r>
-        <w:rPr>
-          <w:lang w:val="ru-RU"/>
-        </w:rPr>
-        <w:t>_</w:t>
-      </w:r>
-      <w:r>
-        <w:t>predictor</w:t>
-      </w:r>
-      <w:r>
-        <w:rPr>
-          <w:lang w:val="ru-RU"/>
-        </w:rPr>
-        <w:t>/</w:t>
-      </w:r>
-      <w:r>
-        <w:t>predictor</w:t>
-      </w:r>
-      <w:r>
-        <w:rPr>
-          <w:lang w:val="ru-RU"/>
-        </w:rPr>
-        <w:t>_</w:t>
-      </w:r>
-      <w:r>
-        <w:t>model</w:t>
-      </w:r>
-      <w:r>
-        <w:rPr>
-          <w:lang w:val="ru-RU"/>
-        </w:rPr>
-        <w:t>_</w:t>
-      </w:r>
-      <w:r>
-        <w:t>dataset</w:t>
-      </w:r>
-      <w:r>
-        <w:rPr>
-          <w:lang w:val="ru-RU"/>
-        </w:rPr>
-        <w:t>_</w:t>
-      </w:r>
-      <w:r>
-        <w:t>from</w:t>
-      </w:r>
-      <w:r>
-        <w:rPr>
-          <w:lang w:val="ru-RU"/>
-        </w:rPr>
-        <w:t>_</w:t>
-      </w:r>
-      <w:r>
-        <w:t>parsers</w:t>
-      </w:r>
-      <w:r>
-        <w:rPr>
-          <w:lang w:val="ru-RU"/>
-        </w:rPr>
-        <w:t>.</w:t>
-      </w:r>
-      <w:r>
-        <w:t>xlsx</w:t>
-      </w:r>
-      <w:r>
-        <w:rPr>
-          <w:lang w:val="ru-RU"/>
-        </w:rPr>
-        <w:t>. Он собирается из сохраненных страниц матчей, истории рейтингов и мастер-файла турниров. После последнего прогона период матчей в датасете составляет 2025-03-02 — 2026-05-11, а история рейтингов доступна с 2025-02-01 по 2026-05-01.</w:t>
-      </w:r>
     </w:p>
     <w:tbl>
       <w:tblPr>
@@ -2032,58 +2352,33 @@
       </w:tr>
     </w:tbl>
     <w:p>
-      <w:pPr>
-        <w:rPr>
-          <w:lang w:val="ru-RU"/>
-        </w:rPr>
-      </w:pPr>
+      <w:pPr/>
+      <w:r>
+        <w:t>Данные для проекта формируются из открытой части сайта Российского теннисного тура. Используются сведения о турнирах, сыгранных матчах и официальных рейтингах игроков на разные даты классификации. Такой источник важен именно для прикладной задачи: модель учится не на абстрактной статистике, а на тех данных, которые реально доступны перед прогнозированием будущего матча.</w:t>
+      </w:r>
     </w:p>
     <w:p>
-      <w:pPr>
-        <w:rPr>
-          <w:lang w:val="ru-RU"/>
-        </w:rPr>
-      </w:pPr>
-      <w:r>
-        <w:rPr>
-          <w:lang w:val="ru-RU"/>
-        </w:rPr>
-        <w:t xml:space="preserve">Критически важное исправление последней версии: даты рейтингов теперь интерпретируются как российские даты </w:t>
-      </w:r>
-      <w:proofErr w:type="spellStart"/>
-      <w:r>
-        <w:rPr>
-          <w:lang w:val="ru-RU"/>
-        </w:rPr>
-        <w:t>дд.</w:t>
-      </w:r>
-      <w:proofErr w:type="gramStart"/>
-      <w:r>
-        <w:rPr>
-          <w:lang w:val="ru-RU"/>
-        </w:rPr>
-        <w:t>мм.гггг</w:t>
-      </w:r>
-      <w:proofErr w:type="spellEnd"/>
-      <w:proofErr w:type="gramEnd"/>
-      <w:r>
-        <w:rPr>
-          <w:lang w:val="ru-RU"/>
-        </w:rPr>
-        <w:t>. Ранее значение 01.05.2026 могло быть ошибочно прочитано как 05.01.2026, что искажало графики и выбор актуального рейтинга. После исправления рейтинг на 01.05.2026 корректно используется для прогнозов после этой даты.</w:t>
+      <w:pPr/>
+      <w:r>
+        <w:t>Сырые веб-данные нельзя напрямую использовать для машинного обучения. В них встречаются разные форматы дат и счета, неполные страницы турниров, будущие или отмененные соревнования, дублирующиеся записи, а также разные варианты написания имен игроков. Поэтому отдельная часть проекта посвящена очистке и нормализации данных: матчи приводятся к единому формату, игроки сопоставляются с их идентификаторами, некорректные и неполные строки исключаются, а повторяющиеся записи не попадают в обучающую выборку дважды.</w:t>
       </w:r>
     </w:p>
     <w:p>
-      <w:pPr>
-        <w:rPr>
-          <w:lang w:val="ru-RU"/>
-        </w:rPr>
-      </w:pPr>
-      <w:r>
-        <w:rPr>
-          <w:lang w:val="ru-RU"/>
-        </w:rPr>
-        <w:t>Рейтинговые очки в разных возрастных категориях у одного игрока могут совпадать, а место в рейтинге отличается. Поэтому в визуализации очки показываются одной линией, а ранг — отдельными линиями по возрастным категориям.</w:t>
+      <w:pPr/>
+      <w:r>
+        <w:t>После подготовки каждый матч преобразуется в набор наблюдений, пригодный для обучения модели: для игрока фиксируется факт победы или поражения, а также набор характеристик, известных до начала встречи. К таким характеристикам относятся рейтинг, рейтинговые очки, история результатов, текущая форма, опыт, отдых после предыдущего матча и другие показатели, описывающие относительную силу соперников.</w:t>
+      </w:r>
+    </w:p>
+    <w:p>
+      <w:pPr/>
+      <w:r>
+        <w:t>Качество подготовки датасета здесь особенно важно, потому что ошибка на этом этапе напрямую приводит к искажению оценки модели. Например, если в признаки случайно попадет информация, ставшая известной только после матча, качество на тесте будет выглядеть завышенным, но реальная прогнозная ценность модели снизится. Поэтому при построении датасета используется хронологический принцип: для каждого матча берутся только те рейтинги и игровые показатели, которые могли быть известны на момент его проведения.</w:t>
+      </w:r>
+    </w:p>
+    <w:p>
+      <w:pPr/>
+      <w:r>
+        <w:t>Ограничения данных также учитываются при интерпретации результата. Модель опирается на официальную историю матчей и рейтингов, но не видит часть факторов, которые могут влиять на исход отдельной встречи: травмы, самочувствие игрока, качество подготовки к конкретному турниру, погодные условия и другие внешние обстоятельства. Поэтому прогноз следует рассматривать как вероятностную оценку на основе доступной статистики, а не как гарантированное предсказание исхода.</w:t>
       </w:r>
     </w:p>
     <w:p>
@@ -2093,7 +2388,7 @@
           <w:lang w:val="ru-RU"/>
         </w:rPr>
       </w:pPr>
-      <w:bookmarkStart w:id="3" w:name="_Toc229494425"/>
+      <w:bookmarkStart w:id="3" w:name="_Toc229495218"/>
       <w:r>
         <w:rPr>
           <w:lang w:val="ru-RU"/>
@@ -2112,14 +2407,7 @@
         <w:rPr>
           <w:lang w:val="ru-RU"/>
         </w:rPr>
-        <w:t xml:space="preserve">Все исторические признаки рассчитываются только по данным, доступным до даты матча. Текущий матч обновляет историю только после того, как признаки для него уже рассчитаны. </w:t>
-      </w:r>
-      <w:r>
-        <w:rPr>
-          <w:lang w:val="ru-RU"/>
-        </w:rPr>
-        <w:lastRenderedPageBreak/>
-        <w:t xml:space="preserve">Это снижает риск </w:t>
+        <w:t xml:space="preserve">Все исторические признаки рассчитываются только по данным, доступным до даты матча. Текущий матч обновляет историю только после того, как признаки для него уже рассчитаны. Это снижает риск </w:t>
       </w:r>
       <w:r>
         <w:t>data</w:t>
@@ -2353,7 +2641,7 @@
           <w:lang w:val="ru-RU"/>
         </w:rPr>
       </w:pPr>
-      <w:bookmarkStart w:id="4" w:name="_Toc229494426"/>
+      <w:bookmarkStart w:id="4" w:name="_Toc229495219"/>
       <w:r>
         <w:rPr>
           <w:lang w:val="ru-RU"/>
@@ -2557,6 +2845,7 @@
         <w:rPr>
           <w:lang w:val="ru-RU"/>
         </w:rPr>
+        <w:lastRenderedPageBreak/>
         <w:t xml:space="preserve">Сравнивались простые </w:t>
       </w:r>
       <w:r>
@@ -2692,12 +2981,11 @@
           <w:lang w:val="ru-RU"/>
         </w:rPr>
       </w:pPr>
-      <w:bookmarkStart w:id="5" w:name="_Toc229494427"/>
-      <w:r>
-        <w:rPr>
-          <w:lang w:val="ru-RU"/>
-        </w:rPr>
-        <w:lastRenderedPageBreak/>
+      <w:bookmarkStart w:id="5" w:name="_Toc229495220"/>
+      <w:r>
+        <w:rPr>
+          <w:lang w:val="ru-RU"/>
+        </w:rPr>
         <w:t>6. Качество построенных моделей машинного обучения</w:t>
       </w:r>
       <w:bookmarkEnd w:id="5"/>
@@ -3549,7 +3837,14 @@
         <w:rPr>
           <w:lang w:val="ru-RU"/>
         </w:rPr>
-        <w:t xml:space="preserve">, потому что при вероятностном прогнозировании приоритет имеют </w:t>
+        <w:t xml:space="preserve">, потому что при </w:t>
+      </w:r>
+      <w:r>
+        <w:rPr>
+          <w:lang w:val="ru-RU"/>
+        </w:rPr>
+        <w:lastRenderedPageBreak/>
+        <w:t xml:space="preserve">вероятностном прогнозировании приоритет имеют </w:t>
       </w:r>
       <w:proofErr w:type="spellStart"/>
       <w:r>
@@ -3902,14 +4197,7 @@
         <w:rPr>
           <w:lang w:val="ru-RU"/>
         </w:rPr>
-        <w:t xml:space="preserve"> имеет </w:t>
-      </w:r>
-      <w:r>
-        <w:rPr>
-          <w:lang w:val="ru-RU"/>
-        </w:rPr>
-        <w:lastRenderedPageBreak/>
-        <w:t xml:space="preserve">меньший разрыв, чем </w:t>
+        <w:t xml:space="preserve"> имеет меньший разрыв, чем </w:t>
       </w:r>
       <w:r>
         <w:t>Random</w:t>
@@ -3946,7 +4234,7 @@
           <w:lang w:val="ru-RU"/>
         </w:rPr>
       </w:pPr>
-      <w:bookmarkStart w:id="6" w:name="_Toc229494428"/>
+      <w:bookmarkStart w:id="6" w:name="_Toc229495221"/>
       <w:r>
         <w:rPr>
           <w:lang w:val="ru-RU"/>
@@ -4281,7 +4569,11 @@
           </w:tcPr>
           <w:p>
             <w:r>
-              <w:t>Скорректированный рейтинг</w:t>
+              <w:t xml:space="preserve">Скорректированный </w:t>
+            </w:r>
+            <w:r>
+              <w:lastRenderedPageBreak/>
+              <w:t>рейтинг</w:t>
             </w:r>
           </w:p>
         </w:tc>
@@ -4291,6 +4583,7 @@
           </w:tcPr>
           <w:p>
             <w:r>
+              <w:lastRenderedPageBreak/>
               <w:t>5.0317</w:t>
             </w:r>
           </w:p>
@@ -4309,7 +4602,14 @@
               <w:rPr>
                 <w:lang w:val="ru-RU"/>
               </w:rPr>
-              <w:t xml:space="preserve">Разница средних рейтинговых очков на один зачётный турнир: </w:t>
+              <w:t xml:space="preserve">Разница средних рейтинговых </w:t>
+            </w:r>
+            <w:r>
+              <w:rPr>
+                <w:lang w:val="ru-RU"/>
+              </w:rPr>
+              <w:lastRenderedPageBreak/>
+              <w:t xml:space="preserve">очков на один зачётный турнир: </w:t>
             </w:r>
             <w:r>
               <w:t>points</w:t>
@@ -4358,6 +4658,7 @@
           <w:p>
             <w:proofErr w:type="spellStart"/>
             <w:r>
+              <w:lastRenderedPageBreak/>
               <w:t>rel_diff_points_pct_min_pre_observed_only</w:t>
             </w:r>
             <w:proofErr w:type="spellEnd"/>
@@ -4456,14 +4757,7 @@
               <w:rPr>
                 <w:lang w:val="ru-RU"/>
               </w:rPr>
-              <w:t xml:space="preserve"> последних пяти </w:t>
-            </w:r>
-            <w:r>
-              <w:rPr>
-                <w:lang w:val="ru-RU"/>
-              </w:rPr>
-              <w:lastRenderedPageBreak/>
-              <w:t>соперников игрока.</w:t>
+              <w:t xml:space="preserve"> последних пяти соперников игрока.</w:t>
             </w:r>
           </w:p>
         </w:tc>
@@ -4476,7 +4770,6 @@
           <w:p>
             <w:proofErr w:type="spellStart"/>
             <w:r>
-              <w:lastRenderedPageBreak/>
               <w:t>opponent_points_per_counting_tournament_pre</w:t>
             </w:r>
             <w:proofErr w:type="spellEnd"/>
@@ -4657,7 +4950,7 @@
           <w:lang w:val="ru-RU"/>
         </w:rPr>
       </w:pPr>
-      <w:bookmarkStart w:id="7" w:name="_Toc229494429"/>
+      <w:bookmarkStart w:id="7" w:name="_Toc229495222"/>
       <w:r>
         <w:rPr>
           <w:lang w:val="ru-RU"/>
@@ -4690,6 +4983,7 @@
         <w:rPr>
           <w:lang w:val="ru-RU"/>
         </w:rPr>
+        <w:lastRenderedPageBreak/>
         <w:t xml:space="preserve">Тренерская подготовка к матчу: модель помогает оценить относительную силу соперника, сравнить игроков по </w:t>
       </w:r>
       <w:r>
@@ -4763,7 +5057,6 @@
         <w:rPr>
           <w:lang w:val="ru-RU"/>
         </w:rPr>
-        <w:lastRenderedPageBreak/>
         <w:t>В рамках дипломного проекта модель следует рассматривать как прототип системы поддержки аналитических решений. Итоговый прогноз не заменяет экспертную оценку тренера и не предназначен для ставок; он показывает, как методы машинного обучения могут расширить традиционный анализ спортивных результатов.</w:t>
       </w:r>
     </w:p>
@@ -4771,7 +5064,7 @@
       <w:pPr>
         <w:pStyle w:val="1"/>
       </w:pPr>
-      <w:bookmarkStart w:id="8" w:name="_Toc229494430"/>
+      <w:bookmarkStart w:id="8" w:name="_Toc229495223"/>
       <w:r>
         <w:t>9. Ограничения проекта</w:t>
       </w:r>
@@ -4945,7 +5238,7 @@
           <w:lang w:val="ru-RU"/>
         </w:rPr>
       </w:pPr>
-      <w:bookmarkStart w:id="9" w:name="_Toc229494431"/>
+      <w:bookmarkStart w:id="9" w:name="_Toc229495224"/>
       <w:r>
         <w:rPr>
           <w:lang w:val="ru-RU"/>
@@ -4986,6 +5279,7 @@
         <w:rPr>
           <w:lang w:val="ru-RU"/>
         </w:rPr>
+        <w:lastRenderedPageBreak/>
         <w:t xml:space="preserve">Полученные результаты подтверждают исходную гипотезу: для прогноза теннисных матчей РТТ полезно использовать не только официальный рейтинг, но и динамическую силу игрока, качество предыдущих соперников, опыт, форму, отдых и результаты против общих соперников. Итоговая </w:t>
       </w:r>
       <w:r>
@@ -5053,7 +5347,7 @@
       <w:pPr>
         <w:pStyle w:val="1"/>
       </w:pPr>
-      <w:bookmarkStart w:id="10" w:name="_Toc229494432"/>
+      <w:bookmarkStart w:id="10" w:name="_Toc229495225"/>
       <w:r>
         <w:t>11. Источники</w:t>
       </w:r>
@@ -5079,7 +5373,6 @@
       </w:pPr>
       <w:proofErr w:type="spellStart"/>
       <w:r>
-        <w:lastRenderedPageBreak/>
         <w:t>Документация</w:t>
       </w:r>
       <w:proofErr w:type="spellEnd"/>

</xml_diff>

<commit_message>
Add ELO explanation to note
</commit_message>
<xml_diff>
--- a/docs/Пояснительная_записка_RTT_tennis_predictor_updated_v14.docx
+++ b/docs/Пояснительная_записка_RTT_tennis_predictor_updated_v14.docx
@@ -383,7 +383,7 @@
           <w:r>
             <w:fldChar w:fldCharType="separate"/>
           </w:r>
-          <w:hyperlink w:anchor="_Toc229495215" w:history="1">
+          <w:hyperlink w:anchor="_Toc229519328" w:history="1">
             <w:r>
               <w:rPr>
                 <w:rStyle w:val="aff8"/>
@@ -411,7 +411,7 @@
                 <w:noProof/>
                 <w:webHidden/>
               </w:rPr>
-              <w:instrText xml:space="preserve"> PAGEREF _Toc229495215 \h </w:instrText>
+              <w:instrText xml:space="preserve"> PAGEREF _Toc229519328 \h </w:instrText>
             </w:r>
             <w:r>
               <w:rPr>
@@ -457,7 +457,7 @@
               <w14:ligatures w14:val="standardContextual"/>
             </w:rPr>
           </w:pPr>
-          <w:hyperlink w:anchor="_Toc229495216" w:history="1">
+          <w:hyperlink w:anchor="_Toc229519329" w:history="1">
             <w:r>
               <w:rPr>
                 <w:rStyle w:val="aff8"/>
@@ -485,7 +485,7 @@
                 <w:noProof/>
                 <w:webHidden/>
               </w:rPr>
-              <w:instrText xml:space="preserve"> PAGEREF _Toc229495216 \h </w:instrText>
+              <w:instrText xml:space="preserve"> PAGEREF _Toc229519329 \h </w:instrText>
             </w:r>
             <w:r>
               <w:rPr>
@@ -531,7 +531,7 @@
               <w14:ligatures w14:val="standardContextual"/>
             </w:rPr>
           </w:pPr>
-          <w:hyperlink w:anchor="_Toc229495217" w:history="1">
+          <w:hyperlink w:anchor="_Toc229519330" w:history="1">
             <w:r>
               <w:rPr>
                 <w:rStyle w:val="aff8"/>
@@ -559,7 +559,7 @@
                 <w:noProof/>
                 <w:webHidden/>
               </w:rPr>
-              <w:instrText xml:space="preserve"> PAGEREF _Toc229495217 \h </w:instrText>
+              <w:instrText xml:space="preserve"> PAGEREF _Toc229519330 \h </w:instrText>
             </w:r>
             <w:r>
               <w:rPr>
@@ -605,7 +605,7 @@
               <w14:ligatures w14:val="standardContextual"/>
             </w:rPr>
           </w:pPr>
-          <w:hyperlink w:anchor="_Toc229495218" w:history="1">
+          <w:hyperlink w:anchor="_Toc229519331" w:history="1">
             <w:r>
               <w:rPr>
                 <w:rStyle w:val="aff8"/>
@@ -633,7 +633,7 @@
                 <w:noProof/>
                 <w:webHidden/>
               </w:rPr>
-              <w:instrText xml:space="preserve"> PAGEREF _Toc229495218 \h </w:instrText>
+              <w:instrText xml:space="preserve"> PAGEREF _Toc229519331 \h </w:instrText>
             </w:r>
             <w:r>
               <w:rPr>
@@ -679,7 +679,7 @@
               <w14:ligatures w14:val="standardContextual"/>
             </w:rPr>
           </w:pPr>
-          <w:hyperlink w:anchor="_Toc229495219" w:history="1">
+          <w:hyperlink w:anchor="_Toc229519332" w:history="1">
             <w:r>
               <w:rPr>
                 <w:rStyle w:val="aff8"/>
@@ -707,7 +707,7 @@
                 <w:noProof/>
                 <w:webHidden/>
               </w:rPr>
-              <w:instrText xml:space="preserve"> PAGEREF _Toc229495219 \h </w:instrText>
+              <w:instrText xml:space="preserve"> PAGEREF _Toc229519332 \h </w:instrText>
             </w:r>
             <w:r>
               <w:rPr>
@@ -727,7 +727,7 @@
                 <w:noProof/>
                 <w:webHidden/>
               </w:rPr>
-              <w:t>5</w:t>
+              <w:t>6</w:t>
             </w:r>
             <w:r>
               <w:rPr>
@@ -753,7 +753,7 @@
               <w14:ligatures w14:val="standardContextual"/>
             </w:rPr>
           </w:pPr>
-          <w:hyperlink w:anchor="_Toc229495220" w:history="1">
+          <w:hyperlink w:anchor="_Toc229519333" w:history="1">
             <w:r>
               <w:rPr>
                 <w:rStyle w:val="aff8"/>
@@ -781,7 +781,7 @@
                 <w:noProof/>
                 <w:webHidden/>
               </w:rPr>
-              <w:instrText xml:space="preserve"> PAGEREF _Toc229495220 \h </w:instrText>
+              <w:instrText xml:space="preserve"> PAGEREF _Toc229519333 \h </w:instrText>
             </w:r>
             <w:r>
               <w:rPr>
@@ -827,7 +827,7 @@
               <w14:ligatures w14:val="standardContextual"/>
             </w:rPr>
           </w:pPr>
-          <w:hyperlink w:anchor="_Toc229495221" w:history="1">
+          <w:hyperlink w:anchor="_Toc229519334" w:history="1">
             <w:r>
               <w:rPr>
                 <w:rStyle w:val="aff8"/>
@@ -855,7 +855,7 @@
                 <w:noProof/>
                 <w:webHidden/>
               </w:rPr>
-              <w:instrText xml:space="preserve"> PAGEREF _Toc229495221 \h </w:instrText>
+              <w:instrText xml:space="preserve"> PAGEREF _Toc229519334 \h </w:instrText>
             </w:r>
             <w:r>
               <w:rPr>
@@ -901,7 +901,7 @@
               <w14:ligatures w14:val="standardContextual"/>
             </w:rPr>
           </w:pPr>
-          <w:hyperlink w:anchor="_Toc229495222" w:history="1">
+          <w:hyperlink w:anchor="_Toc229519335" w:history="1">
             <w:r>
               <w:rPr>
                 <w:rStyle w:val="aff8"/>
@@ -929,7 +929,7 @@
                 <w:noProof/>
                 <w:webHidden/>
               </w:rPr>
-              <w:instrText xml:space="preserve"> PAGEREF _Toc229495222 \h </w:instrText>
+              <w:instrText xml:space="preserve"> PAGEREF _Toc229519335 \h </w:instrText>
             </w:r>
             <w:r>
               <w:rPr>
@@ -949,7 +949,7 @@
                 <w:noProof/>
                 <w:webHidden/>
               </w:rPr>
-              <w:t>8</w:t>
+              <w:t>9</w:t>
             </w:r>
             <w:r>
               <w:rPr>
@@ -975,7 +975,7 @@
               <w14:ligatures w14:val="standardContextual"/>
             </w:rPr>
           </w:pPr>
-          <w:hyperlink w:anchor="_Toc229495223" w:history="1">
+          <w:hyperlink w:anchor="_Toc229519336" w:history="1">
             <w:r>
               <w:rPr>
                 <w:rStyle w:val="aff8"/>
@@ -1002,7 +1002,7 @@
                 <w:noProof/>
                 <w:webHidden/>
               </w:rPr>
-              <w:instrText xml:space="preserve"> PAGEREF _Toc229495223 \h </w:instrText>
+              <w:instrText xml:space="preserve"> PAGEREF _Toc229519336 \h </w:instrText>
             </w:r>
             <w:r>
               <w:rPr>
@@ -1048,7 +1048,7 @@
               <w14:ligatures w14:val="standardContextual"/>
             </w:rPr>
           </w:pPr>
-          <w:hyperlink w:anchor="_Toc229495224" w:history="1">
+          <w:hyperlink w:anchor="_Toc229519337" w:history="1">
             <w:r>
               <w:rPr>
                 <w:rStyle w:val="aff8"/>
@@ -1076,7 +1076,7 @@
                 <w:noProof/>
                 <w:webHidden/>
               </w:rPr>
-              <w:instrText xml:space="preserve"> PAGEREF _Toc229495224 \h </w:instrText>
+              <w:instrText xml:space="preserve"> PAGEREF _Toc229519337 \h </w:instrText>
             </w:r>
             <w:r>
               <w:rPr>
@@ -1096,7 +1096,7 @@
                 <w:noProof/>
                 <w:webHidden/>
               </w:rPr>
-              <w:t>9</w:t>
+              <w:t>10</w:t>
             </w:r>
             <w:r>
               <w:rPr>
@@ -1122,7 +1122,7 @@
               <w14:ligatures w14:val="standardContextual"/>
             </w:rPr>
           </w:pPr>
-          <w:hyperlink w:anchor="_Toc229495225" w:history="1">
+          <w:hyperlink w:anchor="_Toc229519338" w:history="1">
             <w:r>
               <w:rPr>
                 <w:rStyle w:val="aff8"/>
@@ -1149,7 +1149,7 @@
                 <w:noProof/>
                 <w:webHidden/>
               </w:rPr>
-              <w:instrText xml:space="preserve"> PAGEREF _Toc229495225 \h </w:instrText>
+              <w:instrText xml:space="preserve"> PAGEREF _Toc229519338 \h </w:instrText>
             </w:r>
             <w:r>
               <w:rPr>
@@ -1212,7 +1212,7 @@
           <w:lang w:val="ru-RU"/>
         </w:rPr>
       </w:pPr>
-      <w:bookmarkStart w:id="0" w:name="_Toc229495215"/>
+      <w:bookmarkStart w:id="0" w:name="_Toc229519328"/>
       <w:r>
         <w:rPr>
           <w:lang w:val="ru-RU"/>
@@ -1304,7 +1304,7 @@
           <w:lang w:val="ru-RU"/>
         </w:rPr>
       </w:pPr>
-      <w:bookmarkStart w:id="1" w:name="_Toc229495216"/>
+      <w:bookmarkStart w:id="1" w:name="_Toc229519329"/>
       <w:r>
         <w:rPr>
           <w:lang w:val="ru-RU"/>
@@ -1756,7 +1756,7 @@
           <w:lang w:val="ru-RU"/>
         </w:rPr>
       </w:pPr>
-      <w:bookmarkStart w:id="2" w:name="_Toc229495217"/>
+      <w:bookmarkStart w:id="2" w:name="_Toc229519330"/>
       <w:r>
         <w:rPr>
           <w:lang w:val="ru-RU"/>
@@ -1764,6 +1764,19 @@
         <w:t>3. Данные и качество подготовки датасета</w:t>
       </w:r>
       <w:bookmarkEnd w:id="2"/>
+    </w:p>
+    <w:p>
+      <w:pPr>
+        <w:rPr>
+          <w:lang w:val="ru-RU"/>
+        </w:rPr>
+      </w:pPr>
+      <w:r>
+        <w:rPr>
+          <w:lang w:val="ru-RU"/>
+        </w:rPr>
+        <w:t>Ниже представлена таблица с кратким описанием итогового датасета.</w:t>
+      </w:r>
     </w:p>
     <w:tbl>
       <w:tblPr>
@@ -1772,18 +1785,28 @@
         <w:tblLook w:val="04A0" w:firstRow="1" w:lastRow="0" w:firstColumn="1" w:lastColumn="0" w:noHBand="0" w:noVBand="1"/>
       </w:tblPr>
       <w:tblGrid>
-        <w:gridCol w:w="3216"/>
-        <w:gridCol w:w="3216"/>
-        <w:gridCol w:w="3216"/>
+        <w:gridCol w:w="3085"/>
+        <w:gridCol w:w="1276"/>
+        <w:gridCol w:w="5287"/>
       </w:tblGrid>
       <w:tr>
         <w:tc>
           <w:tcPr>
-            <w:tcW w:w="3216" w:type="dxa"/>
+            <w:tcW w:w="3085" w:type="dxa"/>
           </w:tcPr>
           <w:p>
+            <w:pPr>
+              <w:rPr>
+                <w:b/>
+                <w:bCs/>
+              </w:rPr>
+            </w:pPr>
             <w:proofErr w:type="spellStart"/>
             <w:r>
+              <w:rPr>
+                <w:b/>
+                <w:bCs/>
+              </w:rPr>
               <w:t>Показатель</w:t>
             </w:r>
             <w:proofErr w:type="spellEnd"/>
@@ -1791,20 +1814,40 @@
         </w:tc>
         <w:tc>
           <w:tcPr>
-            <w:tcW w:w="3216" w:type="dxa"/>
+            <w:tcW w:w="1276" w:type="dxa"/>
           </w:tcPr>
           <w:p>
-            <w:r>
+            <w:pPr>
+              <w:rPr>
+                <w:b/>
+                <w:bCs/>
+              </w:rPr>
+            </w:pPr>
+            <w:r>
+              <w:rPr>
+                <w:b/>
+                <w:bCs/>
+              </w:rPr>
               <w:t>Значение</w:t>
             </w:r>
           </w:p>
         </w:tc>
         <w:tc>
           <w:tcPr>
-            <w:tcW w:w="3216" w:type="dxa"/>
+            <w:tcW w:w="5287" w:type="dxa"/>
           </w:tcPr>
           <w:p>
-            <w:r>
+            <w:pPr>
+              <w:rPr>
+                <w:b/>
+                <w:bCs/>
+              </w:rPr>
+            </w:pPr>
+            <w:r>
+              <w:rPr>
+                <w:b/>
+                <w:bCs/>
+              </w:rPr>
               <w:t>Комментарий</w:t>
             </w:r>
           </w:p>
@@ -1813,7 +1856,7 @@
       <w:tr>
         <w:tc>
           <w:tcPr>
-            <w:tcW w:w="3216" w:type="dxa"/>
+            <w:tcW w:w="3085" w:type="dxa"/>
           </w:tcPr>
           <w:p>
             <w:r>
@@ -1823,7 +1866,7 @@
         </w:tc>
         <w:tc>
           <w:tcPr>
-            <w:tcW w:w="3216" w:type="dxa"/>
+            <w:tcW w:w="1276" w:type="dxa"/>
           </w:tcPr>
           <w:p>
             <w:r>
@@ -1833,7 +1876,7 @@
         </w:tc>
         <w:tc>
           <w:tcPr>
-            <w:tcW w:w="3216" w:type="dxa"/>
+            <w:tcW w:w="5287" w:type="dxa"/>
           </w:tcPr>
           <w:p>
             <w:r>
@@ -1845,7 +1888,7 @@
       <w:tr>
         <w:tc>
           <w:tcPr>
-            <w:tcW w:w="3216" w:type="dxa"/>
+            <w:tcW w:w="3085" w:type="dxa"/>
           </w:tcPr>
           <w:p>
             <w:r>
@@ -1855,7 +1898,7 @@
         </w:tc>
         <w:tc>
           <w:tcPr>
-            <w:tcW w:w="3216" w:type="dxa"/>
+            <w:tcW w:w="1276" w:type="dxa"/>
           </w:tcPr>
           <w:p>
             <w:r>
@@ -1865,7 +1908,7 @@
         </w:tc>
         <w:tc>
           <w:tcPr>
-            <w:tcW w:w="3216" w:type="dxa"/>
+            <w:tcW w:w="5287" w:type="dxa"/>
           </w:tcPr>
           <w:p>
             <w:pPr>
@@ -1877,7 +1920,13 @@
               <w:rPr>
                 <w:lang w:val="ru-RU"/>
               </w:rPr>
-              <w:t>Две строки на матч: обе перспективы игроков</w:t>
+              <w:t xml:space="preserve">Две строки на матч: </w:t>
+            </w:r>
+            <w:r>
+              <w:rPr>
+                <w:lang w:val="ru-RU"/>
+              </w:rPr>
+              <w:t>по одной на перспективу каждого игрока в матче</w:t>
             </w:r>
           </w:p>
         </w:tc>
@@ -1885,7 +1934,7 @@
       <w:tr>
         <w:tc>
           <w:tcPr>
-            <w:tcW w:w="3216" w:type="dxa"/>
+            <w:tcW w:w="3085" w:type="dxa"/>
           </w:tcPr>
           <w:p>
             <w:proofErr w:type="spellStart"/>
@@ -1916,7 +1965,7 @@
         </w:tc>
         <w:tc>
           <w:tcPr>
-            <w:tcW w:w="3216" w:type="dxa"/>
+            <w:tcW w:w="1276" w:type="dxa"/>
           </w:tcPr>
           <w:p>
             <w:r>
@@ -1926,7 +1975,7 @@
         </w:tc>
         <w:tc>
           <w:tcPr>
-            <w:tcW w:w="3216" w:type="dxa"/>
+            <w:tcW w:w="5287" w:type="dxa"/>
           </w:tcPr>
           <w:p>
             <w:r>
@@ -1938,7 +1987,7 @@
       <w:tr>
         <w:tc>
           <w:tcPr>
-            <w:tcW w:w="3216" w:type="dxa"/>
+            <w:tcW w:w="3085" w:type="dxa"/>
           </w:tcPr>
           <w:p>
             <w:r>
@@ -1948,7 +1997,7 @@
         </w:tc>
         <w:tc>
           <w:tcPr>
-            <w:tcW w:w="3216" w:type="dxa"/>
+            <w:tcW w:w="1276" w:type="dxa"/>
           </w:tcPr>
           <w:p>
             <w:r>
@@ -1958,7 +2007,7 @@
         </w:tc>
         <w:tc>
           <w:tcPr>
-            <w:tcW w:w="3216" w:type="dxa"/>
+            <w:tcW w:w="5287" w:type="dxa"/>
           </w:tcPr>
           <w:p>
             <w:pPr>
@@ -1970,7 +2019,25 @@
               <w:rPr>
                 <w:lang w:val="ru-RU"/>
               </w:rPr>
-              <w:t>Нормализованные идентификаторы, в основном по РНИ</w:t>
+              <w:t>Нормализованные идентификаторы</w:t>
+            </w:r>
+            <w:r>
+              <w:rPr>
+                <w:lang w:val="ru-RU"/>
+              </w:rPr>
+              <w:t xml:space="preserve"> (</w:t>
+            </w:r>
+            <w:r>
+              <w:rPr>
+                <w:lang w:val="ru-RU"/>
+              </w:rPr>
+              <w:t>РНИ</w:t>
+            </w:r>
+            <w:r>
+              <w:rPr>
+                <w:lang w:val="ru-RU"/>
+              </w:rPr>
+              <w:t xml:space="preserve"> – регистрационный номер игрока)</w:t>
             </w:r>
           </w:p>
         </w:tc>
@@ -1978,7 +2045,7 @@
       <w:tr>
         <w:tc>
           <w:tcPr>
-            <w:tcW w:w="3216" w:type="dxa"/>
+            <w:tcW w:w="3085" w:type="dxa"/>
           </w:tcPr>
           <w:p>
             <w:proofErr w:type="spellStart"/>
@@ -1990,7 +2057,7 @@
         </w:tc>
         <w:tc>
           <w:tcPr>
-            <w:tcW w:w="3216" w:type="dxa"/>
+            <w:tcW w:w="1276" w:type="dxa"/>
           </w:tcPr>
           <w:p>
             <w:r>
@@ -2000,7 +2067,7 @@
         </w:tc>
         <w:tc>
           <w:tcPr>
-            <w:tcW w:w="3216" w:type="dxa"/>
+            <w:tcW w:w="5287" w:type="dxa"/>
           </w:tcPr>
           <w:p>
             <w:pPr>
@@ -2012,7 +2079,25 @@
               <w:rPr>
                 <w:lang w:val="ru-RU"/>
               </w:rPr>
-              <w:t>Турниры, из которых вошли матчи</w:t>
+              <w:t xml:space="preserve">Турниры, из которых </w:t>
+            </w:r>
+            <w:r>
+              <w:rPr>
+                <w:lang w:val="ru-RU"/>
+              </w:rPr>
+              <w:t>были взяты данные о</w:t>
+            </w:r>
+            <w:r>
+              <w:rPr>
+                <w:lang w:val="ru-RU"/>
+              </w:rPr>
+              <w:t xml:space="preserve"> матч</w:t>
+            </w:r>
+            <w:r>
+              <w:rPr>
+                <w:lang w:val="ru-RU"/>
+              </w:rPr>
+              <w:t>ах</w:t>
             </w:r>
           </w:p>
         </w:tc>
@@ -2020,7 +2105,7 @@
       <w:tr>
         <w:tc>
           <w:tcPr>
-            <w:tcW w:w="3216" w:type="dxa"/>
+            <w:tcW w:w="3085" w:type="dxa"/>
           </w:tcPr>
           <w:p>
             <w:proofErr w:type="spellStart"/>
@@ -2032,7 +2117,7 @@
         </w:tc>
         <w:tc>
           <w:tcPr>
-            <w:tcW w:w="3216" w:type="dxa"/>
+            <w:tcW w:w="1276" w:type="dxa"/>
           </w:tcPr>
           <w:p>
             <w:r>
@@ -2042,7 +2127,7 @@
         </w:tc>
         <w:tc>
           <w:tcPr>
-            <w:tcW w:w="3216" w:type="dxa"/>
+            <w:tcW w:w="5287" w:type="dxa"/>
           </w:tcPr>
           <w:p>
             <w:pPr>
@@ -2056,13 +2141,19 @@
               </w:rPr>
               <w:t>Города турниров в финальном датасете</w:t>
             </w:r>
+            <w:r>
+              <w:rPr>
+                <w:lang w:val="ru-RU"/>
+              </w:rPr>
+              <w:t xml:space="preserve"> (фокус на Центральном федеральном округе)</w:t>
+            </w:r>
           </w:p>
         </w:tc>
       </w:tr>
       <w:tr>
         <w:tc>
           <w:tcPr>
-            <w:tcW w:w="3216" w:type="dxa"/>
+            <w:tcW w:w="3085" w:type="dxa"/>
           </w:tcPr>
           <w:p>
             <w:proofErr w:type="spellStart"/>
@@ -2090,7 +2181,7 @@
         </w:tc>
         <w:tc>
           <w:tcPr>
-            <w:tcW w:w="3216" w:type="dxa"/>
+            <w:tcW w:w="1276" w:type="dxa"/>
           </w:tcPr>
           <w:p>
             <w:r>
@@ -2100,7 +2191,7 @@
         </w:tc>
         <w:tc>
           <w:tcPr>
-            <w:tcW w:w="3216" w:type="dxa"/>
+            <w:tcW w:w="5287" w:type="dxa"/>
           </w:tcPr>
           <w:p>
             <w:pPr>
@@ -2114,13 +2205,19 @@
               </w:rPr>
               <w:t>Все даты и возрастные категории рейтинга</w:t>
             </w:r>
+            <w:r>
+              <w:rPr>
+                <w:lang w:val="ru-RU"/>
+              </w:rPr>
+              <w:t xml:space="preserve"> (загружались рейтинги всех игроков в разных возрастных категориях). Количество рейтинговых очков в разных возрастных категориях у одного и того же игрока всегда одинаковое, но номер в общем рэнкинге может различаться.</w:t>
+            </w:r>
           </w:p>
         </w:tc>
       </w:tr>
       <w:tr>
         <w:tc>
           <w:tcPr>
-            <w:tcW w:w="3216" w:type="dxa"/>
+            <w:tcW w:w="3085" w:type="dxa"/>
           </w:tcPr>
           <w:p>
             <w:proofErr w:type="spellStart"/>
@@ -2140,7 +2237,7 @@
         </w:tc>
         <w:tc>
           <w:tcPr>
-            <w:tcW w:w="3216" w:type="dxa"/>
+            <w:tcW w:w="1276" w:type="dxa"/>
           </w:tcPr>
           <w:p>
             <w:r>
@@ -2150,7 +2247,7 @@
         </w:tc>
         <w:tc>
           <w:tcPr>
-            <w:tcW w:w="3216" w:type="dxa"/>
+            <w:tcW w:w="5287" w:type="dxa"/>
           </w:tcPr>
           <w:p>
             <w:r>
@@ -2162,7 +2259,7 @@
       <w:tr>
         <w:tc>
           <w:tcPr>
-            <w:tcW w:w="3216" w:type="dxa"/>
+            <w:tcW w:w="3085" w:type="dxa"/>
           </w:tcPr>
           <w:p>
             <w:r>
@@ -2172,7 +2269,7 @@
         </w:tc>
         <w:tc>
           <w:tcPr>
-            <w:tcW w:w="3216" w:type="dxa"/>
+            <w:tcW w:w="1276" w:type="dxa"/>
           </w:tcPr>
           <w:p>
             <w:r>
@@ -2182,7 +2279,7 @@
         </w:tc>
         <w:tc>
           <w:tcPr>
-            <w:tcW w:w="3216" w:type="dxa"/>
+            <w:tcW w:w="5287" w:type="dxa"/>
           </w:tcPr>
           <w:p>
             <w:pPr>
@@ -2202,7 +2299,7 @@
       <w:tr>
         <w:tc>
           <w:tcPr>
-            <w:tcW w:w="3216" w:type="dxa"/>
+            <w:tcW w:w="3085" w:type="dxa"/>
           </w:tcPr>
           <w:p>
             <w:proofErr w:type="spellStart"/>
@@ -2217,7 +2314,7 @@
         </w:tc>
         <w:tc>
           <w:tcPr>
-            <w:tcW w:w="3216" w:type="dxa"/>
+            <w:tcW w:w="1276" w:type="dxa"/>
           </w:tcPr>
           <w:p>
             <w:r>
@@ -2227,7 +2324,7 @@
         </w:tc>
         <w:tc>
           <w:tcPr>
-            <w:tcW w:w="3216" w:type="dxa"/>
+            <w:tcW w:w="5287" w:type="dxa"/>
           </w:tcPr>
           <w:p>
             <w:pPr>
@@ -2247,7 +2344,7 @@
       <w:tr>
         <w:tc>
           <w:tcPr>
-            <w:tcW w:w="3216" w:type="dxa"/>
+            <w:tcW w:w="3085" w:type="dxa"/>
           </w:tcPr>
           <w:p>
             <w:proofErr w:type="spellStart"/>
@@ -2270,7 +2367,7 @@
         </w:tc>
         <w:tc>
           <w:tcPr>
-            <w:tcW w:w="3216" w:type="dxa"/>
+            <w:tcW w:w="1276" w:type="dxa"/>
           </w:tcPr>
           <w:p>
             <w:r>
@@ -2280,7 +2377,7 @@
         </w:tc>
         <w:tc>
           <w:tcPr>
-            <w:tcW w:w="3216" w:type="dxa"/>
+            <w:tcW w:w="5287" w:type="dxa"/>
           </w:tcPr>
           <w:p>
             <w:pPr>
@@ -2300,7 +2397,7 @@
       <w:tr>
         <w:tc>
           <w:tcPr>
-            <w:tcW w:w="3216" w:type="dxa"/>
+            <w:tcW w:w="3085" w:type="dxa"/>
           </w:tcPr>
           <w:p>
             <w:proofErr w:type="spellStart"/>
@@ -2323,7 +2420,7 @@
         </w:tc>
         <w:tc>
           <w:tcPr>
-            <w:tcW w:w="3216" w:type="dxa"/>
+            <w:tcW w:w="1276" w:type="dxa"/>
           </w:tcPr>
           <w:p>
             <w:r>
@@ -2333,7 +2430,7 @@
         </w:tc>
         <w:tc>
           <w:tcPr>
-            <w:tcW w:w="3216" w:type="dxa"/>
+            <w:tcW w:w="5287" w:type="dxa"/>
           </w:tcPr>
           <w:p>
             <w:pPr>
@@ -2352,80 +2449,323 @@
       </w:tr>
     </w:tbl>
     <w:p>
-      <w:pPr/>
-      <w:r>
+      <w:pPr>
+        <w:jc w:val="both"/>
+        <w:rPr>
+          <w:lang w:val="ru-RU"/>
+        </w:rPr>
+      </w:pPr>
+    </w:p>
+    <w:p>
+      <w:pPr>
+        <w:jc w:val="both"/>
+        <w:rPr>
+          <w:lang w:val="ru-RU"/>
+        </w:rPr>
+      </w:pPr>
+      <w:r>
+        <w:rPr>
+          <w:lang w:val="ru-RU"/>
+        </w:rPr>
         <w:t>Данные для проекта формируются из открытой части сайта Российского теннисного тура. Используются сведения о турнирах, сыгранных матчах и официальных рейтингах игроков на разные даты классификации. Такой источник важен именно для прикладной задачи: модель учится не на абстрактной статистике, а на тех данных, которые реально доступны перед прогнозированием будущего матча.</w:t>
+      </w:r>
+    </w:p>
+    <w:p>
+      <w:pPr>
+        <w:jc w:val="both"/>
+        <w:rPr>
+          <w:lang w:val="ru-RU"/>
+        </w:rPr>
+      </w:pPr>
+      <w:r>
+        <w:rPr>
+          <w:lang w:val="ru-RU"/>
+        </w:rPr>
+        <w:lastRenderedPageBreak/>
+        <w:t>Сырые веб-данные нельзя напрямую использовать для машинного обучения. В них встречаются разные форматы дат и счета, неполные страницы турниров, будущие или отмененные соревнования, дублирующиеся записи, а также разные варианты написания имен игроков. Поэтому отдельная часть проекта посвящена очистке и нормализации данных: матчи приводятся к единому формату, игроки сопоставляются с их идентификаторами, некорректные и неполные строки исключаются, а повторяющиеся записи не попадают в обучающую выборку дважды.</w:t>
+      </w:r>
+    </w:p>
+    <w:p>
+      <w:pPr>
+        <w:jc w:val="both"/>
+        <w:rPr>
+          <w:lang w:val="ru-RU"/>
+        </w:rPr>
+      </w:pPr>
+      <w:r>
+        <w:rPr>
+          <w:lang w:val="ru-RU"/>
+        </w:rPr>
+        <w:t>После подготовки каждый матч преобразуется в набор наблюдений, пригодный для обучения модели: для игрока фиксируется факт победы или поражения, а также набор характеристик, известных до начала встречи. К таким характеристикам относятся рейтинг, рейтинговые очки, история результатов, текущая форма, опыт, отдых после предыдущего матча и другие показатели, описывающие относительную силу соперников.</w:t>
+      </w:r>
+    </w:p>
+    <w:p>
+      <w:pPr>
+        <w:jc w:val="both"/>
+        <w:rPr>
+          <w:lang w:val="ru-RU"/>
+        </w:rPr>
+      </w:pPr>
+      <w:r>
+        <w:rPr>
+          <w:lang w:val="ru-RU"/>
+        </w:rPr>
+        <w:t>Качество подготовки датасета здесь особенно важно, потому что ошибка на этом этапе напрямую приводит к искажению оценки модели. Например, если в признаки случайно попадет информация, ставшая известной только после матча, качество на тесте будет выглядеть завышенным, но реальная прогнозная ценность модели снизится. Поэтому при построении датасета используется хронологический принцип: для каждого матча берутся только те рейтинги и игровые показатели, которые могли быть известны на момент его проведения.</w:t>
+      </w:r>
+    </w:p>
+    <w:p>
+      <w:pPr>
+        <w:pStyle w:val="1"/>
+        <w:spacing w:after="240"/>
+        <w:rPr>
+          <w:lang w:val="ru-RU"/>
+        </w:rPr>
+      </w:pPr>
+      <w:bookmarkStart w:id="3" w:name="_Toc229519331"/>
+      <w:r>
+        <w:rPr>
+          <w:lang w:val="ru-RU"/>
+        </w:rPr>
+        <w:t>4. Признаки и предотвращение утечки будущей информации</w:t>
+      </w:r>
+      <w:bookmarkEnd w:id="3"/>
+    </w:p>
+    <w:p>
+      <w:pPr>
+        <w:jc w:val="both"/>
+        <w:rPr>
+          <w:lang w:val="ru-RU"/>
+        </w:rPr>
+      </w:pPr>
+      <w:r>
+        <w:rPr>
+          <w:lang w:val="ru-RU"/>
+        </w:rPr>
+        <w:t xml:space="preserve">Все исторические признаки рассчитываются только по данным, доступным до даты матча. Текущий матч обновляет историю только после того, как признаки для него уже рассчитаны. Это снижает риск </w:t>
+      </w:r>
+      <w:r>
+        <w:t>data</w:t>
+      </w:r>
+      <w:r>
+        <w:rPr>
+          <w:lang w:val="ru-RU"/>
+        </w:rPr>
+        <w:t xml:space="preserve"> </w:t>
+      </w:r>
+      <w:r>
+        <w:t>leakage</w:t>
+      </w:r>
+      <w:r>
+        <w:rPr>
+          <w:lang w:val="ru-RU"/>
+        </w:rPr>
+        <w:t xml:space="preserve"> и делает тестовую оценку ближе к реальному сценарию последовательного прогноза.</w:t>
+      </w:r>
+    </w:p>
+    <w:p>
+      <w:pPr>
+        <w:jc w:val="both"/>
+        <w:rPr>
+          <w:lang w:val="ru-RU"/>
+        </w:rPr>
+      </w:pPr>
+      <w:r>
+        <w:rPr>
+          <w:lang w:val="ru-RU"/>
+        </w:rPr>
+        <w:t>Ниже описаны основные признаки:</w:t>
+      </w:r>
+    </w:p>
+    <w:p>
+      <w:pPr>
+        <w:pStyle w:val="a0"/>
+        <w:rPr>
+          <w:lang w:val="ru-RU"/>
+        </w:rPr>
+      </w:pPr>
+      <w:r>
+        <w:rPr>
+          <w:lang w:val="ru-RU"/>
+        </w:rPr>
+        <w:t>Официальный рейтинг РТТ до даты матча: место, очки, дата классификации и возрастная категория рейтинга.</w:t>
+      </w:r>
+    </w:p>
+    <w:p>
+      <w:pPr>
+        <w:pStyle w:val="a0"/>
+        <w:rPr>
+          <w:lang w:val="ru-RU"/>
+        </w:rPr>
+      </w:pPr>
+      <w:r>
+        <w:rPr>
+          <w:lang w:val="ru-RU"/>
+        </w:rPr>
+        <w:t>Скорректированный рейтинг: средние рейтинговые очки на один зачётный турнир</w:t>
+      </w:r>
+      <w:r>
+        <w:rPr>
+          <w:lang w:val="ru-RU"/>
+        </w:rPr>
+        <w:t xml:space="preserve"> (у игрока может быть мало очков не потому, что он слабо выступал, а потому, что он участвовал в малом количестве турниров, которые пошли в зачет)</w:t>
+      </w:r>
+    </w:p>
+    <w:p>
+      <w:pPr>
+        <w:pStyle w:val="a0"/>
+        <w:rPr>
+          <w:lang w:val="ru-RU"/>
+        </w:rPr>
+      </w:pPr>
+      <w:r>
+        <w:rPr>
+          <w:lang w:val="ru-RU"/>
+        </w:rPr>
+        <w:t>Относительные и абсолютные разницы рейтинговых показателей игрока и соперника.</w:t>
+      </w:r>
+    </w:p>
+    <w:p>
+      <w:pPr>
+        <w:pStyle w:val="a0"/>
+        <w:rPr>
+          <w:lang w:val="ru-RU"/>
+        </w:rPr>
+      </w:pPr>
+      <w:r>
+        <w:t>ELO</w:t>
+      </w:r>
+      <w:r>
+        <w:rPr>
+          <w:lang w:val="ru-RU"/>
+        </w:rPr>
+        <w:t xml:space="preserve"> до матча и ожидаемая вероятность победы по </w:t>
+      </w:r>
+      <w:r>
+        <w:t>ELO</w:t>
+      </w:r>
+      <w:r>
+        <w:rPr>
+          <w:lang w:val="ru-RU"/>
+        </w:rPr>
+        <w:t>.</w:t>
       </w:r>
     </w:p>
     <w:p>
       <w:pPr/>
       <w:r>
-        <w:t>Сырые веб-данные нельзя напрямую использовать для машинного обучения. В них встречаются разные форматы дат и счета, неполные страницы турниров, будущие или отмененные соревнования, дублирующиеся записи, а также разные варианты написания имен игроков. Поэтому отдельная часть проекта посвящена очистке и нормализации данных: матчи приводятся к единому формату, игроки сопоставляются с их идентификаторами, некорректные и неполные строки исключаются, а повторяющиеся записи не попадают в обучающую выборку дважды.</w:t>
+        <w:t>ELO — это динамический рейтинг силы игрока, который пересчитывается после каждого матча. Перед встречей по разнице ELO оценивается ожидаемая вероятность победы: P(A) = 1 / (1 + 10^((ELO_B - ELO_A) / 400)). После матча рейтинг обновляется по формуле ELO_A_new = ELO_A + K * (S_A - P(A)), где S_A равно 1 при победе и 0 при поражении, а K задает силу изменения рейтинга. Поэтому победа над более сильным соперником дает больший прирост, чем ожидаемая победа над более слабым. В проекте ELO считается последовательно по хронологии матчей, то есть для прогноза используются только результаты, сыгранные до даты прогнозируемой встречи.</w:t>
       </w:r>
     </w:p>
     <w:p>
-      <w:pPr/>
-      <w:r>
-        <w:t>После подготовки каждый матч преобразуется в набор наблюдений, пригодный для обучения модели: для игрока фиксируется факт победы или поражения, а также набор характеристик, известных до начала встречи. К таким характеристикам относятся рейтинг, рейтинговые очки, история результатов, текущая форма, опыт, отдых после предыдущего матча и другие показатели, описывающие относительную силу соперников.</w:t>
+      <w:pPr>
+        <w:pStyle w:val="a0"/>
+        <w:rPr>
+          <w:lang w:val="ru-RU"/>
+        </w:rPr>
+      </w:pPr>
+      <w:r>
+        <w:rPr>
+          <w:lang w:val="ru-RU"/>
+        </w:rPr>
+        <w:t xml:space="preserve">Опыт игрока: число прошлых матчей, общий </w:t>
+      </w:r>
+      <w:proofErr w:type="spellStart"/>
+      <w:r>
+        <w:t>winrate</w:t>
+      </w:r>
+      <w:proofErr w:type="spellEnd"/>
+      <w:r>
+        <w:rPr>
+          <w:lang w:val="ru-RU"/>
+        </w:rPr>
+        <w:t>, недавняя форма.</w:t>
       </w:r>
     </w:p>
     <w:p>
-      <w:pPr/>
-      <w:r>
-        <w:t>Качество подготовки датасета здесь особенно важно, потому что ошибка на этом этапе напрямую приводит к искажению оценки модели. Например, если в признаки случайно попадет информация, ставшая известной только после матча, качество на тесте будет выглядеть завышенным, но реальная прогнозная ценность модели снизится. Поэтому при построении датасета используется хронологический принцип: для каждого матча берутся только те рейтинги и игровые показатели, которые могли быть известны на момент его проведения.</w:t>
+      <w:pPr>
+        <w:pStyle w:val="a0"/>
+        <w:rPr>
+          <w:lang w:val="ru-RU"/>
+        </w:rPr>
+      </w:pPr>
+      <w:r>
+        <w:rPr>
+          <w:lang w:val="ru-RU"/>
+        </w:rPr>
+        <w:t>Отдых: количество дней с предыдущего матча и разница отдыха с соперником.</w:t>
       </w:r>
     </w:p>
     <w:p>
-      <w:pPr/>
-      <w:r>
-        <w:t>Ограничения данных также учитываются при интерпретации результата. Модель опирается на официальную историю матчей и рейтингов, но не видит часть факторов, которые могут влиять на исход отдельной встречи: травмы, самочувствие игрока, качество подготовки к конкретному турниру, погодные условия и другие внешние обстоятельства. Поэтому прогноз следует рассматривать как вероятностную оценку на основе доступной статистики, а не как гарантированное предсказание исхода.</w:t>
+      <w:pPr>
+        <w:pStyle w:val="a0"/>
+        <w:rPr>
+          <w:lang w:val="ru-RU"/>
+        </w:rPr>
+      </w:pPr>
+      <w:r>
+        <w:t>Head</w:t>
+      </w:r>
+      <w:r>
+        <w:rPr>
+          <w:lang w:val="ru-RU"/>
+        </w:rPr>
+        <w:t>-</w:t>
+      </w:r>
+      <w:r>
+        <w:t>to</w:t>
+      </w:r>
+      <w:r>
+        <w:rPr>
+          <w:lang w:val="ru-RU"/>
+        </w:rPr>
+        <w:t>-</w:t>
+      </w:r>
+      <w:r>
+        <w:t>head</w:t>
+      </w:r>
+      <w:r>
+        <w:rPr>
+          <w:lang w:val="ru-RU"/>
+        </w:rPr>
+        <w:t>: число и доля побед в личных встречах до матча.</w:t>
       </w:r>
     </w:p>
     <w:p>
       <w:pPr>
-        <w:pStyle w:val="1"/>
-        <w:rPr>
-          <w:lang w:val="ru-RU"/>
-        </w:rPr>
-      </w:pPr>
-      <w:bookmarkStart w:id="3" w:name="_Toc229495218"/>
-      <w:r>
-        <w:rPr>
-          <w:lang w:val="ru-RU"/>
-        </w:rPr>
-        <w:t>4. Признаки и предотвращение утечки будущей информации</w:t>
-      </w:r>
-      <w:bookmarkEnd w:id="3"/>
+        <w:pStyle w:val="a0"/>
+        <w:rPr>
+          <w:lang w:val="ru-RU"/>
+        </w:rPr>
+      </w:pPr>
+      <w:r>
+        <w:rPr>
+          <w:lang w:val="ru-RU"/>
+        </w:rPr>
+        <w:t xml:space="preserve">Сила календаря: средний </w:t>
+      </w:r>
+      <w:r>
+        <w:t>ELO</w:t>
+      </w:r>
+      <w:r>
+        <w:rPr>
+          <w:lang w:val="ru-RU"/>
+        </w:rPr>
+        <w:t xml:space="preserve"> предыдущих соперников.</w:t>
+      </w:r>
     </w:p>
     <w:p>
       <w:pPr>
-        <w:rPr>
-          <w:lang w:val="ru-RU"/>
-        </w:rPr>
-      </w:pPr>
-      <w:r>
-        <w:rPr>
-          <w:lang w:val="ru-RU"/>
-        </w:rPr>
-        <w:t xml:space="preserve">Все исторические признаки рассчитываются только по данным, доступным до даты матча. Текущий матч обновляет историю только после того, как признаки для него уже рассчитаны. Это снижает риск </w:t>
-      </w:r>
-      <w:r>
-        <w:t>data</w:t>
-      </w:r>
-      <w:r>
-        <w:rPr>
-          <w:lang w:val="ru-RU"/>
-        </w:rPr>
-        <w:t xml:space="preserve"> </w:t>
-      </w:r>
-      <w:r>
-        <w:t>leakage</w:t>
-      </w:r>
-      <w:r>
-        <w:rPr>
-          <w:lang w:val="ru-RU"/>
-        </w:rPr>
-        <w:t xml:space="preserve"> и делает тестовую оценку ближе к реальному сценарию последовательного прогноза.</w:t>
+        <w:pStyle w:val="a0"/>
+        <w:rPr>
+          <w:lang w:val="ru-RU"/>
+        </w:rPr>
+      </w:pPr>
+      <w:r>
+        <w:rPr>
+          <w:lang w:val="ru-RU"/>
+        </w:rPr>
+        <w:lastRenderedPageBreak/>
+        <w:t>Признаки общих соперников: сравнительные результаты против игроков, с которыми встречались оба участника.</w:t>
       </w:r>
     </w:p>
     <w:p>
@@ -2439,209 +2779,30 @@
         <w:rPr>
           <w:lang w:val="ru-RU"/>
         </w:rPr>
-        <w:t>Официальный рейтинг РТТ до даты матча: место, очки, дата классификации и возрастная категория рейтинга.</w:t>
+        <w:t>Флаги пропусков рейтинговых данных, чтобы модель отличала отсутствие информации от нулевого значения.</w:t>
       </w:r>
     </w:p>
     <w:p>
       <w:pPr>
-        <w:pStyle w:val="a0"/>
-        <w:rPr>
-          <w:lang w:val="ru-RU"/>
-        </w:rPr>
-      </w:pPr>
-      <w:r>
-        <w:rPr>
-          <w:lang w:val="ru-RU"/>
-        </w:rPr>
-        <w:t>Скорректированный рейтинг: средние рейтинговые очки на один зачётный турнир.</w:t>
+        <w:rPr>
+          <w:lang w:val="ru-RU"/>
+        </w:rPr>
+      </w:pPr>
+      <w:r>
+        <w:rPr>
+          <w:lang w:val="ru-RU"/>
+        </w:rPr>
+        <w:t>Итоговый набор финальной модели содержит 43 признака.</w:t>
       </w:r>
     </w:p>
     <w:p>
       <w:pPr>
-        <w:pStyle w:val="a0"/>
-        <w:rPr>
-          <w:lang w:val="ru-RU"/>
-        </w:rPr>
-      </w:pPr>
-      <w:r>
-        <w:rPr>
-          <w:lang w:val="ru-RU"/>
-        </w:rPr>
-        <w:t>Относительные и абсолютные разницы рейтинговых показателей игрока и соперника.</w:t>
-      </w:r>
-    </w:p>
-    <w:p>
-      <w:pPr>
-        <w:pStyle w:val="a0"/>
-        <w:rPr>
-          <w:lang w:val="ru-RU"/>
-        </w:rPr>
-      </w:pPr>
-      <w:r>
-        <w:t>ELO</w:t>
-      </w:r>
-      <w:r>
-        <w:rPr>
-          <w:lang w:val="ru-RU"/>
-        </w:rPr>
-        <w:t xml:space="preserve"> до матча и ожидаемая вероятность победы по </w:t>
-      </w:r>
-      <w:r>
-        <w:t>ELO</w:t>
-      </w:r>
-      <w:r>
-        <w:rPr>
-          <w:lang w:val="ru-RU"/>
-        </w:rPr>
-        <w:t>.</w:t>
-      </w:r>
-    </w:p>
-    <w:p>
-      <w:pPr>
-        <w:pStyle w:val="a0"/>
-        <w:rPr>
-          <w:lang w:val="ru-RU"/>
-        </w:rPr>
-      </w:pPr>
-      <w:r>
-        <w:rPr>
-          <w:lang w:val="ru-RU"/>
-        </w:rPr>
-        <w:t xml:space="preserve">Опыт игрока: число прошлых матчей, общий </w:t>
-      </w:r>
-      <w:proofErr w:type="spellStart"/>
-      <w:r>
-        <w:t>winrate</w:t>
-      </w:r>
-      <w:proofErr w:type="spellEnd"/>
-      <w:r>
-        <w:rPr>
-          <w:lang w:val="ru-RU"/>
-        </w:rPr>
-        <w:t>, недавняя форма.</w:t>
-      </w:r>
-    </w:p>
-    <w:p>
-      <w:pPr>
-        <w:pStyle w:val="a0"/>
-        <w:rPr>
-          <w:lang w:val="ru-RU"/>
-        </w:rPr>
-      </w:pPr>
-      <w:r>
-        <w:rPr>
-          <w:lang w:val="ru-RU"/>
-        </w:rPr>
-        <w:t>Отдых: количество дней с предыдущего матча и разница отдыха с соперником.</w:t>
-      </w:r>
-    </w:p>
-    <w:p>
-      <w:pPr>
-        <w:pStyle w:val="a0"/>
-        <w:rPr>
-          <w:lang w:val="ru-RU"/>
-        </w:rPr>
-      </w:pPr>
-      <w:r>
-        <w:t>Head</w:t>
-      </w:r>
-      <w:r>
-        <w:rPr>
-          <w:lang w:val="ru-RU"/>
-        </w:rPr>
-        <w:t>-</w:t>
-      </w:r>
-      <w:r>
-        <w:t>to</w:t>
-      </w:r>
-      <w:r>
-        <w:rPr>
-          <w:lang w:val="ru-RU"/>
-        </w:rPr>
-        <w:t>-</w:t>
-      </w:r>
-      <w:r>
-        <w:t>head</w:t>
-      </w:r>
-      <w:r>
-        <w:rPr>
-          <w:lang w:val="ru-RU"/>
-        </w:rPr>
-        <w:t>: число и доля побед в личных встречах до матча.</w:t>
-      </w:r>
-    </w:p>
-    <w:p>
-      <w:pPr>
-        <w:pStyle w:val="a0"/>
-        <w:rPr>
-          <w:lang w:val="ru-RU"/>
-        </w:rPr>
-      </w:pPr>
-      <w:r>
-        <w:rPr>
-          <w:lang w:val="ru-RU"/>
-        </w:rPr>
-        <w:t xml:space="preserve">Сила календаря: средний </w:t>
-      </w:r>
-      <w:r>
-        <w:t>ELO</w:t>
-      </w:r>
-      <w:r>
-        <w:rPr>
-          <w:lang w:val="ru-RU"/>
-        </w:rPr>
-        <w:t xml:space="preserve"> предыдущих соперников.</w:t>
-      </w:r>
-    </w:p>
-    <w:p>
-      <w:pPr>
-        <w:pStyle w:val="a0"/>
-        <w:rPr>
-          <w:lang w:val="ru-RU"/>
-        </w:rPr>
-      </w:pPr>
-      <w:r>
-        <w:rPr>
-          <w:lang w:val="ru-RU"/>
-        </w:rPr>
-        <w:t>Признаки общих соперников: сравнительные результаты против игроков, с которыми встречались оба участника.</w:t>
-      </w:r>
-    </w:p>
-    <w:p>
-      <w:pPr>
-        <w:pStyle w:val="a0"/>
-        <w:rPr>
-          <w:lang w:val="ru-RU"/>
-        </w:rPr>
-      </w:pPr>
-      <w:r>
-        <w:rPr>
-          <w:lang w:val="ru-RU"/>
-        </w:rPr>
-        <w:t>Флаги пропусков рейтинговых данных, чтобы модель отличала отсутствие информации от нулевого значения.</w:t>
-      </w:r>
-    </w:p>
-    <w:p>
-      <w:pPr>
-        <w:rPr>
-          <w:lang w:val="ru-RU"/>
-        </w:rPr>
-      </w:pPr>
-      <w:r>
-        <w:rPr>
-          <w:lang w:val="ru-RU"/>
-        </w:rPr>
-        <w:t>Итоговый набор финальной модели содержит 43 признака.</w:t>
-      </w:r>
-    </w:p>
-    <w:p>
-      <w:pPr>
         <w:pStyle w:val="1"/>
         <w:rPr>
           <w:lang w:val="ru-RU"/>
         </w:rPr>
       </w:pPr>
-      <w:bookmarkStart w:id="4" w:name="_Toc229495219"/>
+      <w:bookmarkStart w:id="4" w:name="_Toc229519332"/>
       <w:r>
         <w:rPr>
           <w:lang w:val="ru-RU"/>
@@ -2845,7 +3006,6 @@
         <w:rPr>
           <w:lang w:val="ru-RU"/>
         </w:rPr>
-        <w:lastRenderedPageBreak/>
         <w:t xml:space="preserve">Сравнивались простые </w:t>
       </w:r>
       <w:r>
@@ -2981,7 +3141,7 @@
           <w:lang w:val="ru-RU"/>
         </w:rPr>
       </w:pPr>
-      <w:bookmarkStart w:id="5" w:name="_Toc229495220"/>
+      <w:bookmarkStart w:id="5" w:name="_Toc229519333"/>
       <w:r>
         <w:rPr>
           <w:lang w:val="ru-RU"/>
@@ -3337,7 +3497,11 @@
           </w:tcPr>
           <w:p>
             <w:r>
-              <w:t>Логистическая регрессия: рейтинг + ELO</w:t>
+              <w:t xml:space="preserve">Логистическая </w:t>
+            </w:r>
+            <w:r>
+              <w:lastRenderedPageBreak/>
+              <w:t>регрессия: рейтинг + ELO</w:t>
             </w:r>
           </w:p>
         </w:tc>
@@ -3347,6 +3511,7 @@
           </w:tcPr>
           <w:p>
             <w:r>
+              <w:lastRenderedPageBreak/>
               <w:t>1 233</w:t>
             </w:r>
           </w:p>
@@ -3837,14 +4002,7 @@
         <w:rPr>
           <w:lang w:val="ru-RU"/>
         </w:rPr>
-        <w:t xml:space="preserve">, потому что при </w:t>
-      </w:r>
-      <w:r>
-        <w:rPr>
-          <w:lang w:val="ru-RU"/>
-        </w:rPr>
-        <w:lastRenderedPageBreak/>
-        <w:t xml:space="preserve">вероятностном прогнозировании приоритет имеют </w:t>
+        <w:t xml:space="preserve">, потому что при вероятностном прогнозировании приоритет имеют </w:t>
       </w:r>
       <w:proofErr w:type="spellStart"/>
       <w:r>
@@ -4234,7 +4392,7 @@
           <w:lang w:val="ru-RU"/>
         </w:rPr>
       </w:pPr>
-      <w:bookmarkStart w:id="6" w:name="_Toc229495221"/>
+      <w:bookmarkStart w:id="6" w:name="_Toc229519334"/>
       <w:r>
         <w:rPr>
           <w:lang w:val="ru-RU"/>
@@ -4333,6 +4491,7 @@
           </w:tcPr>
           <w:p>
             <w:r>
+              <w:lastRenderedPageBreak/>
               <w:t>rel_diff_points_per_counting_tournament_pct_min_pre_observed_only</w:t>
             </w:r>
           </w:p>
@@ -4569,11 +4728,7 @@
           </w:tcPr>
           <w:p>
             <w:r>
-              <w:t xml:space="preserve">Скорректированный </w:t>
-            </w:r>
-            <w:r>
-              <w:lastRenderedPageBreak/>
-              <w:t>рейтинг</w:t>
+              <w:t>Скорректированный рейтинг</w:t>
             </w:r>
           </w:p>
         </w:tc>
@@ -4583,7 +4738,6 @@
           </w:tcPr>
           <w:p>
             <w:r>
-              <w:lastRenderedPageBreak/>
               <w:t>5.0317</w:t>
             </w:r>
           </w:p>
@@ -4602,14 +4756,7 @@
               <w:rPr>
                 <w:lang w:val="ru-RU"/>
               </w:rPr>
-              <w:t xml:space="preserve">Разница средних рейтинговых </w:t>
-            </w:r>
-            <w:r>
-              <w:rPr>
-                <w:lang w:val="ru-RU"/>
-              </w:rPr>
-              <w:lastRenderedPageBreak/>
-              <w:t xml:space="preserve">очков на один зачётный турнир: </w:t>
+              <w:t xml:space="preserve">Разница средних рейтинговых очков на один зачётный турнир: </w:t>
             </w:r>
             <w:r>
               <w:t>points</w:t>
@@ -4658,7 +4805,6 @@
           <w:p>
             <w:proofErr w:type="spellStart"/>
             <w:r>
-              <w:lastRenderedPageBreak/>
               <w:t>rel_diff_points_pct_min_pre_observed_only</w:t>
             </w:r>
             <w:proofErr w:type="spellEnd"/>
@@ -4905,7 +5051,11 @@
           </w:tcPr>
           <w:p>
             <w:r>
-              <w:t>Разница опыта: player_matches_pre - opponent_matches_pre.</w:t>
+              <w:t xml:space="preserve">Разница опыта: </w:t>
+            </w:r>
+            <w:r>
+              <w:lastRenderedPageBreak/>
+              <w:t>player_matches_pre - opponent_matches_pre.</w:t>
             </w:r>
           </w:p>
         </w:tc>
@@ -4950,7 +5100,7 @@
           <w:lang w:val="ru-RU"/>
         </w:rPr>
       </w:pPr>
-      <w:bookmarkStart w:id="7" w:name="_Toc229495222"/>
+      <w:bookmarkStart w:id="7" w:name="_Toc229519335"/>
       <w:r>
         <w:rPr>
           <w:lang w:val="ru-RU"/>
@@ -4983,7 +5133,6 @@
         <w:rPr>
           <w:lang w:val="ru-RU"/>
         </w:rPr>
-        <w:lastRenderedPageBreak/>
         <w:t xml:space="preserve">Тренерская подготовка к матчу: модель помогает оценить относительную силу соперника, сравнить игроков по </w:t>
       </w:r>
       <w:r>
@@ -5064,7 +5213,7 @@
       <w:pPr>
         <w:pStyle w:val="1"/>
       </w:pPr>
-      <w:bookmarkStart w:id="8" w:name="_Toc229495223"/>
+      <w:bookmarkStart w:id="8" w:name="_Toc229519336"/>
       <w:r>
         <w:t>9. Ограничения проекта</w:t>
       </w:r>
@@ -5095,6 +5244,7 @@
         <w:rPr>
           <w:lang w:val="ru-RU"/>
         </w:rPr>
+        <w:lastRenderedPageBreak/>
         <w:t>Модель не учитывает травмы, покрытие, усталость, перелеты, мотивацию, погодные условия и другие внешние факторы.</w:t>
       </w:r>
     </w:p>
@@ -5238,7 +5388,7 @@
           <w:lang w:val="ru-RU"/>
         </w:rPr>
       </w:pPr>
-      <w:bookmarkStart w:id="9" w:name="_Toc229495224"/>
+      <w:bookmarkStart w:id="9" w:name="_Toc229519337"/>
       <w:r>
         <w:rPr>
           <w:lang w:val="ru-RU"/>
@@ -5279,7 +5429,6 @@
         <w:rPr>
           <w:lang w:val="ru-RU"/>
         </w:rPr>
-        <w:lastRenderedPageBreak/>
         <w:t xml:space="preserve">Полученные результаты подтверждают исходную гипотезу: для прогноза теннисных матчей РТТ полезно использовать не только официальный рейтинг, но и динамическую силу игрока, качество предыдущих соперников, опыт, форму, отдых и результаты против общих соперников. Итоговая </w:t>
       </w:r>
       <w:r>
@@ -5347,11 +5496,16 @@
       <w:pPr>
         <w:pStyle w:val="1"/>
       </w:pPr>
-      <w:bookmarkStart w:id="10" w:name="_Toc229495225"/>
-      <w:r>
-        <w:t>11. Источники</w:t>
+      <w:bookmarkStart w:id="10" w:name="_Toc229519338"/>
+      <w:r>
+        <w:t xml:space="preserve">11. </w:t>
+      </w:r>
+      <w:proofErr w:type="spellStart"/>
+      <w:r>
+        <w:t>Источники</w:t>
       </w:r>
       <w:bookmarkEnd w:id="10"/>
+      <w:proofErr w:type="spellEnd"/>
     </w:p>
     <w:p>
       <w:pPr>

</xml_diff>

<commit_message>
Add recent form explanation to note
</commit_message>
<xml_diff>
--- a/docs/Пояснительная_записка_RTT_tennis_predictor_updated_v14.docx
+++ b/docs/Пояснительная_записка_RTT_tennis_predictor_updated_v14.docx
@@ -383,7 +383,7 @@
           <w:r>
             <w:fldChar w:fldCharType="separate"/>
           </w:r>
-          <w:hyperlink w:anchor="_Toc229519328" w:history="1">
+          <w:hyperlink w:anchor="_Toc229521134" w:history="1">
             <w:r>
               <w:rPr>
                 <w:rStyle w:val="aff8"/>
@@ -411,7 +411,7 @@
                 <w:noProof/>
                 <w:webHidden/>
               </w:rPr>
-              <w:instrText xml:space="preserve"> PAGEREF _Toc229519328 \h </w:instrText>
+              <w:instrText xml:space="preserve"> PAGEREF _Toc229521134 \h </w:instrText>
             </w:r>
             <w:r>
               <w:rPr>
@@ -457,7 +457,7 @@
               <w14:ligatures w14:val="standardContextual"/>
             </w:rPr>
           </w:pPr>
-          <w:hyperlink w:anchor="_Toc229519329" w:history="1">
+          <w:hyperlink w:anchor="_Toc229521135" w:history="1">
             <w:r>
               <w:rPr>
                 <w:rStyle w:val="aff8"/>
@@ -485,7 +485,7 @@
                 <w:noProof/>
                 <w:webHidden/>
               </w:rPr>
-              <w:instrText xml:space="preserve"> PAGEREF _Toc229519329 \h </w:instrText>
+              <w:instrText xml:space="preserve"> PAGEREF _Toc229521135 \h </w:instrText>
             </w:r>
             <w:r>
               <w:rPr>
@@ -531,7 +531,7 @@
               <w14:ligatures w14:val="standardContextual"/>
             </w:rPr>
           </w:pPr>
-          <w:hyperlink w:anchor="_Toc229519330" w:history="1">
+          <w:hyperlink w:anchor="_Toc229521136" w:history="1">
             <w:r>
               <w:rPr>
                 <w:rStyle w:val="aff8"/>
@@ -559,7 +559,7 @@
                 <w:noProof/>
                 <w:webHidden/>
               </w:rPr>
-              <w:instrText xml:space="preserve"> PAGEREF _Toc229519330 \h </w:instrText>
+              <w:instrText xml:space="preserve"> PAGEREF _Toc229521136 \h </w:instrText>
             </w:r>
             <w:r>
               <w:rPr>
@@ -605,7 +605,7 @@
               <w14:ligatures w14:val="standardContextual"/>
             </w:rPr>
           </w:pPr>
-          <w:hyperlink w:anchor="_Toc229519331" w:history="1">
+          <w:hyperlink w:anchor="_Toc229521137" w:history="1">
             <w:r>
               <w:rPr>
                 <w:rStyle w:val="aff8"/>
@@ -633,7 +633,7 @@
                 <w:noProof/>
                 <w:webHidden/>
               </w:rPr>
-              <w:instrText xml:space="preserve"> PAGEREF _Toc229519331 \h </w:instrText>
+              <w:instrText xml:space="preserve"> PAGEREF _Toc229521137 \h </w:instrText>
             </w:r>
             <w:r>
               <w:rPr>
@@ -679,7 +679,7 @@
               <w14:ligatures w14:val="standardContextual"/>
             </w:rPr>
           </w:pPr>
-          <w:hyperlink w:anchor="_Toc229519332" w:history="1">
+          <w:hyperlink w:anchor="_Toc229521138" w:history="1">
             <w:r>
               <w:rPr>
                 <w:rStyle w:val="aff8"/>
@@ -707,7 +707,7 @@
                 <w:noProof/>
                 <w:webHidden/>
               </w:rPr>
-              <w:instrText xml:space="preserve"> PAGEREF _Toc229519332 \h </w:instrText>
+              <w:instrText xml:space="preserve"> PAGEREF _Toc229521138 \h </w:instrText>
             </w:r>
             <w:r>
               <w:rPr>
@@ -753,7 +753,7 @@
               <w14:ligatures w14:val="standardContextual"/>
             </w:rPr>
           </w:pPr>
-          <w:hyperlink w:anchor="_Toc229519333" w:history="1">
+          <w:hyperlink w:anchor="_Toc229521139" w:history="1">
             <w:r>
               <w:rPr>
                 <w:rStyle w:val="aff8"/>
@@ -781,7 +781,7 @@
                 <w:noProof/>
                 <w:webHidden/>
               </w:rPr>
-              <w:instrText xml:space="preserve"> PAGEREF _Toc229519333 \h </w:instrText>
+              <w:instrText xml:space="preserve"> PAGEREF _Toc229521139 \h </w:instrText>
             </w:r>
             <w:r>
               <w:rPr>
@@ -801,7 +801,7 @@
                 <w:noProof/>
                 <w:webHidden/>
               </w:rPr>
-              <w:t>6</w:t>
+              <w:t>7</w:t>
             </w:r>
             <w:r>
               <w:rPr>
@@ -827,7 +827,7 @@
               <w14:ligatures w14:val="standardContextual"/>
             </w:rPr>
           </w:pPr>
-          <w:hyperlink w:anchor="_Toc229519334" w:history="1">
+          <w:hyperlink w:anchor="_Toc229521140" w:history="1">
             <w:r>
               <w:rPr>
                 <w:rStyle w:val="aff8"/>
@@ -855,7 +855,7 @@
                 <w:noProof/>
                 <w:webHidden/>
               </w:rPr>
-              <w:instrText xml:space="preserve"> PAGEREF _Toc229519334 \h </w:instrText>
+              <w:instrText xml:space="preserve"> PAGEREF _Toc229521140 \h </w:instrText>
             </w:r>
             <w:r>
               <w:rPr>
@@ -875,7 +875,7 @@
                 <w:noProof/>
                 <w:webHidden/>
               </w:rPr>
-              <w:t>7</w:t>
+              <w:t>8</w:t>
             </w:r>
             <w:r>
               <w:rPr>
@@ -901,7 +901,7 @@
               <w14:ligatures w14:val="standardContextual"/>
             </w:rPr>
           </w:pPr>
-          <w:hyperlink w:anchor="_Toc229519335" w:history="1">
+          <w:hyperlink w:anchor="_Toc229521141" w:history="1">
             <w:r>
               <w:rPr>
                 <w:rStyle w:val="aff8"/>
@@ -929,7 +929,7 @@
                 <w:noProof/>
                 <w:webHidden/>
               </w:rPr>
-              <w:instrText xml:space="preserve"> PAGEREF _Toc229519335 \h </w:instrText>
+              <w:instrText xml:space="preserve"> PAGEREF _Toc229521141 \h </w:instrText>
             </w:r>
             <w:r>
               <w:rPr>
@@ -975,7 +975,7 @@
               <w14:ligatures w14:val="standardContextual"/>
             </w:rPr>
           </w:pPr>
-          <w:hyperlink w:anchor="_Toc229519336" w:history="1">
+          <w:hyperlink w:anchor="_Toc229521142" w:history="1">
             <w:r>
               <w:rPr>
                 <w:rStyle w:val="aff8"/>
@@ -1002,7 +1002,7 @@
                 <w:noProof/>
                 <w:webHidden/>
               </w:rPr>
-              <w:instrText xml:space="preserve"> PAGEREF _Toc229519336 \h </w:instrText>
+              <w:instrText xml:space="preserve"> PAGEREF _Toc229521142 \h </w:instrText>
             </w:r>
             <w:r>
               <w:rPr>
@@ -1022,7 +1022,7 @@
                 <w:noProof/>
                 <w:webHidden/>
               </w:rPr>
-              <w:t>9</w:t>
+              <w:t>10</w:t>
             </w:r>
             <w:r>
               <w:rPr>
@@ -1048,7 +1048,7 @@
               <w14:ligatures w14:val="standardContextual"/>
             </w:rPr>
           </w:pPr>
-          <w:hyperlink w:anchor="_Toc229519337" w:history="1">
+          <w:hyperlink w:anchor="_Toc229521143" w:history="1">
             <w:r>
               <w:rPr>
                 <w:rStyle w:val="aff8"/>
@@ -1076,7 +1076,7 @@
                 <w:noProof/>
                 <w:webHidden/>
               </w:rPr>
-              <w:instrText xml:space="preserve"> PAGEREF _Toc229519337 \h </w:instrText>
+              <w:instrText xml:space="preserve"> PAGEREF _Toc229521143 \h </w:instrText>
             </w:r>
             <w:r>
               <w:rPr>
@@ -1122,7 +1122,7 @@
               <w14:ligatures w14:val="standardContextual"/>
             </w:rPr>
           </w:pPr>
-          <w:hyperlink w:anchor="_Toc229519338" w:history="1">
+          <w:hyperlink w:anchor="_Toc229521144" w:history="1">
             <w:r>
               <w:rPr>
                 <w:rStyle w:val="aff8"/>
@@ -1149,7 +1149,7 @@
                 <w:noProof/>
                 <w:webHidden/>
               </w:rPr>
-              <w:instrText xml:space="preserve"> PAGEREF _Toc229519338 \h </w:instrText>
+              <w:instrText xml:space="preserve"> PAGEREF _Toc229521144 \h </w:instrText>
             </w:r>
             <w:r>
               <w:rPr>
@@ -1212,7 +1212,7 @@
           <w:lang w:val="ru-RU"/>
         </w:rPr>
       </w:pPr>
-      <w:bookmarkStart w:id="0" w:name="_Toc229519328"/>
+      <w:bookmarkStart w:id="0" w:name="_Toc229521134"/>
       <w:r>
         <w:rPr>
           <w:lang w:val="ru-RU"/>
@@ -1304,7 +1304,7 @@
           <w:lang w:val="ru-RU"/>
         </w:rPr>
       </w:pPr>
-      <w:bookmarkStart w:id="1" w:name="_Toc229519329"/>
+      <w:bookmarkStart w:id="1" w:name="_Toc229521135"/>
       <w:r>
         <w:rPr>
           <w:lang w:val="ru-RU"/>
@@ -1756,7 +1756,7 @@
           <w:lang w:val="ru-RU"/>
         </w:rPr>
       </w:pPr>
-      <w:bookmarkStart w:id="2" w:name="_Toc229519330"/>
+      <w:bookmarkStart w:id="2" w:name="_Toc229521136"/>
       <w:r>
         <w:rPr>
           <w:lang w:val="ru-RU"/>
@@ -2521,7 +2521,7 @@
           <w:lang w:val="ru-RU"/>
         </w:rPr>
       </w:pPr>
-      <w:bookmarkStart w:id="3" w:name="_Toc229519331"/>
+      <w:bookmarkStart w:id="3" w:name="_Toc229521137"/>
       <w:r>
         <w:rPr>
           <w:lang w:val="ru-RU"/>
@@ -2651,158 +2651,495 @@
       </w:r>
     </w:p>
     <w:p>
-      <w:pPr/>
-      <w:r>
-        <w:t>ELO — это динамический рейтинг силы игрока, который пересчитывается после каждого матча. Перед встречей по разнице ELO оценивается ожидаемая вероятность победы: P(A) = 1 / (1 + 10^((ELO_B - ELO_A) / 400)). После матча рейтинг обновляется по формуле ELO_A_new = ELO_A + K * (S_A - P(A)), где S_A равно 1 при победе и 0 при поражении, а K задает силу изменения рейтинга. Поэтому победа над более сильным соперником дает больший прирост, чем ожидаемая победа над более слабым. В проекте ELO считается последовательно по хронологии матчей, то есть для прогноза используются только результаты, сыгранные до даты прогнозируемой встречи.</w:t>
+      <w:pPr>
+        <w:ind w:left="360"/>
+        <w:rPr>
+          <w:lang w:val="ru-RU"/>
+        </w:rPr>
+      </w:pPr>
+      <w:r>
+        <w:t>ELO</w:t>
+      </w:r>
+      <w:r>
+        <w:rPr>
+          <w:lang w:val="ru-RU"/>
+        </w:rPr>
+        <w:t xml:space="preserve"> — это динамический рейтинг силы игрока, который пересчитывается после каждого матча.</w:t>
       </w:r>
     </w:p>
     <w:p>
       <w:pPr>
-        <w:pStyle w:val="a0"/>
-        <w:rPr>
-          <w:lang w:val="ru-RU"/>
-        </w:rPr>
-      </w:pPr>
-      <w:r>
-        <w:rPr>
-          <w:lang w:val="ru-RU"/>
-        </w:rPr>
-        <w:t xml:space="preserve">Опыт игрока: число прошлых матчей, общий </w:t>
-      </w:r>
-      <w:proofErr w:type="spellStart"/>
-      <w:r>
-        <w:t>winrate</w:t>
-      </w:r>
-      <w:proofErr w:type="spellEnd"/>
-      <w:r>
-        <w:rPr>
-          <w:lang w:val="ru-RU"/>
-        </w:rPr>
-        <w:t>, недавняя форма.</w:t>
+        <w:ind w:left="360"/>
+        <w:rPr>
+          <w:lang w:val="ru-RU"/>
+        </w:rPr>
+      </w:pPr>
+      <w:r>
+        <w:rPr>
+          <w:lang w:val="ru-RU"/>
+        </w:rPr>
+        <w:t xml:space="preserve">Перед встречей по разнице </w:t>
+      </w:r>
+      <w:r>
+        <w:t>ELO</w:t>
+      </w:r>
+      <w:r>
+        <w:rPr>
+          <w:lang w:val="ru-RU"/>
+        </w:rPr>
+        <w:t xml:space="preserve"> оценивается ожидаемая вероятность победы:</w:t>
       </w:r>
     </w:p>
     <w:p>
       <w:pPr>
-        <w:pStyle w:val="a0"/>
-        <w:rPr>
-          <w:lang w:val="ru-RU"/>
-        </w:rPr>
-      </w:pPr>
-      <w:r>
-        <w:rPr>
-          <w:lang w:val="ru-RU"/>
-        </w:rPr>
-        <w:t>Отдых: количество дней с предыдущего матча и разница отдыха с соперником.</w:t>
+        <w:ind w:left="360"/>
+        <w:rPr>
+          <w:kern w:val="2"/>
+          <w:szCs w:val="24"/>
+          <w:lang w:val="ru-RU" w:eastAsia="ru-RU"/>
+          <w14:ligatures w14:val="standardContextual"/>
+        </w:rPr>
+      </w:pPr>
+      <w:r>
+        <w:rPr>
+          <w:i/>
+          <w:iCs/>
+        </w:rPr>
+        <w:lastRenderedPageBreak/>
+        <w:t>P</w:t>
+      </w:r>
+      <w:r>
+        <w:rPr>
+          <w:i/>
+          <w:iCs/>
+          <w:lang w:val="ru-RU"/>
+        </w:rPr>
+        <w:t>(</w:t>
+      </w:r>
+      <w:r>
+        <w:rPr>
+          <w:i/>
+          <w:iCs/>
+        </w:rPr>
+        <w:t>A</w:t>
+      </w:r>
+      <w:r>
+        <w:rPr>
+          <w:i/>
+          <w:iCs/>
+          <w:lang w:val="ru-RU"/>
+        </w:rPr>
+        <w:t>) = 1 / (1 + 10</w:t>
+      </w:r>
+      <w:r>
+        <w:rPr>
+          <w:i/>
+          <w:iCs/>
+          <w:sz w:val="16"/>
+          <w:szCs w:val="16"/>
+          <w:vertAlign w:val="superscript"/>
+          <w:lang w:val="ru-RU"/>
+        </w:rPr>
+        <w:t>(</w:t>
+      </w:r>
+      <w:r>
+        <w:rPr>
+          <w:i/>
+          <w:iCs/>
+          <w:sz w:val="16"/>
+          <w:szCs w:val="16"/>
+          <w:vertAlign w:val="superscript"/>
+        </w:rPr>
+        <w:t>ELOB</w:t>
+      </w:r>
+      <w:r>
+        <w:rPr>
+          <w:i/>
+          <w:iCs/>
+          <w:sz w:val="16"/>
+          <w:szCs w:val="16"/>
+          <w:vertAlign w:val="superscript"/>
+          <w:lang w:val="ru-RU"/>
+        </w:rPr>
+        <w:t xml:space="preserve"> − </w:t>
+      </w:r>
+      <w:r>
+        <w:rPr>
+          <w:i/>
+          <w:iCs/>
+          <w:sz w:val="16"/>
+          <w:szCs w:val="16"/>
+          <w:vertAlign w:val="superscript"/>
+        </w:rPr>
+        <w:t>ELOA</w:t>
+      </w:r>
+      <w:r>
+        <w:rPr>
+          <w:i/>
+          <w:iCs/>
+          <w:sz w:val="16"/>
+          <w:szCs w:val="16"/>
+          <w:vertAlign w:val="superscript"/>
+          <w:lang w:val="ru-RU"/>
+        </w:rPr>
+        <w:t>)/400</w:t>
+      </w:r>
+      <w:r>
+        <w:rPr>
+          <w:i/>
+          <w:iCs/>
+          <w:lang w:val="ru-RU"/>
+        </w:rPr>
+        <w:t>)</w:t>
       </w:r>
     </w:p>
     <w:p>
       <w:pPr>
-        <w:pStyle w:val="a0"/>
-        <w:rPr>
-          <w:lang w:val="ru-RU"/>
-        </w:rPr>
-      </w:pPr>
-      <w:r>
-        <w:t>Head</w:t>
-      </w:r>
-      <w:r>
-        <w:rPr>
-          <w:lang w:val="ru-RU"/>
-        </w:rPr>
-        <w:t>-</w:t>
-      </w:r>
-      <w:r>
-        <w:t>to</w:t>
-      </w:r>
-      <w:r>
-        <w:rPr>
-          <w:lang w:val="ru-RU"/>
-        </w:rPr>
-        <w:t>-</w:t>
-      </w:r>
-      <w:r>
-        <w:t>head</w:t>
-      </w:r>
-      <w:r>
-        <w:rPr>
-          <w:lang w:val="ru-RU"/>
-        </w:rPr>
-        <w:t>: число и доля побед в личных встречах до матча.</w:t>
+        <w:ind w:left="360"/>
+        <w:rPr>
+          <w:lang w:val="ru-RU"/>
+        </w:rPr>
+      </w:pPr>
+      <w:r>
+        <w:rPr>
+          <w:lang w:val="ru-RU"/>
+        </w:rPr>
+        <w:t>После матча рейтинг обновляется по формуле</w:t>
       </w:r>
     </w:p>
     <w:p>
       <w:pPr>
-        <w:pStyle w:val="a0"/>
-        <w:rPr>
-          <w:lang w:val="ru-RU"/>
-        </w:rPr>
-      </w:pPr>
-      <w:r>
-        <w:rPr>
-          <w:lang w:val="ru-RU"/>
-        </w:rPr>
-        <w:t xml:space="preserve">Сила календаря: средний </w:t>
-      </w:r>
-      <w:r>
+        <w:ind w:left="360"/>
+        <w:rPr>
+          <w:kern w:val="2"/>
+          <w:szCs w:val="24"/>
+          <w:lang w:eastAsia="ru-RU"/>
+          <w14:ligatures w14:val="standardContextual"/>
+        </w:rPr>
+      </w:pPr>
+      <w:proofErr w:type="spellStart"/>
+      <w:r>
+        <w:rPr>
+          <w:i/>
+          <w:iCs/>
+        </w:rPr>
         <w:t>ELO</w:t>
       </w:r>
       <w:r>
         <w:rPr>
-          <w:lang w:val="ru-RU"/>
-        </w:rPr>
-        <w:t xml:space="preserve"> предыдущих соперников.</w:t>
-      </w:r>
+          <w:i/>
+          <w:iCs/>
+          <w:sz w:val="16"/>
+          <w:szCs w:val="16"/>
+          <w:vertAlign w:val="subscript"/>
+        </w:rPr>
+        <w:t>A,new</w:t>
+      </w:r>
+      <w:proofErr w:type="spellEnd"/>
+      <w:r>
+        <w:rPr>
+          <w:i/>
+          <w:iCs/>
+        </w:rPr>
+        <w:t xml:space="preserve"> = ELO</w:t>
+      </w:r>
+      <w:r>
+        <w:rPr>
+          <w:i/>
+          <w:iCs/>
+          <w:sz w:val="16"/>
+          <w:szCs w:val="16"/>
+          <w:vertAlign w:val="subscript"/>
+        </w:rPr>
+        <w:t>A</w:t>
+      </w:r>
+      <w:r>
+        <w:rPr>
+          <w:i/>
+          <w:iCs/>
+        </w:rPr>
+        <w:t xml:space="preserve"> + K × (S</w:t>
+      </w:r>
+      <w:r>
+        <w:rPr>
+          <w:i/>
+          <w:iCs/>
+          <w:sz w:val="16"/>
+          <w:szCs w:val="16"/>
+          <w:vertAlign w:val="subscript"/>
+        </w:rPr>
+        <w:t>A</w:t>
+      </w:r>
+      <w:r>
+        <w:rPr>
+          <w:i/>
+          <w:iCs/>
+        </w:rPr>
+        <w:t xml:space="preserve"> − P(A)), </w:t>
+      </w:r>
+      <w:proofErr w:type="spellStart"/>
+      <w:r>
+        <w:rPr>
+          <w:i/>
+          <w:iCs/>
+        </w:rPr>
+        <w:t>где</w:t>
+      </w:r>
+      <w:proofErr w:type="spellEnd"/>
     </w:p>
     <w:p>
       <w:pPr>
-        <w:pStyle w:val="a0"/>
-        <w:rPr>
-          <w:lang w:val="ru-RU"/>
-        </w:rPr>
-      </w:pPr>
-      <w:r>
-        <w:rPr>
-          <w:lang w:val="ru-RU"/>
-        </w:rPr>
-        <w:lastRenderedPageBreak/>
-        <w:t>Признаки общих соперников: сравнительные результаты против игроков, с которыми встречались оба участника.</w:t>
+        <w:ind w:left="360"/>
+        <w:rPr>
+          <w:lang w:val="ru-RU"/>
+        </w:rPr>
+      </w:pPr>
+      <w:r>
+        <w:rPr>
+          <w:i/>
+          <w:iCs/>
+        </w:rPr>
+        <w:t>S</w:t>
+      </w:r>
+      <w:r>
+        <w:rPr>
+          <w:i/>
+          <w:iCs/>
+          <w:sz w:val="16"/>
+          <w:szCs w:val="16"/>
+          <w:vertAlign w:val="subscript"/>
+        </w:rPr>
+        <w:t>A</w:t>
+      </w:r>
+      <w:r>
+        <w:rPr>
+          <w:lang w:val="ru-RU"/>
+        </w:rPr>
+        <w:t xml:space="preserve"> </w:t>
+      </w:r>
+      <w:r>
+        <w:rPr>
+          <w:lang w:val="ru-RU"/>
+        </w:rPr>
+        <w:t>равно 1 при победе и 0 при поражении,</w:t>
       </w:r>
     </w:p>
     <w:p>
       <w:pPr>
-        <w:pStyle w:val="a0"/>
-        <w:rPr>
-          <w:lang w:val="ru-RU"/>
-        </w:rPr>
-      </w:pPr>
-      <w:r>
-        <w:rPr>
-          <w:lang w:val="ru-RU"/>
-        </w:rPr>
-        <w:t>Флаги пропусков рейтинговых данных, чтобы модель отличала отсутствие информации от нулевого значения.</w:t>
+        <w:ind w:left="360"/>
+        <w:rPr>
+          <w:lang w:val="ru-RU"/>
+        </w:rPr>
+      </w:pPr>
+      <w:r>
+        <w:rPr>
+          <w:lang w:val="ru-RU"/>
+        </w:rPr>
+        <w:t xml:space="preserve">а </w:t>
+      </w:r>
+      <w:r>
+        <w:rPr>
+          <w:i/>
+          <w:iCs/>
+        </w:rPr>
+        <w:t>K</w:t>
+      </w:r>
+      <w:r>
+        <w:rPr>
+          <w:lang w:val="ru-RU"/>
+        </w:rPr>
+        <w:t xml:space="preserve"> задает силу изменения рейтинга.</w:t>
       </w:r>
     </w:p>
     <w:p>
       <w:pPr>
-        <w:rPr>
-          <w:lang w:val="ru-RU"/>
-        </w:rPr>
-      </w:pPr>
-      <w:r>
-        <w:rPr>
-          <w:lang w:val="ru-RU"/>
-        </w:rPr>
-        <w:t>Итоговый набор финальной модели содержит 43 признака.</w:t>
+        <w:ind w:left="360"/>
+        <w:rPr>
+          <w:lang w:val="ru-RU"/>
+        </w:rPr>
+      </w:pPr>
+      <w:r>
+        <w:rPr>
+          <w:lang w:val="ru-RU"/>
+        </w:rPr>
+        <w:t>Поэтому победа над более сильным соперником дает больший прирост, чем ожидаемая победа над более слабым.</w:t>
       </w:r>
     </w:p>
     <w:p>
       <w:pPr>
+        <w:ind w:left="360"/>
+        <w:rPr>
+          <w:lang w:val="ru-RU"/>
+        </w:rPr>
+      </w:pPr>
+      <w:r>
+        <w:rPr>
+          <w:lang w:val="ru-RU"/>
+        </w:rPr>
+        <w:t xml:space="preserve">В проекте </w:t>
+      </w:r>
+      <w:r>
+        <w:t>ELO</w:t>
+      </w:r>
+      <w:r>
+        <w:rPr>
+          <w:lang w:val="ru-RU"/>
+        </w:rPr>
+        <w:t xml:space="preserve"> считается последовательно по хронологии матчей, то есть для прогноза используются только результаты, сыгранные до даты прогнозируемой встречи.</w:t>
+      </w:r>
+    </w:p>
+    <w:p>
+      <w:pPr>
+        <w:pStyle w:val="a0"/>
+        <w:rPr>
+          <w:lang w:val="ru-RU"/>
+        </w:rPr>
+      </w:pPr>
+      <w:r>
+        <w:rPr>
+          <w:lang w:val="ru-RU"/>
+        </w:rPr>
+        <w:t xml:space="preserve">Опыт игрока: число прошлых матчей, общий </w:t>
+      </w:r>
+      <w:proofErr w:type="spellStart"/>
+      <w:r>
+        <w:t>winrate</w:t>
+      </w:r>
+      <w:proofErr w:type="spellEnd"/>
+      <w:r>
+        <w:rPr>
+          <w:lang w:val="ru-RU"/>
+        </w:rPr>
+        <w:t>, недавняя форма.</w:t>
+      </w:r>
+    </w:p>
+    <w:p>
+      <w:pPr/>
+      <w:r>
+        <w:t>Недавняя форма — это результаты игрока в последних матчах перед прогнозируемой встречей.</w:t>
+      </w:r>
+    </w:p>
+    <w:p>
+      <w:pPr>
+        <w:pStyle w:val="a0"/>
+        <w:rPr>
+          <w:lang w:val="ru-RU"/>
+        </w:rPr>
+      </w:pPr>
+      <w:r>
+        <w:rPr>
+          <w:lang w:val="ru-RU"/>
+        </w:rPr>
+        <w:t>Отдых: количество дней с предыдущего матча и разница отдыха с соперником.</w:t>
+      </w:r>
+    </w:p>
+    <w:p>
+      <w:pPr>
+        <w:pStyle w:val="a0"/>
+        <w:rPr>
+          <w:lang w:val="ru-RU"/>
+        </w:rPr>
+      </w:pPr>
+      <w:r>
+        <w:t>Head</w:t>
+      </w:r>
+      <w:r>
+        <w:rPr>
+          <w:lang w:val="ru-RU"/>
+        </w:rPr>
+        <w:t>-</w:t>
+      </w:r>
+      <w:r>
+        <w:t>to</w:t>
+      </w:r>
+      <w:r>
+        <w:rPr>
+          <w:lang w:val="ru-RU"/>
+        </w:rPr>
+        <w:t>-</w:t>
+      </w:r>
+      <w:r>
+        <w:t>head</w:t>
+      </w:r>
+      <w:r>
+        <w:rPr>
+          <w:lang w:val="ru-RU"/>
+        </w:rPr>
+        <w:t>: число и доля побед в личных встречах до матча.</w:t>
+      </w:r>
+    </w:p>
+    <w:p>
+      <w:pPr>
+        <w:pStyle w:val="a0"/>
+        <w:rPr>
+          <w:lang w:val="ru-RU"/>
+        </w:rPr>
+      </w:pPr>
+      <w:r>
+        <w:rPr>
+          <w:lang w:val="ru-RU"/>
+        </w:rPr>
+        <w:t xml:space="preserve">Сила календаря: средний </w:t>
+      </w:r>
+      <w:r>
+        <w:t>ELO</w:t>
+      </w:r>
+      <w:r>
+        <w:rPr>
+          <w:lang w:val="ru-RU"/>
+        </w:rPr>
+        <w:t xml:space="preserve"> предыдущих соперников.</w:t>
+      </w:r>
+    </w:p>
+    <w:p>
+      <w:pPr>
+        <w:pStyle w:val="a0"/>
+        <w:rPr>
+          <w:lang w:val="ru-RU"/>
+        </w:rPr>
+      </w:pPr>
+      <w:r>
+        <w:rPr>
+          <w:lang w:val="ru-RU"/>
+        </w:rPr>
+        <w:t>Признаки общих соперников: сравнительные результаты против игроков, с которыми встречались оба участника.</w:t>
+      </w:r>
+    </w:p>
+    <w:p>
+      <w:pPr>
+        <w:pStyle w:val="a0"/>
+        <w:rPr>
+          <w:lang w:val="ru-RU"/>
+        </w:rPr>
+      </w:pPr>
+      <w:r>
+        <w:rPr>
+          <w:lang w:val="ru-RU"/>
+        </w:rPr>
+        <w:t>Флаги пропусков рейтинговых данных, чтобы модель отличала отсутствие информации от нулевого значения.</w:t>
+      </w:r>
+    </w:p>
+    <w:p>
+      <w:pPr>
+        <w:rPr>
+          <w:lang w:val="ru-RU"/>
+        </w:rPr>
+      </w:pPr>
+      <w:r>
+        <w:rPr>
+          <w:lang w:val="ru-RU"/>
+        </w:rPr>
+        <w:t>Итоговый набор финальной модели содержит 43 признака.</w:t>
+      </w:r>
+    </w:p>
+    <w:p>
+      <w:pPr>
         <w:pStyle w:val="1"/>
         <w:rPr>
           <w:lang w:val="ru-RU"/>
         </w:rPr>
       </w:pPr>
-      <w:bookmarkStart w:id="4" w:name="_Toc229519332"/>
+      <w:bookmarkStart w:id="4" w:name="_Toc229521138"/>
       <w:r>
         <w:rPr>
           <w:lang w:val="ru-RU"/>
@@ -3043,6 +3380,7 @@
         </w:rPr>
       </w:pPr>
       <w:r>
+        <w:lastRenderedPageBreak/>
         <w:t>Baseline</w:t>
       </w:r>
       <w:r>
@@ -3141,7 +3479,7 @@
           <w:lang w:val="ru-RU"/>
         </w:rPr>
       </w:pPr>
-      <w:bookmarkStart w:id="5" w:name="_Toc229519333"/>
+      <w:bookmarkStart w:id="5" w:name="_Toc229521139"/>
       <w:r>
         <w:rPr>
           <w:lang w:val="ru-RU"/>
@@ -3497,11 +3835,7 @@
           </w:tcPr>
           <w:p>
             <w:r>
-              <w:t xml:space="preserve">Логистическая </w:t>
-            </w:r>
-            <w:r>
-              <w:lastRenderedPageBreak/>
-              <w:t>регрессия: рейтинг + ELO</w:t>
+              <w:t>Логистическая регрессия: рейтинг + ELO</w:t>
             </w:r>
           </w:p>
         </w:tc>
@@ -3511,7 +3845,6 @@
           </w:tcPr>
           <w:p>
             <w:r>
-              <w:lastRenderedPageBreak/>
               <w:t>1 233</w:t>
             </w:r>
           </w:p>
@@ -4170,6 +4503,7 @@
           </w:tcPr>
           <w:p>
             <w:r>
+              <w:lastRenderedPageBreak/>
               <w:t>CatBoost</w:t>
             </w:r>
           </w:p>
@@ -4392,7 +4726,7 @@
           <w:lang w:val="ru-RU"/>
         </w:rPr>
       </w:pPr>
-      <w:bookmarkStart w:id="6" w:name="_Toc229519334"/>
+      <w:bookmarkStart w:id="6" w:name="_Toc229521140"/>
       <w:r>
         <w:rPr>
           <w:lang w:val="ru-RU"/>
@@ -4491,7 +4825,6 @@
           </w:tcPr>
           <w:p>
             <w:r>
-              <w:lastRenderedPageBreak/>
               <w:t>rel_diff_points_per_counting_tournament_pct_min_pre_observed_only</w:t>
             </w:r>
           </w:p>
@@ -4844,7 +5177,14 @@
               <w:rPr>
                 <w:lang w:val="ru-RU"/>
               </w:rPr>
-              <w:t>Относительная разница рейтинговых очков в процентах от меньшего из двух значений.</w:t>
+              <w:t xml:space="preserve">Относительная разница </w:t>
+            </w:r>
+            <w:r>
+              <w:rPr>
+                <w:lang w:val="ru-RU"/>
+              </w:rPr>
+              <w:lastRenderedPageBreak/>
+              <w:t>рейтинговых очков в процентах от меньшего из двух значений.</w:t>
             </w:r>
           </w:p>
         </w:tc>
@@ -4856,6 +5196,7 @@
           </w:tcPr>
           <w:p>
             <w:r>
+              <w:lastRenderedPageBreak/>
               <w:t>opp_elo_last_5</w:t>
             </w:r>
           </w:p>
@@ -5051,11 +5392,7 @@
           </w:tcPr>
           <w:p>
             <w:r>
-              <w:t xml:space="preserve">Разница опыта: </w:t>
-            </w:r>
-            <w:r>
-              <w:lastRenderedPageBreak/>
-              <w:t>player_matches_pre - opponent_matches_pre.</w:t>
+              <w:t>Разница опыта: player_matches_pre - opponent_matches_pre.</w:t>
             </w:r>
           </w:p>
         </w:tc>
@@ -5100,7 +5437,7 @@
           <w:lang w:val="ru-RU"/>
         </w:rPr>
       </w:pPr>
-      <w:bookmarkStart w:id="7" w:name="_Toc229519335"/>
+      <w:bookmarkStart w:id="7" w:name="_Toc229521141"/>
       <w:r>
         <w:rPr>
           <w:lang w:val="ru-RU"/>
@@ -5170,6 +5507,7 @@
         <w:rPr>
           <w:lang w:val="ru-RU"/>
         </w:rPr>
+        <w:lastRenderedPageBreak/>
         <w:t xml:space="preserve">Мониторинг развития игрока: динамика </w:t>
       </w:r>
       <w:r>
@@ -5213,7 +5551,7 @@
       <w:pPr>
         <w:pStyle w:val="1"/>
       </w:pPr>
-      <w:bookmarkStart w:id="8" w:name="_Toc229519336"/>
+      <w:bookmarkStart w:id="8" w:name="_Toc229521142"/>
       <w:r>
         <w:t>9. Ограничения проекта</w:t>
       </w:r>
@@ -5244,7 +5582,6 @@
         <w:rPr>
           <w:lang w:val="ru-RU"/>
         </w:rPr>
-        <w:lastRenderedPageBreak/>
         <w:t>Модель не учитывает травмы, покрытие, усталость, перелеты, мотивацию, погодные условия и другие внешние факторы.</w:t>
       </w:r>
     </w:p>
@@ -5388,7 +5725,7 @@
           <w:lang w:val="ru-RU"/>
         </w:rPr>
       </w:pPr>
-      <w:bookmarkStart w:id="9" w:name="_Toc229519337"/>
+      <w:bookmarkStart w:id="9" w:name="_Toc229521143"/>
       <w:r>
         <w:rPr>
           <w:lang w:val="ru-RU"/>
@@ -5489,6 +5826,7 @@
         <w:rPr>
           <w:lang w:val="ru-RU"/>
         </w:rPr>
+        <w:lastRenderedPageBreak/>
         <w:t>Главная практическая ценность проекта — не только один числовой прогноз, но и прозрачная аналитическая панель, которая показывает, на каких факторах основана вероятность победы и где находятся ограничения данных.</w:t>
       </w:r>
     </w:p>
@@ -5496,7 +5834,7 @@
       <w:pPr>
         <w:pStyle w:val="1"/>
       </w:pPr>
-      <w:bookmarkStart w:id="10" w:name="_Toc229519338"/>
+      <w:bookmarkStart w:id="10" w:name="_Toc229521144"/>
       <w:r>
         <w:t xml:space="preserve">11. </w:t>
       </w:r>

</xml_diff>

<commit_message>
Clarify recent form calculation in note
</commit_message>
<xml_diff>
--- a/docs/Пояснительная_записка_RTT_tennis_predictor_updated_v14.docx
+++ b/docs/Пояснительная_записка_RTT_tennis_predictor_updated_v14.docx
@@ -383,7 +383,7 @@
           <w:r>
             <w:fldChar w:fldCharType="separate"/>
           </w:r>
-          <w:hyperlink w:anchor="_Toc229521134" w:history="1">
+          <w:hyperlink w:anchor="_Toc229521680" w:history="1">
             <w:r>
               <w:rPr>
                 <w:rStyle w:val="aff8"/>
@@ -411,7 +411,7 @@
                 <w:noProof/>
                 <w:webHidden/>
               </w:rPr>
-              <w:instrText xml:space="preserve"> PAGEREF _Toc229521134 \h </w:instrText>
+              <w:instrText xml:space="preserve"> PAGEREF _Toc229521680 \h </w:instrText>
             </w:r>
             <w:r>
               <w:rPr>
@@ -457,7 +457,7 @@
               <w14:ligatures w14:val="standardContextual"/>
             </w:rPr>
           </w:pPr>
-          <w:hyperlink w:anchor="_Toc229521135" w:history="1">
+          <w:hyperlink w:anchor="_Toc229521681" w:history="1">
             <w:r>
               <w:rPr>
                 <w:rStyle w:val="aff8"/>
@@ -485,7 +485,7 @@
                 <w:noProof/>
                 <w:webHidden/>
               </w:rPr>
-              <w:instrText xml:space="preserve"> PAGEREF _Toc229521135 \h </w:instrText>
+              <w:instrText xml:space="preserve"> PAGEREF _Toc229521681 \h </w:instrText>
             </w:r>
             <w:r>
               <w:rPr>
@@ -531,7 +531,7 @@
               <w14:ligatures w14:val="standardContextual"/>
             </w:rPr>
           </w:pPr>
-          <w:hyperlink w:anchor="_Toc229521136" w:history="1">
+          <w:hyperlink w:anchor="_Toc229521682" w:history="1">
             <w:r>
               <w:rPr>
                 <w:rStyle w:val="aff8"/>
@@ -559,7 +559,7 @@
                 <w:noProof/>
                 <w:webHidden/>
               </w:rPr>
-              <w:instrText xml:space="preserve"> PAGEREF _Toc229521136 \h </w:instrText>
+              <w:instrText xml:space="preserve"> PAGEREF _Toc229521682 \h </w:instrText>
             </w:r>
             <w:r>
               <w:rPr>
@@ -605,7 +605,7 @@
               <w14:ligatures w14:val="standardContextual"/>
             </w:rPr>
           </w:pPr>
-          <w:hyperlink w:anchor="_Toc229521137" w:history="1">
+          <w:hyperlink w:anchor="_Toc229521683" w:history="1">
             <w:r>
               <w:rPr>
                 <w:rStyle w:val="aff8"/>
@@ -633,7 +633,7 @@
                 <w:noProof/>
                 <w:webHidden/>
               </w:rPr>
-              <w:instrText xml:space="preserve"> PAGEREF _Toc229521137 \h </w:instrText>
+              <w:instrText xml:space="preserve"> PAGEREF _Toc229521683 \h </w:instrText>
             </w:r>
             <w:r>
               <w:rPr>
@@ -679,7 +679,7 @@
               <w14:ligatures w14:val="standardContextual"/>
             </w:rPr>
           </w:pPr>
-          <w:hyperlink w:anchor="_Toc229521138" w:history="1">
+          <w:hyperlink w:anchor="_Toc229521684" w:history="1">
             <w:r>
               <w:rPr>
                 <w:rStyle w:val="aff8"/>
@@ -707,7 +707,7 @@
                 <w:noProof/>
                 <w:webHidden/>
               </w:rPr>
-              <w:instrText xml:space="preserve"> PAGEREF _Toc229521138 \h </w:instrText>
+              <w:instrText xml:space="preserve"> PAGEREF _Toc229521684 \h </w:instrText>
             </w:r>
             <w:r>
               <w:rPr>
@@ -753,7 +753,7 @@
               <w14:ligatures w14:val="standardContextual"/>
             </w:rPr>
           </w:pPr>
-          <w:hyperlink w:anchor="_Toc229521139" w:history="1">
+          <w:hyperlink w:anchor="_Toc229521685" w:history="1">
             <w:r>
               <w:rPr>
                 <w:rStyle w:val="aff8"/>
@@ -781,7 +781,7 @@
                 <w:noProof/>
                 <w:webHidden/>
               </w:rPr>
-              <w:instrText xml:space="preserve"> PAGEREF _Toc229521139 \h </w:instrText>
+              <w:instrText xml:space="preserve"> PAGEREF _Toc229521685 \h </w:instrText>
             </w:r>
             <w:r>
               <w:rPr>
@@ -827,7 +827,7 @@
               <w14:ligatures w14:val="standardContextual"/>
             </w:rPr>
           </w:pPr>
-          <w:hyperlink w:anchor="_Toc229521140" w:history="1">
+          <w:hyperlink w:anchor="_Toc229521686" w:history="1">
             <w:r>
               <w:rPr>
                 <w:rStyle w:val="aff8"/>
@@ -855,7 +855,7 @@
                 <w:noProof/>
                 <w:webHidden/>
               </w:rPr>
-              <w:instrText xml:space="preserve"> PAGEREF _Toc229521140 \h </w:instrText>
+              <w:instrText xml:space="preserve"> PAGEREF _Toc229521686 \h </w:instrText>
             </w:r>
             <w:r>
               <w:rPr>
@@ -901,7 +901,7 @@
               <w14:ligatures w14:val="standardContextual"/>
             </w:rPr>
           </w:pPr>
-          <w:hyperlink w:anchor="_Toc229521141" w:history="1">
+          <w:hyperlink w:anchor="_Toc229521687" w:history="1">
             <w:r>
               <w:rPr>
                 <w:rStyle w:val="aff8"/>
@@ -929,7 +929,7 @@
                 <w:noProof/>
                 <w:webHidden/>
               </w:rPr>
-              <w:instrText xml:space="preserve"> PAGEREF _Toc229521141 \h </w:instrText>
+              <w:instrText xml:space="preserve"> PAGEREF _Toc229521687 \h </w:instrText>
             </w:r>
             <w:r>
               <w:rPr>
@@ -975,7 +975,7 @@
               <w14:ligatures w14:val="standardContextual"/>
             </w:rPr>
           </w:pPr>
-          <w:hyperlink w:anchor="_Toc229521142" w:history="1">
+          <w:hyperlink w:anchor="_Toc229521688" w:history="1">
             <w:r>
               <w:rPr>
                 <w:rStyle w:val="aff8"/>
@@ -1002,7 +1002,7 @@
                 <w:noProof/>
                 <w:webHidden/>
               </w:rPr>
-              <w:instrText xml:space="preserve"> PAGEREF _Toc229521142 \h </w:instrText>
+              <w:instrText xml:space="preserve"> PAGEREF _Toc229521688 \h </w:instrText>
             </w:r>
             <w:r>
               <w:rPr>
@@ -1048,7 +1048,7 @@
               <w14:ligatures w14:val="standardContextual"/>
             </w:rPr>
           </w:pPr>
-          <w:hyperlink w:anchor="_Toc229521143" w:history="1">
+          <w:hyperlink w:anchor="_Toc229521689" w:history="1">
             <w:r>
               <w:rPr>
                 <w:rStyle w:val="aff8"/>
@@ -1076,7 +1076,7 @@
                 <w:noProof/>
                 <w:webHidden/>
               </w:rPr>
-              <w:instrText xml:space="preserve"> PAGEREF _Toc229521143 \h </w:instrText>
+              <w:instrText xml:space="preserve"> PAGEREF _Toc229521689 \h </w:instrText>
             </w:r>
             <w:r>
               <w:rPr>
@@ -1122,7 +1122,7 @@
               <w14:ligatures w14:val="standardContextual"/>
             </w:rPr>
           </w:pPr>
-          <w:hyperlink w:anchor="_Toc229521144" w:history="1">
+          <w:hyperlink w:anchor="_Toc229521690" w:history="1">
             <w:r>
               <w:rPr>
                 <w:rStyle w:val="aff8"/>
@@ -1149,7 +1149,7 @@
                 <w:noProof/>
                 <w:webHidden/>
               </w:rPr>
-              <w:instrText xml:space="preserve"> PAGEREF _Toc229521144 \h </w:instrText>
+              <w:instrText xml:space="preserve"> PAGEREF _Toc229521690 \h </w:instrText>
             </w:r>
             <w:r>
               <w:rPr>
@@ -1169,7 +1169,7 @@
                 <w:noProof/>
                 <w:webHidden/>
               </w:rPr>
-              <w:t>10</w:t>
+              <w:t>11</w:t>
             </w:r>
             <w:r>
               <w:rPr>
@@ -1212,7 +1212,7 @@
           <w:lang w:val="ru-RU"/>
         </w:rPr>
       </w:pPr>
-      <w:bookmarkStart w:id="0" w:name="_Toc229521134"/>
+      <w:bookmarkStart w:id="0" w:name="_Toc229521680"/>
       <w:r>
         <w:rPr>
           <w:lang w:val="ru-RU"/>
@@ -1304,7 +1304,7 @@
           <w:lang w:val="ru-RU"/>
         </w:rPr>
       </w:pPr>
-      <w:bookmarkStart w:id="1" w:name="_Toc229521135"/>
+      <w:bookmarkStart w:id="1" w:name="_Toc229521681"/>
       <w:r>
         <w:rPr>
           <w:lang w:val="ru-RU"/>
@@ -1756,7 +1756,7 @@
           <w:lang w:val="ru-RU"/>
         </w:rPr>
       </w:pPr>
-      <w:bookmarkStart w:id="2" w:name="_Toc229521136"/>
+      <w:bookmarkStart w:id="2" w:name="_Toc229521682"/>
       <w:r>
         <w:rPr>
           <w:lang w:val="ru-RU"/>
@@ -2521,7 +2521,7 @@
           <w:lang w:val="ru-RU"/>
         </w:rPr>
       </w:pPr>
-      <w:bookmarkStart w:id="3" w:name="_Toc229521137"/>
+      <w:bookmarkStart w:id="3" w:name="_Toc229521683"/>
       <w:r>
         <w:rPr>
           <w:lang w:val="ru-RU"/>
@@ -2693,6 +2693,7 @@
     <w:p>
       <w:pPr>
         <w:ind w:left="360"/>
+        <w:jc w:val="center"/>
         <w:rPr>
           <w:kern w:val="2"/>
           <w:szCs w:val="24"/>
@@ -2810,6 +2811,7 @@
     <w:p>
       <w:pPr>
         <w:ind w:left="360"/>
+        <w:jc w:val="center"/>
         <w:rPr>
           <w:kern w:val="2"/>
           <w:szCs w:val="24"/>
@@ -2818,6 +2820,7 @@
         </w:rPr>
       </w:pPr>
       <w:proofErr w:type="spellStart"/>
+      <w:proofErr w:type="gramStart"/>
       <w:r>
         <w:rPr>
           <w:i/>
@@ -2836,6 +2839,7 @@
         <w:t>A,new</w:t>
       </w:r>
       <w:proofErr w:type="spellEnd"/>
+      <w:proofErr w:type="gramEnd"/>
       <w:r>
         <w:rPr>
           <w:i/>
@@ -2915,13 +2919,7 @@
         <w:rPr>
           <w:lang w:val="ru-RU"/>
         </w:rPr>
-        <w:t xml:space="preserve"> </w:t>
-      </w:r>
-      <w:r>
-        <w:rPr>
-          <w:lang w:val="ru-RU"/>
-        </w:rPr>
-        <w:t>равно 1 при победе и 0 при поражении,</w:t>
+        <w:t xml:space="preserve"> равно 1 при победе и 0 при поражении,</w:t>
       </w:r>
     </w:p>
     <w:p>
@@ -3014,9 +3012,14 @@
       </w:r>
     </w:p>
     <w:p>
-      <w:pPr/>
-      <w:r>
-        <w:t>Недавняя форма — это результаты игрока в последних матчах перед прогнозируемой встречей.</w:t>
+      <w:pPr>
+        <w:ind w:left="360"/>
+        <w:rPr>
+          <w:lang w:val="ru-RU"/>
+        </w:rPr>
+      </w:pPr>
+      <w:r>
+        <w:t>Недавняя форма в панели прогноза считается как доля побед игрока в последних 5 и 10 матчах до выбранной даты (Form 5 и Form 10); текущий и будущие матчи в расчет не попадают.</w:t>
       </w:r>
     </w:p>
     <w:p>
@@ -3135,11 +3138,12 @@
     <w:p>
       <w:pPr>
         <w:pStyle w:val="1"/>
-        <w:rPr>
-          <w:lang w:val="ru-RU"/>
-        </w:rPr>
-      </w:pPr>
-      <w:bookmarkStart w:id="4" w:name="_Toc229521138"/>
+        <w:spacing w:after="240"/>
+        <w:rPr>
+          <w:lang w:val="ru-RU"/>
+        </w:rPr>
+      </w:pPr>
+      <w:bookmarkStart w:id="4" w:name="_Toc229521684"/>
       <w:r>
         <w:rPr>
           <w:lang w:val="ru-RU"/>
@@ -3343,6 +3347,7 @@
         <w:rPr>
           <w:lang w:val="ru-RU"/>
         </w:rPr>
+        <w:lastRenderedPageBreak/>
         <w:t xml:space="preserve">Сравнивались простые </w:t>
       </w:r>
       <w:r>
@@ -3380,7 +3385,6 @@
         </w:rPr>
       </w:pPr>
       <w:r>
-        <w:lastRenderedPageBreak/>
         <w:t>Baseline</w:t>
       </w:r>
       <w:r>
@@ -3479,7 +3483,7 @@
           <w:lang w:val="ru-RU"/>
         </w:rPr>
       </w:pPr>
-      <w:bookmarkStart w:id="5" w:name="_Toc229521139"/>
+      <w:bookmarkStart w:id="5" w:name="_Toc229521685"/>
       <w:r>
         <w:rPr>
           <w:lang w:val="ru-RU"/>
@@ -4335,7 +4339,14 @@
         <w:rPr>
           <w:lang w:val="ru-RU"/>
         </w:rPr>
-        <w:t xml:space="preserve">, потому что при вероятностном прогнозировании приоритет имеют </w:t>
+        <w:t xml:space="preserve">, потому что при </w:t>
+      </w:r>
+      <w:r>
+        <w:rPr>
+          <w:lang w:val="ru-RU"/>
+        </w:rPr>
+        <w:lastRenderedPageBreak/>
+        <w:t xml:space="preserve">вероятностном прогнозировании приоритет имеют </w:t>
       </w:r>
       <w:proofErr w:type="spellStart"/>
       <w:r>
@@ -4503,7 +4514,6 @@
           </w:tcPr>
           <w:p>
             <w:r>
-              <w:lastRenderedPageBreak/>
               <w:t>CatBoost</w:t>
             </w:r>
           </w:p>
@@ -4726,7 +4736,7 @@
           <w:lang w:val="ru-RU"/>
         </w:rPr>
       </w:pPr>
-      <w:bookmarkStart w:id="6" w:name="_Toc229521140"/>
+      <w:bookmarkStart w:id="6" w:name="_Toc229521686"/>
       <w:r>
         <w:rPr>
           <w:lang w:val="ru-RU"/>
@@ -5061,7 +5071,11 @@
           </w:tcPr>
           <w:p>
             <w:r>
-              <w:t>Скорректированный рейтинг</w:t>
+              <w:t xml:space="preserve">Скорректированный </w:t>
+            </w:r>
+            <w:r>
+              <w:lastRenderedPageBreak/>
+              <w:t>рейтинг</w:t>
             </w:r>
           </w:p>
         </w:tc>
@@ -5071,6 +5085,7 @@
           </w:tcPr>
           <w:p>
             <w:r>
+              <w:lastRenderedPageBreak/>
               <w:t>5.0317</w:t>
             </w:r>
           </w:p>
@@ -5089,7 +5104,14 @@
               <w:rPr>
                 <w:lang w:val="ru-RU"/>
               </w:rPr>
-              <w:t xml:space="preserve">Разница средних рейтинговых очков на один зачётный турнир: </w:t>
+              <w:t xml:space="preserve">Разница средних рейтинговых </w:t>
+            </w:r>
+            <w:r>
+              <w:rPr>
+                <w:lang w:val="ru-RU"/>
+              </w:rPr>
+              <w:lastRenderedPageBreak/>
+              <w:t xml:space="preserve">очков на один зачётный турнир: </w:t>
             </w:r>
             <w:r>
               <w:t>points</w:t>
@@ -5138,6 +5160,7 @@
           <w:p>
             <w:proofErr w:type="spellStart"/>
             <w:r>
+              <w:lastRenderedPageBreak/>
               <w:t>rel_diff_points_pct_min_pre_observed_only</w:t>
             </w:r>
             <w:proofErr w:type="spellEnd"/>
@@ -5177,14 +5200,7 @@
               <w:rPr>
                 <w:lang w:val="ru-RU"/>
               </w:rPr>
-              <w:t xml:space="preserve">Относительная разница </w:t>
-            </w:r>
-            <w:r>
-              <w:rPr>
-                <w:lang w:val="ru-RU"/>
-              </w:rPr>
-              <w:lastRenderedPageBreak/>
-              <w:t>рейтинговых очков в процентах от меньшего из двух значений.</w:t>
+              <w:t>Относительная разница рейтинговых очков в процентах от меньшего из двух значений.</w:t>
             </w:r>
           </w:p>
         </w:tc>
@@ -5196,7 +5212,6 @@
           </w:tcPr>
           <w:p>
             <w:r>
-              <w:lastRenderedPageBreak/>
               <w:t>opp_elo_last_5</w:t>
             </w:r>
           </w:p>
@@ -5437,7 +5452,7 @@
           <w:lang w:val="ru-RU"/>
         </w:rPr>
       </w:pPr>
-      <w:bookmarkStart w:id="7" w:name="_Toc229521141"/>
+      <w:bookmarkStart w:id="7" w:name="_Toc229521687"/>
       <w:r>
         <w:rPr>
           <w:lang w:val="ru-RU"/>
@@ -5470,6 +5485,7 @@
         <w:rPr>
           <w:lang w:val="ru-RU"/>
         </w:rPr>
+        <w:lastRenderedPageBreak/>
         <w:t xml:space="preserve">Тренерская подготовка к матчу: модель помогает оценить относительную силу соперника, сравнить игроков по </w:t>
       </w:r>
       <w:r>
@@ -5507,7 +5523,6 @@
         <w:rPr>
           <w:lang w:val="ru-RU"/>
         </w:rPr>
-        <w:lastRenderedPageBreak/>
         <w:t xml:space="preserve">Мониторинг развития игрока: динамика </w:t>
       </w:r>
       <w:r>
@@ -5551,7 +5566,7 @@
       <w:pPr>
         <w:pStyle w:val="1"/>
       </w:pPr>
-      <w:bookmarkStart w:id="8" w:name="_Toc229521142"/>
+      <w:bookmarkStart w:id="8" w:name="_Toc229521688"/>
       <w:r>
         <w:t>9. Ограничения проекта</w:t>
       </w:r>
@@ -5725,7 +5740,7 @@
           <w:lang w:val="ru-RU"/>
         </w:rPr>
       </w:pPr>
-      <w:bookmarkStart w:id="9" w:name="_Toc229521143"/>
+      <w:bookmarkStart w:id="9" w:name="_Toc229521689"/>
       <w:r>
         <w:rPr>
           <w:lang w:val="ru-RU"/>
@@ -5766,6 +5781,7 @@
         <w:rPr>
           <w:lang w:val="ru-RU"/>
         </w:rPr>
+        <w:lastRenderedPageBreak/>
         <w:t xml:space="preserve">Полученные результаты подтверждают исходную гипотезу: для прогноза теннисных матчей РТТ полезно использовать не только официальный рейтинг, но и динамическую силу игрока, качество предыдущих соперников, опыт, форму, отдых и результаты против общих соперников. Итоговая </w:t>
       </w:r>
       <w:r>
@@ -5826,7 +5842,6 @@
         <w:rPr>
           <w:lang w:val="ru-RU"/>
         </w:rPr>
-        <w:lastRenderedPageBreak/>
         <w:t>Главная практическая ценность проекта — не только один числовой прогноз, но и прозрачная аналитическая панель, которая показывает, на каких факторах основана вероятность победы и где находятся ограничения данных.</w:t>
       </w:r>
     </w:p>
@@ -5834,7 +5849,7 @@
       <w:pPr>
         <w:pStyle w:val="1"/>
       </w:pPr>
-      <w:bookmarkStart w:id="10" w:name="_Toc229521144"/>
+      <w:bookmarkStart w:id="10" w:name="_Toc229521690"/>
       <w:r>
         <w:t xml:space="preserve">11. </w:t>
       </w:r>

</xml_diff>

<commit_message>
Finalize defense note and add presentation
</commit_message>
<xml_diff>
--- a/docs/Пояснительная_записка_RTT_tennis_predictor_updated_v14.docx
+++ b/docs/Пояснительная_записка_RTT_tennis_predictor_updated_v14.docx
@@ -2513,688 +2513,6 @@
         <w:t>Качество подготовки датасета здесь особенно важно, потому что ошибка на этом этапе напрямую приводит к искажению оценки модели. Например, если в признаки случайно попадет информация, ставшая известной только после матча, качество на тесте будет выглядеть завышенным, но реальная прогнозная ценность модели снизится. Поэтому при построении датасета используется хронологический принцип: для каждого матча берутся только те рейтинги и игровые показатели, которые могли быть известны на момент его проведения.</w:t>
       </w:r>
     </w:p>
-    <w:p>
-      <w:pPr>
-        <w:pStyle w:val="1"/>
-        <w:spacing w:after="240"/>
-        <w:rPr>
-          <w:lang w:val="ru-RU"/>
-        </w:rPr>
-      </w:pPr>
-      <w:bookmarkStart w:id="3" w:name="_Toc229521683"/>
-      <w:r>
-        <w:rPr>
-          <w:lang w:val="ru-RU"/>
-        </w:rPr>
-        <w:t>4. Признаки и предотвращение утечки будущей информации</w:t>
-      </w:r>
-      <w:bookmarkEnd w:id="3"/>
-    </w:p>
-    <w:p>
-      <w:pPr>
-        <w:jc w:val="both"/>
-        <w:rPr>
-          <w:lang w:val="ru-RU"/>
-        </w:rPr>
-      </w:pPr>
-      <w:r>
-        <w:rPr>
-          <w:lang w:val="ru-RU"/>
-        </w:rPr>
-        <w:t xml:space="preserve">Все исторические признаки рассчитываются только по данным, доступным до даты матча. Текущий матч обновляет историю только после того, как признаки для него уже рассчитаны. Это снижает риск </w:t>
-      </w:r>
-      <w:r>
-        <w:t>data</w:t>
-      </w:r>
-      <w:r>
-        <w:rPr>
-          <w:lang w:val="ru-RU"/>
-        </w:rPr>
-        <w:t xml:space="preserve"> </w:t>
-      </w:r>
-      <w:r>
-        <w:t>leakage</w:t>
-      </w:r>
-      <w:r>
-        <w:rPr>
-          <w:lang w:val="ru-RU"/>
-        </w:rPr>
-        <w:t xml:space="preserve"> и делает тестовую оценку ближе к реальному сценарию последовательного прогноза.</w:t>
-      </w:r>
-    </w:p>
-    <w:p>
-      <w:pPr>
-        <w:jc w:val="both"/>
-        <w:rPr>
-          <w:lang w:val="ru-RU"/>
-        </w:rPr>
-      </w:pPr>
-      <w:r>
-        <w:rPr>
-          <w:lang w:val="ru-RU"/>
-        </w:rPr>
-        <w:t>Ниже описаны основные признаки:</w:t>
-      </w:r>
-    </w:p>
-    <w:p>
-      <w:pPr>
-        <w:pStyle w:val="a0"/>
-        <w:rPr>
-          <w:lang w:val="ru-RU"/>
-        </w:rPr>
-      </w:pPr>
-      <w:r>
-        <w:rPr>
-          <w:lang w:val="ru-RU"/>
-        </w:rPr>
-        <w:t>Официальный рейтинг РТТ до даты матча: место, очки, дата классификации и возрастная категория рейтинга.</w:t>
-      </w:r>
-    </w:p>
-    <w:p>
-      <w:pPr>
-        <w:pStyle w:val="a0"/>
-        <w:rPr>
-          <w:lang w:val="ru-RU"/>
-        </w:rPr>
-      </w:pPr>
-      <w:r>
-        <w:rPr>
-          <w:lang w:val="ru-RU"/>
-        </w:rPr>
-        <w:t>Скорректированный рейтинг: средние рейтинговые очки на один зачётный турнир</w:t>
-      </w:r>
-      <w:r>
-        <w:rPr>
-          <w:lang w:val="ru-RU"/>
-        </w:rPr>
-        <w:t xml:space="preserve"> (у игрока может быть мало очков не потому, что он слабо выступал, а потому, что он участвовал в малом количестве турниров, которые пошли в зачет)</w:t>
-      </w:r>
-    </w:p>
-    <w:p>
-      <w:pPr>
-        <w:pStyle w:val="a0"/>
-        <w:rPr>
-          <w:lang w:val="ru-RU"/>
-        </w:rPr>
-      </w:pPr>
-      <w:r>
-        <w:rPr>
-          <w:lang w:val="ru-RU"/>
-        </w:rPr>
-        <w:t>Относительные и абсолютные разницы рейтинговых показателей игрока и соперника.</w:t>
-      </w:r>
-    </w:p>
-    <w:p>
-      <w:pPr>
-        <w:pStyle w:val="a0"/>
-        <w:rPr>
-          <w:lang w:val="ru-RU"/>
-        </w:rPr>
-      </w:pPr>
-      <w:r>
-        <w:t>ELO</w:t>
-      </w:r>
-      <w:r>
-        <w:rPr>
-          <w:lang w:val="ru-RU"/>
-        </w:rPr>
-        <w:t xml:space="preserve"> до матча и ожидаемая вероятность победы по </w:t>
-      </w:r>
-      <w:r>
-        <w:t>ELO</w:t>
-      </w:r>
-      <w:r>
-        <w:rPr>
-          <w:lang w:val="ru-RU"/>
-        </w:rPr>
-        <w:t>.</w:t>
-      </w:r>
-    </w:p>
-    <w:p>
-      <w:pPr>
-        <w:ind w:left="360"/>
-        <w:rPr>
-          <w:lang w:val="ru-RU"/>
-        </w:rPr>
-      </w:pPr>
-      <w:r>
-        <w:t>ELO</w:t>
-      </w:r>
-      <w:r>
-        <w:rPr>
-          <w:lang w:val="ru-RU"/>
-        </w:rPr>
-        <w:t xml:space="preserve"> — это динамический рейтинг силы игрока, который пересчитывается после каждого матча.</w:t>
-      </w:r>
-    </w:p>
-    <w:p>
-      <w:pPr>
-        <w:ind w:left="360"/>
-        <w:rPr>
-          <w:lang w:val="ru-RU"/>
-        </w:rPr>
-      </w:pPr>
-      <w:r>
-        <w:rPr>
-          <w:lang w:val="ru-RU"/>
-        </w:rPr>
-        <w:t xml:space="preserve">Перед встречей по разнице </w:t>
-      </w:r>
-      <w:r>
-        <w:t>ELO</w:t>
-      </w:r>
-      <w:r>
-        <w:rPr>
-          <w:lang w:val="ru-RU"/>
-        </w:rPr>
-        <w:t xml:space="preserve"> оценивается ожидаемая вероятность победы:</w:t>
-      </w:r>
-    </w:p>
-    <w:p>
-      <w:pPr>
-        <w:ind w:left="360"/>
-        <w:jc w:val="center"/>
-        <w:rPr>
-          <w:kern w:val="2"/>
-          <w:szCs w:val="24"/>
-          <w:lang w:val="ru-RU" w:eastAsia="ru-RU"/>
-          <w14:ligatures w14:val="standardContextual"/>
-        </w:rPr>
-      </w:pPr>
-      <w:r>
-        <w:rPr>
-          <w:i/>
-          <w:iCs/>
-        </w:rPr>
-        <w:lastRenderedPageBreak/>
-        <w:t>P</w:t>
-      </w:r>
-      <w:r>
-        <w:rPr>
-          <w:i/>
-          <w:iCs/>
-          <w:lang w:val="ru-RU"/>
-        </w:rPr>
-        <w:t>(</w:t>
-      </w:r>
-      <w:r>
-        <w:rPr>
-          <w:i/>
-          <w:iCs/>
-        </w:rPr>
-        <w:t>A</w:t>
-      </w:r>
-      <w:r>
-        <w:rPr>
-          <w:i/>
-          <w:iCs/>
-          <w:lang w:val="ru-RU"/>
-        </w:rPr>
-        <w:t>) = 1 / (1 + 10</w:t>
-      </w:r>
-      <w:r>
-        <w:rPr>
-          <w:i/>
-          <w:iCs/>
-          <w:sz w:val="16"/>
-          <w:szCs w:val="16"/>
-          <w:vertAlign w:val="superscript"/>
-          <w:lang w:val="ru-RU"/>
-        </w:rPr>
-        <w:t>(</w:t>
-      </w:r>
-      <w:r>
-        <w:rPr>
-          <w:i/>
-          <w:iCs/>
-          <w:sz w:val="16"/>
-          <w:szCs w:val="16"/>
-          <w:vertAlign w:val="superscript"/>
-        </w:rPr>
-        <w:t>ELOB</w:t>
-      </w:r>
-      <w:r>
-        <w:rPr>
-          <w:i/>
-          <w:iCs/>
-          <w:sz w:val="16"/>
-          <w:szCs w:val="16"/>
-          <w:vertAlign w:val="superscript"/>
-          <w:lang w:val="ru-RU"/>
-        </w:rPr>
-        <w:t xml:space="preserve"> − </w:t>
-      </w:r>
-      <w:r>
-        <w:rPr>
-          <w:i/>
-          <w:iCs/>
-          <w:sz w:val="16"/>
-          <w:szCs w:val="16"/>
-          <w:vertAlign w:val="superscript"/>
-        </w:rPr>
-        <w:t>ELOA</w:t>
-      </w:r>
-      <w:r>
-        <w:rPr>
-          <w:i/>
-          <w:iCs/>
-          <w:sz w:val="16"/>
-          <w:szCs w:val="16"/>
-          <w:vertAlign w:val="superscript"/>
-          <w:lang w:val="ru-RU"/>
-        </w:rPr>
-        <w:t>)/400</w:t>
-      </w:r>
-      <w:r>
-        <w:rPr>
-          <w:i/>
-          <w:iCs/>
-          <w:lang w:val="ru-RU"/>
-        </w:rPr>
-        <w:t>)</w:t>
-      </w:r>
-    </w:p>
-    <w:p>
-      <w:pPr>
-        <w:ind w:left="360"/>
-        <w:rPr>
-          <w:lang w:val="ru-RU"/>
-        </w:rPr>
-      </w:pPr>
-      <w:r>
-        <w:rPr>
-          <w:lang w:val="ru-RU"/>
-        </w:rPr>
-        <w:t>После матча рейтинг обновляется по формуле</w:t>
-      </w:r>
-    </w:p>
-    <w:p>
-      <w:pPr>
-        <w:ind w:left="360"/>
-        <w:jc w:val="center"/>
-        <w:rPr>
-          <w:kern w:val="2"/>
-          <w:szCs w:val="24"/>
-          <w:lang w:eastAsia="ru-RU"/>
-          <w14:ligatures w14:val="standardContextual"/>
-        </w:rPr>
-      </w:pPr>
-      <w:proofErr w:type="spellStart"/>
-      <w:proofErr w:type="gramStart"/>
-      <w:r>
-        <w:rPr>
-          <w:i/>
-          <w:iCs/>
-        </w:rPr>
-        <w:t>ELO</w:t>
-      </w:r>
-      <w:r>
-        <w:rPr>
-          <w:i/>
-          <w:iCs/>
-          <w:sz w:val="16"/>
-          <w:szCs w:val="16"/>
-          <w:vertAlign w:val="subscript"/>
-        </w:rPr>
-        <w:t>A,new</w:t>
-      </w:r>
-      <w:proofErr w:type="spellEnd"/>
-      <w:proofErr w:type="gramEnd"/>
-      <w:r>
-        <w:rPr>
-          <w:i/>
-          <w:iCs/>
-        </w:rPr>
-        <w:t xml:space="preserve"> = ELO</w:t>
-      </w:r>
-      <w:r>
-        <w:rPr>
-          <w:i/>
-          <w:iCs/>
-          <w:sz w:val="16"/>
-          <w:szCs w:val="16"/>
-          <w:vertAlign w:val="subscript"/>
-        </w:rPr>
-        <w:t>A</w:t>
-      </w:r>
-      <w:r>
-        <w:rPr>
-          <w:i/>
-          <w:iCs/>
-        </w:rPr>
-        <w:t xml:space="preserve"> + K × (S</w:t>
-      </w:r>
-      <w:r>
-        <w:rPr>
-          <w:i/>
-          <w:iCs/>
-          <w:sz w:val="16"/>
-          <w:szCs w:val="16"/>
-          <w:vertAlign w:val="subscript"/>
-        </w:rPr>
-        <w:t>A</w:t>
-      </w:r>
-      <w:r>
-        <w:rPr>
-          <w:i/>
-          <w:iCs/>
-        </w:rPr>
-        <w:t xml:space="preserve"> − P(A)), </w:t>
-      </w:r>
-      <w:proofErr w:type="spellStart"/>
-      <w:r>
-        <w:rPr>
-          <w:i/>
-          <w:iCs/>
-        </w:rPr>
-        <w:t>где</w:t>
-      </w:r>
-      <w:proofErr w:type="spellEnd"/>
-    </w:p>
-    <w:p>
-      <w:pPr>
-        <w:ind w:left="360"/>
-        <w:rPr>
-          <w:lang w:val="ru-RU"/>
-        </w:rPr>
-      </w:pPr>
-      <w:r>
-        <w:rPr>
-          <w:i/>
-          <w:iCs/>
-        </w:rPr>
-        <w:t>S</w:t>
-      </w:r>
-      <w:r>
-        <w:rPr>
-          <w:i/>
-          <w:iCs/>
-          <w:sz w:val="16"/>
-          <w:szCs w:val="16"/>
-          <w:vertAlign w:val="subscript"/>
-        </w:rPr>
-        <w:t>A</w:t>
-      </w:r>
-      <w:r>
-        <w:rPr>
-          <w:lang w:val="ru-RU"/>
-        </w:rPr>
-        <w:t xml:space="preserve"> равно 1 при победе и 0 при поражении,</w:t>
-      </w:r>
-    </w:p>
-    <w:p>
-      <w:pPr>
-        <w:ind w:left="360"/>
-        <w:rPr>
-          <w:lang w:val="ru-RU"/>
-        </w:rPr>
-      </w:pPr>
-      <w:r>
-        <w:rPr>
-          <w:lang w:val="ru-RU"/>
-        </w:rPr>
-        <w:t xml:space="preserve">а </w:t>
-      </w:r>
-      <w:r>
-        <w:rPr>
-          <w:i/>
-          <w:iCs/>
-        </w:rPr>
-        <w:t>K</w:t>
-      </w:r>
-      <w:r>
-        <w:rPr>
-          <w:lang w:val="ru-RU"/>
-        </w:rPr>
-        <w:t xml:space="preserve"> задает силу изменения рейтинга.</w:t>
-      </w:r>
-    </w:p>
-    <w:p>
-      <w:pPr>
-        <w:ind w:left="360"/>
-        <w:rPr>
-          <w:lang w:val="ru-RU"/>
-        </w:rPr>
-      </w:pPr>
-      <w:r>
-        <w:rPr>
-          <w:lang w:val="ru-RU"/>
-        </w:rPr>
-        <w:t>Поэтому победа над более сильным соперником дает больший прирост, чем ожидаемая победа над более слабым.</w:t>
-      </w:r>
-    </w:p>
-    <w:p>
-      <w:pPr>
-        <w:ind w:left="360"/>
-        <w:rPr>
-          <w:lang w:val="ru-RU"/>
-        </w:rPr>
-      </w:pPr>
-      <w:r>
-        <w:rPr>
-          <w:lang w:val="ru-RU"/>
-        </w:rPr>
-        <w:t xml:space="preserve">В проекте </w:t>
-      </w:r>
-      <w:r>
-        <w:t>ELO</w:t>
-      </w:r>
-      <w:r>
-        <w:rPr>
-          <w:lang w:val="ru-RU"/>
-        </w:rPr>
-        <w:t xml:space="preserve"> считается последовательно по хронологии матчей, то есть для прогноза используются только результаты, сыгранные до даты прогнозируемой встречи.</w:t>
-      </w:r>
-    </w:p>
-    <w:p>
-      <w:pPr>
-        <w:pStyle w:val="a0"/>
-        <w:rPr>
-          <w:lang w:val="ru-RU"/>
-        </w:rPr>
-      </w:pPr>
-      <w:r>
-        <w:rPr>
-          <w:lang w:val="ru-RU"/>
-        </w:rPr>
-        <w:t xml:space="preserve">Опыт игрока: число прошлых матчей, общий </w:t>
-      </w:r>
-      <w:proofErr w:type="spellStart"/>
-      <w:r>
-        <w:t>winrate</w:t>
-      </w:r>
-      <w:proofErr w:type="spellEnd"/>
-      <w:r>
-        <w:rPr>
-          <w:lang w:val="ru-RU"/>
-        </w:rPr>
-        <w:t>, недавняя форма.</w:t>
-      </w:r>
-    </w:p>
-    <w:p>
-      <w:pPr>
-        <w:ind w:left="360"/>
-        <w:rPr>
-          <w:lang w:val="ru-RU"/>
-        </w:rPr>
-      </w:pPr>
-      <w:r>
-        <w:t>Недавняя форма в панели прогноза считается как доля побед игрока в последних 5 и 10 матчах до выбранной даты (Form 5 и Form 10); текущий и будущие матчи в расчет не попадают.</w:t>
-      </w:r>
-    </w:p>
-    <w:p>
-      <w:pPr>
-        <w:pStyle w:val="a0"/>
-        <w:rPr>
-          <w:lang w:val="ru-RU"/>
-        </w:rPr>
-      </w:pPr>
-      <w:r>
-        <w:rPr>
-          <w:lang w:val="ru-RU"/>
-        </w:rPr>
-        <w:t>Отдых: количество дней с предыдущего матча и разница отдыха с соперником.</w:t>
-      </w:r>
-    </w:p>
-    <w:p>
-      <w:pPr>
-        <w:pStyle w:val="a0"/>
-        <w:rPr>
-          <w:lang w:val="ru-RU"/>
-        </w:rPr>
-      </w:pPr>
-      <w:r>
-        <w:t>Head</w:t>
-      </w:r>
-      <w:r>
-        <w:rPr>
-          <w:lang w:val="ru-RU"/>
-        </w:rPr>
-        <w:t>-</w:t>
-      </w:r>
-      <w:r>
-        <w:t>to</w:t>
-      </w:r>
-      <w:r>
-        <w:rPr>
-          <w:lang w:val="ru-RU"/>
-        </w:rPr>
-        <w:t>-</w:t>
-      </w:r>
-      <w:r>
-        <w:t>head</w:t>
-      </w:r>
-      <w:r>
-        <w:rPr>
-          <w:lang w:val="ru-RU"/>
-        </w:rPr>
-        <w:t>: число и доля побед в личных встречах до матча.</w:t>
-      </w:r>
-    </w:p>
-    <w:p>
-      <w:pPr>
-        <w:pStyle w:val="a0"/>
-        <w:rPr>
-          <w:lang w:val="ru-RU"/>
-        </w:rPr>
-      </w:pPr>
-      <w:r>
-        <w:rPr>
-          <w:lang w:val="ru-RU"/>
-        </w:rPr>
-        <w:t xml:space="preserve">Сила календаря: средний </w:t>
-      </w:r>
-      <w:r>
-        <w:t>ELO</w:t>
-      </w:r>
-      <w:r>
-        <w:rPr>
-          <w:lang w:val="ru-RU"/>
-        </w:rPr>
-        <w:t xml:space="preserve"> предыдущих соперников.</w:t>
-      </w:r>
-    </w:p>
-    <w:p>
-      <w:pPr>
-        <w:pStyle w:val="a0"/>
-        <w:rPr>
-          <w:lang w:val="ru-RU"/>
-        </w:rPr>
-      </w:pPr>
-      <w:r>
-        <w:rPr>
-          <w:lang w:val="ru-RU"/>
-        </w:rPr>
-        <w:t>Признаки общих соперников: сравнительные результаты против игроков, с которыми встречались оба участника.</w:t>
-      </w:r>
-    </w:p>
-    <w:p>
-      <w:pPr>
-        <w:pStyle w:val="a0"/>
-        <w:rPr>
-          <w:lang w:val="ru-RU"/>
-        </w:rPr>
-      </w:pPr>
-      <w:r>
-        <w:rPr>
-          <w:lang w:val="ru-RU"/>
-        </w:rPr>
-        <w:t>Флаги пропусков рейтинговых данных, чтобы модель отличала отсутствие информации от нулевого значения.</w:t>
-      </w:r>
-    </w:p>
-    <w:p>
-      <w:pPr>
-        <w:rPr>
-          <w:lang w:val="ru-RU"/>
-        </w:rPr>
-      </w:pPr>
-      <w:r>
-        <w:rPr>
-          <w:lang w:val="ru-RU"/>
-        </w:rPr>
-        <w:t>Итоговый набор финальной модели содержит 43 признака.</w:t>
-      </w:r>
-    </w:p>
-    <w:p>
-      <w:pPr>
-        <w:pStyle w:val="1"/>
-        <w:spacing w:after="240"/>
-        <w:rPr>
-          <w:lang w:val="ru-RU"/>
-        </w:rPr>
-      </w:pPr>
-      <w:bookmarkStart w:id="4" w:name="_Toc229521684"/>
-      <w:r>
-        <w:rPr>
-          <w:lang w:val="ru-RU"/>
-        </w:rPr>
-        <w:t>5. Обучение, тестирование и сравнение моделей</w:t>
-      </w:r>
-      <w:bookmarkEnd w:id="4"/>
-    </w:p>
-    <w:p>
-      <w:pPr>
-        <w:rPr>
-          <w:lang w:val="ru-RU"/>
-        </w:rPr>
-      </w:pPr>
-      <w:r>
-        <w:t>Train</w:t>
-      </w:r>
-      <w:r>
-        <w:rPr>
-          <w:lang w:val="ru-RU"/>
-        </w:rPr>
-        <w:t>/</w:t>
-      </w:r>
-      <w:r>
-        <w:t>test</w:t>
-      </w:r>
-      <w:r>
-        <w:rPr>
-          <w:lang w:val="ru-RU"/>
-        </w:rPr>
-        <w:t xml:space="preserve"> разделение выполнено строго по времени. В текущем прогоне </w:t>
-      </w:r>
-      <w:r>
-        <w:t>test</w:t>
-      </w:r>
-      <w:r>
-        <w:rPr>
-          <w:lang w:val="ru-RU"/>
-        </w:rPr>
-        <w:t xml:space="preserve">-период — последние 3 месяца от максимальной даты матча в датасете. Дата </w:t>
-      </w:r>
-      <w:r>
-        <w:t>split</w:t>
-      </w:r>
-      <w:r>
-        <w:rPr>
-          <w:lang w:val="ru-RU"/>
-        </w:rPr>
-        <w:t>: 2026-02-11. Такой подход лучше отражает реальное использование модели, чем случайное перемешивание матчей.</w:t>
-      </w:r>
-    </w:p>
     <w:tbl>
       <w:tblPr>
         <w:tblStyle w:val="aff0"/>
@@ -3336,220 +2654,6 @@
         </w:tc>
       </w:tr>
     </w:tbl>
-    <w:p/>
-    <w:p>
-      <w:pPr>
-        <w:rPr>
-          <w:lang w:val="ru-RU"/>
-        </w:rPr>
-      </w:pPr>
-      <w:r>
-        <w:rPr>
-          <w:lang w:val="ru-RU"/>
-        </w:rPr>
-        <w:lastRenderedPageBreak/>
-        <w:t xml:space="preserve">Сравнивались простые </w:t>
-      </w:r>
-      <w:r>
-        <w:t>benchmark</w:t>
-      </w:r>
-      <w:r>
-        <w:rPr>
-          <w:lang w:val="ru-RU"/>
-        </w:rPr>
-        <w:t xml:space="preserve">-модели и основные модели на полном наборе признаков. </w:t>
-      </w:r>
-      <w:r>
-        <w:t>Benchmark</w:t>
-      </w:r>
-      <w:r>
-        <w:rPr>
-          <w:lang w:val="ru-RU"/>
-        </w:rPr>
-        <w:t xml:space="preserve"> нужен, чтобы доказать, что сложная модель дает добавленную ценность по сравнению с простым правилом «выше рейтинг — выше вероятность победы».</w:t>
-      </w:r>
-    </w:p>
-    <w:p>
-      <w:pPr>
-        <w:pStyle w:val="a0"/>
-      </w:pPr>
-      <w:r>
-        <w:t>Rating only, adjusted rating only, relative rating only и ELO only — простые однофакторные ориентиры.</w:t>
-      </w:r>
-    </w:p>
-    <w:p>
-      <w:pPr>
-        <w:pStyle w:val="a0"/>
-        <w:rPr>
-          <w:lang w:val="ru-RU"/>
-        </w:rPr>
-      </w:pPr>
-      <w:r>
-        <w:t>Baseline</w:t>
-      </w:r>
-      <w:r>
-        <w:rPr>
-          <w:lang w:val="ru-RU"/>
-        </w:rPr>
-        <w:t xml:space="preserve"> </w:t>
-      </w:r>
-      <w:r>
-        <w:t>rating</w:t>
-      </w:r>
-      <w:r>
-        <w:rPr>
-          <w:lang w:val="ru-RU"/>
-        </w:rPr>
-        <w:t xml:space="preserve"> + </w:t>
-      </w:r>
-      <w:r>
-        <w:t>ELO</w:t>
-      </w:r>
-      <w:r>
-        <w:rPr>
-          <w:lang w:val="ru-RU"/>
-        </w:rPr>
-        <w:t xml:space="preserve"> — логистическая регрессия на компактном наборе рейтинговых и </w:t>
-      </w:r>
-      <w:r>
-        <w:t>ELO</w:t>
-      </w:r>
-      <w:r>
-        <w:rPr>
-          <w:lang w:val="ru-RU"/>
-        </w:rPr>
-        <w:t>-признаков.</w:t>
-      </w:r>
-    </w:p>
-    <w:p>
-      <w:pPr>
-        <w:pStyle w:val="a0"/>
-        <w:rPr>
-          <w:lang w:val="ru-RU"/>
-        </w:rPr>
-      </w:pPr>
-      <w:r>
-        <w:t>Gradient</w:t>
-      </w:r>
-      <w:r>
-        <w:rPr>
-          <w:lang w:val="ru-RU"/>
-        </w:rPr>
-        <w:t xml:space="preserve"> </w:t>
-      </w:r>
-      <w:r>
-        <w:t>Boosting</w:t>
-      </w:r>
-      <w:r>
-        <w:rPr>
-          <w:lang w:val="ru-RU"/>
-        </w:rPr>
-        <w:t xml:space="preserve">, </w:t>
-      </w:r>
-      <w:proofErr w:type="spellStart"/>
-      <w:r>
-        <w:t>CatBoost</w:t>
-      </w:r>
-      <w:proofErr w:type="spellEnd"/>
-      <w:r>
-        <w:rPr>
-          <w:lang w:val="ru-RU"/>
-        </w:rPr>
-        <w:t xml:space="preserve"> и </w:t>
-      </w:r>
-      <w:r>
-        <w:t>Random</w:t>
-      </w:r>
-      <w:r>
-        <w:rPr>
-          <w:lang w:val="ru-RU"/>
-        </w:rPr>
-        <w:t xml:space="preserve"> </w:t>
-      </w:r>
-      <w:r>
-        <w:t>Forest</w:t>
-      </w:r>
-      <w:r>
-        <w:rPr>
-          <w:lang w:val="ru-RU"/>
-        </w:rPr>
-        <w:t xml:space="preserve"> — основные модели на полном наборе признаков.</w:t>
-      </w:r>
-    </w:p>
-    <w:p>
-      <w:pPr>
-        <w:pStyle w:val="1"/>
-        <w:rPr>
-          <w:lang w:val="ru-RU"/>
-        </w:rPr>
-      </w:pPr>
-      <w:bookmarkStart w:id="5" w:name="_Toc229521685"/>
-      <w:r>
-        <w:rPr>
-          <w:lang w:val="ru-RU"/>
-        </w:rPr>
-        <w:t>6. Качество построенных моделей машинного обучения</w:t>
-      </w:r>
-      <w:bookmarkEnd w:id="5"/>
-    </w:p>
-    <w:p>
-      <w:pPr>
-        <w:rPr>
-          <w:lang w:val="ru-RU"/>
-        </w:rPr>
-      </w:pPr>
-      <w:r>
-        <w:rPr>
-          <w:lang w:val="ru-RU"/>
-        </w:rPr>
-        <w:t xml:space="preserve">Основной уровень оценки — </w:t>
-      </w:r>
-      <w:r>
-        <w:t>match</w:t>
-      </w:r>
-      <w:r>
-        <w:rPr>
-          <w:lang w:val="ru-RU"/>
-        </w:rPr>
-        <w:t xml:space="preserve"> / </w:t>
-      </w:r>
-      <w:r>
-        <w:t>symmetrized</w:t>
-      </w:r>
-      <w:r>
-        <w:rPr>
-          <w:lang w:val="ru-RU"/>
-        </w:rPr>
-        <w:t xml:space="preserve">: две строки одного матча объединяются в одну вероятность победы </w:t>
-      </w:r>
-      <w:r>
-        <w:t>player</w:t>
-      </w:r>
-      <w:r>
-        <w:rPr>
-          <w:lang w:val="ru-RU"/>
-        </w:rPr>
-        <w:t xml:space="preserve">1. Это ближе к пользовательскому сценарию, чем оценка отдельных </w:t>
-      </w:r>
-      <w:r>
-        <w:t>long</w:t>
-      </w:r>
-      <w:r>
-        <w:rPr>
-          <w:lang w:val="ru-RU"/>
-        </w:rPr>
-        <w:t>-</w:t>
-      </w:r>
-      <w:r>
-        <w:t>format</w:t>
-      </w:r>
-      <w:r>
-        <w:rPr>
-          <w:lang w:val="ru-RU"/>
-        </w:rPr>
-        <w:t xml:space="preserve"> строк.</w:t>
-      </w:r>
-    </w:p>
     <w:tbl>
       <w:tblPr>
         <w:tblStyle w:val="aff0"/>
@@ -4143,232 +3247,6 @@
         </w:tc>
       </w:tr>
     </w:tbl>
-    <w:p/>
-    <w:p>
-      <w:pPr>
-        <w:rPr>
-          <w:lang w:val="ru-RU"/>
-        </w:rPr>
-      </w:pPr>
-      <w:r>
-        <w:rPr>
-          <w:lang w:val="ru-RU"/>
-        </w:rPr>
-        <w:t xml:space="preserve">Лучшей основной моделью по </w:t>
-      </w:r>
-      <w:proofErr w:type="spellStart"/>
-      <w:r>
-        <w:t>LogLoss</w:t>
-      </w:r>
-      <w:proofErr w:type="spellEnd"/>
-      <w:r>
-        <w:rPr>
-          <w:lang w:val="ru-RU"/>
-        </w:rPr>
-        <w:t xml:space="preserve"> стала </w:t>
-      </w:r>
-      <w:proofErr w:type="spellStart"/>
-      <w:r>
-        <w:t>GradientBoostingClassifier</w:t>
-      </w:r>
-      <w:proofErr w:type="spellEnd"/>
-      <w:r>
-        <w:rPr>
-          <w:lang w:val="ru-RU"/>
-        </w:rPr>
-        <w:t xml:space="preserve">. На </w:t>
-      </w:r>
-      <w:r>
-        <w:t>test</w:t>
-      </w:r>
-      <w:r>
-        <w:rPr>
-          <w:lang w:val="ru-RU"/>
-        </w:rPr>
-        <w:t xml:space="preserve">-периоде она показала </w:t>
-      </w:r>
-      <w:proofErr w:type="spellStart"/>
-      <w:r>
-        <w:t>LogLoss</w:t>
-      </w:r>
-      <w:proofErr w:type="spellEnd"/>
-      <w:r>
-        <w:rPr>
-          <w:lang w:val="ru-RU"/>
-        </w:rPr>
-        <w:t xml:space="preserve"> = 0.4557, </w:t>
-      </w:r>
-      <w:r>
-        <w:t>Brier</w:t>
-      </w:r>
-      <w:r>
-        <w:rPr>
-          <w:lang w:val="ru-RU"/>
-        </w:rPr>
-        <w:t xml:space="preserve"> = 0.1498, </w:t>
-      </w:r>
-      <w:r>
-        <w:t>ROC</w:t>
-      </w:r>
-      <w:r>
-        <w:rPr>
-          <w:lang w:val="ru-RU"/>
-        </w:rPr>
-        <w:t>-</w:t>
-      </w:r>
-      <w:r>
-        <w:t>AUC</w:t>
-      </w:r>
-      <w:r>
-        <w:rPr>
-          <w:lang w:val="ru-RU"/>
-        </w:rPr>
-        <w:t xml:space="preserve"> = 0.8658 и </w:t>
-      </w:r>
-      <w:r>
-        <w:t>Accuracy</w:t>
-      </w:r>
-      <w:r>
-        <w:rPr>
-          <w:lang w:val="ru-RU"/>
-        </w:rPr>
-        <w:t xml:space="preserve"> = 78.1%. По сравнению с </w:t>
-      </w:r>
-      <w:r>
-        <w:t>baseline</w:t>
-      </w:r>
-      <w:r>
-        <w:rPr>
-          <w:lang w:val="ru-RU"/>
-        </w:rPr>
-        <w:t xml:space="preserve"> </w:t>
-      </w:r>
-      <w:r>
-        <w:t>rating</w:t>
-      </w:r>
-      <w:r>
-        <w:rPr>
-          <w:lang w:val="ru-RU"/>
-        </w:rPr>
-        <w:t xml:space="preserve"> + </w:t>
-      </w:r>
-      <w:r>
-        <w:t>ELO</w:t>
-      </w:r>
-      <w:r>
-        <w:rPr>
-          <w:lang w:val="ru-RU"/>
-        </w:rPr>
-        <w:t xml:space="preserve"> это дает снижение </w:t>
-      </w:r>
-      <w:proofErr w:type="spellStart"/>
-      <w:r>
-        <w:t>LogLoss</w:t>
-      </w:r>
-      <w:proofErr w:type="spellEnd"/>
-      <w:r>
-        <w:rPr>
-          <w:lang w:val="ru-RU"/>
-        </w:rPr>
-        <w:t xml:space="preserve"> примерно на 7.8% и прирост </w:t>
-      </w:r>
-      <w:r>
-        <w:t>ROC</w:t>
-      </w:r>
-      <w:r>
-        <w:rPr>
-          <w:lang w:val="ru-RU"/>
-        </w:rPr>
-        <w:t>-</w:t>
-      </w:r>
-      <w:r>
-        <w:t>AUC</w:t>
-      </w:r>
-      <w:r>
-        <w:rPr>
-          <w:lang w:val="ru-RU"/>
-        </w:rPr>
-        <w:t xml:space="preserve"> на 0.0255.</w:t>
-      </w:r>
-    </w:p>
-    <w:p>
-      <w:pPr>
-        <w:rPr>
-          <w:lang w:val="ru-RU"/>
-        </w:rPr>
-      </w:pPr>
-      <w:r>
-        <w:rPr>
-          <w:lang w:val="ru-RU"/>
-        </w:rPr>
-        <w:t xml:space="preserve">Важно, что </w:t>
-      </w:r>
-      <w:proofErr w:type="spellStart"/>
-      <w:r>
-        <w:t>CatBoost</w:t>
-      </w:r>
-      <w:proofErr w:type="spellEnd"/>
-      <w:r>
-        <w:rPr>
-          <w:lang w:val="ru-RU"/>
-        </w:rPr>
-        <w:t xml:space="preserve"> оказался очень близок к </w:t>
-      </w:r>
-      <w:r>
-        <w:t>GBM</w:t>
-      </w:r>
-      <w:r>
-        <w:rPr>
-          <w:lang w:val="ru-RU"/>
-        </w:rPr>
-        <w:t xml:space="preserve">, а по </w:t>
-      </w:r>
-      <w:r>
-        <w:t>Accuracy</w:t>
-      </w:r>
-      <w:r>
-        <w:rPr>
-          <w:lang w:val="ru-RU"/>
-        </w:rPr>
-        <w:t xml:space="preserve"> в данном прогоне даже немного выше. Тем не менее итоговый выбор сделан в пользу </w:t>
-      </w:r>
-      <w:r>
-        <w:t>GBM</w:t>
-      </w:r>
-      <w:r>
-        <w:rPr>
-          <w:lang w:val="ru-RU"/>
-        </w:rPr>
-        <w:t xml:space="preserve">, потому что при </w:t>
-      </w:r>
-      <w:r>
-        <w:rPr>
-          <w:lang w:val="ru-RU"/>
-        </w:rPr>
-        <w:lastRenderedPageBreak/>
-        <w:t xml:space="preserve">вероятностном прогнозировании приоритет имеют </w:t>
-      </w:r>
-      <w:proofErr w:type="spellStart"/>
-      <w:r>
-        <w:t>LogLoss</w:t>
-      </w:r>
-      <w:proofErr w:type="spellEnd"/>
-      <w:r>
-        <w:rPr>
-          <w:lang w:val="ru-RU"/>
-        </w:rPr>
-        <w:t xml:space="preserve"> и </w:t>
-      </w:r>
-      <w:r>
-        <w:t>Brier</w:t>
-      </w:r>
-      <w:r>
-        <w:rPr>
-          <w:lang w:val="ru-RU"/>
-        </w:rPr>
-        <w:t>: они оценивают качество вероятностей, а не только правильность класса при пороге 0.5.</w:t>
-      </w:r>
-    </w:p>
     <w:tbl>
       <w:tblPr>
         <w:tblStyle w:val="aff0"/>
@@ -4632,148 +3510,6 @@
         </w:tc>
       </w:tr>
     </w:tbl>
-    <w:p/>
-    <w:p>
-      <w:pPr>
-        <w:rPr>
-          <w:lang w:val="ru-RU"/>
-        </w:rPr>
-      </w:pPr>
-      <w:r>
-        <w:rPr>
-          <w:lang w:val="ru-RU"/>
-        </w:rPr>
-        <w:t xml:space="preserve">Контроль переобучения показывает, что </w:t>
-      </w:r>
-      <w:r>
-        <w:t>Random</w:t>
-      </w:r>
-      <w:r>
-        <w:rPr>
-          <w:lang w:val="ru-RU"/>
-        </w:rPr>
-        <w:t xml:space="preserve"> </w:t>
-      </w:r>
-      <w:r>
-        <w:t>Forest</w:t>
-      </w:r>
-      <w:r>
-        <w:rPr>
-          <w:lang w:val="ru-RU"/>
-        </w:rPr>
-        <w:t xml:space="preserve"> имеет самый большой разрыв </w:t>
-      </w:r>
-      <w:r>
-        <w:t>train</w:t>
-      </w:r>
-      <w:r>
-        <w:rPr>
-          <w:lang w:val="ru-RU"/>
-        </w:rPr>
-        <w:t>/</w:t>
-      </w:r>
-      <w:r>
-        <w:t>test</w:t>
-      </w:r>
-      <w:r>
-        <w:rPr>
-          <w:lang w:val="ru-RU"/>
-        </w:rPr>
-        <w:t xml:space="preserve"> </w:t>
-      </w:r>
-      <w:proofErr w:type="spellStart"/>
-      <w:r>
-        <w:t>LogLoss</w:t>
-      </w:r>
-      <w:proofErr w:type="spellEnd"/>
-      <w:r>
-        <w:rPr>
-          <w:lang w:val="ru-RU"/>
-        </w:rPr>
-        <w:t xml:space="preserve">, то есть сильнее подстраивается под обучающую выборку. </w:t>
-      </w:r>
-      <w:r>
-        <w:t>GBM</w:t>
-      </w:r>
-      <w:r>
-        <w:rPr>
-          <w:lang w:val="ru-RU"/>
-        </w:rPr>
-        <w:t xml:space="preserve"> имеет меньший разрыв, чем </w:t>
-      </w:r>
-      <w:r>
-        <w:t>Random</w:t>
-      </w:r>
-      <w:r>
-        <w:rPr>
-          <w:lang w:val="ru-RU"/>
-        </w:rPr>
-        <w:t xml:space="preserve"> </w:t>
-      </w:r>
-      <w:r>
-        <w:t>Forest</w:t>
-      </w:r>
-      <w:r>
-        <w:rPr>
-          <w:lang w:val="ru-RU"/>
-        </w:rPr>
-        <w:t xml:space="preserve">, и при этом лучшую </w:t>
-      </w:r>
-      <w:r>
-        <w:t>test</w:t>
-      </w:r>
-      <w:r>
-        <w:rPr>
-          <w:lang w:val="ru-RU"/>
-        </w:rPr>
-        <w:t>-метрику среди основных моделей. Это делает ее более устойчивым выбором для пользовательского предиктора.</w:t>
-      </w:r>
-    </w:p>
-    <w:p>
-      <w:pPr>
-        <w:pStyle w:val="1"/>
-        <w:rPr>
-          <w:lang w:val="ru-RU"/>
-        </w:rPr>
-      </w:pPr>
-      <w:bookmarkStart w:id="6" w:name="_Toc229521686"/>
-      <w:r>
-        <w:rPr>
-          <w:lang w:val="ru-RU"/>
-        </w:rPr>
-        <w:t>7. Интерпретация факторов прогноза</w:t>
-      </w:r>
-      <w:bookmarkEnd w:id="6"/>
-    </w:p>
-    <w:p>
-      <w:r>
-        <w:rPr>
-          <w:lang w:val="ru-RU"/>
-        </w:rPr>
-        <w:t xml:space="preserve">Для объяснения результата используются глобальные важности признаков и локальная таблица </w:t>
-      </w:r>
-      <w:r>
-        <w:t>factor</w:t>
-      </w:r>
-      <w:r>
-        <w:rPr>
-          <w:lang w:val="ru-RU"/>
-        </w:rPr>
-        <w:t>_</w:t>
-      </w:r>
-      <w:r>
-        <w:t>contributions</w:t>
-      </w:r>
-      <w:r>
-        <w:rPr>
-          <w:lang w:val="ru-RU"/>
-        </w:rPr>
-        <w:t xml:space="preserve"> в контрольной панели. </w:t>
-      </w:r>
-      <w:r>
-        <w:t>Ниже приведены наиболее сильные признаки по последнему прогону.</w:t>
-      </w:r>
-    </w:p>
     <w:tbl>
       <w:tblPr>
         <w:tblStyle w:val="aff0"/>
@@ -5413,464 +4149,767 @@
         </w:tc>
       </w:tr>
     </w:tbl>
-    <w:p/>
     <w:p>
       <w:pPr>
-        <w:rPr>
-          <w:lang w:val="ru-RU"/>
-        </w:rPr>
+        <w:pStyle w:val="1"/>
       </w:pPr>
       <w:r>
-        <w:rPr>
-          <w:lang w:val="ru-RU"/>
-        </w:rPr>
-        <w:t xml:space="preserve">Интерпретация важностей согласуется с предметной областью: основной сигнал дают скорректированный рейтинг, </w:t>
-      </w:r>
-      <w:r>
-        <w:t>ELO</w:t>
-      </w:r>
-      <w:r>
-        <w:rPr>
-          <w:lang w:val="ru-RU"/>
-        </w:rPr>
-        <w:t xml:space="preserve">, официальное место в рейтинге, сила предыдущих соперников и опыт. Признаки общих соперников важны в отдельных матчах, но доступны не всегда, поэтому они дополняют, а не заменяют рейтинговые и </w:t>
-      </w:r>
-      <w:r>
-        <w:t>ELO</w:t>
-      </w:r>
-      <w:r>
-        <w:rPr>
-          <w:lang w:val="ru-RU"/>
-        </w:rPr>
-        <w:t>-факторы.</w:t>
+        <w:t>4. Признаки и предотвращение утечки будущей информации</w:t>
       </w:r>
     </w:p>
     <w:p>
-      <w:pPr>
-        <w:pStyle w:val="1"/>
-        <w:rPr>
-          <w:lang w:val="ru-RU"/>
-        </w:rPr>
-      </w:pPr>
-      <w:bookmarkStart w:id="7" w:name="_Toc229521687"/>
+      <w:pPr/>
       <w:r>
-        <w:rPr>
-          <w:lang w:val="ru-RU"/>
-        </w:rPr>
-        <w:t>8. Практическое применение</w:t>
+        <w:t>Ключевой принцип построения признаков — модель должна видеть только ту информацию, которая была доступна до начала прогнозируемого матча. Это важно для честной оценки качества: если в обучающую выборку случайно попадут сведения из будущего, модель будет выглядеть точнее на тесте, но хуже работать в реальном применении.</w:t>
       </w:r>
-      <w:bookmarkEnd w:id="7"/>
     </w:p>
     <w:p>
-      <w:pPr>
-        <w:rPr>
-          <w:lang w:val="ru-RU"/>
-        </w:rPr>
-      </w:pPr>
+      <w:pPr/>
       <w:r>
-        <w:rPr>
-          <w:lang w:val="ru-RU"/>
-        </w:rPr>
-        <w:t>Разработанная модель может применяться как аналитический инструмент в юниорском и любительском теннисе, где официального рейтинга часто недостаточно для полной оценки текущей силы игрока. Практическая ценность решения состоит не в автоматическом принятии решения, а в предоставлении дополнительной вероятностной оценки и объяснимых факторов, которые помогают тренеру, спортсмену или аналитику интерпретировать предстоящий матч.</w:t>
+        <w:t>В итоговом наборе используется 43 признака. Их можно разделить на несколько смысловых групп:</w:t>
       </w:r>
     </w:p>
     <w:p>
       <w:pPr>
         <w:pStyle w:val="a0"/>
-        <w:rPr>
-          <w:lang w:val="ru-RU"/>
-        </w:rPr>
       </w:pPr>
       <w:r>
-        <w:rPr>
-          <w:lang w:val="ru-RU"/>
-        </w:rPr>
-        <w:lastRenderedPageBreak/>
-        <w:t xml:space="preserve">Тренерская подготовка к матчу: модель помогает оценить относительную силу соперника, сравнить игроков по </w:t>
-      </w:r>
-      <w:r>
-        <w:t>ELO</w:t>
-      </w:r>
-      <w:r>
-        <w:rPr>
-          <w:lang w:val="ru-RU"/>
-        </w:rPr>
-        <w:t>, рейтингу, форме, опыту, отдыху и результатам против общих соперников.</w:t>
+        <w:t>официальный рейтинг РТТ: место игрока, рейтинговые очки, дата классификации и возрастная категория рейтинга;</w:t>
       </w:r>
     </w:p>
     <w:p>
       <w:pPr>
         <w:pStyle w:val="a0"/>
-        <w:rPr>
-          <w:lang w:val="ru-RU"/>
-        </w:rPr>
       </w:pPr>
       <w:r>
-        <w:rPr>
-          <w:lang w:val="ru-RU"/>
-        </w:rPr>
-        <w:t>Планирование турниров и календаря: прогнозы могут использоваться для предварительной оценки сложности сетки, ожидаемого уровня соперников и целесообразности участия в конкретных соревнованиях.</w:t>
+        <w:t>скорректированные рейтинговые показатели: средние очки на один зачётный турнир, что помогает не занижать силу игрока только из-за малого числа сыгранных турниров;</w:t>
       </w:r>
     </w:p>
     <w:p>
       <w:pPr>
         <w:pStyle w:val="a0"/>
-        <w:rPr>
-          <w:lang w:val="ru-RU"/>
-        </w:rPr>
       </w:pPr>
       <w:r>
-        <w:rPr>
-          <w:lang w:val="ru-RU"/>
-        </w:rPr>
-        <w:t xml:space="preserve">Мониторинг развития игрока: динамика </w:t>
-      </w:r>
-      <w:r>
-        <w:t>ELO</w:t>
-      </w:r>
-      <w:r>
-        <w:rPr>
-          <w:lang w:val="ru-RU"/>
-        </w:rPr>
-        <w:t>, рейтинговых очков, места в рейтинге и формы позволяет отслеживать прогресс не только через официальный рейтинг, но и через качество фактических матчевых результатов.</w:t>
+        <w:t>относительные признаки пары: разницы и процентные разницы рейтинга, очков, скорректированных очков и ELO между игроком и соперником;</w:t>
       </w:r>
     </w:p>
     <w:p>
       <w:pPr>
         <w:pStyle w:val="a0"/>
-        <w:rPr>
-          <w:lang w:val="ru-RU"/>
-        </w:rPr>
       </w:pPr>
       <w:r>
-        <w:rPr>
-          <w:lang w:val="ru-RU"/>
-        </w:rPr>
-        <w:t>Выявление расхождений между официальным рейтингом и фактической игровой силой: модель подсвечивает случаи, когда игрок может быть недооценен или переоценен рейтингом из-за малого числа турниров, недавних результатов или силы предыдущих соперников.</w:t>
+        <w:t>игровая история: количество предыдущих матчей, общий winrate до матча, личные встречи, отдых после последнего матча и результаты против общих соперников;</w:t>
       </w:r>
     </w:p>
     <w:p>
       <w:pPr>
-        <w:rPr>
-          <w:lang w:val="ru-RU"/>
-        </w:rPr>
+        <w:pStyle w:val="a0"/>
       </w:pPr>
       <w:r>
-        <w:rPr>
-          <w:lang w:val="ru-RU"/>
-        </w:rPr>
-        <w:t>В рамках дипломного проекта модель следует рассматривать как прототип системы поддержки аналитических решений. Итоговый прогноз не заменяет экспертную оценку тренера и не предназначен для ставок; он показывает, как методы машинного обучения могут расширить традиционный анализ спортивных результатов.</w:t>
+        <w:t>сила предыдущих соперников: средний ELO соперников в недавних матчах, который показывает, насколько сложным был календарь игрока;</w:t>
+      </w:r>
+    </w:p>
+    <w:p>
+      <w:pPr>
+        <w:pStyle w:val="a0"/>
+      </w:pPr>
+      <w:r>
+        <w:t>служебные флаги пропусков: они позволяют модели отличать реальное нулевое значение от ситуации, когда информации о рейтинге или истории игрока недостаточно.</w:t>
+      </w:r>
+    </w:p>
+    <w:p>
+      <w:pPr/>
+      <w:r>
+        <w:t>ELO — это динамический рейтинг силы игрока, который пересчитывается после каждого матча. Перед встречей по разнице ELO оценивается ожидаемая вероятность победы: P(A) = 1 / (1 + 10^((ELO_B - ELO_A) / 400)). После матча рейтинг обновляется по формуле ELO_A,new = ELO_A + K × (S_A - P(A)), где S_A равно 1 при победе и 0 при поражении. Поэтому победа над более сильным соперником дает больший прирост, чем ожидаемая победа над более слабым. В проекте ELO считается строго по хронологии матчей.</w:t>
+      </w:r>
+    </w:p>
+    <w:p>
+      <w:pPr/>
+      <w:r>
+        <w:t>Недавняя форма в панели прогноза считается как доля побед игрока в последних 5 и 10 матчах до выбранной даты (Form 5 и Form 10). Текущий и будущие матчи в этот расчет не попадают.</w:t>
+      </w:r>
+    </w:p>
+    <w:p>
+      <w:pPr/>
+      <w:r>
+        <w:t>Для каждого матча признаки рассчитываются до обновления истории текущим результатом. Такой порядок защищает от data leakage и делает тестирование похожим на реальный сценарий: сначала прогноз, потом появление результата.</w:t>
       </w:r>
     </w:p>
     <w:p>
       <w:pPr>
         <w:pStyle w:val="1"/>
       </w:pPr>
-      <w:bookmarkStart w:id="8" w:name="_Toc229521688"/>
       <w:r>
-        <w:t>9. Ограничения проекта</w:t>
+        <w:t>5. Обучение, тестирование и сравнение моделей</w:t>
       </w:r>
-      <w:bookmarkEnd w:id="8"/>
     </w:p>
     <w:p>
-      <w:pPr>
-        <w:pStyle w:val="a0"/>
-        <w:rPr>
-          <w:lang w:val="ru-RU"/>
-        </w:rPr>
-      </w:pPr>
+      <w:pPr/>
       <w:r>
-        <w:rPr>
-          <w:lang w:val="ru-RU"/>
-        </w:rPr>
-        <w:t>Качество зависит от публичных данных РТТ и устойчивости верстки сайта; при изменении сайта парсеры требуют адаптации.</w:t>
+        <w:t>Модель обучалась как задача бинарной классификации: для каждой пары «игрок — соперник» нужно оценить вероятность победы рассматриваемого игрока. Один матч представлен в двух перспективах, а для пользовательского прогноза вероятность симметризуется на уровне матча, чтобы получить единую оценку победы одного игрока над другим.</w:t>
+      </w:r>
+    </w:p>
+    <w:p>
+      <w:pPr/>
+      <w:r>
+        <w:t>Разделение на train и test выполнено по времени, а не случайным образом. В актуальном обучении тестовая часть содержит последние три месяца матчей: при периоде данных с 02.03.2025 по 11.05.2026 граница разделения приходится на 11.02.2026. В train вошло 6326 матчей, в test — 1233 матча. Такой подход ближе к реальному применению, потому что модель всегда прогнозирует будущие матчи по прошлой истории.</w:t>
+      </w:r>
+    </w:p>
+    <w:p>
+      <w:pPr/>
+      <w:r>
+        <w:t>Для сравнения использовались несколько уровней решений:</w:t>
       </w:r>
     </w:p>
     <w:p>
       <w:pPr>
         <w:pStyle w:val="a0"/>
-        <w:rPr>
-          <w:lang w:val="ru-RU"/>
-        </w:rPr>
       </w:pPr>
       <w:r>
-        <w:rPr>
-          <w:lang w:val="ru-RU"/>
-        </w:rPr>
-        <w:t>Модель не учитывает травмы, покрытие, усталость, перелеты, мотивацию, погодные условия и другие внешние факторы.</w:t>
+        <w:t>простые однофакторные ориентиры: официальный рейтинг, скорректированный рейтинг, относительный рейтинг и ELO;</w:t>
       </w:r>
     </w:p>
     <w:p>
       <w:pPr>
         <w:pStyle w:val="a0"/>
-        <w:rPr>
-          <w:lang w:val="ru-RU"/>
-        </w:rPr>
       </w:pPr>
       <w:r>
-        <w:rPr>
-          <w:lang w:val="ru-RU"/>
-        </w:rPr>
-        <w:t xml:space="preserve">У части игроков мало исторических матчей, поэтому </w:t>
-      </w:r>
-      <w:r>
-        <w:t>ELO</w:t>
-      </w:r>
-      <w:r>
-        <w:rPr>
-          <w:lang w:val="ru-RU"/>
-        </w:rPr>
-        <w:t xml:space="preserve">, форма, </w:t>
-      </w:r>
-      <w:r>
-        <w:t>H</w:t>
-      </w:r>
-      <w:r>
-        <w:rPr>
-          <w:lang w:val="ru-RU"/>
-        </w:rPr>
-        <w:t>2</w:t>
-      </w:r>
-      <w:r>
-        <w:t>H</w:t>
-      </w:r>
-      <w:r>
-        <w:rPr>
-          <w:lang w:val="ru-RU"/>
-        </w:rPr>
-        <w:t xml:space="preserve"> и общие соперники могут быть нестабильны.</w:t>
+        <w:t>компактный baseline rating + ELO, который проверяет качество простого рейтингового подхода;</w:t>
       </w:r>
     </w:p>
     <w:p>
       <w:pPr>
         <w:pStyle w:val="a0"/>
-        <w:rPr>
-          <w:lang w:val="ru-RU"/>
-        </w:rPr>
       </w:pPr>
       <w:r>
-        <w:rPr>
-          <w:lang w:val="ru-RU"/>
-        </w:rPr>
-        <w:t xml:space="preserve">ФИО игроков могут быть неоднозначны; для снижения риска используется РНИ и </w:t>
-      </w:r>
-      <w:r>
-        <w:t>audit</w:t>
-      </w:r>
-      <w:r>
-        <w:rPr>
-          <w:lang w:val="ru-RU"/>
-        </w:rPr>
-        <w:t>-таблицы сопоставления.</w:t>
+        <w:t>основные модели на полном наборе признаков: Gradient Boosting, CatBoost и Random Forest.</w:t>
       </w:r>
     </w:p>
     <w:p>
-      <w:pPr>
-        <w:pStyle w:val="a0"/>
-        <w:rPr>
-          <w:lang w:val="ru-RU"/>
-        </w:rPr>
-      </w:pPr>
+      <w:pPr/>
       <w:r>
-        <w:rPr>
-          <w:lang w:val="ru-RU"/>
-        </w:rPr>
-        <w:t xml:space="preserve">Метрики относятся к историческому </w:t>
-      </w:r>
-      <w:r>
-        <w:t>test</w:t>
-      </w:r>
-      <w:r>
-        <w:rPr>
-          <w:lang w:val="ru-RU"/>
-        </w:rPr>
-        <w:t>-периоду и не гарантируют такое же качество на будущих данных.</w:t>
-      </w:r>
-    </w:p>
-    <w:p>
-      <w:pPr>
-        <w:pStyle w:val="a0"/>
-        <w:rPr>
-          <w:lang w:val="ru-RU"/>
-        </w:rPr>
-      </w:pPr>
-      <w:r>
-        <w:rPr>
-          <w:lang w:val="ru-RU"/>
-        </w:rPr>
-        <w:t xml:space="preserve">Для промышленного применения нужна </w:t>
-      </w:r>
-      <w:r>
-        <w:t>rolling</w:t>
-      </w:r>
-      <w:r>
-        <w:rPr>
-          <w:lang w:val="ru-RU"/>
-        </w:rPr>
-        <w:t>-</w:t>
-      </w:r>
-      <w:r>
-        <w:t>validation</w:t>
-      </w:r>
-      <w:r>
-        <w:rPr>
-          <w:lang w:val="ru-RU"/>
-        </w:rPr>
-        <w:t xml:space="preserve"> на нескольких временных окнах и регулярный мониторинг качества.</w:t>
-      </w:r>
-    </w:p>
-    <w:p>
-      <w:pPr>
-        <w:pStyle w:val="a0"/>
-        <w:rPr>
-          <w:lang w:val="ru-RU"/>
-        </w:rPr>
-      </w:pPr>
-      <w:r>
-        <w:rPr>
-          <w:lang w:val="ru-RU"/>
-        </w:rPr>
-        <w:t>Проект учебный и не предназначен для ставок или коммерческого прогнозирования.</w:t>
-      </w:r>
-    </w:p>
-    <w:p>
-      <w:pPr>
-        <w:pStyle w:val="1"/>
-        <w:rPr>
-          <w:lang w:val="ru-RU"/>
-        </w:rPr>
-      </w:pPr>
-      <w:bookmarkStart w:id="9" w:name="_Toc229521689"/>
-      <w:r>
-        <w:rPr>
-          <w:lang w:val="ru-RU"/>
-        </w:rPr>
-        <w:t>10. Заключение</w:t>
-      </w:r>
-      <w:bookmarkEnd w:id="9"/>
-    </w:p>
-    <w:p>
-      <w:pPr>
-        <w:rPr>
-          <w:lang w:val="ru-RU"/>
-        </w:rPr>
-      </w:pPr>
-      <w:r>
-        <w:rPr>
-          <w:lang w:val="ru-RU"/>
-        </w:rPr>
-        <w:t xml:space="preserve">В проекте реализован полный цикл </w:t>
-      </w:r>
-      <w:r>
-        <w:t>ML</w:t>
-      </w:r>
-      <w:r>
-        <w:rPr>
-          <w:lang w:val="ru-RU"/>
-        </w:rPr>
-        <w:t>-решения: сбор и обновление данных, парсинг матчей и рейтингов, сборка датасета, расчет исторических признаков без утечки будущей информации, обучение нескольких моделей, оценка качества и интерактивный пользовательский прогноз.</w:t>
-      </w:r>
-    </w:p>
-    <w:p>
-      <w:pPr>
-        <w:rPr>
-          <w:lang w:val="ru-RU"/>
-        </w:rPr>
-      </w:pPr>
-      <w:r>
-        <w:rPr>
-          <w:lang w:val="ru-RU"/>
-        </w:rPr>
-        <w:lastRenderedPageBreak/>
-        <w:t xml:space="preserve">Полученные результаты подтверждают исходную гипотезу: для прогноза теннисных матчей РТТ полезно использовать не только официальный рейтинг, но и динамическую силу игрока, качество предыдущих соперников, опыт, форму, отдых и результаты против общих соперников. Итоговая </w:t>
-      </w:r>
-      <w:r>
-        <w:t>GBM</w:t>
-      </w:r>
-      <w:r>
-        <w:rPr>
-          <w:lang w:val="ru-RU"/>
-        </w:rPr>
-        <w:t xml:space="preserve">-модель уверенно превосходит простые </w:t>
-      </w:r>
-      <w:r>
-        <w:t>benchmark</w:t>
-      </w:r>
-      <w:r>
-        <w:rPr>
-          <w:lang w:val="ru-RU"/>
-        </w:rPr>
-        <w:t xml:space="preserve">-модели по </w:t>
-      </w:r>
-      <w:proofErr w:type="spellStart"/>
-      <w:r>
-        <w:t>LogLoss</w:t>
-      </w:r>
-      <w:proofErr w:type="spellEnd"/>
-      <w:r>
-        <w:rPr>
-          <w:lang w:val="ru-RU"/>
-        </w:rPr>
-        <w:t xml:space="preserve"> и </w:t>
-      </w:r>
-      <w:r>
-        <w:t>ROC</w:t>
-      </w:r>
-      <w:r>
-        <w:rPr>
-          <w:lang w:val="ru-RU"/>
-        </w:rPr>
-        <w:t>-</w:t>
-      </w:r>
-      <w:r>
-        <w:t>AUC</w:t>
-      </w:r>
-      <w:r>
-        <w:rPr>
-          <w:lang w:val="ru-RU"/>
-        </w:rPr>
-        <w:t>, что показывает добавленную ценность построенного набора признаков.</w:t>
-      </w:r>
-    </w:p>
-    <w:p>
-      <w:pPr>
-        <w:rPr>
-          <w:lang w:val="ru-RU"/>
-        </w:rPr>
-      </w:pPr>
-      <w:r>
-        <w:rPr>
-          <w:lang w:val="ru-RU"/>
-        </w:rPr>
-        <w:t>Главная практическая ценность проекта — не только один числовой прогноз, но и прозрачная аналитическая панель, которая показывает, на каких факторах основана вероятность победы и где находятся ограничения данных.</w:t>
+        <w:t>После оценки качества дополнительно обучается production-версия модели на всех доступных данных. Она используется для пользовательского прогноза конкретного матча, чтобы учитывать максимально свежую историю игроков.</w:t>
       </w:r>
     </w:p>
     <w:p>
       <w:pPr>
         <w:pStyle w:val="1"/>
       </w:pPr>
-      <w:bookmarkStart w:id="10" w:name="_Toc229521690"/>
       <w:r>
-        <w:t xml:space="preserve">11. </w:t>
+        <w:t>6. Качество построенных моделей машинного обучения</w:t>
       </w:r>
-      <w:proofErr w:type="spellStart"/>
+    </w:p>
+    <w:p>
+      <w:pPr/>
       <w:r>
-        <w:t>Источники</w:t>
+        <w:t>Главная метрика проекта — LogLoss, потому что пользователю важен не только выбор победителя, но и качество вероятности. Также анализируются Brier score, ROC-AUC и Accuracy. Brier score показывает среднюю ошибку вероятностного прогноза, ROC-AUC оценивает способность модели ранжировать победы выше поражений, а Accuracy дает привычную долю правильных классификаций при пороге 0.5.</w:t>
       </w:r>
-      <w:bookmarkEnd w:id="10"/>
-      <w:proofErr w:type="spellEnd"/>
+    </w:p>
+    <w:p>
+      <w:pPr/>
+      <w:r>
+        <w:t>Ключевые результаты на test-периоде приведены ниже.</w:t>
+      </w:r>
+    </w:p>
+    <w:tbl>
+      <w:tblPr>
+        <w:tblStyle w:val="aff0"/>
+        <w:tblW w:type="auto" w:w="0"/>
+        <w:tblLook w:firstColumn="1" w:firstRow="1" w:lastColumn="0" w:lastRow="0" w:noHBand="0" w:noVBand="1" w:val="04A0"/>
+      </w:tblPr>
+      <w:tblGrid>
+        <w:gridCol w:w="1930"/>
+        <w:gridCol w:w="1930"/>
+        <w:gridCol w:w="1930"/>
+        <w:gridCol w:w="1930"/>
+        <w:gridCol w:w="1930"/>
+      </w:tblGrid>
+      <w:tr>
+        <w:tc>
+          <w:tcPr>
+            <w:tcW w:type="dxa" w:w="1930"/>
+          </w:tcPr>
+          <w:p>
+            <w:pPr>
+              <w:jc w:val="left"/>
+            </w:pPr>
+            <w:r>
+              <w:rPr>
+                <w:b/>
+              </w:rPr>
+              <w:t>Модель</w:t>
+            </w:r>
+          </w:p>
+        </w:tc>
+        <w:tc>
+          <w:tcPr>
+            <w:tcW w:type="dxa" w:w="1930"/>
+          </w:tcPr>
+          <w:p>
+            <w:pPr>
+              <w:jc w:val="center"/>
+            </w:pPr>
+            <w:r>
+              <w:rPr>
+                <w:b/>
+              </w:rPr>
+              <w:t>LogLoss</w:t>
+            </w:r>
+          </w:p>
+        </w:tc>
+        <w:tc>
+          <w:tcPr>
+            <w:tcW w:type="dxa" w:w="1930"/>
+          </w:tcPr>
+          <w:p>
+            <w:pPr>
+              <w:jc w:val="center"/>
+            </w:pPr>
+            <w:r>
+              <w:rPr>
+                <w:b/>
+              </w:rPr>
+              <w:t>Brier</w:t>
+            </w:r>
+          </w:p>
+        </w:tc>
+        <w:tc>
+          <w:tcPr>
+            <w:tcW w:type="dxa" w:w="1930"/>
+          </w:tcPr>
+          <w:p>
+            <w:pPr>
+              <w:jc w:val="center"/>
+            </w:pPr>
+            <w:r>
+              <w:rPr>
+                <w:b/>
+              </w:rPr>
+              <w:t>ROC-AUC</w:t>
+            </w:r>
+          </w:p>
+        </w:tc>
+        <w:tc>
+          <w:tcPr>
+            <w:tcW w:type="dxa" w:w="1930"/>
+          </w:tcPr>
+          <w:p>
+            <w:pPr>
+              <w:jc w:val="center"/>
+            </w:pPr>
+            <w:r>
+              <w:rPr>
+                <w:b/>
+              </w:rPr>
+              <w:t>Accuracy</w:t>
+            </w:r>
+          </w:p>
+        </w:tc>
+      </w:tr>
+      <w:tr>
+        <w:tc>
+          <w:tcPr>
+            <w:tcW w:type="dxa" w:w="1930"/>
+          </w:tcPr>
+          <w:p>
+            <w:pPr>
+              <w:jc w:val="left"/>
+            </w:pPr>
+            <w:r>
+              <w:t>Gradient Boosting</w:t>
+            </w:r>
+          </w:p>
+        </w:tc>
+        <w:tc>
+          <w:tcPr>
+            <w:tcW w:type="dxa" w:w="1930"/>
+          </w:tcPr>
+          <w:p>
+            <w:pPr>
+              <w:jc w:val="center"/>
+            </w:pPr>
+            <w:r>
+              <w:t>0.4557</w:t>
+            </w:r>
+          </w:p>
+        </w:tc>
+        <w:tc>
+          <w:tcPr>
+            <w:tcW w:type="dxa" w:w="1930"/>
+          </w:tcPr>
+          <w:p>
+            <w:pPr>
+              <w:jc w:val="center"/>
+            </w:pPr>
+            <w:r>
+              <w:t>0.1498</w:t>
+            </w:r>
+          </w:p>
+        </w:tc>
+        <w:tc>
+          <w:tcPr>
+            <w:tcW w:type="dxa" w:w="1930"/>
+          </w:tcPr>
+          <w:p>
+            <w:pPr>
+              <w:jc w:val="center"/>
+            </w:pPr>
+            <w:r>
+              <w:t>0.8658</w:t>
+            </w:r>
+          </w:p>
+        </w:tc>
+        <w:tc>
+          <w:tcPr>
+            <w:tcW w:type="dxa" w:w="1930"/>
+          </w:tcPr>
+          <w:p>
+            <w:pPr>
+              <w:jc w:val="center"/>
+            </w:pPr>
+            <w:r>
+              <w:t>78.1%</w:t>
+            </w:r>
+          </w:p>
+        </w:tc>
+      </w:tr>
+      <w:tr>
+        <w:tc>
+          <w:tcPr>
+            <w:tcW w:type="dxa" w:w="1930"/>
+          </w:tcPr>
+          <w:p>
+            <w:pPr>
+              <w:jc w:val="left"/>
+            </w:pPr>
+            <w:r>
+              <w:t>CatBoost</w:t>
+            </w:r>
+          </w:p>
+        </w:tc>
+        <w:tc>
+          <w:tcPr>
+            <w:tcW w:type="dxa" w:w="1930"/>
+          </w:tcPr>
+          <w:p>
+            <w:pPr>
+              <w:jc w:val="center"/>
+            </w:pPr>
+            <w:r>
+              <w:t>0.4561</w:t>
+            </w:r>
+          </w:p>
+        </w:tc>
+        <w:tc>
+          <w:tcPr>
+            <w:tcW w:type="dxa" w:w="1930"/>
+          </w:tcPr>
+          <w:p>
+            <w:pPr>
+              <w:jc w:val="center"/>
+            </w:pPr>
+            <w:r>
+              <w:t>0.1501</w:t>
+            </w:r>
+          </w:p>
+        </w:tc>
+        <w:tc>
+          <w:tcPr>
+            <w:tcW w:type="dxa" w:w="1930"/>
+          </w:tcPr>
+          <w:p>
+            <w:pPr>
+              <w:jc w:val="center"/>
+            </w:pPr>
+            <w:r>
+              <w:t>0.8653</w:t>
+            </w:r>
+          </w:p>
+        </w:tc>
+        <w:tc>
+          <w:tcPr>
+            <w:tcW w:type="dxa" w:w="1930"/>
+          </w:tcPr>
+          <w:p>
+            <w:pPr>
+              <w:jc w:val="center"/>
+            </w:pPr>
+            <w:r>
+              <w:t>78.3%</w:t>
+            </w:r>
+          </w:p>
+        </w:tc>
+      </w:tr>
+      <w:tr>
+        <w:tc>
+          <w:tcPr>
+            <w:tcW w:type="dxa" w:w="1930"/>
+          </w:tcPr>
+          <w:p>
+            <w:pPr>
+              <w:jc w:val="left"/>
+            </w:pPr>
+            <w:r>
+              <w:t>Random Forest</w:t>
+            </w:r>
+          </w:p>
+        </w:tc>
+        <w:tc>
+          <w:tcPr>
+            <w:tcW w:type="dxa" w:w="1930"/>
+          </w:tcPr>
+          <w:p>
+            <w:pPr>
+              <w:jc w:val="center"/>
+            </w:pPr>
+            <w:r>
+              <w:t>0.4621</w:t>
+            </w:r>
+          </w:p>
+        </w:tc>
+        <w:tc>
+          <w:tcPr>
+            <w:tcW w:type="dxa" w:w="1930"/>
+          </w:tcPr>
+          <w:p>
+            <w:pPr>
+              <w:jc w:val="center"/>
+            </w:pPr>
+            <w:r>
+              <w:t>0.1518</w:t>
+            </w:r>
+          </w:p>
+        </w:tc>
+        <w:tc>
+          <w:tcPr>
+            <w:tcW w:type="dxa" w:w="1930"/>
+          </w:tcPr>
+          <w:p>
+            <w:pPr>
+              <w:jc w:val="center"/>
+            </w:pPr>
+            <w:r>
+              <w:t>0.8621</w:t>
+            </w:r>
+          </w:p>
+        </w:tc>
+        <w:tc>
+          <w:tcPr>
+            <w:tcW w:type="dxa" w:w="1930"/>
+          </w:tcPr>
+          <w:p>
+            <w:pPr>
+              <w:jc w:val="center"/>
+            </w:pPr>
+            <w:r>
+              <w:t>77.2%</w:t>
+            </w:r>
+          </w:p>
+        </w:tc>
+      </w:tr>
+      <w:tr>
+        <w:tc>
+          <w:tcPr>
+            <w:tcW w:type="dxa" w:w="1930"/>
+          </w:tcPr>
+          <w:p>
+            <w:pPr>
+              <w:jc w:val="left"/>
+            </w:pPr>
+            <w:r>
+              <w:t>Baseline rating + ELO</w:t>
+            </w:r>
+          </w:p>
+        </w:tc>
+        <w:tc>
+          <w:tcPr>
+            <w:tcW w:type="dxa" w:w="1930"/>
+          </w:tcPr>
+          <w:p>
+            <w:pPr>
+              <w:jc w:val="center"/>
+            </w:pPr>
+            <w:r>
+              <w:t>0.4942</w:t>
+            </w:r>
+          </w:p>
+        </w:tc>
+        <w:tc>
+          <w:tcPr>
+            <w:tcW w:type="dxa" w:w="1930"/>
+          </w:tcPr>
+          <w:p>
+            <w:pPr>
+              <w:jc w:val="center"/>
+            </w:pPr>
+            <w:r>
+              <w:t>0.1635</w:t>
+            </w:r>
+          </w:p>
+        </w:tc>
+        <w:tc>
+          <w:tcPr>
+            <w:tcW w:type="dxa" w:w="1930"/>
+          </w:tcPr>
+          <w:p>
+            <w:pPr>
+              <w:jc w:val="center"/>
+            </w:pPr>
+            <w:r>
+              <w:t>0.8403</w:t>
+            </w:r>
+          </w:p>
+        </w:tc>
+        <w:tc>
+          <w:tcPr>
+            <w:tcW w:type="dxa" w:w="1930"/>
+          </w:tcPr>
+          <w:p>
+            <w:pPr>
+              <w:jc w:val="center"/>
+            </w:pPr>
+            <w:r>
+              <w:t>75.8%</w:t>
+            </w:r>
+          </w:p>
+        </w:tc>
+      </w:tr>
+    </w:tbl>
+    <w:p>
+      <w:pPr/>
+      <w:r>
+        <w:t>Лучшей основной моделью по LogLoss стала Gradient Boosting. Она показала LogLoss 0.4557 и ROC-AUC 0.8658 на уровне симметризованного матча. По сравнению с baseline rating + ELO снижение LogLoss составляет около 7.8%, что подтверждает добавленную ценность расширенного набора признаков.</w:t>
+      </w:r>
+    </w:p>
+    <w:p>
+      <w:pPr/>
+      <w:r>
+        <w:t>CatBoost оказался очень близок к Gradient Boosting и даже немного выше по Accuracy, однако итоговый выбор сделан в пользу Gradient Boosting из-за лучшего LogLoss и Brier score. Для вероятностного прогноза эти метрики важнее, чем небольшая разница в Accuracy.</w:t>
+      </w:r>
+    </w:p>
+    <w:p>
+      <w:pPr/>
+      <w:r>
+        <w:t>Random Forest показал сопоставимое качество на test, но заметно сильнее подстроился под train: разрыв train/test LogLoss у него существенно выше, чем у Gradient Boosting. Поэтому Random Forest не был выбран как основная модель.</w:t>
+      </w:r>
+    </w:p>
+    <w:p>
+      <w:pPr/>
+      <w:r>
+        <w:t>В целом результаты можно считать устойчивыми для учебного проекта: модель уверенно превосходит простые рейтинговые ориентиры, а качество оценивается на временном test-периоде, который имитирует прогнозирование будущих матчей.</w:t>
+      </w:r>
+    </w:p>
+    <w:p>
+      <w:pPr>
+        <w:pStyle w:val="1"/>
+      </w:pPr>
+      <w:r>
+        <w:t>7. Интерпретация факторов прогноза</w:t>
+      </w:r>
+    </w:p>
+    <w:p>
+      <w:pPr/>
+      <w:r>
+        <w:t>Для практического использования важно понимать не только итоговую вероятность, но и факторы, которые подтолкнули модель к такому прогнозу. Поэтому в проекте используются два уровня интерпретации: глобальная важность признаков для всей модели и локальная таблица вкладов факторов для выбранного матча.</w:t>
+      </w:r>
+    </w:p>
+    <w:p>
+      <w:pPr/>
+      <w:r>
+        <w:t>По последнему обучению наиболее сильные группы признаков связаны со скорректированными рейтинговыми очками, ELO, официальным местом в рейтинге, силой предыдущих соперников, опытом и общей историей побед. Это согласуется с предметной областью: исход матча обычно определяется не одним показателем, а сочетанием официального рейтинга, динамической силы игрока и качества его недавней игровой истории.</w:t>
+      </w:r>
+    </w:p>
+    <w:p>
+      <w:pPr/>
+      <w:r>
+        <w:t>Локальная интерпретация в панели прогноза показывает, какие признаки работали в пользу первого игрока, а какие — в пользу соперника. Такой формат не является строгим причинным объяснением, но помогает пользователю проверить, почему модель оценила конкретный матч именно так.</w:t>
+      </w:r>
+    </w:p>
+    <w:p>
+      <w:pPr>
+        <w:pStyle w:val="1"/>
+      </w:pPr>
+      <w:r>
+        <w:t>8. Практическое применение</w:t>
+      </w:r>
+    </w:p>
+    <w:p>
+      <w:pPr/>
+      <w:r>
+        <w:t>Разработанная модель может применяться как аналитический инструмент в юниорском и любительском теннисе, где официального рейтинга часто недостаточно для полной оценки текущей силы игрока. Практическая ценность решения состоит не в автоматическом принятии решений, а в дополнительной вероятностной оценке и объяснимых факторах.</w:t>
+      </w:r>
     </w:p>
     <w:p>
       <w:pPr>
         <w:pStyle w:val="a0"/>
-        <w:rPr>
-          <w:lang w:val="ru-RU"/>
-        </w:rPr>
       </w:pPr>
       <w:r>
-        <w:rPr>
-          <w:lang w:val="ru-RU"/>
-        </w:rPr>
+        <w:t>Тренерская подготовка к матчу: сравнение игроков по рейтингу, ELO, форме, опыту, отдыху и результатам против общих соперников.</w:t>
+      </w:r>
+    </w:p>
+    <w:p>
+      <w:pPr>
+        <w:pStyle w:val="a0"/>
+      </w:pPr>
+      <w:r>
+        <w:t>Планирование календаря: предварительная оценка сложности турнира, потенциальных соперников и уровня сетки.</w:t>
+      </w:r>
+    </w:p>
+    <w:p>
+      <w:pPr>
+        <w:pStyle w:val="a0"/>
+      </w:pPr>
+      <w:r>
+        <w:t>Мониторинг развития игрока: отслеживание динамики ELO, рейтинговых очков, места в рейтинге и формы.</w:t>
+      </w:r>
+    </w:p>
+    <w:p>
+      <w:pPr>
+        <w:pStyle w:val="a0"/>
+      </w:pPr>
+      <w:r>
+        <w:t>Выявление расхождений между официальным рейтингом и фактической игровой силой, например у игроков с малым числом турниров или резким изменением результатов.</w:t>
+      </w:r>
+    </w:p>
+    <w:p>
+      <w:pPr/>
+      <w:r>
+        <w:t>В рамках дипломного проекта решение следует рассматривать как прототип системы поддержки аналитических решений. Оно не заменяет экспертную оценку тренера и не предназначено для ставок.</w:t>
+      </w:r>
+    </w:p>
+    <w:p>
+      <w:pPr>
+        <w:pStyle w:val="1"/>
+      </w:pPr>
+      <w:r>
+        <w:t>9. Ограничения проекта</w:t>
+      </w:r>
+    </w:p>
+    <w:p>
+      <w:pPr>
+        <w:pStyle w:val="a0"/>
+      </w:pPr>
+      <w:r>
+        <w:t>Качество зависит от полноты и стабильности публичных данных РТТ; при изменении сайта парсеры потребуется адаптировать.</w:t>
+      </w:r>
+    </w:p>
+    <w:p>
+      <w:pPr>
+        <w:pStyle w:val="a0"/>
+      </w:pPr>
+      <w:r>
+        <w:t>Модель не видит часть факторов, влияющих на отдельный матч: травмы, покрытие, погодные условия, переезды, мотивацию и текущее физическое состояние игрока.</w:t>
+      </w:r>
+    </w:p>
+    <w:p>
+      <w:pPr>
+        <w:pStyle w:val="a0"/>
+      </w:pPr>
+      <w:r>
+        <w:t>У игроков с короткой историей матчей признаки ELO, формы, личных встреч и общих соперников менее устойчивы.</w:t>
+      </w:r>
+    </w:p>
+    <w:p>
+      <w:pPr>
+        <w:pStyle w:val="a0"/>
+      </w:pPr>
+      <w:r>
+        <w:t>Сопоставление игроков по имени может быть неоднозначным, поэтому для снижения риска используется РНИ и проверки качества сопоставления.</w:t>
+      </w:r>
+    </w:p>
+    <w:p>
+      <w:pPr>
+        <w:pStyle w:val="a0"/>
+      </w:pPr>
+      <w:r>
+        <w:t>Метрики получены на историческом test-периоде и не гарантируют идентичное качество на будущих данных.</w:t>
+      </w:r>
+    </w:p>
+    <w:p>
+      <w:pPr>
+        <w:pStyle w:val="a0"/>
+      </w:pPr>
+      <w:r>
+        <w:t>Для промышленного применения нужны регулярный мониторинг качества, rolling-validation на нескольких временных окнах и контроль стабильности вероятностной калибровки.</w:t>
+      </w:r>
+    </w:p>
+    <w:p>
+      <w:pPr>
+        <w:pStyle w:val="1"/>
+      </w:pPr>
+      <w:r>
+        <w:t>10. Заключение и направления развития</w:t>
+      </w:r>
+    </w:p>
+    <w:p>
+      <w:pPr/>
+      <w:r>
+        <w:t>В проекте реализован полный цикл ML-решения: автоматизированный сбор данных, подготовка датасета, построение исторических признаков без утечки будущей информации, обучение нескольких моделей, оценка качества и интерактивный прогноз конкретного матча.</w:t>
+      </w:r>
+    </w:p>
+    <w:p>
+      <w:pPr/>
+      <w:r>
+        <w:t>Полученные результаты подтверждают исходную гипотезу: для прогноза матчей РТТ полезно использовать не только официальный рейтинг, но и динамическую силу игрока, качество предыдущих соперников, опыт, отдых, историю побед и результаты против общих соперников. Итоговая Gradient Boosting модель превосходит простые benchmark-модели по LogLoss и ROC-AUC.</w:t>
+      </w:r>
+    </w:p>
+    <w:p>
+      <w:pPr/>
+      <w:r>
+        <w:t>Главная ценность проекта — не только числовой прогноз, но и аналитическая панель, которая показывает состояние данных, дает прогноз по выбранной паре игроков и помогает интерпретировать, какие факторы сильнее всего повлияли на вероятность победы.</w:t>
+      </w:r>
+    </w:p>
+    <w:p>
+      <w:pPr/>
+      <w:r>
+        <w:t>Возможные направления дальнейшего развития:</w:t>
+      </w:r>
+    </w:p>
+    <w:p>
+      <w:pPr>
+        <w:pStyle w:val="a0"/>
+      </w:pPr>
+      <w:r>
+        <w:t>добавить регулярную rolling-validation и мониторинг качества после каждого обновления данных;</w:t>
+      </w:r>
+    </w:p>
+    <w:p>
+      <w:pPr>
+        <w:pStyle w:val="a0"/>
+      </w:pPr>
+      <w:r>
+        <w:t>улучшить калибровку вероятностей и отдельно контролировать качество на разных возрастных группах;</w:t>
+      </w:r>
+    </w:p>
+    <w:p>
+      <w:pPr>
+        <w:pStyle w:val="a0"/>
+      </w:pPr>
+      <w:r>
+        <w:t>расширить признаки при появлении новых данных: покрытие, город, длительность турнира, сетка, травмы или снятия;</w:t>
+      </w:r>
+    </w:p>
+    <w:p>
+      <w:pPr>
+        <w:pStyle w:val="a0"/>
+      </w:pPr>
+      <w:r>
+        <w:t>развить пользовательский интерфейс панели и добавить экспорт отчетов по матчу или игроку.</w:t>
+      </w:r>
+    </w:p>
+    <w:p>
+      <w:pPr>
+        <w:pStyle w:val="1"/>
+      </w:pPr>
+      <w:r>
+        <w:t>11. Источники</w:t>
+      </w:r>
+    </w:p>
+    <w:p>
+      <w:pPr>
+        <w:pStyle w:val="a0"/>
+      </w:pPr>
+      <w:r>
         <w:t>Публичные страницы Российского теннисного тура: календарь турниров, страницы матчей и рейтинги игроков.</w:t>
       </w:r>
     </w:p>
@@ -5878,29 +4917,16 @@
       <w:pPr>
         <w:pStyle w:val="a0"/>
       </w:pPr>
-      <w:proofErr w:type="spellStart"/>
       <w:r>
-        <w:t>Документация</w:t>
+        <w:t>Репозиторий проекта на GitHub: https://github.com/PnL-One/rtt-tennis-match-predictor</w:t>
       </w:r>
-      <w:proofErr w:type="spellEnd"/>
+    </w:p>
+    <w:p>
+      <w:pPr>
+        <w:pStyle w:val="a0"/>
+      </w:pPr>
       <w:r>
-        <w:t xml:space="preserve"> scikit-learn: </w:t>
-      </w:r>
-      <w:proofErr w:type="spellStart"/>
-      <w:r>
-        <w:t>GradientBoostingClassifier</w:t>
-      </w:r>
-      <w:proofErr w:type="spellEnd"/>
-      <w:r>
-        <w:t xml:space="preserve">, </w:t>
-      </w:r>
-      <w:proofErr w:type="spellStart"/>
-      <w:r>
-        <w:t>RandomForestClassifier</w:t>
-      </w:r>
-      <w:proofErr w:type="spellEnd"/>
-      <w:r>
-        <w:t>, LogisticRegression, Pipeline, SimpleImputer, метрики классификации.</w:t>
+        <w:t>Документация scikit-learn: GradientBoostingClassifier, RandomForestClassifier, LogisticRegression, Pipeline, SimpleImputer и метрики классификации.</w:t>
       </w:r>
     </w:p>
     <w:p>
@@ -5917,14 +4943,6 @@
       </w:pPr>
       <w:r>
         <w:t>Arpad E. Elo. The Rating of Chessplayers, Past and Present — базовая идея динамического рейтинга силы игрока.</w:t>
-      </w:r>
-    </w:p>
-    <w:p>
-      <w:pPr>
-        <w:pStyle w:val="a0"/>
-      </w:pPr>
-      <w:r>
-        <w:t>Файлы проекта: notebooks/00_data_control_panel.ipynb, scripts/run_full_pipeline.py, scripts/train_model.py, assembled_predictor/predictor_model_dataset_from_parsers.xlsx.</w:t>
       </w:r>
     </w:p>
     <w:sectPr>

</xml_diff>

<commit_message>
Improve note table flow
</commit_message>
<xml_diff>
--- a/docs/Пояснительная_записка_RTT_tennis_predictor_updated_v14.docx
+++ b/docs/Пояснительная_записка_RTT_tennis_predictor_updated_v14.docx
@@ -383,7 +383,7 @@
           <w:r>
             <w:fldChar w:fldCharType="separate"/>
           </w:r>
-          <w:hyperlink w:anchor="_Toc229521680" w:history="1">
+          <w:hyperlink w:anchor="_Toc229557232" w:history="1">
             <w:r>
               <w:rPr>
                 <w:rStyle w:val="aff8"/>
@@ -411,7 +411,7 @@
                 <w:noProof/>
                 <w:webHidden/>
               </w:rPr>
-              <w:instrText xml:space="preserve"> PAGEREF _Toc229521680 \h </w:instrText>
+              <w:instrText xml:space="preserve"> PAGEREF _Toc229557232 \h </w:instrText>
             </w:r>
             <w:r>
               <w:rPr>
@@ -457,7 +457,7 @@
               <w14:ligatures w14:val="standardContextual"/>
             </w:rPr>
           </w:pPr>
-          <w:hyperlink w:anchor="_Toc229521681" w:history="1">
+          <w:hyperlink w:anchor="_Toc229557233" w:history="1">
             <w:r>
               <w:rPr>
                 <w:rStyle w:val="aff8"/>
@@ -485,7 +485,7 @@
                 <w:noProof/>
                 <w:webHidden/>
               </w:rPr>
-              <w:instrText xml:space="preserve"> PAGEREF _Toc229521681 \h </w:instrText>
+              <w:instrText xml:space="preserve"> PAGEREF _Toc229557233 \h </w:instrText>
             </w:r>
             <w:r>
               <w:rPr>
@@ -531,7 +531,7 @@
               <w14:ligatures w14:val="standardContextual"/>
             </w:rPr>
           </w:pPr>
-          <w:hyperlink w:anchor="_Toc229521682" w:history="1">
+          <w:hyperlink w:anchor="_Toc229557234" w:history="1">
             <w:r>
               <w:rPr>
                 <w:rStyle w:val="aff8"/>
@@ -559,7 +559,7 @@
                 <w:noProof/>
                 <w:webHidden/>
               </w:rPr>
-              <w:instrText xml:space="preserve"> PAGEREF _Toc229521682 \h </w:instrText>
+              <w:instrText xml:space="preserve"> PAGEREF _Toc229557234 \h </w:instrText>
             </w:r>
             <w:r>
               <w:rPr>
@@ -605,12 +605,11 @@
               <w14:ligatures w14:val="standardContextual"/>
             </w:rPr>
           </w:pPr>
-          <w:hyperlink w:anchor="_Toc229521683" w:history="1">
+          <w:hyperlink w:anchor="_Toc229557235" w:history="1">
             <w:r>
               <w:rPr>
                 <w:rStyle w:val="aff8"/>
                 <w:noProof/>
-                <w:lang w:val="ru-RU"/>
               </w:rPr>
               <w:t>4. Признаки и предотвращение утечки будущей информации</w:t>
             </w:r>
@@ -633,7 +632,7 @@
                 <w:noProof/>
                 <w:webHidden/>
               </w:rPr>
-              <w:instrText xml:space="preserve"> PAGEREF _Toc229521683 \h </w:instrText>
+              <w:instrText xml:space="preserve"> PAGEREF _Toc229557235 \h </w:instrText>
             </w:r>
             <w:r>
               <w:rPr>
@@ -653,7 +652,7 @@
                 <w:noProof/>
                 <w:webHidden/>
               </w:rPr>
-              <w:t>5</w:t>
+              <w:t>7</w:t>
             </w:r>
             <w:r>
               <w:rPr>
@@ -679,12 +678,11 @@
               <w14:ligatures w14:val="standardContextual"/>
             </w:rPr>
           </w:pPr>
-          <w:hyperlink w:anchor="_Toc229521684" w:history="1">
+          <w:hyperlink w:anchor="_Toc229557236" w:history="1">
             <w:r>
               <w:rPr>
                 <w:rStyle w:val="aff8"/>
                 <w:noProof/>
-                <w:lang w:val="ru-RU"/>
               </w:rPr>
               <w:t>5. Обучение, тестирование и сравнение моделей</w:t>
             </w:r>
@@ -707,7 +705,7 @@
                 <w:noProof/>
                 <w:webHidden/>
               </w:rPr>
-              <w:instrText xml:space="preserve"> PAGEREF _Toc229521684 \h </w:instrText>
+              <w:instrText xml:space="preserve"> PAGEREF _Toc229557236 \h </w:instrText>
             </w:r>
             <w:r>
               <w:rPr>
@@ -727,7 +725,7 @@
                 <w:noProof/>
                 <w:webHidden/>
               </w:rPr>
-              <w:t>6</w:t>
+              <w:t>8</w:t>
             </w:r>
             <w:r>
               <w:rPr>
@@ -753,12 +751,11 @@
               <w14:ligatures w14:val="standardContextual"/>
             </w:rPr>
           </w:pPr>
-          <w:hyperlink w:anchor="_Toc229521685" w:history="1">
+          <w:hyperlink w:anchor="_Toc229557237" w:history="1">
             <w:r>
               <w:rPr>
                 <w:rStyle w:val="aff8"/>
                 <w:noProof/>
-                <w:lang w:val="ru-RU"/>
               </w:rPr>
               <w:t>6. Качество построенных моделей машинного обучения</w:t>
             </w:r>
@@ -781,7 +778,7 @@
                 <w:noProof/>
                 <w:webHidden/>
               </w:rPr>
-              <w:instrText xml:space="preserve"> PAGEREF _Toc229521685 \h </w:instrText>
+              <w:instrText xml:space="preserve"> PAGEREF _Toc229557237 \h </w:instrText>
             </w:r>
             <w:r>
               <w:rPr>
@@ -801,7 +798,7 @@
                 <w:noProof/>
                 <w:webHidden/>
               </w:rPr>
-              <w:t>7</w:t>
+              <w:t>8</w:t>
             </w:r>
             <w:r>
               <w:rPr>
@@ -827,12 +824,11 @@
               <w14:ligatures w14:val="standardContextual"/>
             </w:rPr>
           </w:pPr>
-          <w:hyperlink w:anchor="_Toc229521686" w:history="1">
+          <w:hyperlink w:anchor="_Toc229557238" w:history="1">
             <w:r>
               <w:rPr>
                 <w:rStyle w:val="aff8"/>
                 <w:noProof/>
-                <w:lang w:val="ru-RU"/>
               </w:rPr>
               <w:t>7. Интерпретация факторов прогноза</w:t>
             </w:r>
@@ -855,7 +851,7 @@
                 <w:noProof/>
                 <w:webHidden/>
               </w:rPr>
-              <w:instrText xml:space="preserve"> PAGEREF _Toc229521686 \h </w:instrText>
+              <w:instrText xml:space="preserve"> PAGEREF _Toc229557238 \h </w:instrText>
             </w:r>
             <w:r>
               <w:rPr>
@@ -875,7 +871,7 @@
                 <w:noProof/>
                 <w:webHidden/>
               </w:rPr>
-              <w:t>8</w:t>
+              <w:t>9</w:t>
             </w:r>
             <w:r>
               <w:rPr>
@@ -901,12 +897,11 @@
               <w14:ligatures w14:val="standardContextual"/>
             </w:rPr>
           </w:pPr>
-          <w:hyperlink w:anchor="_Toc229521687" w:history="1">
+          <w:hyperlink w:anchor="_Toc229557239" w:history="1">
             <w:r>
               <w:rPr>
                 <w:rStyle w:val="aff8"/>
                 <w:noProof/>
-                <w:lang w:val="ru-RU"/>
               </w:rPr>
               <w:t>8. Практическое применение</w:t>
             </w:r>
@@ -929,7 +924,7 @@
                 <w:noProof/>
                 <w:webHidden/>
               </w:rPr>
-              <w:instrText xml:space="preserve"> PAGEREF _Toc229521687 \h </w:instrText>
+              <w:instrText xml:space="preserve"> PAGEREF _Toc229557239 \h </w:instrText>
             </w:r>
             <w:r>
               <w:rPr>
@@ -975,7 +970,7 @@
               <w14:ligatures w14:val="standardContextual"/>
             </w:rPr>
           </w:pPr>
-          <w:hyperlink w:anchor="_Toc229521688" w:history="1">
+          <w:hyperlink w:anchor="_Toc229557240" w:history="1">
             <w:r>
               <w:rPr>
                 <w:rStyle w:val="aff8"/>
@@ -1002,7 +997,7 @@
                 <w:noProof/>
                 <w:webHidden/>
               </w:rPr>
-              <w:instrText xml:space="preserve"> PAGEREF _Toc229521688 \h </w:instrText>
+              <w:instrText xml:space="preserve"> PAGEREF _Toc229557240 \h </w:instrText>
             </w:r>
             <w:r>
               <w:rPr>
@@ -1048,14 +1043,13 @@
               <w14:ligatures w14:val="standardContextual"/>
             </w:rPr>
           </w:pPr>
-          <w:hyperlink w:anchor="_Toc229521689" w:history="1">
+          <w:hyperlink w:anchor="_Toc229557241" w:history="1">
             <w:r>
               <w:rPr>
                 <w:rStyle w:val="aff8"/>
                 <w:noProof/>
-                <w:lang w:val="ru-RU"/>
               </w:rPr>
-              <w:t>10. Заключение</w:t>
+              <w:t>10. Заключение и направления развития</w:t>
             </w:r>
             <w:r>
               <w:rPr>
@@ -1076,7 +1070,7 @@
                 <w:noProof/>
                 <w:webHidden/>
               </w:rPr>
-              <w:instrText xml:space="preserve"> PAGEREF _Toc229521689 \h </w:instrText>
+              <w:instrText xml:space="preserve"> PAGEREF _Toc229557241 \h </w:instrText>
             </w:r>
             <w:r>
               <w:rPr>
@@ -1122,7 +1116,7 @@
               <w14:ligatures w14:val="standardContextual"/>
             </w:rPr>
           </w:pPr>
-          <w:hyperlink w:anchor="_Toc229521690" w:history="1">
+          <w:hyperlink w:anchor="_Toc229557242" w:history="1">
             <w:r>
               <w:rPr>
                 <w:rStyle w:val="aff8"/>
@@ -1149,7 +1143,7 @@
                 <w:noProof/>
                 <w:webHidden/>
               </w:rPr>
-              <w:instrText xml:space="preserve"> PAGEREF _Toc229521690 \h </w:instrText>
+              <w:instrText xml:space="preserve"> PAGEREF _Toc229557242 \h </w:instrText>
             </w:r>
             <w:r>
               <w:rPr>
@@ -1212,7 +1206,7 @@
           <w:lang w:val="ru-RU"/>
         </w:rPr>
       </w:pPr>
-      <w:bookmarkStart w:id="0" w:name="_Toc229521680"/>
+      <w:bookmarkStart w:id="0" w:name="_Toc229557232"/>
       <w:r>
         <w:rPr>
           <w:lang w:val="ru-RU"/>
@@ -1256,7 +1250,19 @@
         <w:rPr>
           <w:lang w:val="ru-RU"/>
         </w:rPr>
-        <w:t xml:space="preserve"> равна 1, если рассматриваемый игрок выиграл матч, и 0 в противном случае. Выход модели — не только класс победителя, а именно вероятность, поэтому основной метрикой качества выбран </w:t>
+        <w:t xml:space="preserve"> равна 1, если рассматриваемый игрок выиграл матч, и 0 в противном случае. Выход модели — не только класс победителя, </w:t>
+      </w:r>
+      <w:r>
+        <w:rPr>
+          <w:lang w:val="ru-RU"/>
+        </w:rPr>
+        <w:t>но и</w:t>
+      </w:r>
+      <w:r>
+        <w:rPr>
+          <w:lang w:val="ru-RU"/>
+        </w:rPr>
+        <w:t xml:space="preserve"> вероятность, поэтому основной метрикой качества выбран </w:t>
       </w:r>
       <w:proofErr w:type="spellStart"/>
       <w:r>
@@ -1304,7 +1310,7 @@
           <w:lang w:val="ru-RU"/>
         </w:rPr>
       </w:pPr>
-      <w:bookmarkStart w:id="1" w:name="_Toc229521681"/>
+      <w:bookmarkStart w:id="1" w:name="_Toc229557233"/>
       <w:r>
         <w:rPr>
           <w:lang w:val="ru-RU"/>
@@ -1756,7 +1762,7 @@
           <w:lang w:val="ru-RU"/>
         </w:rPr>
       </w:pPr>
-      <w:bookmarkStart w:id="2" w:name="_Toc229521682"/>
+      <w:bookmarkStart w:id="2" w:name="_Toc229557234"/>
       <w:r>
         <w:rPr>
           <w:lang w:val="ru-RU"/>
@@ -2513,11 +2519,529 @@
         <w:t>Качество подготовки датасета здесь особенно важно, потому что ошибка на этом этапе напрямую приводит к искажению оценки модели. Например, если в признаки случайно попадет информация, ставшая известной только после матча, качество на тесте будет выглядеть завышенным, но реальная прогнозная ценность модели снизится. Поэтому при построении датасета используется хронологический принцип: для каждого матча берутся только те рейтинги и игровые показатели, которые могли быть известны на момент его проведения.</w:t>
       </w:r>
     </w:p>
+    <w:p>
+      <w:pPr/>
+      <w:r>
+        <w:t>Таким образом, к этапу моделирования поступает не набор разрозненных выгрузок, а очищенная хронологическая история матчей. На ее основе дальше рассчитываются признаки, описанные в следующем разделе.</w:t>
+      </w:r>
+    </w:p>
+    <w:p>
+      <w:pPr>
+        <w:pStyle w:val="1"/>
+        <w:rPr>
+          <w:lang w:val="ru-RU"/>
+        </w:rPr>
+      </w:pPr>
+      <w:bookmarkStart w:id="3" w:name="_Toc229557235"/>
+      <w:r>
+        <w:rPr>
+          <w:lang w:val="ru-RU"/>
+        </w:rPr>
+        <w:t>4. Признаки и предотвращение утечки будущей информации</w:t>
+      </w:r>
+      <w:bookmarkEnd w:id="3"/>
+    </w:p>
+    <w:p>
+      <w:pPr>
+        <w:rPr>
+          <w:lang w:val="ru-RU"/>
+        </w:rPr>
+      </w:pPr>
+      <w:r>
+        <w:rPr>
+          <w:lang w:val="ru-RU"/>
+        </w:rPr>
+        <w:t>Ключевой принцип построения признаков — модель должна видеть только ту информацию, которая была доступна до начала прогнозируемого матча. Это важно для честной оценки качества: если в обучающую выборку случайно попадут сведения из будущего, модель будет выглядеть точнее на тесте, но хуже работать в реальном применении.</w:t>
+      </w:r>
+    </w:p>
+    <w:p>
+      <w:pPr>
+        <w:rPr>
+          <w:lang w:val="ru-RU"/>
+        </w:rPr>
+      </w:pPr>
+      <w:r>
+        <w:rPr>
+          <w:lang w:val="ru-RU"/>
+        </w:rPr>
+        <w:t>В итоговом наборе используется 43 признака. Их можно разделить на несколько смысловых групп:</w:t>
+      </w:r>
+    </w:p>
+    <w:p>
+      <w:pPr>
+        <w:pStyle w:val="a0"/>
+        <w:rPr>
+          <w:lang w:val="ru-RU"/>
+        </w:rPr>
+      </w:pPr>
+      <w:r>
+        <w:rPr>
+          <w:lang w:val="ru-RU"/>
+        </w:rPr>
+        <w:t>официальный рейтинг РТТ: место игрока, рейтинговые очки, дата классификации и возрастная категория рейтинга;</w:t>
+      </w:r>
+    </w:p>
+    <w:p>
+      <w:pPr>
+        <w:pStyle w:val="a0"/>
+        <w:rPr>
+          <w:lang w:val="ru-RU"/>
+        </w:rPr>
+      </w:pPr>
+      <w:r>
+        <w:rPr>
+          <w:lang w:val="ru-RU"/>
+        </w:rPr>
+        <w:t>скорректированные рейтинговые показатели: средние очки на один зачётный турнир, что помогает не занижать силу игрока только из-за малого числа сыгранных турниров;</w:t>
+      </w:r>
+    </w:p>
+    <w:p>
+      <w:pPr>
+        <w:pStyle w:val="a0"/>
+        <w:rPr>
+          <w:lang w:val="ru-RU"/>
+        </w:rPr>
+      </w:pPr>
+      <w:r>
+        <w:rPr>
+          <w:lang w:val="ru-RU"/>
+        </w:rPr>
+        <w:t xml:space="preserve">относительные признаки пары: разницы и процентные разницы рейтинга, очков, скорректированных очков и </w:t>
+      </w:r>
+      <w:r>
+        <w:t>ELO</w:t>
+      </w:r>
+      <w:r>
+        <w:rPr>
+          <w:lang w:val="ru-RU"/>
+        </w:rPr>
+        <w:t xml:space="preserve"> между игроком и соперником;</w:t>
+      </w:r>
+    </w:p>
+    <w:p>
+      <w:pPr>
+        <w:pStyle w:val="a0"/>
+        <w:rPr>
+          <w:lang w:val="ru-RU"/>
+        </w:rPr>
+      </w:pPr>
+      <w:r>
+        <w:rPr>
+          <w:lang w:val="ru-RU"/>
+        </w:rPr>
+        <w:t xml:space="preserve">игровая история: количество предыдущих матчей, общий </w:t>
+      </w:r>
+      <w:proofErr w:type="spellStart"/>
+      <w:r>
+        <w:t>winrate</w:t>
+      </w:r>
+      <w:proofErr w:type="spellEnd"/>
+      <w:r>
+        <w:rPr>
+          <w:lang w:val="ru-RU"/>
+        </w:rPr>
+        <w:t xml:space="preserve"> до матча, личные встречи, отдых после последнего матча и результаты против общих соперников;</w:t>
+      </w:r>
+    </w:p>
+    <w:p>
+      <w:pPr>
+        <w:pStyle w:val="a0"/>
+        <w:rPr>
+          <w:lang w:val="ru-RU"/>
+        </w:rPr>
+      </w:pPr>
+      <w:r>
+        <w:rPr>
+          <w:lang w:val="ru-RU"/>
+        </w:rPr>
+        <w:t xml:space="preserve">сила предыдущих соперников: средний </w:t>
+      </w:r>
+      <w:r>
+        <w:t>ELO</w:t>
+      </w:r>
+      <w:r>
+        <w:rPr>
+          <w:lang w:val="ru-RU"/>
+        </w:rPr>
+        <w:t xml:space="preserve"> соперников в недавних матчах, который показывает, насколько сложным был календарь игрока;</w:t>
+      </w:r>
+    </w:p>
+    <w:p>
+      <w:pPr>
+        <w:pStyle w:val="a0"/>
+        <w:rPr>
+          <w:lang w:val="ru-RU"/>
+        </w:rPr>
+      </w:pPr>
+      <w:r>
+        <w:rPr>
+          <w:lang w:val="ru-RU"/>
+        </w:rPr>
+        <w:t>служебные флаги пропусков: они позволяют модели отличать реальное нулевое значение от ситуации, когда информации о рейтинге или истории игрока недостаточно.</w:t>
+      </w:r>
+    </w:p>
+    <w:p>
+      <w:pPr>
+        <w:rPr>
+          <w:lang w:val="ru-RU"/>
+        </w:rPr>
+      </w:pPr>
+      <w:r>
+        <w:t>ELO</w:t>
+      </w:r>
+      <w:r>
+        <w:rPr>
+          <w:lang w:val="ru-RU"/>
+        </w:rPr>
+        <w:t xml:space="preserve"> — это динамический рейтинг силы игрока, который пересчитывается после каждого матча. Перед встречей по разнице </w:t>
+      </w:r>
+      <w:r>
+        <w:t>ELO</w:t>
+      </w:r>
+      <w:r>
+        <w:rPr>
+          <w:lang w:val="ru-RU"/>
+        </w:rPr>
+        <w:t xml:space="preserve"> оценивается ожидаемая вероятность победы: </w:t>
+      </w:r>
+      <w:r>
+        <w:t>P</w:t>
+      </w:r>
+      <w:r>
+        <w:rPr>
+          <w:lang w:val="ru-RU"/>
+        </w:rPr>
+        <w:t>(</w:t>
+      </w:r>
+      <w:r>
+        <w:t>A</w:t>
+      </w:r>
+      <w:r>
+        <w:rPr>
+          <w:lang w:val="ru-RU"/>
+        </w:rPr>
+        <w:t>) = 1 / (1 + 10^((</w:t>
+      </w:r>
+      <w:r>
+        <w:t>ELO</w:t>
+      </w:r>
+      <w:r>
+        <w:rPr>
+          <w:lang w:val="ru-RU"/>
+        </w:rPr>
+        <w:t>_</w:t>
+      </w:r>
+      <w:r>
+        <w:t>B</w:t>
+      </w:r>
+      <w:r>
+        <w:rPr>
+          <w:lang w:val="ru-RU"/>
+        </w:rPr>
+        <w:t xml:space="preserve"> - </w:t>
+      </w:r>
+      <w:r>
+        <w:t>ELO</w:t>
+      </w:r>
+      <w:r>
+        <w:rPr>
+          <w:lang w:val="ru-RU"/>
+        </w:rPr>
+        <w:t>_</w:t>
+      </w:r>
+      <w:r>
+        <w:t>A</w:t>
+      </w:r>
+      <w:r>
+        <w:rPr>
+          <w:lang w:val="ru-RU"/>
+        </w:rPr>
+        <w:t xml:space="preserve">) / 400)). После матча рейтинг обновляется по формуле </w:t>
+      </w:r>
+      <w:r>
+        <w:t>ELO</w:t>
+      </w:r>
+      <w:r>
+        <w:rPr>
+          <w:lang w:val="ru-RU"/>
+        </w:rPr>
+        <w:t>_</w:t>
+      </w:r>
+      <w:r>
+        <w:t>A</w:t>
+      </w:r>
+      <w:r>
+        <w:rPr>
+          <w:lang w:val="ru-RU"/>
+        </w:rPr>
+        <w:t>,</w:t>
+      </w:r>
+      <w:r>
+        <w:t>new</w:t>
+      </w:r>
+      <w:r>
+        <w:rPr>
+          <w:lang w:val="ru-RU"/>
+        </w:rPr>
+        <w:t xml:space="preserve"> = </w:t>
+      </w:r>
+      <w:r>
+        <w:t>ELO</w:t>
+      </w:r>
+      <w:r>
+        <w:rPr>
+          <w:lang w:val="ru-RU"/>
+        </w:rPr>
+        <w:t>_</w:t>
+      </w:r>
+      <w:r>
+        <w:t>A</w:t>
+      </w:r>
+      <w:r>
+        <w:rPr>
+          <w:lang w:val="ru-RU"/>
+        </w:rPr>
+        <w:t xml:space="preserve"> + </w:t>
+      </w:r>
+      <w:r>
+        <w:t>K</w:t>
+      </w:r>
+      <w:r>
+        <w:rPr>
+          <w:lang w:val="ru-RU"/>
+        </w:rPr>
+        <w:t xml:space="preserve"> × (</w:t>
+      </w:r>
+      <w:r>
+        <w:t>S</w:t>
+      </w:r>
+      <w:r>
+        <w:rPr>
+          <w:lang w:val="ru-RU"/>
+        </w:rPr>
+        <w:t>_</w:t>
+      </w:r>
+      <w:r>
+        <w:t>A</w:t>
+      </w:r>
+      <w:r>
+        <w:rPr>
+          <w:lang w:val="ru-RU"/>
+        </w:rPr>
+        <w:t xml:space="preserve"> - </w:t>
+      </w:r>
+      <w:r>
+        <w:t>P</w:t>
+      </w:r>
+      <w:r>
+        <w:rPr>
+          <w:lang w:val="ru-RU"/>
+        </w:rPr>
+        <w:t>(</w:t>
+      </w:r>
+      <w:r>
+        <w:t>A</w:t>
+      </w:r>
+      <w:r>
+        <w:rPr>
+          <w:lang w:val="ru-RU"/>
+        </w:rPr>
+        <w:t xml:space="preserve">)), где </w:t>
+      </w:r>
+      <w:r>
+        <w:t>S</w:t>
+      </w:r>
+      <w:r>
+        <w:rPr>
+          <w:lang w:val="ru-RU"/>
+        </w:rPr>
+        <w:t>_</w:t>
+      </w:r>
+      <w:r>
+        <w:t>A</w:t>
+      </w:r>
+      <w:r>
+        <w:rPr>
+          <w:lang w:val="ru-RU"/>
+        </w:rPr>
+        <w:t xml:space="preserve"> равно 1 при победе и 0 при поражении. Поэтому победа над более сильным соперником дает больший прирост, чем ожидаемая победа над более слабым. В проекте </w:t>
+      </w:r>
+      <w:r>
+        <w:t>ELO</w:t>
+      </w:r>
+      <w:r>
+        <w:rPr>
+          <w:lang w:val="ru-RU"/>
+        </w:rPr>
+        <w:t xml:space="preserve"> считается строго по хронологии матчей.</w:t>
+      </w:r>
+    </w:p>
+    <w:p>
+      <w:pPr>
+        <w:rPr>
+          <w:lang w:val="ru-RU"/>
+        </w:rPr>
+      </w:pPr>
+      <w:r>
+        <w:rPr>
+          <w:lang w:val="ru-RU"/>
+        </w:rPr>
+        <w:t>Недавняя форма в панели прогноза считается как доля побед игрока в последних 5 и 10 матчах до выбранной даты (</w:t>
+      </w:r>
+      <w:r>
+        <w:t>Form</w:t>
+      </w:r>
+      <w:r>
+        <w:rPr>
+          <w:lang w:val="ru-RU"/>
+        </w:rPr>
+        <w:t xml:space="preserve"> 5 и </w:t>
+      </w:r>
+      <w:r>
+        <w:t>Form</w:t>
+      </w:r>
+      <w:r>
+        <w:rPr>
+          <w:lang w:val="ru-RU"/>
+        </w:rPr>
+        <w:t xml:space="preserve"> 10). Текущий и будущие матчи в этот расчет не попадают.</w:t>
+      </w:r>
+    </w:p>
+    <w:p>
+      <w:pPr>
+        <w:rPr>
+          <w:lang w:val="ru-RU"/>
+        </w:rPr>
+      </w:pPr>
+      <w:r>
+        <w:rPr>
+          <w:lang w:val="ru-RU"/>
+        </w:rPr>
+        <w:lastRenderedPageBreak/>
+        <w:t xml:space="preserve">Для каждого матча признаки рассчитываются до обновления истории текущим результатом. Такой порядок защищает от </w:t>
+      </w:r>
+      <w:r>
+        <w:t>data</w:t>
+      </w:r>
+      <w:r>
+        <w:rPr>
+          <w:lang w:val="ru-RU"/>
+        </w:rPr>
+        <w:t xml:space="preserve"> </w:t>
+      </w:r>
+      <w:r>
+        <w:t>leakage</w:t>
+      </w:r>
+      <w:r>
+        <w:rPr>
+          <w:lang w:val="ru-RU"/>
+        </w:rPr>
+        <w:t xml:space="preserve"> и делает тестирование похожим на реальный сценарий: сначала прогноз, потом появление результата.</w:t>
+      </w:r>
+    </w:p>
+    <w:p>
+      <w:pPr>
+        <w:pStyle w:val="1"/>
+        <w:rPr>
+          <w:lang w:val="ru-RU"/>
+        </w:rPr>
+      </w:pPr>
+      <w:bookmarkStart w:id="4" w:name="_Toc229557236"/>
+      <w:r>
+        <w:rPr>
+          <w:lang w:val="ru-RU"/>
+        </w:rPr>
+        <w:t>5. Обучение, тестирование и сравнение моделей</w:t>
+      </w:r>
+      <w:bookmarkEnd w:id="4"/>
+    </w:p>
+    <w:p>
+      <w:pPr>
+        <w:rPr>
+          <w:lang w:val="ru-RU"/>
+        </w:rPr>
+      </w:pPr>
+      <w:r>
+        <w:rPr>
+          <w:lang w:val="ru-RU"/>
+        </w:rPr>
+        <w:t xml:space="preserve">Модель обучалась как задача бинарной классификации: для каждой пары «игрок — соперник» нужно оценить вероятность победы рассматриваемого игрока. Один матч представлен в двух перспективах, а для пользовательского прогноза вероятность </w:t>
+      </w:r>
+      <w:proofErr w:type="spellStart"/>
+      <w:r>
+        <w:rPr>
+          <w:lang w:val="ru-RU"/>
+        </w:rPr>
+        <w:t>симметризуется</w:t>
+      </w:r>
+      <w:proofErr w:type="spellEnd"/>
+      <w:r>
+        <w:rPr>
+          <w:lang w:val="ru-RU"/>
+        </w:rPr>
+        <w:t xml:space="preserve"> на уровне матча, чтобы получить единую оценку победы одного игрока над другим.</w:t>
+      </w:r>
+    </w:p>
+    <w:p>
+      <w:pPr>
+        <w:rPr>
+          <w:lang w:val="ru-RU"/>
+        </w:rPr>
+      </w:pPr>
+      <w:r>
+        <w:rPr>
+          <w:lang w:val="ru-RU"/>
+        </w:rPr>
+        <w:t xml:space="preserve">Разделение на </w:t>
+      </w:r>
+      <w:r>
+        <w:t>train</w:t>
+      </w:r>
+      <w:r>
+        <w:rPr>
+          <w:lang w:val="ru-RU"/>
+        </w:rPr>
+        <w:t xml:space="preserve"> и </w:t>
+      </w:r>
+      <w:r>
+        <w:t>test</w:t>
+      </w:r>
+      <w:r>
+        <w:rPr>
+          <w:lang w:val="ru-RU"/>
+        </w:rPr>
+        <w:t xml:space="preserve"> выполнено по времени, а не случайным образом. В актуальном обучении тестовая часть содержит последние три месяца матчей: при периоде данных с 02.03.2025 по 11.05.2026 граница разделения приходится на 11.02.2026. В </w:t>
+      </w:r>
+      <w:r>
+        <w:t>train</w:t>
+      </w:r>
+      <w:r>
+        <w:rPr>
+          <w:lang w:val="ru-RU"/>
+        </w:rPr>
+        <w:t xml:space="preserve"> вошло 6326 матчей, в </w:t>
+      </w:r>
+      <w:r>
+        <w:t>test</w:t>
+      </w:r>
+      <w:r>
+        <w:rPr>
+          <w:lang w:val="ru-RU"/>
+        </w:rPr>
+        <w:t xml:space="preserve"> — 1233 матча. Такой подход ближе к реальному применению, потому что модель всегда прогнозирует будущие матчи по прошлой истории.</w:t>
+      </w:r>
+    </w:p>
+    <w:p>
+      <w:pPr/>
+      <w:r>
+        <w:t>Ниже показано это разделение в компактном виде. Таблица отделена от описания, чтобы было видно: test используется не для обучения, а только для честной проверки качества на более поздних матчах.</w:t>
+      </w:r>
+    </w:p>
     <w:tbl>
       <w:tblPr>
         <w:tblStyle w:val="aff0"/>
-        <w:tblW w:w="0" w:type="auto"/>
-        <w:tblLook w:val="04A0" w:firstRow="1" w:lastRow="0" w:firstColumn="1" w:lastColumn="0" w:noHBand="0" w:noVBand="1"/>
+        <w:tblW w:type="auto" w:w="0"/>
+        <w:tblLook w:firstColumn="1" w:firstRow="1" w:lastColumn="0" w:lastRow="0" w:noHBand="0" w:noVBand="1" w:val="04A0"/>
       </w:tblPr>
       <w:tblGrid>
         <w:gridCol w:w="2412"/>
@@ -2528,42 +3052,52 @@
       <w:tr>
         <w:tc>
           <w:tcPr>
-            <w:tcW w:w="2412" w:type="dxa"/>
+            <w:tcW w:type="dxa" w:w="2412"/>
           </w:tcPr>
           <w:p>
-            <w:proofErr w:type="spellStart"/>
-            <w:r>
+            <w:r>
+              <w:rPr>
+                <w:b/>
+              </w:rPr>
               <w:t>Часть</w:t>
             </w:r>
-            <w:proofErr w:type="spellEnd"/>
           </w:p>
         </w:tc>
         <w:tc>
           <w:tcPr>
-            <w:tcW w:w="2412" w:type="dxa"/>
+            <w:tcW w:type="dxa" w:w="2412"/>
           </w:tcPr>
           <w:p>
             <w:r>
+              <w:rPr>
+                <w:b/>
+              </w:rPr>
               <w:t>Период</w:t>
             </w:r>
           </w:p>
         </w:tc>
         <w:tc>
           <w:tcPr>
-            <w:tcW w:w="2412" w:type="dxa"/>
+            <w:tcW w:type="dxa" w:w="2412"/>
           </w:tcPr>
           <w:p>
             <w:r>
+              <w:rPr>
+                <w:b/>
+              </w:rPr>
               <w:t>Матчей</w:t>
             </w:r>
           </w:p>
         </w:tc>
         <w:tc>
           <w:tcPr>
-            <w:tcW w:w="2412" w:type="dxa"/>
+            <w:tcW w:type="dxa" w:w="2412"/>
           </w:tcPr>
           <w:p>
             <w:r>
+              <w:rPr>
+                <w:b/>
+              </w:rPr>
               <w:t>Long-format строк</w:t>
             </w:r>
           </w:p>
@@ -2572,7 +3106,7 @@
       <w:tr>
         <w:tc>
           <w:tcPr>
-            <w:tcW w:w="2412" w:type="dxa"/>
+            <w:tcW w:type="dxa" w:w="2412"/>
           </w:tcPr>
           <w:p>
             <w:r>
@@ -2582,17 +3116,17 @@
         </w:tc>
         <w:tc>
           <w:tcPr>
-            <w:tcW w:w="2412" w:type="dxa"/>
+            <w:tcW w:type="dxa" w:w="2412"/>
           </w:tcPr>
           <w:p>
             <w:r>
-              <w:t>2025-03-02 — день до 2026-02-11</w:t>
+              <w:t>02.03.2025 — 10.02.2026</w:t>
             </w:r>
           </w:p>
         </w:tc>
         <w:tc>
           <w:tcPr>
-            <w:tcW w:w="2412" w:type="dxa"/>
+            <w:tcW w:type="dxa" w:w="2412"/>
           </w:tcPr>
           <w:p>
             <w:r>
@@ -2602,7 +3136,7 @@
         </w:tc>
         <w:tc>
           <w:tcPr>
-            <w:tcW w:w="2412" w:type="dxa"/>
+            <w:tcW w:type="dxa" w:w="2412"/>
           </w:tcPr>
           <w:p>
             <w:r>
@@ -2614,7 +3148,7 @@
       <w:tr>
         <w:tc>
           <w:tcPr>
-            <w:tcW w:w="2412" w:type="dxa"/>
+            <w:tcW w:type="dxa" w:w="2412"/>
           </w:tcPr>
           <w:p>
             <w:r>
@@ -2624,17 +3158,17 @@
         </w:tc>
         <w:tc>
           <w:tcPr>
-            <w:tcW w:w="2412" w:type="dxa"/>
+            <w:tcW w:type="dxa" w:w="2412"/>
           </w:tcPr>
           <w:p>
             <w:r>
-              <w:t>2026-02-11 — 2026-05-11</w:t>
+              <w:t>11.02.2026 — 11.05.2026</w:t>
             </w:r>
           </w:p>
         </w:tc>
         <w:tc>
           <w:tcPr>
-            <w:tcW w:w="2412" w:type="dxa"/>
+            <w:tcW w:type="dxa" w:w="2412"/>
           </w:tcPr>
           <w:p>
             <w:r>
@@ -2644,7 +3178,7 @@
         </w:tc>
         <w:tc>
           <w:tcPr>
-            <w:tcW w:w="2412" w:type="dxa"/>
+            <w:tcW w:type="dxa" w:w="2412"/>
           </w:tcPr>
           <w:p>
             <w:r>
@@ -2654,1668 +3188,329 @@
         </w:tc>
       </w:tr>
     </w:tbl>
+    <w:p>
+      <w:pPr/>
+      <w:r>
+        <w:t>Такое разделение защищает от завышенной оценки качества: модель учится на прошлом и проверяется на матчах, которые для нее находятся в будущем.</w:t>
+      </w:r>
+    </w:p>
+    <w:p>
+      <w:pPr>
+        <w:rPr>
+          <w:lang w:val="ru-RU"/>
+        </w:rPr>
+      </w:pPr>
+      <w:r>
+        <w:rPr>
+          <w:lang w:val="ru-RU"/>
+        </w:rPr>
+        <w:t>Для сравнения использовались несколько уровней решений:</w:t>
+      </w:r>
+    </w:p>
+    <w:p>
+      <w:pPr>
+        <w:pStyle w:val="a0"/>
+        <w:rPr>
+          <w:lang w:val="ru-RU"/>
+        </w:rPr>
+      </w:pPr>
+      <w:r>
+        <w:rPr>
+          <w:lang w:val="ru-RU"/>
+        </w:rPr>
+        <w:t xml:space="preserve">простые однофакторные ориентиры: официальный рейтинг, скорректированный рейтинг, относительный рейтинг и </w:t>
+      </w:r>
+      <w:r>
+        <w:t>ELO</w:t>
+      </w:r>
+      <w:r>
+        <w:rPr>
+          <w:lang w:val="ru-RU"/>
+        </w:rPr>
+        <w:t>;</w:t>
+      </w:r>
+    </w:p>
+    <w:p>
+      <w:pPr>
+        <w:pStyle w:val="a0"/>
+        <w:rPr>
+          <w:lang w:val="ru-RU"/>
+        </w:rPr>
+      </w:pPr>
+      <w:r>
+        <w:rPr>
+          <w:lang w:val="ru-RU"/>
+        </w:rPr>
+        <w:t xml:space="preserve">компактный </w:t>
+      </w:r>
+      <w:r>
+        <w:t>baseline</w:t>
+      </w:r>
+      <w:r>
+        <w:rPr>
+          <w:lang w:val="ru-RU"/>
+        </w:rPr>
+        <w:t xml:space="preserve"> </w:t>
+      </w:r>
+      <w:r>
+        <w:t>rating</w:t>
+      </w:r>
+      <w:r>
+        <w:rPr>
+          <w:lang w:val="ru-RU"/>
+        </w:rPr>
+        <w:t xml:space="preserve"> + </w:t>
+      </w:r>
+      <w:r>
+        <w:t>ELO</w:t>
+      </w:r>
+      <w:r>
+        <w:rPr>
+          <w:lang w:val="ru-RU"/>
+        </w:rPr>
+        <w:t>, который проверяет качество простого рейтингового подхода;</w:t>
+      </w:r>
+    </w:p>
+    <w:p>
+      <w:pPr>
+        <w:pStyle w:val="a0"/>
+        <w:rPr>
+          <w:lang w:val="ru-RU"/>
+        </w:rPr>
+      </w:pPr>
+      <w:r>
+        <w:rPr>
+          <w:lang w:val="ru-RU"/>
+        </w:rPr>
+        <w:t xml:space="preserve">основные модели на полном наборе признаков: </w:t>
+      </w:r>
+      <w:r>
+        <w:t>Gradient</w:t>
+      </w:r>
+      <w:r>
+        <w:rPr>
+          <w:lang w:val="ru-RU"/>
+        </w:rPr>
+        <w:t xml:space="preserve"> </w:t>
+      </w:r>
+      <w:r>
+        <w:t>Boosting</w:t>
+      </w:r>
+      <w:r>
+        <w:rPr>
+          <w:lang w:val="ru-RU"/>
+        </w:rPr>
+        <w:t xml:space="preserve">, </w:t>
+      </w:r>
+      <w:proofErr w:type="spellStart"/>
+      <w:r>
+        <w:t>CatBoost</w:t>
+      </w:r>
+      <w:proofErr w:type="spellEnd"/>
+      <w:r>
+        <w:rPr>
+          <w:lang w:val="ru-RU"/>
+        </w:rPr>
+        <w:t xml:space="preserve"> и </w:t>
+      </w:r>
+      <w:r>
+        <w:t>Random</w:t>
+      </w:r>
+      <w:r>
+        <w:rPr>
+          <w:lang w:val="ru-RU"/>
+        </w:rPr>
+        <w:t xml:space="preserve"> </w:t>
+      </w:r>
+      <w:r>
+        <w:t>Forest</w:t>
+      </w:r>
+      <w:r>
+        <w:rPr>
+          <w:lang w:val="ru-RU"/>
+        </w:rPr>
+        <w:t>.</w:t>
+      </w:r>
+    </w:p>
+    <w:p>
+      <w:pPr>
+        <w:rPr>
+          <w:lang w:val="ru-RU"/>
+        </w:rPr>
+      </w:pPr>
+      <w:r>
+        <w:rPr>
+          <w:lang w:val="ru-RU"/>
+        </w:rPr>
+        <w:t xml:space="preserve">После оценки качества дополнительно обучается </w:t>
+      </w:r>
+      <w:r>
+        <w:t>production</w:t>
+      </w:r>
+      <w:r>
+        <w:rPr>
+          <w:lang w:val="ru-RU"/>
+        </w:rPr>
+        <w:t>-версия модели на всех доступных данных. Она используется для пользовательского прогноза конкретного матча, чтобы учитывать максимально свежую историю игроков.</w:t>
+      </w:r>
+    </w:p>
+    <w:p>
+      <w:pPr>
+        <w:pStyle w:val="1"/>
+        <w:rPr>
+          <w:lang w:val="ru-RU"/>
+        </w:rPr>
+      </w:pPr>
+      <w:bookmarkStart w:id="5" w:name="_Toc229557237"/>
+      <w:r>
+        <w:rPr>
+          <w:lang w:val="ru-RU"/>
+        </w:rPr>
+        <w:t>6. Качество построенных моделей машинного обучения</w:t>
+      </w:r>
+      <w:bookmarkEnd w:id="5"/>
+    </w:p>
+    <w:p>
+      <w:pPr>
+        <w:rPr>
+          <w:lang w:val="ru-RU"/>
+        </w:rPr>
+      </w:pPr>
+      <w:r>
+        <w:rPr>
+          <w:lang w:val="ru-RU"/>
+        </w:rPr>
+        <w:t xml:space="preserve">Главная метрика проекта — </w:t>
+      </w:r>
+      <w:proofErr w:type="spellStart"/>
+      <w:r>
+        <w:t>LogLoss</w:t>
+      </w:r>
+      <w:proofErr w:type="spellEnd"/>
+      <w:r>
+        <w:rPr>
+          <w:lang w:val="ru-RU"/>
+        </w:rPr>
+        <w:t xml:space="preserve">, потому что пользователю важен не только выбор победителя, но и качество вероятности. Также анализируются </w:t>
+      </w:r>
+      <w:r>
+        <w:t>Brier</w:t>
+      </w:r>
+      <w:r>
+        <w:rPr>
+          <w:lang w:val="ru-RU"/>
+        </w:rPr>
+        <w:t xml:space="preserve"> </w:t>
+      </w:r>
+      <w:r>
+        <w:t>score</w:t>
+      </w:r>
+      <w:r>
+        <w:rPr>
+          <w:lang w:val="ru-RU"/>
+        </w:rPr>
+        <w:t xml:space="preserve">, </w:t>
+      </w:r>
+      <w:r>
+        <w:t>ROC</w:t>
+      </w:r>
+      <w:r>
+        <w:rPr>
+          <w:lang w:val="ru-RU"/>
+        </w:rPr>
+        <w:t>-</w:t>
+      </w:r>
+      <w:r>
+        <w:t>AUC</w:t>
+      </w:r>
+      <w:r>
+        <w:rPr>
+          <w:lang w:val="ru-RU"/>
+        </w:rPr>
+        <w:t xml:space="preserve"> и </w:t>
+      </w:r>
+      <w:r>
+        <w:t>Accuracy</w:t>
+      </w:r>
+      <w:r>
+        <w:rPr>
+          <w:lang w:val="ru-RU"/>
+        </w:rPr>
+        <w:t xml:space="preserve">. </w:t>
+      </w:r>
+      <w:r>
+        <w:t>Brier</w:t>
+      </w:r>
+      <w:r>
+        <w:rPr>
+          <w:lang w:val="ru-RU"/>
+        </w:rPr>
+        <w:t xml:space="preserve"> </w:t>
+      </w:r>
+      <w:r>
+        <w:t>score</w:t>
+      </w:r>
+      <w:r>
+        <w:rPr>
+          <w:lang w:val="ru-RU"/>
+        </w:rPr>
+        <w:t xml:space="preserve"> показывает среднюю ошибку вероятностного прогноза, </w:t>
+      </w:r>
+      <w:r>
+        <w:t>ROC</w:t>
+      </w:r>
+      <w:r>
+        <w:rPr>
+          <w:lang w:val="ru-RU"/>
+        </w:rPr>
+        <w:t>-</w:t>
+      </w:r>
+      <w:r>
+        <w:t>AUC</w:t>
+      </w:r>
+      <w:r>
+        <w:rPr>
+          <w:lang w:val="ru-RU"/>
+        </w:rPr>
+        <w:t xml:space="preserve"> оценивает способность модели ранжировать победы выше поражений, а </w:t>
+      </w:r>
+      <w:r>
+        <w:t>Accuracy</w:t>
+      </w:r>
+      <w:r>
+        <w:rPr>
+          <w:lang w:val="ru-RU"/>
+        </w:rPr>
+        <w:t xml:space="preserve"> дает привычную долю правильных классификаций при пороге 0.5.</w:t>
+      </w:r>
+    </w:p>
+    <w:p>
+      <w:pPr>
+        <w:rPr>
+          <w:lang w:val="ru-RU"/>
+        </w:rPr>
+      </w:pPr>
+      <w:r>
+        <w:rPr>
+          <w:lang w:val="ru-RU"/>
+        </w:rPr>
+        <w:t xml:space="preserve">Ключевые результаты на </w:t>
+      </w:r>
+      <w:r>
+        <w:t>test</w:t>
+      </w:r>
+      <w:r>
+        <w:rPr>
+          <w:lang w:val="ru-RU"/>
+        </w:rPr>
+        <w:t>-периоде приведены ниже.</w:t>
+      </w:r>
+    </w:p>
     <w:tbl>
       <w:tblPr>
         <w:tblStyle w:val="aff0"/>
         <w:tblW w:w="0" w:type="auto"/>
         <w:tblLook w:val="04A0" w:firstRow="1" w:lastRow="0" w:firstColumn="1" w:lastColumn="0" w:noHBand="0" w:noVBand="1"/>
-      </w:tblPr>
-      <w:tblGrid>
-        <w:gridCol w:w="2262"/>
-        <w:gridCol w:w="1514"/>
-        <w:gridCol w:w="1531"/>
-        <w:gridCol w:w="1507"/>
-        <w:gridCol w:w="1507"/>
-        <w:gridCol w:w="1543"/>
-      </w:tblGrid>
-      <w:tr>
-        <w:tc>
-          <w:tcPr>
-            <w:tcW w:w="1608" w:type="dxa"/>
-          </w:tcPr>
-          <w:p>
-            <w:r>
-              <w:t>Модель</w:t>
-            </w:r>
-          </w:p>
-        </w:tc>
-        <w:tc>
-          <w:tcPr>
-            <w:tcW w:w="1608" w:type="dxa"/>
-          </w:tcPr>
-          <w:p>
-            <w:r>
-              <w:t>N матчей</w:t>
-            </w:r>
-          </w:p>
-        </w:tc>
-        <w:tc>
-          <w:tcPr>
-            <w:tcW w:w="1608" w:type="dxa"/>
-          </w:tcPr>
-          <w:p>
-            <w:r>
-              <w:t>LogLoss</w:t>
-            </w:r>
-          </w:p>
-        </w:tc>
-        <w:tc>
-          <w:tcPr>
-            <w:tcW w:w="1608" w:type="dxa"/>
-          </w:tcPr>
-          <w:p>
-            <w:r>
-              <w:t>Brier</w:t>
-            </w:r>
-          </w:p>
-        </w:tc>
-        <w:tc>
-          <w:tcPr>
-            <w:tcW w:w="1608" w:type="dxa"/>
-          </w:tcPr>
-          <w:p>
-            <w:r>
-              <w:t>ROC-AUC</w:t>
-            </w:r>
-          </w:p>
-        </w:tc>
-        <w:tc>
-          <w:tcPr>
-            <w:tcW w:w="1608" w:type="dxa"/>
-          </w:tcPr>
-          <w:p>
-            <w:r>
-              <w:t>Accuracy</w:t>
-            </w:r>
-          </w:p>
-        </w:tc>
-      </w:tr>
-      <w:tr>
-        <w:tc>
-          <w:tcPr>
-            <w:tcW w:w="1608" w:type="dxa"/>
-          </w:tcPr>
-          <w:p>
-            <w:pPr>
-              <w:rPr>
-                <w:lang w:val="ru-RU"/>
-              </w:rPr>
-            </w:pPr>
-            <w:r>
-              <w:t>Gradient</w:t>
-            </w:r>
-            <w:r>
-              <w:rPr>
-                <w:lang w:val="ru-RU"/>
-              </w:rPr>
-              <w:t xml:space="preserve"> </w:t>
-            </w:r>
-            <w:r>
-              <w:t>Boosting</w:t>
-            </w:r>
-            <w:r>
-              <w:rPr>
-                <w:lang w:val="ru-RU"/>
-              </w:rPr>
-              <w:t xml:space="preserve"> (итоговая основная модель)</w:t>
-            </w:r>
-          </w:p>
-        </w:tc>
-        <w:tc>
-          <w:tcPr>
-            <w:tcW w:w="1608" w:type="dxa"/>
-          </w:tcPr>
-          <w:p>
-            <w:r>
-              <w:t>1 233</w:t>
-            </w:r>
-          </w:p>
-        </w:tc>
-        <w:tc>
-          <w:tcPr>
-            <w:tcW w:w="1608" w:type="dxa"/>
-          </w:tcPr>
-          <w:p>
-            <w:r>
-              <w:t>0.4557</w:t>
-            </w:r>
-          </w:p>
-        </w:tc>
-        <w:tc>
-          <w:tcPr>
-            <w:tcW w:w="1608" w:type="dxa"/>
-          </w:tcPr>
-          <w:p>
-            <w:r>
-              <w:t>0.1498</w:t>
-            </w:r>
-          </w:p>
-        </w:tc>
-        <w:tc>
-          <w:tcPr>
-            <w:tcW w:w="1608" w:type="dxa"/>
-          </w:tcPr>
-          <w:p>
-            <w:r>
-              <w:t>0.8658</w:t>
-            </w:r>
-          </w:p>
-        </w:tc>
-        <w:tc>
-          <w:tcPr>
-            <w:tcW w:w="1608" w:type="dxa"/>
-          </w:tcPr>
-          <w:p>
-            <w:r>
-              <w:t>78.1%</w:t>
-            </w:r>
-          </w:p>
-        </w:tc>
-      </w:tr>
-      <w:tr>
-        <w:tc>
-          <w:tcPr>
-            <w:tcW w:w="1608" w:type="dxa"/>
-          </w:tcPr>
-          <w:p>
-            <w:r>
-              <w:t>CatBoost</w:t>
-            </w:r>
-          </w:p>
-        </w:tc>
-        <w:tc>
-          <w:tcPr>
-            <w:tcW w:w="1608" w:type="dxa"/>
-          </w:tcPr>
-          <w:p>
-            <w:r>
-              <w:t>1 233</w:t>
-            </w:r>
-          </w:p>
-        </w:tc>
-        <w:tc>
-          <w:tcPr>
-            <w:tcW w:w="1608" w:type="dxa"/>
-          </w:tcPr>
-          <w:p>
-            <w:r>
-              <w:t>0.4561</w:t>
-            </w:r>
-          </w:p>
-        </w:tc>
-        <w:tc>
-          <w:tcPr>
-            <w:tcW w:w="1608" w:type="dxa"/>
-          </w:tcPr>
-          <w:p>
-            <w:r>
-              <w:t>0.1501</w:t>
-            </w:r>
-          </w:p>
-        </w:tc>
-        <w:tc>
-          <w:tcPr>
-            <w:tcW w:w="1608" w:type="dxa"/>
-          </w:tcPr>
-          <w:p>
-            <w:r>
-              <w:t>0.8653</w:t>
-            </w:r>
-          </w:p>
-        </w:tc>
-        <w:tc>
-          <w:tcPr>
-            <w:tcW w:w="1608" w:type="dxa"/>
-          </w:tcPr>
-          <w:p>
-            <w:r>
-              <w:t>78.3%</w:t>
-            </w:r>
-          </w:p>
-        </w:tc>
-      </w:tr>
-      <w:tr>
-        <w:tc>
-          <w:tcPr>
-            <w:tcW w:w="1608" w:type="dxa"/>
-          </w:tcPr>
-          <w:p>
-            <w:r>
-              <w:t>Random Forest</w:t>
-            </w:r>
-          </w:p>
-        </w:tc>
-        <w:tc>
-          <w:tcPr>
-            <w:tcW w:w="1608" w:type="dxa"/>
-          </w:tcPr>
-          <w:p>
-            <w:r>
-              <w:t>1 233</w:t>
-            </w:r>
-          </w:p>
-        </w:tc>
-        <w:tc>
-          <w:tcPr>
-            <w:tcW w:w="1608" w:type="dxa"/>
-          </w:tcPr>
-          <w:p>
-            <w:r>
-              <w:t>0.4621</w:t>
-            </w:r>
-          </w:p>
-        </w:tc>
-        <w:tc>
-          <w:tcPr>
-            <w:tcW w:w="1608" w:type="dxa"/>
-          </w:tcPr>
-          <w:p>
-            <w:r>
-              <w:t>0.1518</w:t>
-            </w:r>
-          </w:p>
-        </w:tc>
-        <w:tc>
-          <w:tcPr>
-            <w:tcW w:w="1608" w:type="dxa"/>
-          </w:tcPr>
-          <w:p>
-            <w:r>
-              <w:t>0.8621</w:t>
-            </w:r>
-          </w:p>
-        </w:tc>
-        <w:tc>
-          <w:tcPr>
-            <w:tcW w:w="1608" w:type="dxa"/>
-          </w:tcPr>
-          <w:p>
-            <w:r>
-              <w:t>77.2%</w:t>
-            </w:r>
-          </w:p>
-        </w:tc>
-      </w:tr>
-      <w:tr>
-        <w:tc>
-          <w:tcPr>
-            <w:tcW w:w="1608" w:type="dxa"/>
-          </w:tcPr>
-          <w:p>
-            <w:r>
-              <w:t>Логистическая регрессия: рейтинг + ELO</w:t>
-            </w:r>
-          </w:p>
-        </w:tc>
-        <w:tc>
-          <w:tcPr>
-            <w:tcW w:w="1608" w:type="dxa"/>
-          </w:tcPr>
-          <w:p>
-            <w:r>
-              <w:t>1 233</w:t>
-            </w:r>
-          </w:p>
-        </w:tc>
-        <w:tc>
-          <w:tcPr>
-            <w:tcW w:w="1608" w:type="dxa"/>
-          </w:tcPr>
-          <w:p>
-            <w:r>
-              <w:t>0.4942</w:t>
-            </w:r>
-          </w:p>
-        </w:tc>
-        <w:tc>
-          <w:tcPr>
-            <w:tcW w:w="1608" w:type="dxa"/>
-          </w:tcPr>
-          <w:p>
-            <w:r>
-              <w:t>0.1635</w:t>
-            </w:r>
-          </w:p>
-        </w:tc>
-        <w:tc>
-          <w:tcPr>
-            <w:tcW w:w="1608" w:type="dxa"/>
-          </w:tcPr>
-          <w:p>
-            <w:r>
-              <w:t>0.8403</w:t>
-            </w:r>
-          </w:p>
-        </w:tc>
-        <w:tc>
-          <w:tcPr>
-            <w:tcW w:w="1608" w:type="dxa"/>
-          </w:tcPr>
-          <w:p>
-            <w:r>
-              <w:t>75.8%</w:t>
-            </w:r>
-          </w:p>
-        </w:tc>
-      </w:tr>
-      <w:tr>
-        <w:tc>
-          <w:tcPr>
-            <w:tcW w:w="1608" w:type="dxa"/>
-          </w:tcPr>
-          <w:p>
-            <w:r>
-              <w:t>Только скорректированный рейтинг</w:t>
-            </w:r>
-          </w:p>
-        </w:tc>
-        <w:tc>
-          <w:tcPr>
-            <w:tcW w:w="1608" w:type="dxa"/>
-          </w:tcPr>
-          <w:p>
-            <w:r>
-              <w:t>1 109</w:t>
-            </w:r>
-          </w:p>
-        </w:tc>
-        <w:tc>
-          <w:tcPr>
-            <w:tcW w:w="1608" w:type="dxa"/>
-          </w:tcPr>
-          <w:p>
-            <w:r>
-              <w:t>0.5666</w:t>
-            </w:r>
-          </w:p>
-        </w:tc>
-        <w:tc>
-          <w:tcPr>
-            <w:tcW w:w="1608" w:type="dxa"/>
-          </w:tcPr>
-          <w:p>
-            <w:r>
-              <w:t>0.1813</w:t>
-            </w:r>
-          </w:p>
-        </w:tc>
-        <w:tc>
-          <w:tcPr>
-            <w:tcW w:w="1608" w:type="dxa"/>
-          </w:tcPr>
-          <w:p>
-            <w:r>
-              <w:t>0.8161</w:t>
-            </w:r>
-          </w:p>
-        </w:tc>
-        <w:tc>
-          <w:tcPr>
-            <w:tcW w:w="1608" w:type="dxa"/>
-          </w:tcPr>
-          <w:p>
-            <w:r>
-              <w:t>75.8%</w:t>
-            </w:r>
-          </w:p>
-        </w:tc>
-      </w:tr>
-      <w:tr>
-        <w:tc>
-          <w:tcPr>
-            <w:tcW w:w="1608" w:type="dxa"/>
-          </w:tcPr>
-          <w:p>
-            <w:r>
-              <w:t>Только относительная разница очков</w:t>
-            </w:r>
-          </w:p>
-        </w:tc>
-        <w:tc>
-          <w:tcPr>
-            <w:tcW w:w="1608" w:type="dxa"/>
-          </w:tcPr>
-          <w:p>
-            <w:r>
-              <w:t>1 109</w:t>
-            </w:r>
-          </w:p>
-        </w:tc>
-        <w:tc>
-          <w:tcPr>
-            <w:tcW w:w="1608" w:type="dxa"/>
-          </w:tcPr>
-          <w:p>
-            <w:r>
-              <w:t>0.5680</w:t>
-            </w:r>
-          </w:p>
-        </w:tc>
-        <w:tc>
-          <w:tcPr>
-            <w:tcW w:w="1608" w:type="dxa"/>
-          </w:tcPr>
-          <w:p>
-            <w:r>
-              <w:t>0.1760</w:t>
-            </w:r>
-          </w:p>
-        </w:tc>
-        <w:tc>
-          <w:tcPr>
-            <w:tcW w:w="1608" w:type="dxa"/>
-          </w:tcPr>
-          <w:p>
-            <w:r>
-              <w:t>0.8274</w:t>
-            </w:r>
-          </w:p>
-        </w:tc>
-        <w:tc>
-          <w:tcPr>
-            <w:tcW w:w="1608" w:type="dxa"/>
-          </w:tcPr>
-          <w:p>
-            <w:r>
-              <w:t>74.9%</w:t>
-            </w:r>
-          </w:p>
-        </w:tc>
-      </w:tr>
-      <w:tr>
-        <w:tc>
-          <w:tcPr>
-            <w:tcW w:w="1608" w:type="dxa"/>
-          </w:tcPr>
-          <w:p>
-            <w:r>
-              <w:t>Только официальный рейтинг</w:t>
-            </w:r>
-          </w:p>
-        </w:tc>
-        <w:tc>
-          <w:tcPr>
-            <w:tcW w:w="1608" w:type="dxa"/>
-          </w:tcPr>
-          <w:p>
-            <w:r>
-              <w:t>1 109</w:t>
-            </w:r>
-          </w:p>
-        </w:tc>
-        <w:tc>
-          <w:tcPr>
-            <w:tcW w:w="1608" w:type="dxa"/>
-          </w:tcPr>
-          <w:p>
-            <w:r>
-              <w:t>0.6691</w:t>
-            </w:r>
-          </w:p>
-        </w:tc>
-        <w:tc>
-          <w:tcPr>
-            <w:tcW w:w="1608" w:type="dxa"/>
-          </w:tcPr>
-          <w:p>
-            <w:r>
-              <w:t>0.1823</w:t>
-            </w:r>
-          </w:p>
-        </w:tc>
-        <w:tc>
-          <w:tcPr>
-            <w:tcW w:w="1608" w:type="dxa"/>
-          </w:tcPr>
-          <w:p>
-            <w:r>
-              <w:t>0.8080</w:t>
-            </w:r>
-          </w:p>
-        </w:tc>
-        <w:tc>
-          <w:tcPr>
-            <w:tcW w:w="1608" w:type="dxa"/>
-          </w:tcPr>
-          <w:p>
-            <w:r>
-              <w:t>74.9%</w:t>
-            </w:r>
-          </w:p>
-        </w:tc>
-      </w:tr>
-      <w:tr>
-        <w:tc>
-          <w:tcPr>
-            <w:tcW w:w="1608" w:type="dxa"/>
-          </w:tcPr>
-          <w:p>
-            <w:r>
-              <w:t>Только ELO</w:t>
-            </w:r>
-          </w:p>
-        </w:tc>
-        <w:tc>
-          <w:tcPr>
-            <w:tcW w:w="1608" w:type="dxa"/>
-          </w:tcPr>
-          <w:p>
-            <w:r>
-              <w:t>1 233</w:t>
-            </w:r>
-          </w:p>
-        </w:tc>
-        <w:tc>
-          <w:tcPr>
-            <w:tcW w:w="1608" w:type="dxa"/>
-          </w:tcPr>
-          <w:p>
-            <w:r>
-              <w:t>0.6003</w:t>
-            </w:r>
-          </w:p>
-        </w:tc>
-        <w:tc>
-          <w:tcPr>
-            <w:tcW w:w="1608" w:type="dxa"/>
-          </w:tcPr>
-          <w:p>
-            <w:r>
-              <w:t>0.2065</w:t>
-            </w:r>
-          </w:p>
-        </w:tc>
-        <w:tc>
-          <w:tcPr>
-            <w:tcW w:w="1608" w:type="dxa"/>
-          </w:tcPr>
-          <w:p>
-            <w:r>
-              <w:t>0.7475</w:t>
-            </w:r>
-          </w:p>
-        </w:tc>
-        <w:tc>
-          <w:tcPr>
-            <w:tcW w:w="1608" w:type="dxa"/>
-          </w:tcPr>
-          <w:p>
-            <w:r>
-              <w:t>69.2%</w:t>
-            </w:r>
-          </w:p>
-        </w:tc>
-      </w:tr>
-    </w:tbl>
-    <w:tbl>
-      <w:tblPr>
-        <w:tblStyle w:val="aff0"/>
-        <w:tblW w:w="0" w:type="auto"/>
-        <w:tblLook w:val="04A0" w:firstRow="1" w:lastRow="0" w:firstColumn="1" w:lastColumn="0" w:noHBand="0" w:noVBand="1"/>
-      </w:tblPr>
-      <w:tblGrid>
-        <w:gridCol w:w="1608"/>
-        <w:gridCol w:w="1608"/>
-        <w:gridCol w:w="1608"/>
-        <w:gridCol w:w="1608"/>
-        <w:gridCol w:w="1608"/>
-        <w:gridCol w:w="1608"/>
-      </w:tblGrid>
-      <w:tr>
-        <w:tc>
-          <w:tcPr>
-            <w:tcW w:w="1608" w:type="dxa"/>
-          </w:tcPr>
-          <w:p>
-            <w:r>
-              <w:t>Модель</w:t>
-            </w:r>
-          </w:p>
-        </w:tc>
-        <w:tc>
-          <w:tcPr>
-            <w:tcW w:w="1608" w:type="dxa"/>
-          </w:tcPr>
-          <w:p>
-            <w:r>
-              <w:t>Train LogLoss</w:t>
-            </w:r>
-          </w:p>
-        </w:tc>
-        <w:tc>
-          <w:tcPr>
-            <w:tcW w:w="1608" w:type="dxa"/>
-          </w:tcPr>
-          <w:p>
-            <w:r>
-              <w:t>Test LogLoss</w:t>
-            </w:r>
-          </w:p>
-        </w:tc>
-        <w:tc>
-          <w:tcPr>
-            <w:tcW w:w="1608" w:type="dxa"/>
-          </w:tcPr>
-          <w:p>
-            <w:r>
-              <w:t>Gap</w:t>
-            </w:r>
-          </w:p>
-        </w:tc>
-        <w:tc>
-          <w:tcPr>
-            <w:tcW w:w="1608" w:type="dxa"/>
-          </w:tcPr>
-          <w:p>
-            <w:r>
-              <w:t>Train ROC-AUC</w:t>
-            </w:r>
-          </w:p>
-        </w:tc>
-        <w:tc>
-          <w:tcPr>
-            <w:tcW w:w="1608" w:type="dxa"/>
-          </w:tcPr>
-          <w:p>
-            <w:r>
-              <w:t>Test ROC-AUC</w:t>
-            </w:r>
-          </w:p>
-        </w:tc>
-      </w:tr>
-      <w:tr>
-        <w:tc>
-          <w:tcPr>
-            <w:tcW w:w="1608" w:type="dxa"/>
-          </w:tcPr>
-          <w:p>
-            <w:r>
-              <w:t>Gradient Boosting</w:t>
-            </w:r>
-          </w:p>
-        </w:tc>
-        <w:tc>
-          <w:tcPr>
-            <w:tcW w:w="1608" w:type="dxa"/>
-          </w:tcPr>
-          <w:p>
-            <w:r>
-              <w:t>0.4408</w:t>
-            </w:r>
-          </w:p>
-        </w:tc>
-        <w:tc>
-          <w:tcPr>
-            <w:tcW w:w="1608" w:type="dxa"/>
-          </w:tcPr>
-          <w:p>
-            <w:r>
-              <w:t>0.4598</w:t>
-            </w:r>
-          </w:p>
-        </w:tc>
-        <w:tc>
-          <w:tcPr>
-            <w:tcW w:w="1608" w:type="dxa"/>
-          </w:tcPr>
-          <w:p>
-            <w:r>
-              <w:t>0.0190</w:t>
-            </w:r>
-          </w:p>
-        </w:tc>
-        <w:tc>
-          <w:tcPr>
-            <w:tcW w:w="1608" w:type="dxa"/>
-          </w:tcPr>
-          <w:p>
-            <w:r>
-              <w:t>0.8767</w:t>
-            </w:r>
-          </w:p>
-        </w:tc>
-        <w:tc>
-          <w:tcPr>
-            <w:tcW w:w="1608" w:type="dxa"/>
-          </w:tcPr>
-          <w:p>
-            <w:r>
-              <w:t>0.8636</w:t>
-            </w:r>
-          </w:p>
-        </w:tc>
-      </w:tr>
-      <w:tr>
-        <w:tc>
-          <w:tcPr>
-            <w:tcW w:w="1608" w:type="dxa"/>
-          </w:tcPr>
-          <w:p>
-            <w:r>
-              <w:t>CatBoost</w:t>
-            </w:r>
-          </w:p>
-        </w:tc>
-        <w:tc>
-          <w:tcPr>
-            <w:tcW w:w="1608" w:type="dxa"/>
-          </w:tcPr>
-          <w:p>
-            <w:r>
-              <w:t>0.4229</w:t>
-            </w:r>
-          </w:p>
-        </w:tc>
-        <w:tc>
-          <w:tcPr>
-            <w:tcW w:w="1608" w:type="dxa"/>
-          </w:tcPr>
-          <w:p>
-            <w:r>
-              <w:t>0.4599</w:t>
-            </w:r>
-          </w:p>
-        </w:tc>
-        <w:tc>
-          <w:tcPr>
-            <w:tcW w:w="1608" w:type="dxa"/>
-          </w:tcPr>
-          <w:p>
-            <w:r>
-              <w:t>0.0370</w:t>
-            </w:r>
-          </w:p>
-        </w:tc>
-        <w:tc>
-          <w:tcPr>
-            <w:tcW w:w="1608" w:type="dxa"/>
-          </w:tcPr>
-          <w:p>
-            <w:r>
-              <w:t>0.8897</w:t>
-            </w:r>
-          </w:p>
-        </w:tc>
-        <w:tc>
-          <w:tcPr>
-            <w:tcW w:w="1608" w:type="dxa"/>
-          </w:tcPr>
-          <w:p>
-            <w:r>
-              <w:t>0.8632</w:t>
-            </w:r>
-          </w:p>
-        </w:tc>
-      </w:tr>
-      <w:tr>
-        <w:tc>
-          <w:tcPr>
-            <w:tcW w:w="1608" w:type="dxa"/>
-          </w:tcPr>
-          <w:p>
-            <w:r>
-              <w:t>Random Forest</w:t>
-            </w:r>
-          </w:p>
-        </w:tc>
-        <w:tc>
-          <w:tcPr>
-            <w:tcW w:w="1608" w:type="dxa"/>
-          </w:tcPr>
-          <w:p>
-            <w:r>
-              <w:t>0.3236</w:t>
-            </w:r>
-          </w:p>
-        </w:tc>
-        <w:tc>
-          <w:tcPr>
-            <w:tcW w:w="1608" w:type="dxa"/>
-          </w:tcPr>
-          <w:p>
-            <w:r>
-              <w:t>0.4637</w:t>
-            </w:r>
-          </w:p>
-        </w:tc>
-        <w:tc>
-          <w:tcPr>
-            <w:tcW w:w="1608" w:type="dxa"/>
-          </w:tcPr>
-          <w:p>
-            <w:r>
-              <w:t>0.1401</w:t>
-            </w:r>
-          </w:p>
-        </w:tc>
-        <w:tc>
-          <w:tcPr>
-            <w:tcW w:w="1608" w:type="dxa"/>
-          </w:tcPr>
-          <w:p>
-            <w:r>
-              <w:t>0.9626</w:t>
-            </w:r>
-          </w:p>
-        </w:tc>
-        <w:tc>
-          <w:tcPr>
-            <w:tcW w:w="1608" w:type="dxa"/>
-          </w:tcPr>
-          <w:p>
-            <w:r>
-              <w:t>0.8608</w:t>
-            </w:r>
-          </w:p>
-        </w:tc>
-      </w:tr>
-    </w:tbl>
-    <w:tbl>
-      <w:tblPr>
-        <w:tblStyle w:val="aff0"/>
-        <w:tblW w:w="0" w:type="auto"/>
-        <w:tblLook w:val="04A0" w:firstRow="1" w:lastRow="0" w:firstColumn="1" w:lastColumn="0" w:noHBand="0" w:noVBand="1"/>
-      </w:tblPr>
-      <w:tblGrid>
-        <w:gridCol w:w="4590"/>
-        <w:gridCol w:w="1548"/>
-        <w:gridCol w:w="1730"/>
-        <w:gridCol w:w="1996"/>
-      </w:tblGrid>
-      <w:tr>
-        <w:tc>
-          <w:tcPr>
-            <w:tcW w:w="2412" w:type="dxa"/>
-          </w:tcPr>
-          <w:p>
-            <w:r>
-              <w:t>Признак</w:t>
-            </w:r>
-          </w:p>
-        </w:tc>
-        <w:tc>
-          <w:tcPr>
-            <w:tcW w:w="2412" w:type="dxa"/>
-          </w:tcPr>
-          <w:p>
-            <w:r>
-              <w:t>Группа</w:t>
-            </w:r>
-          </w:p>
-        </w:tc>
-        <w:tc>
-          <w:tcPr>
-            <w:tcW w:w="2412" w:type="dxa"/>
-          </w:tcPr>
-          <w:p>
-            <w:r>
-              <w:t>PredictionValuesChange</w:t>
-            </w:r>
-          </w:p>
-        </w:tc>
-        <w:tc>
-          <w:tcPr>
-            <w:tcW w:w="2412" w:type="dxa"/>
-          </w:tcPr>
-          <w:p>
-            <w:r>
-              <w:t>Смысл</w:t>
-            </w:r>
-          </w:p>
-        </w:tc>
-      </w:tr>
-      <w:tr>
-        <w:tc>
-          <w:tcPr>
-            <w:tcW w:w="2412" w:type="dxa"/>
-          </w:tcPr>
-          <w:p>
-            <w:r>
-              <w:t>rel_diff_points_per_counting_tournament_pct_min_pre_observed_only</w:t>
-            </w:r>
-          </w:p>
-        </w:tc>
-        <w:tc>
-          <w:tcPr>
-            <w:tcW w:w="2412" w:type="dxa"/>
-          </w:tcPr>
-          <w:p>
-            <w:r>
-              <w:t>Скорректированный рейтинг</w:t>
-            </w:r>
-          </w:p>
-        </w:tc>
-        <w:tc>
-          <w:tcPr>
-            <w:tcW w:w="2412" w:type="dxa"/>
-          </w:tcPr>
-          <w:p>
-            <w:r>
-              <w:t>10.2024</w:t>
-            </w:r>
-          </w:p>
-        </w:tc>
-        <w:tc>
-          <w:tcPr>
-            <w:tcW w:w="2412" w:type="dxa"/>
-          </w:tcPr>
-          <w:p>
-            <w:pPr>
-              <w:rPr>
-                <w:lang w:val="ru-RU"/>
-              </w:rPr>
-            </w:pPr>
-            <w:r>
-              <w:rPr>
-                <w:lang w:val="ru-RU"/>
-              </w:rPr>
-              <w:t>Относительная разница средних очков на зачётный турнир в процентах от меньшего значения.</w:t>
-            </w:r>
-          </w:p>
-        </w:tc>
-      </w:tr>
-      <w:tr>
-        <w:tc>
-          <w:tcPr>
-            <w:tcW w:w="2412" w:type="dxa"/>
-          </w:tcPr>
-          <w:p>
-            <w:proofErr w:type="spellStart"/>
-            <w:r>
-              <w:t>elo_diff</w:t>
-            </w:r>
-            <w:proofErr w:type="spellEnd"/>
-          </w:p>
-        </w:tc>
-        <w:tc>
-          <w:tcPr>
-            <w:tcW w:w="2412" w:type="dxa"/>
-          </w:tcPr>
-          <w:p>
-            <w:r>
-              <w:t>ELO</w:t>
-            </w:r>
-          </w:p>
-        </w:tc>
-        <w:tc>
-          <w:tcPr>
-            <w:tcW w:w="2412" w:type="dxa"/>
-          </w:tcPr>
-          <w:p>
-            <w:r>
-              <w:t>8.4629</w:t>
-            </w:r>
-          </w:p>
-        </w:tc>
-        <w:tc>
-          <w:tcPr>
-            <w:tcW w:w="2412" w:type="dxa"/>
-          </w:tcPr>
-          <w:p>
-            <w:pPr>
-              <w:rPr>
-                <w:lang w:val="ru-RU"/>
-              </w:rPr>
-            </w:pPr>
-            <w:r>
-              <w:rPr>
-                <w:lang w:val="ru-RU"/>
-              </w:rPr>
-              <w:t xml:space="preserve">Разница </w:t>
-            </w:r>
-            <w:r>
-              <w:t>ELO</w:t>
-            </w:r>
-            <w:r>
-              <w:rPr>
-                <w:lang w:val="ru-RU"/>
-              </w:rPr>
-              <w:t xml:space="preserve"> игрока и соперника.</w:t>
-            </w:r>
-          </w:p>
-        </w:tc>
-      </w:tr>
-      <w:tr>
-        <w:tc>
-          <w:tcPr>
-            <w:tcW w:w="2412" w:type="dxa"/>
-          </w:tcPr>
-          <w:p>
-            <w:proofErr w:type="spellStart"/>
-            <w:r>
-              <w:t>expected_win_prob_elo</w:t>
-            </w:r>
-            <w:proofErr w:type="spellEnd"/>
-          </w:p>
-        </w:tc>
-        <w:tc>
-          <w:tcPr>
-            <w:tcW w:w="2412" w:type="dxa"/>
-          </w:tcPr>
-          <w:p>
-            <w:r>
-              <w:t>ELO</w:t>
-            </w:r>
-          </w:p>
-        </w:tc>
-        <w:tc>
-          <w:tcPr>
-            <w:tcW w:w="2412" w:type="dxa"/>
-          </w:tcPr>
-          <w:p>
-            <w:r>
-              <w:t>7.5909</w:t>
-            </w:r>
-          </w:p>
-        </w:tc>
-        <w:tc>
-          <w:tcPr>
-            <w:tcW w:w="2412" w:type="dxa"/>
-          </w:tcPr>
-          <w:p>
-            <w:pPr>
-              <w:rPr>
-                <w:lang w:val="ru-RU"/>
-              </w:rPr>
-            </w:pPr>
-            <w:r>
-              <w:rPr>
-                <w:lang w:val="ru-RU"/>
-              </w:rPr>
-              <w:t xml:space="preserve">Вероятность победы игрока по </w:t>
-            </w:r>
-            <w:r>
-              <w:t>ELO</w:t>
-            </w:r>
-            <w:r>
-              <w:rPr>
-                <w:lang w:val="ru-RU"/>
-              </w:rPr>
-              <w:t xml:space="preserve"> до матча.</w:t>
-            </w:r>
-          </w:p>
-        </w:tc>
-      </w:tr>
-      <w:tr>
-        <w:tc>
-          <w:tcPr>
-            <w:tcW w:w="2412" w:type="dxa"/>
-          </w:tcPr>
-          <w:p>
-            <w:proofErr w:type="spellStart"/>
-            <w:r>
-              <w:t>diff_rank_pre_observed_only</w:t>
-            </w:r>
-            <w:proofErr w:type="spellEnd"/>
-          </w:p>
-        </w:tc>
-        <w:tc>
-          <w:tcPr>
-            <w:tcW w:w="2412" w:type="dxa"/>
-          </w:tcPr>
-          <w:p>
-            <w:r>
-              <w:t>Официальный рейтинг</w:t>
-            </w:r>
-          </w:p>
-        </w:tc>
-        <w:tc>
-          <w:tcPr>
-            <w:tcW w:w="2412" w:type="dxa"/>
-          </w:tcPr>
-          <w:p>
-            <w:r>
-              <w:t>6.7823</w:t>
-            </w:r>
-          </w:p>
-        </w:tc>
-        <w:tc>
-          <w:tcPr>
-            <w:tcW w:w="2412" w:type="dxa"/>
-          </w:tcPr>
-          <w:p>
-            <w:pPr>
-              <w:rPr>
-                <w:lang w:val="ru-RU"/>
-              </w:rPr>
-            </w:pPr>
-            <w:r>
-              <w:rPr>
-                <w:lang w:val="ru-RU"/>
-              </w:rPr>
-              <w:t>Разница рангов игрока и соперника до матча; считается только если ранг есть у обоих.</w:t>
-            </w:r>
-          </w:p>
-        </w:tc>
-      </w:tr>
-      <w:tr>
-        <w:tc>
-          <w:tcPr>
-            <w:tcW w:w="2412" w:type="dxa"/>
-          </w:tcPr>
-          <w:p>
-            <w:proofErr w:type="spellStart"/>
-            <w:r>
-              <w:t>diff_points_per_counting_tournament_pre_observed_only</w:t>
-            </w:r>
-            <w:proofErr w:type="spellEnd"/>
-          </w:p>
-        </w:tc>
-        <w:tc>
-          <w:tcPr>
-            <w:tcW w:w="2412" w:type="dxa"/>
-          </w:tcPr>
-          <w:p>
-            <w:r>
-              <w:t xml:space="preserve">Скорректированный </w:t>
-            </w:r>
-            <w:r>
-              <w:lastRenderedPageBreak/>
-              <w:t>рейтинг</w:t>
-            </w:r>
-          </w:p>
-        </w:tc>
-        <w:tc>
-          <w:tcPr>
-            <w:tcW w:w="2412" w:type="dxa"/>
-          </w:tcPr>
-          <w:p>
-            <w:r>
-              <w:lastRenderedPageBreak/>
-              <w:t>5.0317</w:t>
-            </w:r>
-          </w:p>
-        </w:tc>
-        <w:tc>
-          <w:tcPr>
-            <w:tcW w:w="2412" w:type="dxa"/>
-          </w:tcPr>
-          <w:p>
-            <w:pPr>
-              <w:rPr>
-                <w:lang w:val="ru-RU"/>
-              </w:rPr>
-            </w:pPr>
-            <w:r>
-              <w:rPr>
-                <w:lang w:val="ru-RU"/>
-              </w:rPr>
-              <w:t xml:space="preserve">Разница средних рейтинговых </w:t>
-            </w:r>
-            <w:r>
-              <w:rPr>
-                <w:lang w:val="ru-RU"/>
-              </w:rPr>
-              <w:lastRenderedPageBreak/>
-              <w:t xml:space="preserve">очков на один зачётный турнир: </w:t>
-            </w:r>
-            <w:r>
-              <w:t>points</w:t>
-            </w:r>
-            <w:r>
-              <w:rPr>
-                <w:lang w:val="ru-RU"/>
-              </w:rPr>
-              <w:t xml:space="preserve"> / </w:t>
-            </w:r>
-            <w:r>
-              <w:t>rated</w:t>
-            </w:r>
-            <w:r>
-              <w:rPr>
-                <w:lang w:val="ru-RU"/>
-              </w:rPr>
-              <w:t>_</w:t>
-            </w:r>
-            <w:r>
-              <w:t>counting</w:t>
-            </w:r>
-            <w:r>
-              <w:rPr>
-                <w:lang w:val="ru-RU"/>
-              </w:rPr>
-              <w:t>_</w:t>
-            </w:r>
-            <w:r>
-              <w:t>tournaments</w:t>
-            </w:r>
-            <w:r>
-              <w:rPr>
-                <w:lang w:val="ru-RU"/>
-              </w:rPr>
-              <w:t>.</w:t>
-            </w:r>
-          </w:p>
-        </w:tc>
-      </w:tr>
-      <w:tr>
-        <w:tc>
-          <w:tcPr>
-            <w:tcW w:w="2412" w:type="dxa"/>
-          </w:tcPr>
-          <w:p>
-            <w:proofErr w:type="spellStart"/>
-            <w:r>
-              <w:lastRenderedPageBreak/>
-              <w:t>rel_diff_points_pct_min_pre_observed_only</w:t>
-            </w:r>
-            <w:proofErr w:type="spellEnd"/>
-          </w:p>
-        </w:tc>
-        <w:tc>
-          <w:tcPr>
-            <w:tcW w:w="2412" w:type="dxa"/>
-          </w:tcPr>
-          <w:p>
-            <w:r>
-              <w:t>Официальный рейтинг</w:t>
-            </w:r>
-          </w:p>
-        </w:tc>
-        <w:tc>
-          <w:tcPr>
-            <w:tcW w:w="2412" w:type="dxa"/>
-          </w:tcPr>
-          <w:p>
-            <w:r>
-              <w:t>3.2939</w:t>
-            </w:r>
-          </w:p>
-        </w:tc>
-        <w:tc>
-          <w:tcPr>
-            <w:tcW w:w="2412" w:type="dxa"/>
-          </w:tcPr>
-          <w:p>
-            <w:pPr>
-              <w:rPr>
-                <w:lang w:val="ru-RU"/>
-              </w:rPr>
-            </w:pPr>
-            <w:r>
-              <w:rPr>
-                <w:lang w:val="ru-RU"/>
-              </w:rPr>
-              <w:t>Относительная разница рейтинговых очков в процентах от меньшего из двух значений.</w:t>
-            </w:r>
-          </w:p>
-        </w:tc>
-      </w:tr>
-      <w:tr>
-        <w:tc>
-          <w:tcPr>
-            <w:tcW w:w="2412" w:type="dxa"/>
-          </w:tcPr>
-          <w:p>
-            <w:r>
-              <w:t>opp_elo_last_5</w:t>
-            </w:r>
-          </w:p>
-        </w:tc>
-        <w:tc>
-          <w:tcPr>
-            <w:tcW w:w="2412" w:type="dxa"/>
-          </w:tcPr>
-          <w:p>
-            <w:r>
-              <w:t>Сила соперников</w:t>
-            </w:r>
-          </w:p>
-        </w:tc>
-        <w:tc>
-          <w:tcPr>
-            <w:tcW w:w="2412" w:type="dxa"/>
-          </w:tcPr>
-          <w:p>
-            <w:r>
-              <w:t>4.8603</w:t>
-            </w:r>
-          </w:p>
-        </w:tc>
-        <w:tc>
-          <w:tcPr>
-            <w:tcW w:w="2412" w:type="dxa"/>
-          </w:tcPr>
-          <w:p>
-            <w:pPr>
-              <w:rPr>
-                <w:lang w:val="ru-RU"/>
-              </w:rPr>
-            </w:pPr>
-            <w:r>
-              <w:rPr>
-                <w:lang w:val="ru-RU"/>
-              </w:rPr>
-              <w:t xml:space="preserve">Средний </w:t>
-            </w:r>
-            <w:r>
-              <w:t>ELO</w:t>
-            </w:r>
-            <w:r>
-              <w:rPr>
-                <w:lang w:val="ru-RU"/>
-              </w:rPr>
-              <w:t xml:space="preserve"> последних пяти соперников игрока.</w:t>
-            </w:r>
-          </w:p>
-        </w:tc>
-      </w:tr>
-      <w:tr>
-        <w:tc>
-          <w:tcPr>
-            <w:tcW w:w="2412" w:type="dxa"/>
-          </w:tcPr>
-          <w:p>
-            <w:proofErr w:type="spellStart"/>
-            <w:r>
-              <w:t>opponent_points_per_counting_tournament_pre</w:t>
-            </w:r>
-            <w:proofErr w:type="spellEnd"/>
-          </w:p>
-        </w:tc>
-        <w:tc>
-          <w:tcPr>
-            <w:tcW w:w="2412" w:type="dxa"/>
-          </w:tcPr>
-          <w:p>
-            <w:r>
-              <w:t>Скорректированный рейтинг</w:t>
-            </w:r>
-          </w:p>
-        </w:tc>
-        <w:tc>
-          <w:tcPr>
-            <w:tcW w:w="2412" w:type="dxa"/>
-          </w:tcPr>
-          <w:p>
-            <w:r>
-              <w:t>3.6733</w:t>
-            </w:r>
-          </w:p>
-        </w:tc>
-        <w:tc>
-          <w:tcPr>
-            <w:tcW w:w="2412" w:type="dxa"/>
-          </w:tcPr>
-          <w:p>
-            <w:pPr>
-              <w:rPr>
-                <w:lang w:val="ru-RU"/>
-              </w:rPr>
-            </w:pPr>
-            <w:r>
-              <w:rPr>
-                <w:lang w:val="ru-RU"/>
-              </w:rPr>
-              <w:t>Средние рейтинговые очки соперника на один зачётный турнир.</w:t>
-            </w:r>
-          </w:p>
-        </w:tc>
-      </w:tr>
-      <w:tr>
-        <w:tc>
-          <w:tcPr>
-            <w:tcW w:w="2412" w:type="dxa"/>
-          </w:tcPr>
-          <w:p>
-            <w:proofErr w:type="spellStart"/>
-            <w:r>
-              <w:t>opponent_points_pre</w:t>
-            </w:r>
-            <w:proofErr w:type="spellEnd"/>
-          </w:p>
-        </w:tc>
-        <w:tc>
-          <w:tcPr>
-            <w:tcW w:w="2412" w:type="dxa"/>
-          </w:tcPr>
-          <w:p>
-            <w:r>
-              <w:t>Официальный рейтинг</w:t>
-            </w:r>
-          </w:p>
-        </w:tc>
-        <w:tc>
-          <w:tcPr>
-            <w:tcW w:w="2412" w:type="dxa"/>
-          </w:tcPr>
-          <w:p>
-            <w:r>
-              <w:t>2.8869</w:t>
-            </w:r>
-          </w:p>
-        </w:tc>
-        <w:tc>
-          <w:tcPr>
-            <w:tcW w:w="2412" w:type="dxa"/>
-          </w:tcPr>
-          <w:p>
-            <w:pPr>
-              <w:rPr>
-                <w:lang w:val="ru-RU"/>
-              </w:rPr>
-            </w:pPr>
-            <w:r>
-              <w:rPr>
-                <w:lang w:val="ru-RU"/>
-              </w:rPr>
-              <w:t>Рейтинговые очки соперника до матча.</w:t>
-            </w:r>
-          </w:p>
-        </w:tc>
-      </w:tr>
-      <w:tr>
-        <w:tc>
-          <w:tcPr>
-            <w:tcW w:w="2412" w:type="dxa"/>
-          </w:tcPr>
-          <w:p>
-            <w:proofErr w:type="spellStart"/>
-            <w:r>
-              <w:t>experience_diff</w:t>
-            </w:r>
-            <w:proofErr w:type="spellEnd"/>
-          </w:p>
-        </w:tc>
-        <w:tc>
-          <w:tcPr>
-            <w:tcW w:w="2412" w:type="dxa"/>
-          </w:tcPr>
-          <w:p>
-            <w:r>
-              <w:t>Опыт</w:t>
-            </w:r>
-          </w:p>
-        </w:tc>
-        <w:tc>
-          <w:tcPr>
-            <w:tcW w:w="2412" w:type="dxa"/>
-          </w:tcPr>
-          <w:p>
-            <w:r>
-              <w:t>5.4278</w:t>
-            </w:r>
-          </w:p>
-        </w:tc>
-        <w:tc>
-          <w:tcPr>
-            <w:tcW w:w="2412" w:type="dxa"/>
-          </w:tcPr>
-          <w:p>
-            <w:r>
-              <w:t>Разница опыта: player_matches_pre - opponent_matches_pre.</w:t>
-            </w:r>
-          </w:p>
-        </w:tc>
-      </w:tr>
-    </w:tbl>
-    <w:p>
-      <w:pPr>
-        <w:pStyle w:val="1"/>
-      </w:pPr>
-      <w:r>
-        <w:t>4. Признаки и предотвращение утечки будущей информации</w:t>
-      </w:r>
-    </w:p>
-    <w:p>
-      <w:pPr/>
-      <w:r>
-        <w:t>Ключевой принцип построения признаков — модель должна видеть только ту информацию, которая была доступна до начала прогнозируемого матча. Это важно для честной оценки качества: если в обучающую выборку случайно попадут сведения из будущего, модель будет выглядеть точнее на тесте, но хуже работать в реальном применении.</w:t>
-      </w:r>
-    </w:p>
-    <w:p>
-      <w:pPr/>
-      <w:r>
-        <w:t>В итоговом наборе используется 43 признака. Их можно разделить на несколько смысловых групп:</w:t>
-      </w:r>
-    </w:p>
-    <w:p>
-      <w:pPr>
-        <w:pStyle w:val="a0"/>
-      </w:pPr>
-      <w:r>
-        <w:t>официальный рейтинг РТТ: место игрока, рейтинговые очки, дата классификации и возрастная категория рейтинга;</w:t>
-      </w:r>
-    </w:p>
-    <w:p>
-      <w:pPr>
-        <w:pStyle w:val="a0"/>
-      </w:pPr>
-      <w:r>
-        <w:t>скорректированные рейтинговые показатели: средние очки на один зачётный турнир, что помогает не занижать силу игрока только из-за малого числа сыгранных турниров;</w:t>
-      </w:r>
-    </w:p>
-    <w:p>
-      <w:pPr>
-        <w:pStyle w:val="a0"/>
-      </w:pPr>
-      <w:r>
-        <w:t>относительные признаки пары: разницы и процентные разницы рейтинга, очков, скорректированных очков и ELO между игроком и соперником;</w:t>
-      </w:r>
-    </w:p>
-    <w:p>
-      <w:pPr>
-        <w:pStyle w:val="a0"/>
-      </w:pPr>
-      <w:r>
-        <w:t>игровая история: количество предыдущих матчей, общий winrate до матча, личные встречи, отдых после последнего матча и результаты против общих соперников;</w:t>
-      </w:r>
-    </w:p>
-    <w:p>
-      <w:pPr>
-        <w:pStyle w:val="a0"/>
-      </w:pPr>
-      <w:r>
-        <w:t>сила предыдущих соперников: средний ELO соперников в недавних матчах, который показывает, насколько сложным был календарь игрока;</w:t>
-      </w:r>
-    </w:p>
-    <w:p>
-      <w:pPr>
-        <w:pStyle w:val="a0"/>
-      </w:pPr>
-      <w:r>
-        <w:t>служебные флаги пропусков: они позволяют модели отличать реальное нулевое значение от ситуации, когда информации о рейтинге или истории игрока недостаточно.</w:t>
-      </w:r>
-    </w:p>
-    <w:p>
-      <w:pPr/>
-      <w:r>
-        <w:t>ELO — это динамический рейтинг силы игрока, который пересчитывается после каждого матча. Перед встречей по разнице ELO оценивается ожидаемая вероятность победы: P(A) = 1 / (1 + 10^((ELO_B - ELO_A) / 400)). После матча рейтинг обновляется по формуле ELO_A,new = ELO_A + K × (S_A - P(A)), где S_A равно 1 при победе и 0 при поражении. Поэтому победа над более сильным соперником дает больший прирост, чем ожидаемая победа над более слабым. В проекте ELO считается строго по хронологии матчей.</w:t>
-      </w:r>
-    </w:p>
-    <w:p>
-      <w:pPr/>
-      <w:r>
-        <w:t>Недавняя форма в панели прогноза считается как доля побед игрока в последних 5 и 10 матчах до выбранной даты (Form 5 и Form 10). Текущий и будущие матчи в этот расчет не попадают.</w:t>
-      </w:r>
-    </w:p>
-    <w:p>
-      <w:pPr/>
-      <w:r>
-        <w:t>Для каждого матча признаки рассчитываются до обновления истории текущим результатом. Такой порядок защищает от data leakage и делает тестирование похожим на реальный сценарий: сначала прогноз, потом появление результата.</w:t>
-      </w:r>
-    </w:p>
-    <w:p>
-      <w:pPr>
-        <w:pStyle w:val="1"/>
-      </w:pPr>
-      <w:r>
-        <w:t>5. Обучение, тестирование и сравнение моделей</w:t>
-      </w:r>
-    </w:p>
-    <w:p>
-      <w:pPr/>
-      <w:r>
-        <w:t>Модель обучалась как задача бинарной классификации: для каждой пары «игрок — соперник» нужно оценить вероятность победы рассматриваемого игрока. Один матч представлен в двух перспективах, а для пользовательского прогноза вероятность симметризуется на уровне матча, чтобы получить единую оценку победы одного игрока над другим.</w:t>
-      </w:r>
-    </w:p>
-    <w:p>
-      <w:pPr/>
-      <w:r>
-        <w:t>Разделение на train и test выполнено по времени, а не случайным образом. В актуальном обучении тестовая часть содержит последние три месяца матчей: при периоде данных с 02.03.2025 по 11.05.2026 граница разделения приходится на 11.02.2026. В train вошло 6326 матчей, в test — 1233 матча. Такой подход ближе к реальному применению, потому что модель всегда прогнозирует будущие матчи по прошлой истории.</w:t>
-      </w:r>
-    </w:p>
-    <w:p>
-      <w:pPr/>
-      <w:r>
-        <w:t>Для сравнения использовались несколько уровней решений:</w:t>
-      </w:r>
-    </w:p>
-    <w:p>
-      <w:pPr>
-        <w:pStyle w:val="a0"/>
-      </w:pPr>
-      <w:r>
-        <w:t>простые однофакторные ориентиры: официальный рейтинг, скорректированный рейтинг, относительный рейтинг и ELO;</w:t>
-      </w:r>
-    </w:p>
-    <w:p>
-      <w:pPr>
-        <w:pStyle w:val="a0"/>
-      </w:pPr>
-      <w:r>
-        <w:t>компактный baseline rating + ELO, который проверяет качество простого рейтингового подхода;</w:t>
-      </w:r>
-    </w:p>
-    <w:p>
-      <w:pPr>
-        <w:pStyle w:val="a0"/>
-      </w:pPr>
-      <w:r>
-        <w:t>основные модели на полном наборе признаков: Gradient Boosting, CatBoost и Random Forest.</w:t>
-      </w:r>
-    </w:p>
-    <w:p>
-      <w:pPr/>
-      <w:r>
-        <w:t>После оценки качества дополнительно обучается production-версия модели на всех доступных данных. Она используется для пользовательского прогноза конкретного матча, чтобы учитывать максимально свежую историю игроков.</w:t>
-      </w:r>
-    </w:p>
-    <w:p>
-      <w:pPr>
-        <w:pStyle w:val="1"/>
-      </w:pPr>
-      <w:r>
-        <w:t>6. Качество построенных моделей машинного обучения</w:t>
-      </w:r>
-    </w:p>
-    <w:p>
-      <w:pPr/>
-      <w:r>
-        <w:t>Главная метрика проекта — LogLoss, потому что пользователю важен не только выбор победителя, но и качество вероятности. Также анализируются Brier score, ROC-AUC и Accuracy. Brier score показывает среднюю ошибку вероятностного прогноза, ROC-AUC оценивает способность модели ранжировать победы выше поражений, а Accuracy дает привычную долю правильных классификаций при пороге 0.5.</w:t>
-      </w:r>
-    </w:p>
-    <w:p>
-      <w:pPr/>
-      <w:r>
-        <w:t>Ключевые результаты на test-периоде приведены ниже.</w:t>
-      </w:r>
-    </w:p>
-    <w:tbl>
-      <w:tblPr>
-        <w:tblStyle w:val="aff0"/>
-        <w:tblW w:type="auto" w:w="0"/>
-        <w:tblLook w:firstColumn="1" w:firstRow="1" w:lastColumn="0" w:lastRow="0" w:noHBand="0" w:noVBand="1" w:val="04A0"/>
       </w:tblPr>
       <w:tblGrid>
         <w:gridCol w:w="1930"/>
@@ -4327,12 +3522,9 @@
       <w:tr>
         <w:tc>
           <w:tcPr>
-            <w:tcW w:type="dxa" w:w="1930"/>
+            <w:tcW w:w="1930" w:type="dxa"/>
           </w:tcPr>
           <w:p>
-            <w:pPr>
-              <w:jc w:val="left"/>
-            </w:pPr>
             <w:r>
               <w:rPr>
                 <w:b/>
@@ -4343,7 +3535,7 @@
         </w:tc>
         <w:tc>
           <w:tcPr>
-            <w:tcW w:type="dxa" w:w="1930"/>
+            <w:tcW w:w="1930" w:type="dxa"/>
           </w:tcPr>
           <w:p>
             <w:pPr>
@@ -4359,7 +3551,7 @@
         </w:tc>
         <w:tc>
           <w:tcPr>
-            <w:tcW w:type="dxa" w:w="1930"/>
+            <w:tcW w:w="1930" w:type="dxa"/>
           </w:tcPr>
           <w:p>
             <w:pPr>
@@ -4375,7 +3567,7 @@
         </w:tc>
         <w:tc>
           <w:tcPr>
-            <w:tcW w:type="dxa" w:w="1930"/>
+            <w:tcW w:w="1930" w:type="dxa"/>
           </w:tcPr>
           <w:p>
             <w:pPr>
@@ -4391,7 +3583,7 @@
         </w:tc>
         <w:tc>
           <w:tcPr>
-            <w:tcW w:type="dxa" w:w="1930"/>
+            <w:tcW w:w="1930" w:type="dxa"/>
           </w:tcPr>
           <w:p>
             <w:pPr>
@@ -4409,12 +3601,9 @@
       <w:tr>
         <w:tc>
           <w:tcPr>
-            <w:tcW w:type="dxa" w:w="1930"/>
+            <w:tcW w:w="1930" w:type="dxa"/>
           </w:tcPr>
           <w:p>
-            <w:pPr>
-              <w:jc w:val="left"/>
-            </w:pPr>
             <w:r>
               <w:t>Gradient Boosting</w:t>
             </w:r>
@@ -4422,7 +3611,7 @@
         </w:tc>
         <w:tc>
           <w:tcPr>
-            <w:tcW w:type="dxa" w:w="1930"/>
+            <w:tcW w:w="1930" w:type="dxa"/>
           </w:tcPr>
           <w:p>
             <w:pPr>
@@ -4435,7 +3624,7 @@
         </w:tc>
         <w:tc>
           <w:tcPr>
-            <w:tcW w:type="dxa" w:w="1930"/>
+            <w:tcW w:w="1930" w:type="dxa"/>
           </w:tcPr>
           <w:p>
             <w:pPr>
@@ -4448,7 +3637,7 @@
         </w:tc>
         <w:tc>
           <w:tcPr>
-            <w:tcW w:type="dxa" w:w="1930"/>
+            <w:tcW w:w="1930" w:type="dxa"/>
           </w:tcPr>
           <w:p>
             <w:pPr>
@@ -4461,7 +3650,7 @@
         </w:tc>
         <w:tc>
           <w:tcPr>
-            <w:tcW w:type="dxa" w:w="1930"/>
+            <w:tcW w:w="1930" w:type="dxa"/>
           </w:tcPr>
           <w:p>
             <w:pPr>
@@ -4476,12 +3665,9 @@
       <w:tr>
         <w:tc>
           <w:tcPr>
-            <w:tcW w:type="dxa" w:w="1930"/>
+            <w:tcW w:w="1930" w:type="dxa"/>
           </w:tcPr>
           <w:p>
-            <w:pPr>
-              <w:jc w:val="left"/>
-            </w:pPr>
             <w:r>
               <w:t>CatBoost</w:t>
             </w:r>
@@ -4489,7 +3675,7 @@
         </w:tc>
         <w:tc>
           <w:tcPr>
-            <w:tcW w:type="dxa" w:w="1930"/>
+            <w:tcW w:w="1930" w:type="dxa"/>
           </w:tcPr>
           <w:p>
             <w:pPr>
@@ -4502,7 +3688,7 @@
         </w:tc>
         <w:tc>
           <w:tcPr>
-            <w:tcW w:type="dxa" w:w="1930"/>
+            <w:tcW w:w="1930" w:type="dxa"/>
           </w:tcPr>
           <w:p>
             <w:pPr>
@@ -4515,7 +3701,7 @@
         </w:tc>
         <w:tc>
           <w:tcPr>
-            <w:tcW w:type="dxa" w:w="1930"/>
+            <w:tcW w:w="1930" w:type="dxa"/>
           </w:tcPr>
           <w:p>
             <w:pPr>
@@ -4528,7 +3714,7 @@
         </w:tc>
         <w:tc>
           <w:tcPr>
-            <w:tcW w:type="dxa" w:w="1930"/>
+            <w:tcW w:w="1930" w:type="dxa"/>
           </w:tcPr>
           <w:p>
             <w:pPr>
@@ -4543,20 +3729,18 @@
       <w:tr>
         <w:tc>
           <w:tcPr>
-            <w:tcW w:type="dxa" w:w="1930"/>
+            <w:tcW w:w="1930" w:type="dxa"/>
           </w:tcPr>
           <w:p>
-            <w:pPr>
-              <w:jc w:val="left"/>
-            </w:pPr>
-            <w:r>
+            <w:r>
+              <w:lastRenderedPageBreak/>
               <w:t>Random Forest</w:t>
             </w:r>
           </w:p>
         </w:tc>
         <w:tc>
           <w:tcPr>
-            <w:tcW w:type="dxa" w:w="1930"/>
+            <w:tcW w:w="1930" w:type="dxa"/>
           </w:tcPr>
           <w:p>
             <w:pPr>
@@ -4569,7 +3753,7 @@
         </w:tc>
         <w:tc>
           <w:tcPr>
-            <w:tcW w:type="dxa" w:w="1930"/>
+            <w:tcW w:w="1930" w:type="dxa"/>
           </w:tcPr>
           <w:p>
             <w:pPr>
@@ -4582,7 +3766,7 @@
         </w:tc>
         <w:tc>
           <w:tcPr>
-            <w:tcW w:type="dxa" w:w="1930"/>
+            <w:tcW w:w="1930" w:type="dxa"/>
           </w:tcPr>
           <w:p>
             <w:pPr>
@@ -4595,7 +3779,7 @@
         </w:tc>
         <w:tc>
           <w:tcPr>
-            <w:tcW w:type="dxa" w:w="1930"/>
+            <w:tcW w:w="1930" w:type="dxa"/>
           </w:tcPr>
           <w:p>
             <w:pPr>
@@ -4610,12 +3794,9 @@
       <w:tr>
         <w:tc>
           <w:tcPr>
-            <w:tcW w:type="dxa" w:w="1930"/>
+            <w:tcW w:w="1930" w:type="dxa"/>
           </w:tcPr>
           <w:p>
-            <w:pPr>
-              <w:jc w:val="left"/>
-            </w:pPr>
             <w:r>
               <w:t>Baseline rating + ELO</w:t>
             </w:r>
@@ -4623,7 +3804,7 @@
         </w:tc>
         <w:tc>
           <w:tcPr>
-            <w:tcW w:type="dxa" w:w="1930"/>
+            <w:tcW w:w="1930" w:type="dxa"/>
           </w:tcPr>
           <w:p>
             <w:pPr>
@@ -4636,7 +3817,7 @@
         </w:tc>
         <w:tc>
           <w:tcPr>
-            <w:tcW w:type="dxa" w:w="1930"/>
+            <w:tcW w:w="1930" w:type="dxa"/>
           </w:tcPr>
           <w:p>
             <w:pPr>
@@ -4649,7 +3830,7 @@
         </w:tc>
         <w:tc>
           <w:tcPr>
-            <w:tcW w:type="dxa" w:w="1930"/>
+            <w:tcW w:w="1930" w:type="dxa"/>
           </w:tcPr>
           <w:p>
             <w:pPr>
@@ -4662,7 +3843,7 @@
         </w:tc>
         <w:tc>
           <w:tcPr>
-            <w:tcW w:type="dxa" w:w="1930"/>
+            <w:tcW w:w="1930" w:type="dxa"/>
           </w:tcPr>
           <w:p>
             <w:pPr>
@@ -4678,247 +3859,1029 @@
     <w:p>
       <w:pPr/>
       <w:r>
-        <w:t>Лучшей основной моделью по LogLoss стала Gradient Boosting. Она показала LogLoss 0.4557 и ROC-AUC 0.8658 на уровне симметризованного матча. По сравнению с baseline rating + ELO снижение LogLoss составляет около 7.8%, что подтверждает добавленную ценность расширенного набора признаков.</w:t>
+        <w:t>Эта таблица показывает не только абсолютное качество итоговой модели, но и ее предиктивную силу относительно простого рейтингового подхода: модель на полном наборе признаков дает более качественные вероятности, чем baseline rating + ELO.</w:t>
       </w:r>
     </w:p>
     <w:p>
-      <w:pPr/>
-      <w:r>
-        <w:t>CatBoost оказался очень близок к Gradient Boosting и даже немного выше по Accuracy, однако итоговый выбор сделан в пользу Gradient Boosting из-за лучшего LogLoss и Brier score. Для вероятностного прогноза эти метрики важнее, чем небольшая разница в Accuracy.</w:t>
+      <w:pPr>
+        <w:rPr>
+          <w:lang w:val="ru-RU"/>
+        </w:rPr>
+      </w:pPr>
+      <w:r>
+        <w:rPr>
+          <w:lang w:val="ru-RU"/>
+        </w:rPr>
+        <w:t xml:space="preserve">Лучшей основной моделью по </w:t>
+      </w:r>
+      <w:proofErr w:type="spellStart"/>
+      <w:r>
+        <w:t>LogLoss</w:t>
+      </w:r>
+      <w:proofErr w:type="spellEnd"/>
+      <w:r>
+        <w:rPr>
+          <w:lang w:val="ru-RU"/>
+        </w:rPr>
+        <w:t xml:space="preserve"> стала </w:t>
+      </w:r>
+      <w:r>
+        <w:t>Gradient</w:t>
+      </w:r>
+      <w:r>
+        <w:rPr>
+          <w:lang w:val="ru-RU"/>
+        </w:rPr>
+        <w:t xml:space="preserve"> </w:t>
+      </w:r>
+      <w:r>
+        <w:t>Boosting</w:t>
+      </w:r>
+      <w:r>
+        <w:rPr>
+          <w:lang w:val="ru-RU"/>
+        </w:rPr>
+        <w:t xml:space="preserve">. Она показала </w:t>
+      </w:r>
+      <w:proofErr w:type="spellStart"/>
+      <w:r>
+        <w:t>LogLoss</w:t>
+      </w:r>
+      <w:proofErr w:type="spellEnd"/>
+      <w:r>
+        <w:rPr>
+          <w:lang w:val="ru-RU"/>
+        </w:rPr>
+        <w:t xml:space="preserve"> 0.4557 и </w:t>
+      </w:r>
+      <w:r>
+        <w:t>ROC</w:t>
+      </w:r>
+      <w:r>
+        <w:rPr>
+          <w:lang w:val="ru-RU"/>
+        </w:rPr>
+        <w:t>-</w:t>
+      </w:r>
+      <w:r>
+        <w:t>AUC</w:t>
+      </w:r>
+      <w:r>
+        <w:rPr>
+          <w:lang w:val="ru-RU"/>
+        </w:rPr>
+        <w:t xml:space="preserve"> 0.8658 на уровне </w:t>
+      </w:r>
+      <w:proofErr w:type="spellStart"/>
+      <w:r>
+        <w:rPr>
+          <w:lang w:val="ru-RU"/>
+        </w:rPr>
+        <w:t>симметризованного</w:t>
+      </w:r>
+      <w:proofErr w:type="spellEnd"/>
+      <w:r>
+        <w:rPr>
+          <w:lang w:val="ru-RU"/>
+        </w:rPr>
+        <w:t xml:space="preserve"> матча. По сравнению с </w:t>
+      </w:r>
+      <w:r>
+        <w:t>baseline</w:t>
+      </w:r>
+      <w:r>
+        <w:rPr>
+          <w:lang w:val="ru-RU"/>
+        </w:rPr>
+        <w:t xml:space="preserve"> </w:t>
+      </w:r>
+      <w:r>
+        <w:t>rating</w:t>
+      </w:r>
+      <w:r>
+        <w:rPr>
+          <w:lang w:val="ru-RU"/>
+        </w:rPr>
+        <w:t xml:space="preserve"> + </w:t>
+      </w:r>
+      <w:r>
+        <w:t>ELO</w:t>
+      </w:r>
+      <w:r>
+        <w:rPr>
+          <w:lang w:val="ru-RU"/>
+        </w:rPr>
+        <w:t xml:space="preserve"> снижение </w:t>
+      </w:r>
+      <w:proofErr w:type="spellStart"/>
+      <w:r>
+        <w:t>LogLoss</w:t>
+      </w:r>
+      <w:proofErr w:type="spellEnd"/>
+      <w:r>
+        <w:rPr>
+          <w:lang w:val="ru-RU"/>
+        </w:rPr>
+        <w:t xml:space="preserve"> составляет около 7.8%, что подтверждает добавленную ценность расширенного набора признаков.</w:t>
       </w:r>
     </w:p>
     <w:p>
-      <w:pPr/>
-      <w:r>
-        <w:t>Random Forest показал сопоставимое качество на test, но заметно сильнее подстроился под train: разрыв train/test LogLoss у него существенно выше, чем у Gradient Boosting. Поэтому Random Forest не был выбран как основная модель.</w:t>
+      <w:pPr>
+        <w:rPr>
+          <w:lang w:val="ru-RU"/>
+        </w:rPr>
+      </w:pPr>
+      <w:proofErr w:type="spellStart"/>
+      <w:r>
+        <w:t>CatBoost</w:t>
+      </w:r>
+      <w:proofErr w:type="spellEnd"/>
+      <w:r>
+        <w:rPr>
+          <w:lang w:val="ru-RU"/>
+        </w:rPr>
+        <w:t xml:space="preserve"> оказался очень близок к </w:t>
+      </w:r>
+      <w:r>
+        <w:t>Gradient</w:t>
+      </w:r>
+      <w:r>
+        <w:rPr>
+          <w:lang w:val="ru-RU"/>
+        </w:rPr>
+        <w:t xml:space="preserve"> </w:t>
+      </w:r>
+      <w:r>
+        <w:t>Boosting</w:t>
+      </w:r>
+      <w:r>
+        <w:rPr>
+          <w:lang w:val="ru-RU"/>
+        </w:rPr>
+        <w:t xml:space="preserve"> и даже немного выше по </w:t>
+      </w:r>
+      <w:r>
+        <w:t>Accuracy</w:t>
+      </w:r>
+      <w:r>
+        <w:rPr>
+          <w:lang w:val="ru-RU"/>
+        </w:rPr>
+        <w:t xml:space="preserve">, однако итоговый выбор сделан в пользу </w:t>
+      </w:r>
+      <w:r>
+        <w:t>Gradient</w:t>
+      </w:r>
+      <w:r>
+        <w:rPr>
+          <w:lang w:val="ru-RU"/>
+        </w:rPr>
+        <w:t xml:space="preserve"> </w:t>
+      </w:r>
+      <w:r>
+        <w:t>Boosting</w:t>
+      </w:r>
+      <w:r>
+        <w:rPr>
+          <w:lang w:val="ru-RU"/>
+        </w:rPr>
+        <w:t xml:space="preserve"> из-за лучшего </w:t>
+      </w:r>
+      <w:proofErr w:type="spellStart"/>
+      <w:r>
+        <w:t>LogLoss</w:t>
+      </w:r>
+      <w:proofErr w:type="spellEnd"/>
+      <w:r>
+        <w:rPr>
+          <w:lang w:val="ru-RU"/>
+        </w:rPr>
+        <w:t xml:space="preserve"> и </w:t>
+      </w:r>
+      <w:r>
+        <w:t>Brier</w:t>
+      </w:r>
+      <w:r>
+        <w:rPr>
+          <w:lang w:val="ru-RU"/>
+        </w:rPr>
+        <w:t xml:space="preserve"> </w:t>
+      </w:r>
+      <w:r>
+        <w:t>score</w:t>
+      </w:r>
+      <w:r>
+        <w:rPr>
+          <w:lang w:val="ru-RU"/>
+        </w:rPr>
+        <w:t xml:space="preserve">. Для вероятностного прогноза эти метрики важнее, чем небольшая разница в </w:t>
+      </w:r>
+      <w:r>
+        <w:t>Accuracy</w:t>
+      </w:r>
+      <w:r>
+        <w:rPr>
+          <w:lang w:val="ru-RU"/>
+        </w:rPr>
+        <w:t>.</w:t>
       </w:r>
     </w:p>
     <w:p>
-      <w:pPr/>
-      <w:r>
-        <w:t>В целом результаты можно считать устойчивыми для учебного проекта: модель уверенно превосходит простые рейтинговые ориентиры, а качество оценивается на временном test-периоде, который имитирует прогнозирование будущих матчей.</w:t>
+      <w:pPr>
+        <w:rPr>
+          <w:lang w:val="ru-RU"/>
+        </w:rPr>
+      </w:pPr>
+      <w:r>
+        <w:t>Random</w:t>
+      </w:r>
+      <w:r>
+        <w:rPr>
+          <w:lang w:val="ru-RU"/>
+        </w:rPr>
+        <w:t xml:space="preserve"> </w:t>
+      </w:r>
+      <w:r>
+        <w:t>Forest</w:t>
+      </w:r>
+      <w:r>
+        <w:rPr>
+          <w:lang w:val="ru-RU"/>
+        </w:rPr>
+        <w:t xml:space="preserve"> показал сопоставимое качество на </w:t>
+      </w:r>
+      <w:r>
+        <w:t>test</w:t>
+      </w:r>
+      <w:r>
+        <w:rPr>
+          <w:lang w:val="ru-RU"/>
+        </w:rPr>
+        <w:t xml:space="preserve">, но заметно сильнее подстроился под </w:t>
+      </w:r>
+      <w:r>
+        <w:t>train</w:t>
+      </w:r>
+      <w:r>
+        <w:rPr>
+          <w:lang w:val="ru-RU"/>
+        </w:rPr>
+        <w:t xml:space="preserve">: разрыв </w:t>
+      </w:r>
+      <w:r>
+        <w:t>train</w:t>
+      </w:r>
+      <w:r>
+        <w:rPr>
+          <w:lang w:val="ru-RU"/>
+        </w:rPr>
+        <w:t>/</w:t>
+      </w:r>
+      <w:r>
+        <w:t>test</w:t>
+      </w:r>
+      <w:r>
+        <w:rPr>
+          <w:lang w:val="ru-RU"/>
+        </w:rPr>
+        <w:t xml:space="preserve"> </w:t>
+      </w:r>
+      <w:proofErr w:type="spellStart"/>
+      <w:r>
+        <w:t>LogLoss</w:t>
+      </w:r>
+      <w:proofErr w:type="spellEnd"/>
+      <w:r>
+        <w:rPr>
+          <w:lang w:val="ru-RU"/>
+        </w:rPr>
+        <w:t xml:space="preserve"> у него существенно выше, чем у </w:t>
+      </w:r>
+      <w:r>
+        <w:t>Gradient</w:t>
+      </w:r>
+      <w:r>
+        <w:rPr>
+          <w:lang w:val="ru-RU"/>
+        </w:rPr>
+        <w:t xml:space="preserve"> </w:t>
+      </w:r>
+      <w:r>
+        <w:t>Boosting</w:t>
+      </w:r>
+      <w:r>
+        <w:rPr>
+          <w:lang w:val="ru-RU"/>
+        </w:rPr>
+        <w:t xml:space="preserve">. Поэтому </w:t>
+      </w:r>
+      <w:r>
+        <w:t>Random</w:t>
+      </w:r>
+      <w:r>
+        <w:rPr>
+          <w:lang w:val="ru-RU"/>
+        </w:rPr>
+        <w:t xml:space="preserve"> </w:t>
+      </w:r>
+      <w:r>
+        <w:t>Forest</w:t>
+      </w:r>
+      <w:r>
+        <w:rPr>
+          <w:lang w:val="ru-RU"/>
+        </w:rPr>
+        <w:t xml:space="preserve"> не был выбран как основная модель.</w:t>
       </w:r>
     </w:p>
     <w:p>
       <w:pPr>
-        <w:pStyle w:val="1"/>
-      </w:pPr>
-      <w:r>
-        <w:t>7. Интерпретация факторов прогноза</w:t>
+        <w:rPr>
+          <w:lang w:val="ru-RU"/>
+        </w:rPr>
+      </w:pPr>
+      <w:r>
+        <w:rPr>
+          <w:lang w:val="ru-RU"/>
+        </w:rPr>
+        <w:t xml:space="preserve">В целом результаты можно считать устойчивыми для учебного проекта: модель уверенно превосходит простые рейтинговые ориентиры, а качество оценивается на временном </w:t>
+      </w:r>
+      <w:r>
+        <w:t>test</w:t>
+      </w:r>
+      <w:r>
+        <w:rPr>
+          <w:lang w:val="ru-RU"/>
+        </w:rPr>
+        <w:t>-периоде, который имитирует прогнозирование будущих матчей.</w:t>
       </w:r>
     </w:p>
     <w:p>
-      <w:pPr/>
-      <w:r>
-        <w:t>Для практического использования важно понимать не только итоговую вероятность, но и факторы, которые подтолкнули модель к такому прогнозу. Поэтому в проекте используются два уровня интерпретации: глобальная важность признаков для всей модели и локальная таблица вкладов факторов для выбранного матча.</w:t>
-      </w:r>
+      <w:pPr>
+        <w:pStyle w:val="1"/>
+        <w:rPr>
+          <w:lang w:val="ru-RU"/>
+        </w:rPr>
+      </w:pPr>
+      <w:bookmarkStart w:id="6" w:name="_Toc229557238"/>
+      <w:r>
+        <w:rPr>
+          <w:lang w:val="ru-RU"/>
+        </w:rPr>
+        <w:t>7. Интерпретация факторов прогноза</w:t>
+      </w:r>
+      <w:bookmarkEnd w:id="6"/>
     </w:p>
     <w:p>
-      <w:pPr/>
-      <w:r>
-        <w:t>По последнему обучению наиболее сильные группы признаков связаны со скорректированными рейтинговыми очками, ELO, официальным местом в рейтинге, силой предыдущих соперников, опытом и общей историей побед. Это согласуется с предметной областью: исход матча обычно определяется не одним показателем, а сочетанием официального рейтинга, динамической силы игрока и качества его недавней игровой истории.</w:t>
+      <w:pPr>
+        <w:rPr>
+          <w:lang w:val="ru-RU"/>
+        </w:rPr>
+      </w:pPr>
+      <w:r>
+        <w:rPr>
+          <w:lang w:val="ru-RU"/>
+        </w:rPr>
+        <w:t>Для практического использования важно понимать не только итоговую вероятность, но и факторы, которые подтолкнули модель к такому прогнозу. Поэтому в проекте используются два уровня интерпретации: глобальная важность признаков для всей модели и локальная таблица вкладов факторов для выбранного матча.</w:t>
       </w:r>
     </w:p>
     <w:p>
-      <w:pPr/>
-      <w:r>
-        <w:t>Локальная интерпретация в панели прогноза показывает, какие признаки работали в пользу первого игрока, а какие — в пользу соперника. Такой формат не является строгим причинным объяснением, но помогает пользователю проверить, почему модель оценила конкретный матч именно так.</w:t>
+      <w:pPr>
+        <w:rPr>
+          <w:lang w:val="ru-RU"/>
+        </w:rPr>
+      </w:pPr>
+      <w:r>
+        <w:rPr>
+          <w:lang w:val="ru-RU"/>
+        </w:rPr>
+        <w:t xml:space="preserve">По последнему обучению наиболее сильные группы признаков связаны со скорректированными рейтинговыми очками, </w:t>
+      </w:r>
+      <w:r>
+        <w:t>ELO</w:t>
+      </w:r>
+      <w:r>
+        <w:rPr>
+          <w:lang w:val="ru-RU"/>
+        </w:rPr>
+        <w:t>, официальным местом в рейтинге, силой предыдущих соперников, опытом и общей историей побед. Это согласуется с предметной областью: исход матча обычно определяется не одним показателем, а сочетанием официального рейтинга, динамической силы игрока и качества его недавней игровой истории.</w:t>
       </w:r>
     </w:p>
     <w:p>
       <w:pPr>
-        <w:pStyle w:val="1"/>
-      </w:pPr>
-      <w:r>
-        <w:t>8. Практическое применение</w:t>
+        <w:rPr>
+          <w:lang w:val="ru-RU"/>
+        </w:rPr>
+      </w:pPr>
+      <w:r>
+        <w:rPr>
+          <w:lang w:val="ru-RU"/>
+        </w:rPr>
+        <w:t>Локальная интерпретация в панели прогноза показывает, какие признаки работали в пользу первого игрока, а какие — в пользу соперника. Такой формат не является строгим причинным объяснением, но помогает пользователю проверить, почему модель оценила конкретный матч именно так.</w:t>
       </w:r>
     </w:p>
     <w:p>
-      <w:pPr/>
-      <w:r>
-        <w:t>Разработанная модель может применяться как аналитический инструмент в юниорском и любительском теннисе, где официального рейтинга часто недостаточно для полной оценки текущей силы игрока. Практическая ценность решения состоит не в автоматическом принятии решений, а в дополнительной вероятностной оценке и объяснимых факторах.</w:t>
-      </w:r>
+      <w:pPr>
+        <w:pStyle w:val="1"/>
+        <w:rPr>
+          <w:lang w:val="ru-RU"/>
+        </w:rPr>
+      </w:pPr>
+      <w:bookmarkStart w:id="7" w:name="_Toc229557239"/>
+      <w:r>
+        <w:rPr>
+          <w:lang w:val="ru-RU"/>
+        </w:rPr>
+        <w:t>8. Практическое применение</w:t>
+      </w:r>
+      <w:bookmarkEnd w:id="7"/>
     </w:p>
     <w:p>
       <w:pPr>
-        <w:pStyle w:val="a0"/>
-      </w:pPr>
-      <w:r>
-        <w:t>Тренерская подготовка к матчу: сравнение игроков по рейтингу, ELO, форме, опыту, отдыху и результатам против общих соперников.</w:t>
+        <w:rPr>
+          <w:lang w:val="ru-RU"/>
+        </w:rPr>
+      </w:pPr>
+      <w:r>
+        <w:rPr>
+          <w:lang w:val="ru-RU"/>
+        </w:rPr>
+        <w:t>Разработанная модель может применяться как аналитический инструмент в юниорском и любительском теннисе, где официального рейтинга часто недостаточно для полной оценки текущей силы игрока. Практическая ценность решения состоит не в автоматическом принятии решений, а в дополнительной вероятностной оценке и объяснимых факторах.</w:t>
       </w:r>
     </w:p>
     <w:p>
       <w:pPr>
         <w:pStyle w:val="a0"/>
-      </w:pPr>
-      <w:r>
-        <w:t>Планирование календаря: предварительная оценка сложности турнира, потенциальных соперников и уровня сетки.</w:t>
+        <w:rPr>
+          <w:lang w:val="ru-RU"/>
+        </w:rPr>
+      </w:pPr>
+      <w:r>
+        <w:rPr>
+          <w:lang w:val="ru-RU"/>
+        </w:rPr>
+        <w:lastRenderedPageBreak/>
+        <w:t xml:space="preserve">Тренерская подготовка к матчу: сравнение игроков по рейтингу, </w:t>
+      </w:r>
+      <w:r>
+        <w:t>ELO</w:t>
+      </w:r>
+      <w:r>
+        <w:rPr>
+          <w:lang w:val="ru-RU"/>
+        </w:rPr>
+        <w:t>, форме, опыту, отдыху и результатам против общих соперников.</w:t>
       </w:r>
     </w:p>
     <w:p>
       <w:pPr>
         <w:pStyle w:val="a0"/>
-      </w:pPr>
-      <w:r>
-        <w:t>Мониторинг развития игрока: отслеживание динамики ELO, рейтинговых очков, места в рейтинге и формы.</w:t>
+        <w:rPr>
+          <w:lang w:val="ru-RU"/>
+        </w:rPr>
+      </w:pPr>
+      <w:r>
+        <w:rPr>
+          <w:lang w:val="ru-RU"/>
+        </w:rPr>
+        <w:t>Планирование календаря: предварительная оценка сложности турнира, потенциальных соперников и уровня сетки.</w:t>
       </w:r>
     </w:p>
     <w:p>
       <w:pPr>
         <w:pStyle w:val="a0"/>
-      </w:pPr>
-      <w:r>
-        <w:t>Выявление расхождений между официальным рейтингом и фактической игровой силой, например у игроков с малым числом турниров или резким изменением результатов.</w:t>
+        <w:rPr>
+          <w:lang w:val="ru-RU"/>
+        </w:rPr>
+      </w:pPr>
+      <w:r>
+        <w:rPr>
+          <w:lang w:val="ru-RU"/>
+        </w:rPr>
+        <w:t xml:space="preserve">Мониторинг развития игрока: отслеживание динамики </w:t>
+      </w:r>
+      <w:r>
+        <w:t>ELO</w:t>
+      </w:r>
+      <w:r>
+        <w:rPr>
+          <w:lang w:val="ru-RU"/>
+        </w:rPr>
+        <w:t>, рейтинговых очков, места в рейтинге и формы.</w:t>
       </w:r>
     </w:p>
     <w:p>
-      <w:pPr/>
-      <w:r>
-        <w:t>В рамках дипломного проекта решение следует рассматривать как прототип системы поддержки аналитических решений. Оно не заменяет экспертную оценку тренера и не предназначено для ставок.</w:t>
+      <w:pPr>
+        <w:pStyle w:val="a0"/>
+        <w:rPr>
+          <w:lang w:val="ru-RU"/>
+        </w:rPr>
+      </w:pPr>
+      <w:r>
+        <w:rPr>
+          <w:lang w:val="ru-RU"/>
+        </w:rPr>
+        <w:t>Выявление расхождений между официальным рейтингом и фактической игровой силой, например у игроков с малым числом турниров или резким изменением результатов.</w:t>
       </w:r>
     </w:p>
     <w:p>
       <w:pPr>
-        <w:pStyle w:val="1"/>
-      </w:pPr>
-      <w:r>
-        <w:t>9. Ограничения проекта</w:t>
+        <w:rPr>
+          <w:lang w:val="ru-RU"/>
+        </w:rPr>
+      </w:pPr>
+      <w:r>
+        <w:rPr>
+          <w:lang w:val="ru-RU"/>
+        </w:rPr>
+        <w:t>В рамках дипломного проекта решение следует рассматривать как прототип системы поддержки аналитических решений. Оно не заменяет экспертную оценку тренера и не предназначено для ставок.</w:t>
       </w:r>
     </w:p>
     <w:p>
       <w:pPr>
-        <w:pStyle w:val="a0"/>
-      </w:pPr>
-      <w:r>
-        <w:t>Качество зависит от полноты и стабильности публичных данных РТТ; при изменении сайта парсеры потребуется адаптировать.</w:t>
-      </w:r>
+        <w:pStyle w:val="1"/>
+      </w:pPr>
+      <w:bookmarkStart w:id="8" w:name="_Toc229557240"/>
+      <w:r>
+        <w:t>9. Ограничения проекта</w:t>
+      </w:r>
+      <w:bookmarkEnd w:id="8"/>
     </w:p>
     <w:p>
       <w:pPr>
         <w:pStyle w:val="a0"/>
-      </w:pPr>
-      <w:r>
-        <w:t>Модель не видит часть факторов, влияющих на отдельный матч: травмы, покрытие, погодные условия, переезды, мотивацию и текущее физическое состояние игрока.</w:t>
+        <w:rPr>
+          <w:lang w:val="ru-RU"/>
+        </w:rPr>
+      </w:pPr>
+      <w:r>
+        <w:rPr>
+          <w:lang w:val="ru-RU"/>
+        </w:rPr>
+        <w:t>Качество зависит от полноты и стабильности публичных данных РТТ; при изменении сайта парсеры потребуется адаптировать.</w:t>
       </w:r>
     </w:p>
     <w:p>
       <w:pPr>
         <w:pStyle w:val="a0"/>
-      </w:pPr>
-      <w:r>
-        <w:t>У игроков с короткой историей матчей признаки ELO, формы, личных встреч и общих соперников менее устойчивы.</w:t>
+        <w:rPr>
+          <w:lang w:val="ru-RU"/>
+        </w:rPr>
+      </w:pPr>
+      <w:r>
+        <w:rPr>
+          <w:lang w:val="ru-RU"/>
+        </w:rPr>
+        <w:t>Модель не видит часть факторов, влияющих на отдельный матч: травмы, покрытие, погодные условия, переезды, мотивацию и текущее физическое состояние игрока.</w:t>
       </w:r>
     </w:p>
     <w:p>
       <w:pPr>
         <w:pStyle w:val="a0"/>
-      </w:pPr>
-      <w:r>
-        <w:t>Сопоставление игроков по имени может быть неоднозначным, поэтому для снижения риска используется РНИ и проверки качества сопоставления.</w:t>
+        <w:rPr>
+          <w:lang w:val="ru-RU"/>
+        </w:rPr>
+      </w:pPr>
+      <w:r>
+        <w:rPr>
+          <w:lang w:val="ru-RU"/>
+        </w:rPr>
+        <w:t xml:space="preserve">У игроков с короткой историей матчей признаки </w:t>
+      </w:r>
+      <w:r>
+        <w:t>ELO</w:t>
+      </w:r>
+      <w:r>
+        <w:rPr>
+          <w:lang w:val="ru-RU"/>
+        </w:rPr>
+        <w:t>, формы, личных встреч и общих соперников менее устойчивы.</w:t>
       </w:r>
     </w:p>
     <w:p>
       <w:pPr>
         <w:pStyle w:val="a0"/>
-      </w:pPr>
-      <w:r>
-        <w:t>Метрики получены на историческом test-периоде и не гарантируют идентичное качество на будущих данных.</w:t>
+        <w:rPr>
+          <w:lang w:val="ru-RU"/>
+        </w:rPr>
+      </w:pPr>
+      <w:r>
+        <w:rPr>
+          <w:lang w:val="ru-RU"/>
+        </w:rPr>
+        <w:t>Сопоставление игроков по имени может быть неоднозначным, поэтому для снижения риска используется РНИ и проверки качества сопоставления.</w:t>
       </w:r>
     </w:p>
     <w:p>
       <w:pPr>
         <w:pStyle w:val="a0"/>
-      </w:pPr>
-      <w:r>
-        <w:t>Для промышленного применения нужны регулярный мониторинг качества, rolling-validation на нескольких временных окнах и контроль стабильности вероятностной калибровки.</w:t>
+        <w:rPr>
+          <w:lang w:val="ru-RU"/>
+        </w:rPr>
+      </w:pPr>
+      <w:r>
+        <w:rPr>
+          <w:lang w:val="ru-RU"/>
+        </w:rPr>
+        <w:t xml:space="preserve">Метрики получены на историческом </w:t>
+      </w:r>
+      <w:r>
+        <w:t>test</w:t>
+      </w:r>
+      <w:r>
+        <w:rPr>
+          <w:lang w:val="ru-RU"/>
+        </w:rPr>
+        <w:t>-периоде и не гарантируют идентичное качество на будущих данных.</w:t>
       </w:r>
     </w:p>
     <w:p>
       <w:pPr>
-        <w:pStyle w:val="1"/>
-      </w:pPr>
-      <w:r>
-        <w:t>10. Заключение и направления развития</w:t>
+        <w:pStyle w:val="a0"/>
+        <w:rPr>
+          <w:lang w:val="ru-RU"/>
+        </w:rPr>
+      </w:pPr>
+      <w:r>
+        <w:rPr>
+          <w:lang w:val="ru-RU"/>
+        </w:rPr>
+        <w:t xml:space="preserve">Для промышленного применения нужны регулярный мониторинг качества, </w:t>
+      </w:r>
+      <w:r>
+        <w:t>rolling</w:t>
+      </w:r>
+      <w:r>
+        <w:rPr>
+          <w:lang w:val="ru-RU"/>
+        </w:rPr>
+        <w:t>-</w:t>
+      </w:r>
+      <w:r>
+        <w:t>validation</w:t>
+      </w:r>
+      <w:r>
+        <w:rPr>
+          <w:lang w:val="ru-RU"/>
+        </w:rPr>
+        <w:t xml:space="preserve"> на нескольких временных окнах и контроль стабильности вероятностной калибровки.</w:t>
       </w:r>
     </w:p>
     <w:p>
-      <w:pPr/>
-      <w:r>
-        <w:t>В проекте реализован полный цикл ML-решения: автоматизированный сбор данных, подготовка датасета, построение исторических признаков без утечки будущей информации, обучение нескольких моделей, оценка качества и интерактивный прогноз конкретного матча.</w:t>
-      </w:r>
+      <w:pPr>
+        <w:pStyle w:val="1"/>
+        <w:rPr>
+          <w:lang w:val="ru-RU"/>
+        </w:rPr>
+      </w:pPr>
+      <w:bookmarkStart w:id="9" w:name="_Toc229557241"/>
+      <w:r>
+        <w:rPr>
+          <w:lang w:val="ru-RU"/>
+        </w:rPr>
+        <w:t>10. Заключение и направления развития</w:t>
+      </w:r>
+      <w:bookmarkEnd w:id="9"/>
     </w:p>
     <w:p>
-      <w:pPr/>
-      <w:r>
-        <w:t>Полученные результаты подтверждают исходную гипотезу: для прогноза матчей РТТ полезно использовать не только официальный рейтинг, но и динамическую силу игрока, качество предыдущих соперников, опыт, отдых, историю побед и результаты против общих соперников. Итоговая Gradient Boosting модель превосходит простые benchmark-модели по LogLoss и ROC-AUC.</w:t>
+      <w:pPr>
+        <w:rPr>
+          <w:lang w:val="ru-RU"/>
+        </w:rPr>
+      </w:pPr>
+      <w:r>
+        <w:rPr>
+          <w:lang w:val="ru-RU"/>
+        </w:rPr>
+        <w:t xml:space="preserve">В проекте реализован полный цикл </w:t>
+      </w:r>
+      <w:r>
+        <w:t>ML</w:t>
+      </w:r>
+      <w:r>
+        <w:rPr>
+          <w:lang w:val="ru-RU"/>
+        </w:rPr>
+        <w:t>-решения: автоматизированный сбор данных, подготовка датасета, построение исторических признаков без утечки будущей информации, обучение нескольких моделей, оценка качества и интерактивный прогноз конкретного матча.</w:t>
       </w:r>
     </w:p>
     <w:p>
-      <w:pPr/>
-      <w:r>
-        <w:t>Главная ценность проекта — не только числовой прогноз, но и аналитическая панель, которая показывает состояние данных, дает прогноз по выбранной паре игроков и помогает интерпретировать, какие факторы сильнее всего повлияли на вероятность победы.</w:t>
+      <w:pPr>
+        <w:rPr>
+          <w:lang w:val="ru-RU"/>
+        </w:rPr>
+      </w:pPr>
+      <w:r>
+        <w:rPr>
+          <w:lang w:val="ru-RU"/>
+        </w:rPr>
+        <w:t xml:space="preserve">Полученные результаты подтверждают исходную гипотезу: для прогноза матчей РТТ полезно использовать не только официальный рейтинг, но и динамическую силу игрока, качество предыдущих соперников, опыт, отдых, историю побед и результаты против общих соперников. Итоговая </w:t>
+      </w:r>
+      <w:r>
+        <w:t>Gradient</w:t>
+      </w:r>
+      <w:r>
+        <w:rPr>
+          <w:lang w:val="ru-RU"/>
+        </w:rPr>
+        <w:t xml:space="preserve"> </w:t>
+      </w:r>
+      <w:r>
+        <w:t>Boosting</w:t>
+      </w:r>
+      <w:r>
+        <w:rPr>
+          <w:lang w:val="ru-RU"/>
+        </w:rPr>
+        <w:t xml:space="preserve"> модель превосходит простые </w:t>
+      </w:r>
+      <w:r>
+        <w:t>benchmark</w:t>
+      </w:r>
+      <w:r>
+        <w:rPr>
+          <w:lang w:val="ru-RU"/>
+        </w:rPr>
+        <w:t xml:space="preserve">-модели по </w:t>
+      </w:r>
+      <w:proofErr w:type="spellStart"/>
+      <w:r>
+        <w:t>LogLoss</w:t>
+      </w:r>
+      <w:proofErr w:type="spellEnd"/>
+      <w:r>
+        <w:rPr>
+          <w:lang w:val="ru-RU"/>
+        </w:rPr>
+        <w:t xml:space="preserve"> и </w:t>
+      </w:r>
+      <w:r>
+        <w:t>ROC</w:t>
+      </w:r>
+      <w:r>
+        <w:rPr>
+          <w:lang w:val="ru-RU"/>
+        </w:rPr>
+        <w:t>-</w:t>
+      </w:r>
+      <w:r>
+        <w:t>AUC</w:t>
+      </w:r>
+      <w:r>
+        <w:rPr>
+          <w:lang w:val="ru-RU"/>
+        </w:rPr>
+        <w:t>.</w:t>
       </w:r>
     </w:p>
     <w:p>
-      <w:pPr/>
-      <w:r>
-        <w:t>Возможные направления дальнейшего развития:</w:t>
+      <w:pPr>
+        <w:rPr>
+          <w:lang w:val="ru-RU"/>
+        </w:rPr>
+      </w:pPr>
+      <w:r>
+        <w:rPr>
+          <w:lang w:val="ru-RU"/>
+        </w:rPr>
+        <w:lastRenderedPageBreak/>
+        <w:t>Главная ценность проекта — не только числовой прогноз, но и аналитическая панель, которая показывает состояние данных, дает прогноз по выбранной паре игроков и помогает интерпретировать, какие факторы сильнее всего повлияли на вероятность победы.</w:t>
       </w:r>
     </w:p>
     <w:p>
-      <w:pPr>
-        <w:pStyle w:val="a0"/>
-      </w:pPr>
-      <w:r>
-        <w:t>добавить регулярную rolling-validation и мониторинг качества после каждого обновления данных;</w:t>
+      <w:proofErr w:type="spellStart"/>
+      <w:r>
+        <w:t>Возможные</w:t>
+      </w:r>
+      <w:proofErr w:type="spellEnd"/>
+      <w:r>
+        <w:t xml:space="preserve"> </w:t>
+      </w:r>
+      <w:proofErr w:type="spellStart"/>
+      <w:r>
+        <w:t>направления</w:t>
+      </w:r>
+      <w:proofErr w:type="spellEnd"/>
+      <w:r>
+        <w:t xml:space="preserve"> </w:t>
+      </w:r>
+      <w:proofErr w:type="spellStart"/>
+      <w:r>
+        <w:t>дальнейшего</w:t>
+      </w:r>
+      <w:proofErr w:type="spellEnd"/>
+      <w:r>
+        <w:t xml:space="preserve"> </w:t>
+      </w:r>
+      <w:proofErr w:type="spellStart"/>
+      <w:r>
+        <w:t>развития</w:t>
+      </w:r>
+      <w:proofErr w:type="spellEnd"/>
+      <w:r>
+        <w:t>:</w:t>
       </w:r>
     </w:p>
     <w:p>
       <w:pPr>
         <w:pStyle w:val="a0"/>
-      </w:pPr>
-      <w:r>
-        <w:t>улучшить калибровку вероятностей и отдельно контролировать качество на разных возрастных группах;</w:t>
+        <w:rPr>
+          <w:lang w:val="ru-RU"/>
+        </w:rPr>
+      </w:pPr>
+      <w:r>
+        <w:rPr>
+          <w:lang w:val="ru-RU"/>
+        </w:rPr>
+        <w:t xml:space="preserve">добавить регулярную </w:t>
+      </w:r>
+      <w:r>
+        <w:t>rolling</w:t>
+      </w:r>
+      <w:r>
+        <w:rPr>
+          <w:lang w:val="ru-RU"/>
+        </w:rPr>
+        <w:t>-</w:t>
+      </w:r>
+      <w:r>
+        <w:t>validation</w:t>
+      </w:r>
+      <w:r>
+        <w:rPr>
+          <w:lang w:val="ru-RU"/>
+        </w:rPr>
+        <w:t xml:space="preserve"> и мониторинг качества после каждого обновления данных;</w:t>
       </w:r>
     </w:p>
     <w:p>
       <w:pPr>
         <w:pStyle w:val="a0"/>
-      </w:pPr>
-      <w:r>
-        <w:t>расширить признаки при появлении новых данных: покрытие, город, длительность турнира, сетка, травмы или снятия;</w:t>
+        <w:rPr>
+          <w:lang w:val="ru-RU"/>
+        </w:rPr>
+      </w:pPr>
+      <w:r>
+        <w:rPr>
+          <w:lang w:val="ru-RU"/>
+        </w:rPr>
+        <w:t>улучшить калибровку вероятностей и отдельно контролировать качество на разных возрастных группах;</w:t>
       </w:r>
     </w:p>
     <w:p>
       <w:pPr>
         <w:pStyle w:val="a0"/>
-      </w:pPr>
-      <w:r>
-        <w:t>развить пользовательский интерфейс панели и добавить экспорт отчетов по матчу или игроку.</w:t>
+        <w:rPr>
+          <w:lang w:val="ru-RU"/>
+        </w:rPr>
+      </w:pPr>
+      <w:r>
+        <w:rPr>
+          <w:lang w:val="ru-RU"/>
+        </w:rPr>
+        <w:t>расширить признаки при появлении новых данных: покрытие, город, длительность турнира, сетка, травмы или снятия;</w:t>
       </w:r>
     </w:p>
     <w:p>
       <w:pPr>
-        <w:pStyle w:val="1"/>
-      </w:pPr>
-      <w:r>
-        <w:t>11. Источники</w:t>
+        <w:pStyle w:val="a0"/>
+        <w:rPr>
+          <w:lang w:val="ru-RU"/>
+        </w:rPr>
+      </w:pPr>
+      <w:r>
+        <w:rPr>
+          <w:lang w:val="ru-RU"/>
+        </w:rPr>
+        <w:t>развить пользовательский интерфейс панели и добавить экспорт отчетов по матчу или игроку.</w:t>
       </w:r>
     </w:p>
     <w:p>
       <w:pPr>
-        <w:pStyle w:val="a0"/>
-      </w:pPr>
-      <w:r>
-        <w:t>Публичные страницы Российского теннисного тура: календарь турниров, страницы матчей и рейтинги игроков.</w:t>
-      </w:r>
+        <w:pStyle w:val="1"/>
+      </w:pPr>
+      <w:bookmarkStart w:id="10" w:name="_Toc229557242"/>
+      <w:r>
+        <w:t>11. Источники</w:t>
+      </w:r>
+      <w:bookmarkEnd w:id="10"/>
     </w:p>
     <w:p>
       <w:pPr>
         <w:pStyle w:val="a0"/>
-      </w:pPr>
-      <w:r>
-        <w:t>Репозиторий проекта на GitHub: https://github.com/PnL-One/rtt-tennis-match-predictor</w:t>
+        <w:rPr>
+          <w:lang w:val="ru-RU"/>
+        </w:rPr>
+      </w:pPr>
+      <w:r>
+        <w:rPr>
+          <w:lang w:val="ru-RU"/>
+        </w:rPr>
+        <w:t>Публичные страницы Российского теннисного тура: календарь турниров, страницы матчей и рейтинги игроков.</w:t>
+      </w:r>
+    </w:p>
+    <w:p>
+      <w:pPr>
+        <w:pStyle w:val="a0"/>
+        <w:rPr>
+          <w:lang w:val="ru-RU"/>
+        </w:rPr>
+      </w:pPr>
+      <w:r>
+        <w:rPr>
+          <w:lang w:val="ru-RU"/>
+        </w:rPr>
+        <w:t xml:space="preserve">Репозиторий проекта на </w:t>
+      </w:r>
+      <w:r>
+        <w:t>GitHub</w:t>
+      </w:r>
+      <w:r>
+        <w:rPr>
+          <w:lang w:val="ru-RU"/>
+        </w:rPr>
+        <w:t xml:space="preserve">: </w:t>
+      </w:r>
+      <w:r>
+        <w:t>https</w:t>
+      </w:r>
+      <w:r>
+        <w:rPr>
+          <w:lang w:val="ru-RU"/>
+        </w:rPr>
+        <w:t>://</w:t>
+      </w:r>
+      <w:proofErr w:type="spellStart"/>
+      <w:r>
+        <w:t>github</w:t>
+      </w:r>
+      <w:proofErr w:type="spellEnd"/>
+      <w:r>
+        <w:rPr>
+          <w:lang w:val="ru-RU"/>
+        </w:rPr>
+        <w:t>.</w:t>
+      </w:r>
+      <w:r>
+        <w:t>com</w:t>
+      </w:r>
+      <w:r>
+        <w:rPr>
+          <w:lang w:val="ru-RU"/>
+        </w:rPr>
+        <w:t>/</w:t>
+      </w:r>
+      <w:proofErr w:type="spellStart"/>
+      <w:r>
+        <w:t>PnL</w:t>
+      </w:r>
+      <w:proofErr w:type="spellEnd"/>
+      <w:r>
+        <w:rPr>
+          <w:lang w:val="ru-RU"/>
+        </w:rPr>
+        <w:t>-</w:t>
+      </w:r>
+      <w:r>
+        <w:t>One</w:t>
+      </w:r>
+      <w:r>
+        <w:rPr>
+          <w:lang w:val="ru-RU"/>
+        </w:rPr>
+        <w:t>/</w:t>
+      </w:r>
+      <w:proofErr w:type="spellStart"/>
+      <w:r>
+        <w:t>rtt</w:t>
+      </w:r>
+      <w:proofErr w:type="spellEnd"/>
+      <w:r>
+        <w:rPr>
+          <w:lang w:val="ru-RU"/>
+        </w:rPr>
+        <w:t>-</w:t>
+      </w:r>
+      <w:r>
+        <w:t>tennis</w:t>
+      </w:r>
+      <w:r>
+        <w:rPr>
+          <w:lang w:val="ru-RU"/>
+        </w:rPr>
+        <w:t>-</w:t>
+      </w:r>
+      <w:r>
+        <w:t>match</w:t>
+      </w:r>
+      <w:r>
+        <w:rPr>
+          <w:lang w:val="ru-RU"/>
+        </w:rPr>
+        <w:t>-</w:t>
+      </w:r>
+      <w:r>
+        <w:t>predictor</w:t>
       </w:r>
     </w:p>
     <w:p>

</xml_diff>

<commit_message>
Format ELO formulas in note
</commit_message>
<xml_diff>
--- a/docs/Пояснительная_записка_RTT_tennis_predictor_updated_v14.docx
+++ b/docs/Пояснительная_записка_RTT_tennis_predictor_updated_v14.docx
@@ -316,7 +316,19 @@
         <w:rPr>
           <w:lang w:val="ru-RU"/>
         </w:rPr>
-        <w:t>Дата актуализации записки: 12.05.2026</w:t>
+        <w:t>Дата актуализации записки: 1</w:t>
+      </w:r>
+      <w:r>
+        <w:rPr>
+          <w:lang w:val="ru-RU"/>
+        </w:rPr>
+        <w:t>3</w:t>
+      </w:r>
+      <w:r>
+        <w:rPr>
+          <w:lang w:val="ru-RU"/>
+        </w:rPr>
+        <w:t>.05.2026</w:t>
       </w:r>
       <w:r>
         <w:rPr>
@@ -383,7 +395,7 @@
           <w:r>
             <w:fldChar w:fldCharType="separate"/>
           </w:r>
-          <w:hyperlink w:anchor="_Toc229557232" w:history="1">
+          <w:hyperlink w:anchor="_Toc229557926" w:history="1">
             <w:r>
               <w:rPr>
                 <w:rStyle w:val="aff8"/>
@@ -411,7 +423,7 @@
                 <w:noProof/>
                 <w:webHidden/>
               </w:rPr>
-              <w:instrText xml:space="preserve"> PAGEREF _Toc229557232 \h </w:instrText>
+              <w:instrText xml:space="preserve"> PAGEREF _Toc229557926 \h </w:instrText>
             </w:r>
             <w:r>
               <w:rPr>
@@ -457,7 +469,7 @@
               <w14:ligatures w14:val="standardContextual"/>
             </w:rPr>
           </w:pPr>
-          <w:hyperlink w:anchor="_Toc229557233" w:history="1">
+          <w:hyperlink w:anchor="_Toc229557927" w:history="1">
             <w:r>
               <w:rPr>
                 <w:rStyle w:val="aff8"/>
@@ -485,7 +497,7 @@
                 <w:noProof/>
                 <w:webHidden/>
               </w:rPr>
-              <w:instrText xml:space="preserve"> PAGEREF _Toc229557233 \h </w:instrText>
+              <w:instrText xml:space="preserve"> PAGEREF _Toc229557927 \h </w:instrText>
             </w:r>
             <w:r>
               <w:rPr>
@@ -531,7 +543,7 @@
               <w14:ligatures w14:val="standardContextual"/>
             </w:rPr>
           </w:pPr>
-          <w:hyperlink w:anchor="_Toc229557234" w:history="1">
+          <w:hyperlink w:anchor="_Toc229557928" w:history="1">
             <w:r>
               <w:rPr>
                 <w:rStyle w:val="aff8"/>
@@ -559,7 +571,7 @@
                 <w:noProof/>
                 <w:webHidden/>
               </w:rPr>
-              <w:instrText xml:space="preserve"> PAGEREF _Toc229557234 \h </w:instrText>
+              <w:instrText xml:space="preserve"> PAGEREF _Toc229557928 \h </w:instrText>
             </w:r>
             <w:r>
               <w:rPr>
@@ -605,11 +617,12 @@
               <w14:ligatures w14:val="standardContextual"/>
             </w:rPr>
           </w:pPr>
-          <w:hyperlink w:anchor="_Toc229557235" w:history="1">
+          <w:hyperlink w:anchor="_Toc229557929" w:history="1">
             <w:r>
               <w:rPr>
                 <w:rStyle w:val="aff8"/>
                 <w:noProof/>
+                <w:lang w:val="ru-RU"/>
               </w:rPr>
               <w:t>4. Признаки и предотвращение утечки будущей информации</w:t>
             </w:r>
@@ -632,7 +645,7 @@
                 <w:noProof/>
                 <w:webHidden/>
               </w:rPr>
-              <w:instrText xml:space="preserve"> PAGEREF _Toc229557235 \h </w:instrText>
+              <w:instrText xml:space="preserve"> PAGEREF _Toc229557929 \h </w:instrText>
             </w:r>
             <w:r>
               <w:rPr>
@@ -652,7 +665,7 @@
                 <w:noProof/>
                 <w:webHidden/>
               </w:rPr>
-              <w:t>7</w:t>
+              <w:t>5</w:t>
             </w:r>
             <w:r>
               <w:rPr>
@@ -678,11 +691,12 @@
               <w14:ligatures w14:val="standardContextual"/>
             </w:rPr>
           </w:pPr>
-          <w:hyperlink w:anchor="_Toc229557236" w:history="1">
+          <w:hyperlink w:anchor="_Toc229557930" w:history="1">
             <w:r>
               <w:rPr>
                 <w:rStyle w:val="aff8"/>
                 <w:noProof/>
+                <w:lang w:val="ru-RU"/>
               </w:rPr>
               <w:t>5. Обучение, тестирование и сравнение моделей</w:t>
             </w:r>
@@ -705,7 +719,7 @@
                 <w:noProof/>
                 <w:webHidden/>
               </w:rPr>
-              <w:instrText xml:space="preserve"> PAGEREF _Toc229557236 \h </w:instrText>
+              <w:instrText xml:space="preserve"> PAGEREF _Toc229557930 \h </w:instrText>
             </w:r>
             <w:r>
               <w:rPr>
@@ -725,7 +739,7 @@
                 <w:noProof/>
                 <w:webHidden/>
               </w:rPr>
-              <w:t>8</w:t>
+              <w:t>6</w:t>
             </w:r>
             <w:r>
               <w:rPr>
@@ -751,11 +765,12 @@
               <w14:ligatures w14:val="standardContextual"/>
             </w:rPr>
           </w:pPr>
-          <w:hyperlink w:anchor="_Toc229557237" w:history="1">
+          <w:hyperlink w:anchor="_Toc229557931" w:history="1">
             <w:r>
               <w:rPr>
                 <w:rStyle w:val="aff8"/>
                 <w:noProof/>
+                <w:lang w:val="ru-RU"/>
               </w:rPr>
               <w:t>6. Качество построенных моделей машинного обучения</w:t>
             </w:r>
@@ -778,7 +793,7 @@
                 <w:noProof/>
                 <w:webHidden/>
               </w:rPr>
-              <w:instrText xml:space="preserve"> PAGEREF _Toc229557237 \h </w:instrText>
+              <w:instrText xml:space="preserve"> PAGEREF _Toc229557931 \h </w:instrText>
             </w:r>
             <w:r>
               <w:rPr>
@@ -798,7 +813,7 @@
                 <w:noProof/>
                 <w:webHidden/>
               </w:rPr>
-              <w:t>8</w:t>
+              <w:t>7</w:t>
             </w:r>
             <w:r>
               <w:rPr>
@@ -824,11 +839,12 @@
               <w14:ligatures w14:val="standardContextual"/>
             </w:rPr>
           </w:pPr>
-          <w:hyperlink w:anchor="_Toc229557238" w:history="1">
+          <w:hyperlink w:anchor="_Toc229557932" w:history="1">
             <w:r>
               <w:rPr>
                 <w:rStyle w:val="aff8"/>
                 <w:noProof/>
+                <w:lang w:val="ru-RU"/>
               </w:rPr>
               <w:t>7. Интерпретация факторов прогноза</w:t>
             </w:r>
@@ -851,7 +867,7 @@
                 <w:noProof/>
                 <w:webHidden/>
               </w:rPr>
-              <w:instrText xml:space="preserve"> PAGEREF _Toc229557238 \h </w:instrText>
+              <w:instrText xml:space="preserve"> PAGEREF _Toc229557932 \h </w:instrText>
             </w:r>
             <w:r>
               <w:rPr>
@@ -871,7 +887,7 @@
                 <w:noProof/>
                 <w:webHidden/>
               </w:rPr>
-              <w:t>9</w:t>
+              <w:t>8</w:t>
             </w:r>
             <w:r>
               <w:rPr>
@@ -897,11 +913,12 @@
               <w14:ligatures w14:val="standardContextual"/>
             </w:rPr>
           </w:pPr>
-          <w:hyperlink w:anchor="_Toc229557239" w:history="1">
+          <w:hyperlink w:anchor="_Toc229557933" w:history="1">
             <w:r>
               <w:rPr>
                 <w:rStyle w:val="aff8"/>
                 <w:noProof/>
+                <w:lang w:val="ru-RU"/>
               </w:rPr>
               <w:t>8. Практическое применение</w:t>
             </w:r>
@@ -924,7 +941,7 @@
                 <w:noProof/>
                 <w:webHidden/>
               </w:rPr>
-              <w:instrText xml:space="preserve"> PAGEREF _Toc229557239 \h </w:instrText>
+              <w:instrText xml:space="preserve"> PAGEREF _Toc229557933 \h </w:instrText>
             </w:r>
             <w:r>
               <w:rPr>
@@ -944,7 +961,7 @@
                 <w:noProof/>
                 <w:webHidden/>
               </w:rPr>
-              <w:t>9</w:t>
+              <w:t>8</w:t>
             </w:r>
             <w:r>
               <w:rPr>
@@ -970,7 +987,7 @@
               <w14:ligatures w14:val="standardContextual"/>
             </w:rPr>
           </w:pPr>
-          <w:hyperlink w:anchor="_Toc229557240" w:history="1">
+          <w:hyperlink w:anchor="_Toc229557934" w:history="1">
             <w:r>
               <w:rPr>
                 <w:rStyle w:val="aff8"/>
@@ -997,7 +1014,7 @@
                 <w:noProof/>
                 <w:webHidden/>
               </w:rPr>
-              <w:instrText xml:space="preserve"> PAGEREF _Toc229557240 \h </w:instrText>
+              <w:instrText xml:space="preserve"> PAGEREF _Toc229557934 \h </w:instrText>
             </w:r>
             <w:r>
               <w:rPr>
@@ -1017,7 +1034,7 @@
                 <w:noProof/>
                 <w:webHidden/>
               </w:rPr>
-              <w:t>10</w:t>
+              <w:t>9</w:t>
             </w:r>
             <w:r>
               <w:rPr>
@@ -1043,11 +1060,12 @@
               <w14:ligatures w14:val="standardContextual"/>
             </w:rPr>
           </w:pPr>
-          <w:hyperlink w:anchor="_Toc229557241" w:history="1">
+          <w:hyperlink w:anchor="_Toc229557935" w:history="1">
             <w:r>
               <w:rPr>
                 <w:rStyle w:val="aff8"/>
                 <w:noProof/>
+                <w:lang w:val="ru-RU"/>
               </w:rPr>
               <w:t>10. Заключение и направления развития</w:t>
             </w:r>
@@ -1070,7 +1088,7 @@
                 <w:noProof/>
                 <w:webHidden/>
               </w:rPr>
-              <w:instrText xml:space="preserve"> PAGEREF _Toc229557241 \h </w:instrText>
+              <w:instrText xml:space="preserve"> PAGEREF _Toc229557935 \h </w:instrText>
             </w:r>
             <w:r>
               <w:rPr>
@@ -1090,7 +1108,7 @@
                 <w:noProof/>
                 <w:webHidden/>
               </w:rPr>
-              <w:t>10</w:t>
+              <w:t>9</w:t>
             </w:r>
             <w:r>
               <w:rPr>
@@ -1116,7 +1134,7 @@
               <w14:ligatures w14:val="standardContextual"/>
             </w:rPr>
           </w:pPr>
-          <w:hyperlink w:anchor="_Toc229557242" w:history="1">
+          <w:hyperlink w:anchor="_Toc229557936" w:history="1">
             <w:r>
               <w:rPr>
                 <w:rStyle w:val="aff8"/>
@@ -1143,7 +1161,7 @@
                 <w:noProof/>
                 <w:webHidden/>
               </w:rPr>
-              <w:instrText xml:space="preserve"> PAGEREF _Toc229557242 \h </w:instrText>
+              <w:instrText xml:space="preserve"> PAGEREF _Toc229557936 \h </w:instrText>
             </w:r>
             <w:r>
               <w:rPr>
@@ -1163,7 +1181,7 @@
                 <w:noProof/>
                 <w:webHidden/>
               </w:rPr>
-              <w:t>11</w:t>
+              <w:t>10</w:t>
             </w:r>
             <w:r>
               <w:rPr>
@@ -1206,7 +1224,7 @@
           <w:lang w:val="ru-RU"/>
         </w:rPr>
       </w:pPr>
-      <w:bookmarkStart w:id="0" w:name="_Toc229557232"/>
+      <w:bookmarkStart w:id="0" w:name="_Toc229557926"/>
       <w:r>
         <w:rPr>
           <w:lang w:val="ru-RU"/>
@@ -1310,7 +1328,7 @@
           <w:lang w:val="ru-RU"/>
         </w:rPr>
       </w:pPr>
-      <w:bookmarkStart w:id="1" w:name="_Toc229557233"/>
+      <w:bookmarkStart w:id="1" w:name="_Toc229557927"/>
       <w:r>
         <w:rPr>
           <w:lang w:val="ru-RU"/>
@@ -1762,7 +1780,7 @@
           <w:lang w:val="ru-RU"/>
         </w:rPr>
       </w:pPr>
-      <w:bookmarkStart w:id="2" w:name="_Toc229557234"/>
+      <w:bookmarkStart w:id="2" w:name="_Toc229557928"/>
       <w:r>
         <w:rPr>
           <w:lang w:val="ru-RU"/>
@@ -2520,8 +2538,15 @@
       </w:r>
     </w:p>
     <w:p>
-      <w:pPr/>
-      <w:r>
+      <w:pPr>
+        <w:rPr>
+          <w:lang w:val="ru-RU"/>
+        </w:rPr>
+      </w:pPr>
+      <w:r>
+        <w:rPr>
+          <w:lang w:val="ru-RU"/>
+        </w:rPr>
         <w:t>Таким образом, к этапу моделирования поступает не набор разрозненных выгрузок, а очищенная хронологическая история матчей. На ее основе дальше рассчитываются признаки, описанные в следующем разделе.</w:t>
       </w:r>
     </w:p>
@@ -2532,7 +2557,7 @@
           <w:lang w:val="ru-RU"/>
         </w:rPr>
       </w:pPr>
-      <w:bookmarkStart w:id="3" w:name="_Toc229557235"/>
+      <w:bookmarkStart w:id="3" w:name="_Toc229557929"/>
       <w:r>
         <w:rPr>
           <w:lang w:val="ru-RU"/>
@@ -2654,6 +2679,7 @@
         <w:rPr>
           <w:lang w:val="ru-RU"/>
         </w:rPr>
+        <w:lastRenderedPageBreak/>
         <w:t xml:space="preserve">сила предыдущих соперников: средний </w:t>
       </w:r>
       <w:r>
@@ -2681,272 +2707,240 @@
       </w:r>
     </w:p>
     <w:p>
-      <w:pPr>
-        <w:rPr>
-          <w:lang w:val="ru-RU"/>
-        </w:rPr>
-      </w:pPr>
-      <w:r>
-        <w:t>ELO</w:t>
-      </w:r>
-      <w:r>
-        <w:rPr>
-          <w:lang w:val="ru-RU"/>
-        </w:rPr>
-        <w:t xml:space="preserve"> — это динамический рейтинг силы игрока, который пересчитывается после каждого матча. Перед встречей по разнице </w:t>
-      </w:r>
-      <w:r>
-        <w:t>ELO</w:t>
-      </w:r>
-      <w:r>
-        <w:rPr>
-          <w:lang w:val="ru-RU"/>
-        </w:rPr>
-        <w:t xml:space="preserve"> оценивается ожидаемая вероятность победы: </w:t>
-      </w:r>
-      <w:r>
-        <w:t>P</w:t>
-      </w:r>
-      <w:r>
-        <w:rPr>
-          <w:lang w:val="ru-RU"/>
-        </w:rPr>
-        <w:t>(</w:t>
-      </w:r>
-      <w:r>
-        <w:t>A</w:t>
-      </w:r>
-      <w:r>
-        <w:rPr>
-          <w:lang w:val="ru-RU"/>
-        </w:rPr>
-        <w:t>) = 1 / (1 + 10^((</w:t>
-      </w:r>
-      <w:r>
-        <w:t>ELO</w:t>
-      </w:r>
-      <w:r>
-        <w:rPr>
-          <w:lang w:val="ru-RU"/>
-        </w:rPr>
-        <w:t>_</w:t>
-      </w:r>
-      <w:r>
-        <w:t>B</w:t>
-      </w:r>
-      <w:r>
-        <w:rPr>
-          <w:lang w:val="ru-RU"/>
-        </w:rPr>
-        <w:t xml:space="preserve"> - </w:t>
-      </w:r>
-      <w:r>
-        <w:t>ELO</w:t>
-      </w:r>
-      <w:r>
-        <w:rPr>
-          <w:lang w:val="ru-RU"/>
-        </w:rPr>
-        <w:t>_</w:t>
-      </w:r>
-      <w:r>
-        <w:t>A</w:t>
-      </w:r>
-      <w:r>
-        <w:rPr>
-          <w:lang w:val="ru-RU"/>
-        </w:rPr>
-        <w:t xml:space="preserve">) / 400)). После матча рейтинг обновляется по формуле </w:t>
-      </w:r>
-      <w:r>
-        <w:t>ELO</w:t>
-      </w:r>
-      <w:r>
-        <w:rPr>
-          <w:lang w:val="ru-RU"/>
-        </w:rPr>
-        <w:t>_</w:t>
-      </w:r>
-      <w:r>
-        <w:t>A</w:t>
-      </w:r>
-      <w:r>
-        <w:rPr>
-          <w:lang w:val="ru-RU"/>
-        </w:rPr>
-        <w:t>,</w:t>
-      </w:r>
-      <w:r>
-        <w:t>new</w:t>
-      </w:r>
-      <w:r>
-        <w:rPr>
-          <w:lang w:val="ru-RU"/>
-        </w:rPr>
-        <w:t xml:space="preserve"> = </w:t>
-      </w:r>
-      <w:r>
-        <w:t>ELO</w:t>
-      </w:r>
-      <w:r>
-        <w:rPr>
-          <w:lang w:val="ru-RU"/>
-        </w:rPr>
-        <w:t>_</w:t>
-      </w:r>
-      <w:r>
-        <w:t>A</w:t>
-      </w:r>
-      <w:r>
-        <w:rPr>
-          <w:lang w:val="ru-RU"/>
-        </w:rPr>
-        <w:t xml:space="preserve"> + </w:t>
-      </w:r>
-      <w:r>
-        <w:t>K</w:t>
-      </w:r>
-      <w:r>
-        <w:rPr>
-          <w:lang w:val="ru-RU"/>
-        </w:rPr>
-        <w:t xml:space="preserve"> × (</w:t>
-      </w:r>
-      <w:r>
-        <w:t>S</w:t>
-      </w:r>
-      <w:r>
-        <w:rPr>
-          <w:lang w:val="ru-RU"/>
-        </w:rPr>
-        <w:t>_</w:t>
-      </w:r>
-      <w:r>
-        <w:t>A</w:t>
-      </w:r>
-      <w:r>
-        <w:rPr>
-          <w:lang w:val="ru-RU"/>
-        </w:rPr>
-        <w:t xml:space="preserve"> - </w:t>
-      </w:r>
-      <w:r>
-        <w:t>P</w:t>
-      </w:r>
-      <w:r>
-        <w:rPr>
-          <w:lang w:val="ru-RU"/>
-        </w:rPr>
-        <w:t>(</w:t>
-      </w:r>
-      <w:r>
-        <w:t>A</w:t>
-      </w:r>
-      <w:r>
-        <w:rPr>
-          <w:lang w:val="ru-RU"/>
-        </w:rPr>
-        <w:t xml:space="preserve">)), где </w:t>
-      </w:r>
-      <w:r>
-        <w:t>S</w:t>
-      </w:r>
-      <w:r>
-        <w:rPr>
-          <w:lang w:val="ru-RU"/>
-        </w:rPr>
-        <w:t>_</w:t>
-      </w:r>
-      <w:r>
-        <w:t>A</w:t>
-      </w:r>
-      <w:r>
-        <w:rPr>
-          <w:lang w:val="ru-RU"/>
-        </w:rPr>
-        <w:t xml:space="preserve"> равно 1 при победе и 0 при поражении. Поэтому победа над более сильным соперником дает больший прирост, чем ожидаемая победа над более слабым. В проекте </w:t>
-      </w:r>
-      <w:r>
-        <w:t>ELO</w:t>
-      </w:r>
-      <w:r>
-        <w:rPr>
-          <w:lang w:val="ru-RU"/>
-        </w:rPr>
-        <w:t xml:space="preserve"> считается строго по хронологии матчей.</w:t>
+      <w:r>
+        <w:t>ELO — это динамический рейтинг силы игрока, который пересчитывается после каждого матча. Перед встречей по разнице ELO оценивается ожидаемая вероятность победы:</w:t>
       </w:r>
     </w:p>
     <w:p>
       <w:pPr>
-        <w:rPr>
-          <w:lang w:val="ru-RU"/>
-        </w:rPr>
-      </w:pPr>
-      <w:r>
-        <w:rPr>
-          <w:lang w:val="ru-RU"/>
-        </w:rPr>
-        <w:t>Недавняя форма в панели прогноза считается как доля побед игрока в последних 5 и 10 матчах до выбранной даты (</w:t>
-      </w:r>
-      <w:r>
-        <w:t>Form</w:t>
-      </w:r>
-      <w:r>
-        <w:rPr>
-          <w:lang w:val="ru-RU"/>
-        </w:rPr>
-        <w:t xml:space="preserve"> 5 и </w:t>
-      </w:r>
-      <w:r>
-        <w:t>Form</w:t>
-      </w:r>
-      <w:r>
-        <w:rPr>
-          <w:lang w:val="ru-RU"/>
-        </w:rPr>
-        <w:t xml:space="preserve"> 10). Текущий и будущие матчи в этот расчет не попадают.</w:t>
-      </w:r>
+        <w:jc w:val="center"/>
+        <w:spacing w:before="80" w:after="80"/>
+      </w:pPr>
+      <m:oMathPara>
+        <m:oMath>
+          <m:r>
+            <m:rPr/>
+            <m:t>P(A) = </m:t>
+          </m:r>
+          <m:f>
+            <m:fPr>
+              <m:type m:val="bar"/>
+            </m:fPr>
+            <m:num>
+              <m:r>
+                <m:rPr/>
+                <m:t>1</m:t>
+              </m:r>
+            </m:num>
+            <m:den>
+              <m:r>
+                <m:rPr/>
+                <m:t>1 + </m:t>
+              </m:r>
+              <m:sSup>
+                <m:e>
+                  <m:r>
+                    <m:rPr/>
+                    <m:t>10</m:t>
+                  </m:r>
+                </m:e>
+                <m:sup>
+                  <m:f>
+                    <m:fPr>
+                      <m:type m:val="bar"/>
+                    </m:fPr>
+                    <m:num>
+                      <m:sSub>
+                        <m:e>
+                          <m:r>
+                            <m:rPr/>
+                            <m:t>ELO</m:t>
+                          </m:r>
+                        </m:e>
+                        <m:sub>
+                          <m:r>
+                            <m:rPr/>
+                            <m:t>B</m:t>
+                          </m:r>
+                        </m:sub>
+                      </m:sSub>
+                      <m:r>
+                        <m:rPr/>
+                        <m:t> − </m:t>
+                      </m:r>
+                      <m:sSub>
+                        <m:e>
+                          <m:r>
+                            <m:rPr/>
+                            <m:t>ELO</m:t>
+                          </m:r>
+                        </m:e>
+                        <m:sub>
+                          <m:r>
+                            <m:rPr/>
+                            <m:t>A</m:t>
+                          </m:r>
+                        </m:sub>
+                      </m:sSub>
+                    </m:num>
+                    <m:den>
+                      <m:r>
+                        <m:rPr/>
+                        <m:t>400</m:t>
+                      </m:r>
+                    </m:den>
+                  </m:f>
+                </m:sup>
+              </m:sSup>
+            </m:den>
+          </m:f>
+        </m:oMath>
+      </m:oMathPara>
     </w:p>
     <w:p>
-      <w:pPr>
-        <w:rPr>
-          <w:lang w:val="ru-RU"/>
-        </w:rPr>
-      </w:pPr>
-      <w:r>
-        <w:rPr>
-          <w:lang w:val="ru-RU"/>
-        </w:rPr>
-        <w:lastRenderedPageBreak/>
-        <w:t xml:space="preserve">Для каждого матча признаки рассчитываются до обновления истории текущим результатом. Такой порядок защищает от </w:t>
-      </w:r>
-      <w:r>
-        <w:t>data</w:t>
-      </w:r>
-      <w:r>
-        <w:rPr>
-          <w:lang w:val="ru-RU"/>
-        </w:rPr>
-        <w:t xml:space="preserve"> </w:t>
-      </w:r>
-      <w:r>
-        <w:t>leakage</w:t>
-      </w:r>
-      <w:r>
-        <w:rPr>
-          <w:lang w:val="ru-RU"/>
-        </w:rPr>
-        <w:t xml:space="preserve"> и делает тестирование похожим на реальный сценарий: сначала прогноз, потом появление результата.</w:t>
+      <w:r>
+        <w:t>После матча рейтинг обновляется по формуле:</w:t>
       </w:r>
     </w:p>
     <w:p>
       <w:pPr>
+        <w:jc w:val="center"/>
+        <w:spacing w:before="80" w:after="80"/>
+      </w:pPr>
+      <m:oMathPara>
+        <m:oMath>
+          <m:sSub>
+            <m:e>
+              <m:r>
+                <m:rPr/>
+                <m:t>ELO</m:t>
+              </m:r>
+            </m:e>
+            <m:sub>
+              <m:r>
+                <m:rPr/>
+                <m:t>A,new</m:t>
+              </m:r>
+            </m:sub>
+          </m:sSub>
+          <m:r>
+            <m:rPr/>
+            <m:t> = </m:t>
+          </m:r>
+          <m:sSub>
+            <m:e>
+              <m:r>
+                <m:rPr/>
+                <m:t>ELO</m:t>
+              </m:r>
+            </m:e>
+            <m:sub>
+              <m:r>
+                <m:rPr/>
+                <m:t>A</m:t>
+              </m:r>
+            </m:sub>
+          </m:sSub>
+          <m:r>
+            <m:rPr/>
+            <m:t> + K × (</m:t>
+          </m:r>
+          <m:sSub>
+            <m:e>
+              <m:r>
+                <m:rPr/>
+                <m:t>S</m:t>
+              </m:r>
+            </m:e>
+            <m:sub>
+              <m:r>
+                <m:rPr/>
+                <m:t>A</m:t>
+              </m:r>
+            </m:sub>
+          </m:sSub>
+          <m:r>
+            <m:rPr/>
+            <m:t> − P(A))</m:t>
+          </m:r>
+        </m:oMath>
+      </m:oMathPara>
+    </w:p>
+    <w:p>
+      <w:r>
+        <w:t>Здесь S_A равно 1 при победе игрока A и 0 при поражении, а K задает силу изменения рейтинга. Победа над более сильным соперником дает больший прирост, чем ожидаемая победа над более слабым. В проекте ELO считается строго по хронологии матчей.</w:t>
+      </w:r>
+    </w:p>
+    <w:p>
+      <w:pPr>
+        <w:rPr>
+          <w:lang w:val="ru-RU"/>
+        </w:rPr>
+      </w:pPr>
+      <w:r>
+        <w:rPr>
+          <w:lang w:val="ru-RU"/>
+        </w:rPr>
+        <w:t>Недавняя форма в панели прогноза считается как доля побед игрока в последних 5 и 10 матчах до выбранной даты (</w:t>
+      </w:r>
+      <w:r>
+        <w:t>Form</w:t>
+      </w:r>
+      <w:r>
+        <w:rPr>
+          <w:lang w:val="ru-RU"/>
+        </w:rPr>
+        <w:t xml:space="preserve"> 5 и </w:t>
+      </w:r>
+      <w:r>
+        <w:t>Form</w:t>
+      </w:r>
+      <w:r>
+        <w:rPr>
+          <w:lang w:val="ru-RU"/>
+        </w:rPr>
+        <w:t xml:space="preserve"> 10). Текущий и будущие матчи в этот расчет не попадают.</w:t>
+      </w:r>
+    </w:p>
+    <w:p>
+      <w:pPr>
+        <w:rPr>
+          <w:lang w:val="ru-RU"/>
+        </w:rPr>
+      </w:pPr>
+      <w:r>
+        <w:rPr>
+          <w:lang w:val="ru-RU"/>
+        </w:rPr>
+        <w:t xml:space="preserve">Для каждого матча признаки рассчитываются до обновления истории текущим результатом. Такой порядок защищает от </w:t>
+      </w:r>
+      <w:r>
+        <w:t>data</w:t>
+      </w:r>
+      <w:r>
+        <w:rPr>
+          <w:lang w:val="ru-RU"/>
+        </w:rPr>
+        <w:t xml:space="preserve"> </w:t>
+      </w:r>
+      <w:r>
+        <w:t>leakage</w:t>
+      </w:r>
+      <w:r>
+        <w:rPr>
+          <w:lang w:val="ru-RU"/>
+        </w:rPr>
+        <w:t xml:space="preserve"> и делает тестирование похожим на реальный сценарий: сначала прогноз, потом появление результата.</w:t>
+      </w:r>
+    </w:p>
+    <w:p>
+      <w:pPr>
         <w:pStyle w:val="1"/>
         <w:rPr>
           <w:lang w:val="ru-RU"/>
         </w:rPr>
       </w:pPr>
-      <w:bookmarkStart w:id="4" w:name="_Toc229557236"/>
+      <w:bookmarkStart w:id="4" w:name="_Toc229557930"/>
       <w:r>
         <w:rPr>
           <w:lang w:val="ru-RU"/>
@@ -3032,16 +3026,32 @@
       </w:r>
     </w:p>
     <w:p>
-      <w:pPr/>
-      <w:r>
-        <w:t>Ниже показано это разделение в компактном виде. Таблица отделена от описания, чтобы было видно: test используется не для обучения, а только для честной проверки качества на более поздних матчах.</w:t>
+      <w:pPr>
+        <w:rPr>
+          <w:lang w:val="ru-RU"/>
+        </w:rPr>
+      </w:pPr>
+      <w:r>
+        <w:rPr>
+          <w:lang w:val="ru-RU"/>
+        </w:rPr>
+        <w:t xml:space="preserve">Ниже показано это разделение в компактном виде. Таблица отделена от описания, чтобы было видно: </w:t>
+      </w:r>
+      <w:r>
+        <w:t>test</w:t>
+      </w:r>
+      <w:r>
+        <w:rPr>
+          <w:lang w:val="ru-RU"/>
+        </w:rPr>
+        <w:t xml:space="preserve"> используется не для обучения, а только для честной проверки качества на более поздних матчах.</w:t>
       </w:r>
     </w:p>
     <w:tbl>
       <w:tblPr>
         <w:tblStyle w:val="aff0"/>
-        <w:tblW w:type="auto" w:w="0"/>
-        <w:tblLook w:firstColumn="1" w:firstRow="1" w:lastColumn="0" w:lastRow="0" w:noHBand="0" w:noVBand="1" w:val="04A0"/>
+        <w:tblW w:w="0" w:type="auto"/>
+        <w:tblLook w:val="04A0" w:firstRow="1" w:lastRow="0" w:firstColumn="1" w:lastColumn="0" w:noHBand="0" w:noVBand="1"/>
       </w:tblPr>
       <w:tblGrid>
         <w:gridCol w:w="2412"/>
@@ -3052,20 +3062,22 @@
       <w:tr>
         <w:tc>
           <w:tcPr>
-            <w:tcW w:type="dxa" w:w="2412"/>
+            <w:tcW w:w="2412" w:type="dxa"/>
           </w:tcPr>
           <w:p>
+            <w:proofErr w:type="spellStart"/>
             <w:r>
               <w:rPr>
                 <w:b/>
               </w:rPr>
               <w:t>Часть</w:t>
             </w:r>
+            <w:proofErr w:type="spellEnd"/>
           </w:p>
         </w:tc>
         <w:tc>
           <w:tcPr>
-            <w:tcW w:type="dxa" w:w="2412"/>
+            <w:tcW w:w="2412" w:type="dxa"/>
           </w:tcPr>
           <w:p>
             <w:r>
@@ -3078,7 +3090,7 @@
         </w:tc>
         <w:tc>
           <w:tcPr>
-            <w:tcW w:type="dxa" w:w="2412"/>
+            <w:tcW w:w="2412" w:type="dxa"/>
           </w:tcPr>
           <w:p>
             <w:r>
@@ -3091,7 +3103,7 @@
         </w:tc>
         <w:tc>
           <w:tcPr>
-            <w:tcW w:type="dxa" w:w="2412"/>
+            <w:tcW w:w="2412" w:type="dxa"/>
           </w:tcPr>
           <w:p>
             <w:r>
@@ -3106,7 +3118,7 @@
       <w:tr>
         <w:tc>
           <w:tcPr>
-            <w:tcW w:type="dxa" w:w="2412"/>
+            <w:tcW w:w="2412" w:type="dxa"/>
           </w:tcPr>
           <w:p>
             <w:r>
@@ -3116,7 +3128,7 @@
         </w:tc>
         <w:tc>
           <w:tcPr>
-            <w:tcW w:type="dxa" w:w="2412"/>
+            <w:tcW w:w="2412" w:type="dxa"/>
           </w:tcPr>
           <w:p>
             <w:r>
@@ -3126,7 +3138,7 @@
         </w:tc>
         <w:tc>
           <w:tcPr>
-            <w:tcW w:type="dxa" w:w="2412"/>
+            <w:tcW w:w="2412" w:type="dxa"/>
           </w:tcPr>
           <w:p>
             <w:r>
@@ -3136,7 +3148,7 @@
         </w:tc>
         <w:tc>
           <w:tcPr>
-            <w:tcW w:type="dxa" w:w="2412"/>
+            <w:tcW w:w="2412" w:type="dxa"/>
           </w:tcPr>
           <w:p>
             <w:r>
@@ -3148,7 +3160,7 @@
       <w:tr>
         <w:tc>
           <w:tcPr>
-            <w:tcW w:type="dxa" w:w="2412"/>
+            <w:tcW w:w="2412" w:type="dxa"/>
           </w:tcPr>
           <w:p>
             <w:r>
@@ -3158,7 +3170,7 @@
         </w:tc>
         <w:tc>
           <w:tcPr>
-            <w:tcW w:type="dxa" w:w="2412"/>
+            <w:tcW w:w="2412" w:type="dxa"/>
           </w:tcPr>
           <w:p>
             <w:r>
@@ -3168,7 +3180,7 @@
         </w:tc>
         <w:tc>
           <w:tcPr>
-            <w:tcW w:type="dxa" w:w="2412"/>
+            <w:tcW w:w="2412" w:type="dxa"/>
           </w:tcPr>
           <w:p>
             <w:r>
@@ -3178,7 +3190,7 @@
         </w:tc>
         <w:tc>
           <w:tcPr>
-            <w:tcW w:type="dxa" w:w="2412"/>
+            <w:tcW w:w="2412" w:type="dxa"/>
           </w:tcPr>
           <w:p>
             <w:r>
@@ -3189,8 +3201,15 @@
       </w:tr>
     </w:tbl>
     <w:p>
-      <w:pPr/>
-      <w:r>
+      <w:pPr>
+        <w:rPr>
+          <w:lang w:val="ru-RU"/>
+        </w:rPr>
+      </w:pPr>
+      <w:r>
+        <w:rPr>
+          <w:lang w:val="ru-RU"/>
+        </w:rPr>
         <w:t>Такое разделение защищает от завышенной оценки качества: модель учится на прошлом и проверяется на матчах, которые для нее находятся в будущем.</w:t>
       </w:r>
     </w:p>
@@ -3204,6 +3223,7 @@
         <w:rPr>
           <w:lang w:val="ru-RU"/>
         </w:rPr>
+        <w:lastRenderedPageBreak/>
         <w:t>Для сравнения использовались несколько уровней решений:</w:t>
       </w:r>
     </w:p>
@@ -3361,7 +3381,7 @@
           <w:lang w:val="ru-RU"/>
         </w:rPr>
       </w:pPr>
-      <w:bookmarkStart w:id="5" w:name="_Toc229557237"/>
+      <w:bookmarkStart w:id="5" w:name="_Toc229557931"/>
       <w:r>
         <w:rPr>
           <w:lang w:val="ru-RU"/>
@@ -3733,7 +3753,6 @@
           </w:tcPr>
           <w:p>
             <w:r>
-              <w:lastRenderedPageBreak/>
               <w:t>Random Forest</w:t>
             </w:r>
           </w:p>
@@ -3857,9 +3876,43 @@
       </w:tr>
     </w:tbl>
     <w:p>
-      <w:pPr/>
-      <w:r>
-        <w:t>Эта таблица показывает не только абсолютное качество итоговой модели, но и ее предиктивную силу относительно простого рейтингового подхода: модель на полном наборе признаков дает более качественные вероятности, чем baseline rating + ELO.</w:t>
+      <w:pPr>
+        <w:rPr>
+          <w:lang w:val="ru-RU"/>
+        </w:rPr>
+      </w:pPr>
+      <w:r>
+        <w:rPr>
+          <w:lang w:val="ru-RU"/>
+        </w:rPr>
+        <w:t xml:space="preserve">Эта таблица показывает не только абсолютное качество итоговой модели, но и ее предиктивную силу относительно простого рейтингового подхода: модель на полном наборе признаков дает более качественные вероятности, чем </w:t>
+      </w:r>
+      <w:r>
+        <w:t>baseline</w:t>
+      </w:r>
+      <w:r>
+        <w:rPr>
+          <w:lang w:val="ru-RU"/>
+        </w:rPr>
+        <w:t xml:space="preserve"> </w:t>
+      </w:r>
+      <w:r>
+        <w:t>rating</w:t>
+      </w:r>
+      <w:r>
+        <w:rPr>
+          <w:lang w:val="ru-RU"/>
+        </w:rPr>
+        <w:t xml:space="preserve"> + </w:t>
+      </w:r>
+      <w:r>
+        <w:t>ELO</w:t>
+      </w:r>
+      <w:r>
+        <w:rPr>
+          <w:lang w:val="ru-RU"/>
+        </w:rPr>
+        <w:t>.</w:t>
       </w:r>
     </w:p>
     <w:p>
@@ -4204,6 +4257,7 @@
         <w:rPr>
           <w:lang w:val="ru-RU"/>
         </w:rPr>
+        <w:lastRenderedPageBreak/>
         <w:t xml:space="preserve">В целом результаты можно считать устойчивыми для учебного проекта: модель уверенно превосходит простые рейтинговые ориентиры, а качество оценивается на временном </w:t>
       </w:r>
       <w:r>
@@ -4223,7 +4277,7 @@
           <w:lang w:val="ru-RU"/>
         </w:rPr>
       </w:pPr>
-      <w:bookmarkStart w:id="6" w:name="_Toc229557238"/>
+      <w:bookmarkStart w:id="6" w:name="_Toc229557932"/>
       <w:r>
         <w:rPr>
           <w:lang w:val="ru-RU"/>
@@ -4287,7 +4341,7 @@
           <w:lang w:val="ru-RU"/>
         </w:rPr>
       </w:pPr>
-      <w:bookmarkStart w:id="7" w:name="_Toc229557239"/>
+      <w:bookmarkStart w:id="7" w:name="_Toc229557933"/>
       <w:r>
         <w:rPr>
           <w:lang w:val="ru-RU"/>
@@ -4320,7 +4374,6 @@
         <w:rPr>
           <w:lang w:val="ru-RU"/>
         </w:rPr>
-        <w:lastRenderedPageBreak/>
         <w:t xml:space="preserve">Тренерская подготовка к матчу: сравнение игроков по рейтингу, </w:t>
       </w:r>
       <w:r>
@@ -4401,8 +4454,9 @@
       <w:pPr>
         <w:pStyle w:val="1"/>
       </w:pPr>
-      <w:bookmarkStart w:id="8" w:name="_Toc229557240"/>
-      <w:r>
+      <w:bookmarkStart w:id="8" w:name="_Toc229557934"/>
+      <w:r>
+        <w:lastRenderedPageBreak/>
         <w:t>9. Ограничения проекта</w:t>
       </w:r>
       <w:bookmarkEnd w:id="8"/>
@@ -4534,7 +4588,7 @@
           <w:lang w:val="ru-RU"/>
         </w:rPr>
       </w:pPr>
-      <w:bookmarkStart w:id="9" w:name="_Toc229557241"/>
+      <w:bookmarkStart w:id="9" w:name="_Toc229557935"/>
       <w:r>
         <w:rPr>
           <w:lang w:val="ru-RU"/>
@@ -4644,7 +4698,6 @@
         <w:rPr>
           <w:lang w:val="ru-RU"/>
         </w:rPr>
-        <w:lastRenderedPageBreak/>
         <w:t>Главная ценность проекта — не только числовой прогноз, но и аналитическая панель, которая показывает состояние данных, дает прогноз по выбранной паре игроков и помогает интерпретировать, какие факторы сильнее всего повлияли на вероятность победы.</w:t>
       </w:r>
     </w:p>
@@ -4760,8 +4813,9 @@
       <w:pPr>
         <w:pStyle w:val="1"/>
       </w:pPr>
-      <w:bookmarkStart w:id="10" w:name="_Toc229557242"/>
-      <w:r>
+      <w:bookmarkStart w:id="10" w:name="_Toc229557936"/>
+      <w:r>
+        <w:lastRenderedPageBreak/>
         <w:t>11. Источники</w:t>
       </w:r>
       <w:bookmarkEnd w:id="10"/>

</xml_diff>

<commit_message>
Clarify production model selection in note
</commit_message>
<xml_diff>
--- a/docs/Пояснительная_записка_RTT_tennis_predictor_updated_v14.docx
+++ b/docs/Пояснительная_записка_RTT_tennis_predictor_updated_v14.docx
@@ -395,7 +395,7 @@
           <w:r>
             <w:fldChar w:fldCharType="separate"/>
           </w:r>
-          <w:hyperlink w:anchor="_Toc229557926" w:history="1">
+          <w:hyperlink w:anchor="_Toc229559699" w:history="1">
             <w:r>
               <w:rPr>
                 <w:rStyle w:val="aff8"/>
@@ -423,7 +423,7 @@
                 <w:noProof/>
                 <w:webHidden/>
               </w:rPr>
-              <w:instrText xml:space="preserve"> PAGEREF _Toc229557926 \h </w:instrText>
+              <w:instrText xml:space="preserve"> PAGEREF _Toc229559699 \h </w:instrText>
             </w:r>
             <w:r>
               <w:rPr>
@@ -469,7 +469,7 @@
               <w14:ligatures w14:val="standardContextual"/>
             </w:rPr>
           </w:pPr>
-          <w:hyperlink w:anchor="_Toc229557927" w:history="1">
+          <w:hyperlink w:anchor="_Toc229559700" w:history="1">
             <w:r>
               <w:rPr>
                 <w:rStyle w:val="aff8"/>
@@ -497,7 +497,7 @@
                 <w:noProof/>
                 <w:webHidden/>
               </w:rPr>
-              <w:instrText xml:space="preserve"> PAGEREF _Toc229557927 \h </w:instrText>
+              <w:instrText xml:space="preserve"> PAGEREF _Toc229559700 \h </w:instrText>
             </w:r>
             <w:r>
               <w:rPr>
@@ -543,7 +543,7 @@
               <w14:ligatures w14:val="standardContextual"/>
             </w:rPr>
           </w:pPr>
-          <w:hyperlink w:anchor="_Toc229557928" w:history="1">
+          <w:hyperlink w:anchor="_Toc229559701" w:history="1">
             <w:r>
               <w:rPr>
                 <w:rStyle w:val="aff8"/>
@@ -571,7 +571,7 @@
                 <w:noProof/>
                 <w:webHidden/>
               </w:rPr>
-              <w:instrText xml:space="preserve"> PAGEREF _Toc229557928 \h </w:instrText>
+              <w:instrText xml:space="preserve"> PAGEREF _Toc229559701 \h </w:instrText>
             </w:r>
             <w:r>
               <w:rPr>
@@ -617,7 +617,7 @@
               <w14:ligatures w14:val="standardContextual"/>
             </w:rPr>
           </w:pPr>
-          <w:hyperlink w:anchor="_Toc229557929" w:history="1">
+          <w:hyperlink w:anchor="_Toc229559702" w:history="1">
             <w:r>
               <w:rPr>
                 <w:rStyle w:val="aff8"/>
@@ -645,7 +645,7 @@
                 <w:noProof/>
                 <w:webHidden/>
               </w:rPr>
-              <w:instrText xml:space="preserve"> PAGEREF _Toc229557929 \h </w:instrText>
+              <w:instrText xml:space="preserve"> PAGEREF _Toc229559702 \h </w:instrText>
             </w:r>
             <w:r>
               <w:rPr>
@@ -691,7 +691,7 @@
               <w14:ligatures w14:val="standardContextual"/>
             </w:rPr>
           </w:pPr>
-          <w:hyperlink w:anchor="_Toc229557930" w:history="1">
+          <w:hyperlink w:anchor="_Toc229559703" w:history="1">
             <w:r>
               <w:rPr>
                 <w:rStyle w:val="aff8"/>
@@ -719,7 +719,7 @@
                 <w:noProof/>
                 <w:webHidden/>
               </w:rPr>
-              <w:instrText xml:space="preserve"> PAGEREF _Toc229557930 \h </w:instrText>
+              <w:instrText xml:space="preserve"> PAGEREF _Toc229559703 \h </w:instrText>
             </w:r>
             <w:r>
               <w:rPr>
@@ -765,7 +765,7 @@
               <w14:ligatures w14:val="standardContextual"/>
             </w:rPr>
           </w:pPr>
-          <w:hyperlink w:anchor="_Toc229557931" w:history="1">
+          <w:hyperlink w:anchor="_Toc229559704" w:history="1">
             <w:r>
               <w:rPr>
                 <w:rStyle w:val="aff8"/>
@@ -793,7 +793,7 @@
                 <w:noProof/>
                 <w:webHidden/>
               </w:rPr>
-              <w:instrText xml:space="preserve"> PAGEREF _Toc229557931 \h </w:instrText>
+              <w:instrText xml:space="preserve"> PAGEREF _Toc229559704 \h </w:instrText>
             </w:r>
             <w:r>
               <w:rPr>
@@ -839,7 +839,7 @@
               <w14:ligatures w14:val="standardContextual"/>
             </w:rPr>
           </w:pPr>
-          <w:hyperlink w:anchor="_Toc229557932" w:history="1">
+          <w:hyperlink w:anchor="_Toc229559705" w:history="1">
             <w:r>
               <w:rPr>
                 <w:rStyle w:val="aff8"/>
@@ -867,7 +867,7 @@
                 <w:noProof/>
                 <w:webHidden/>
               </w:rPr>
-              <w:instrText xml:space="preserve"> PAGEREF _Toc229557932 \h </w:instrText>
+              <w:instrText xml:space="preserve"> PAGEREF _Toc229559705 \h </w:instrText>
             </w:r>
             <w:r>
               <w:rPr>
@@ -913,7 +913,7 @@
               <w14:ligatures w14:val="standardContextual"/>
             </w:rPr>
           </w:pPr>
-          <w:hyperlink w:anchor="_Toc229557933" w:history="1">
+          <w:hyperlink w:anchor="_Toc229559706" w:history="1">
             <w:r>
               <w:rPr>
                 <w:rStyle w:val="aff8"/>
@@ -941,7 +941,7 @@
                 <w:noProof/>
                 <w:webHidden/>
               </w:rPr>
-              <w:instrText xml:space="preserve"> PAGEREF _Toc229557933 \h </w:instrText>
+              <w:instrText xml:space="preserve"> PAGEREF _Toc229559706 \h </w:instrText>
             </w:r>
             <w:r>
               <w:rPr>
@@ -987,7 +987,7 @@
               <w14:ligatures w14:val="standardContextual"/>
             </w:rPr>
           </w:pPr>
-          <w:hyperlink w:anchor="_Toc229557934" w:history="1">
+          <w:hyperlink w:anchor="_Toc229559707" w:history="1">
             <w:r>
               <w:rPr>
                 <w:rStyle w:val="aff8"/>
@@ -1014,7 +1014,7 @@
                 <w:noProof/>
                 <w:webHidden/>
               </w:rPr>
-              <w:instrText xml:space="preserve"> PAGEREF _Toc229557934 \h </w:instrText>
+              <w:instrText xml:space="preserve"> PAGEREF _Toc229559707 \h </w:instrText>
             </w:r>
             <w:r>
               <w:rPr>
@@ -1060,7 +1060,7 @@
               <w14:ligatures w14:val="standardContextual"/>
             </w:rPr>
           </w:pPr>
-          <w:hyperlink w:anchor="_Toc229557935" w:history="1">
+          <w:hyperlink w:anchor="_Toc229559708" w:history="1">
             <w:r>
               <w:rPr>
                 <w:rStyle w:val="aff8"/>
@@ -1088,7 +1088,7 @@
                 <w:noProof/>
                 <w:webHidden/>
               </w:rPr>
-              <w:instrText xml:space="preserve"> PAGEREF _Toc229557935 \h </w:instrText>
+              <w:instrText xml:space="preserve"> PAGEREF _Toc229559708 \h </w:instrText>
             </w:r>
             <w:r>
               <w:rPr>
@@ -1134,7 +1134,7 @@
               <w14:ligatures w14:val="standardContextual"/>
             </w:rPr>
           </w:pPr>
-          <w:hyperlink w:anchor="_Toc229557936" w:history="1">
+          <w:hyperlink w:anchor="_Toc229559709" w:history="1">
             <w:r>
               <w:rPr>
                 <w:rStyle w:val="aff8"/>
@@ -1161,7 +1161,7 @@
                 <w:noProof/>
                 <w:webHidden/>
               </w:rPr>
-              <w:instrText xml:space="preserve"> PAGEREF _Toc229557936 \h </w:instrText>
+              <w:instrText xml:space="preserve"> PAGEREF _Toc229559709 \h </w:instrText>
             </w:r>
             <w:r>
               <w:rPr>
@@ -1224,7 +1224,7 @@
           <w:lang w:val="ru-RU"/>
         </w:rPr>
       </w:pPr>
-      <w:bookmarkStart w:id="0" w:name="_Toc229557926"/>
+      <w:bookmarkStart w:id="0" w:name="_Toc229559699"/>
       <w:r>
         <w:rPr>
           <w:lang w:val="ru-RU"/>
@@ -1328,7 +1328,7 @@
           <w:lang w:val="ru-RU"/>
         </w:rPr>
       </w:pPr>
-      <w:bookmarkStart w:id="1" w:name="_Toc229557927"/>
+      <w:bookmarkStart w:id="1" w:name="_Toc229559700"/>
       <w:r>
         <w:rPr>
           <w:lang w:val="ru-RU"/>
@@ -1780,7 +1780,7 @@
           <w:lang w:val="ru-RU"/>
         </w:rPr>
       </w:pPr>
-      <w:bookmarkStart w:id="2" w:name="_Toc229557928"/>
+      <w:bookmarkStart w:id="2" w:name="_Toc229559701"/>
       <w:r>
         <w:rPr>
           <w:lang w:val="ru-RU"/>
@@ -2539,6 +2539,7 @@
     </w:p>
     <w:p>
       <w:pPr>
+        <w:jc w:val="both"/>
         <w:rPr>
           <w:lang w:val="ru-RU"/>
         </w:rPr>
@@ -2553,11 +2554,12 @@
     <w:p>
       <w:pPr>
         <w:pStyle w:val="1"/>
-        <w:rPr>
-          <w:lang w:val="ru-RU"/>
-        </w:rPr>
-      </w:pPr>
-      <w:bookmarkStart w:id="3" w:name="_Toc229557929"/>
+        <w:spacing w:after="240"/>
+        <w:rPr>
+          <w:lang w:val="ru-RU"/>
+        </w:rPr>
+      </w:pPr>
+      <w:bookmarkStart w:id="3" w:name="_Toc229559702"/>
       <w:r>
         <w:rPr>
           <w:lang w:val="ru-RU"/>
@@ -2568,6 +2570,7 @@
     </w:p>
     <w:p>
       <w:pPr>
+        <w:jc w:val="both"/>
         <w:rPr>
           <w:lang w:val="ru-RU"/>
         </w:rPr>
@@ -2654,6 +2657,7 @@
         <w:rPr>
           <w:lang w:val="ru-RU"/>
         </w:rPr>
+        <w:lastRenderedPageBreak/>
         <w:t xml:space="preserve">игровая история: количество предыдущих матчей, общий </w:t>
       </w:r>
       <w:proofErr w:type="spellStart"/>
@@ -2679,7 +2683,6 @@
         <w:rPr>
           <w:lang w:val="ru-RU"/>
         </w:rPr>
-        <w:lastRenderedPageBreak/>
         <w:t xml:space="preserve">сила предыдущих соперников: средний </w:t>
       </w:r>
       <w:r>
@@ -2707,77 +2710,248 @@
       </w:r>
     </w:p>
     <w:p>
-      <w:r>
-        <w:t>ELO — это динамический рейтинг силы игрока, который пересчитывается после каждого матча. Перед встречей по разнице ELO оценивается ожидаемая вероятность победы:</w:t>
+      <w:pPr>
+        <w:ind w:left="360"/>
+        <w:rPr>
+          <w:i/>
+          <w:iCs/>
+          <w:sz w:val="22"/>
+        </w:rPr>
+      </w:pPr>
+      <w:r>
+        <w:rPr>
+          <w:i/>
+          <w:iCs/>
+          <w:sz w:val="22"/>
+        </w:rPr>
+        <w:t>ELO</w:t>
+      </w:r>
+      <w:r>
+        <w:rPr>
+          <w:i/>
+          <w:iCs/>
+          <w:sz w:val="22"/>
+          <w:lang w:val="ru-RU"/>
+        </w:rPr>
+        <w:t xml:space="preserve"> — это динамический рейтинг силы игрока, который пересчитывается после каждого матча. </w:t>
+      </w:r>
+      <w:proofErr w:type="spellStart"/>
+      <w:r>
+        <w:rPr>
+          <w:i/>
+          <w:iCs/>
+          <w:sz w:val="22"/>
+        </w:rPr>
+        <w:t>Перед</w:t>
+      </w:r>
+      <w:proofErr w:type="spellEnd"/>
+      <w:r>
+        <w:rPr>
+          <w:i/>
+          <w:iCs/>
+          <w:sz w:val="22"/>
+        </w:rPr>
+        <w:t xml:space="preserve"> </w:t>
+      </w:r>
+      <w:proofErr w:type="spellStart"/>
+      <w:r>
+        <w:rPr>
+          <w:i/>
+          <w:iCs/>
+          <w:sz w:val="22"/>
+        </w:rPr>
+        <w:t>встречей</w:t>
+      </w:r>
+      <w:proofErr w:type="spellEnd"/>
+      <w:r>
+        <w:rPr>
+          <w:i/>
+          <w:iCs/>
+          <w:sz w:val="22"/>
+        </w:rPr>
+        <w:t xml:space="preserve"> </w:t>
+      </w:r>
+      <w:proofErr w:type="spellStart"/>
+      <w:r>
+        <w:rPr>
+          <w:i/>
+          <w:iCs/>
+          <w:sz w:val="22"/>
+        </w:rPr>
+        <w:t>по</w:t>
+      </w:r>
+      <w:proofErr w:type="spellEnd"/>
+      <w:r>
+        <w:rPr>
+          <w:i/>
+          <w:iCs/>
+          <w:sz w:val="22"/>
+        </w:rPr>
+        <w:t xml:space="preserve"> </w:t>
+      </w:r>
+      <w:proofErr w:type="spellStart"/>
+      <w:r>
+        <w:rPr>
+          <w:i/>
+          <w:iCs/>
+          <w:sz w:val="22"/>
+        </w:rPr>
+        <w:t>разнице</w:t>
+      </w:r>
+      <w:proofErr w:type="spellEnd"/>
+      <w:r>
+        <w:rPr>
+          <w:i/>
+          <w:iCs/>
+          <w:sz w:val="22"/>
+        </w:rPr>
+        <w:t xml:space="preserve"> ELO оценивается ожидаемая вероятность победы:</w:t>
       </w:r>
     </w:p>
     <w:p>
       <w:pPr>
+        <w:spacing w:before="80" w:after="80"/>
+        <w:ind w:left="360"/>
         <w:jc w:val="center"/>
-        <w:spacing w:before="80" w:after="80"/>
+        <w:rPr>
+          <w:i/>
+          <w:iCs/>
+          <w:sz w:val="22"/>
+        </w:rPr>
       </w:pPr>
       <m:oMathPara>
         <m:oMath>
           <m:r>
-            <m:rPr/>
-            <m:t>P(A) = </m:t>
+            <w:rPr>
+              <w:rFonts w:ascii="Cambria Math" w:hAnsi="Cambria Math"/>
+              <w:sz w:val="22"/>
+            </w:rPr>
+            <m:t xml:space="preserve">P(A) = </m:t>
           </m:r>
           <m:f>
             <m:fPr>
-              <m:type m:val="bar"/>
+              <m:ctrlPr>
+                <w:rPr>
+                  <w:rFonts w:ascii="Cambria Math" w:hAnsi="Cambria Math"/>
+                  <w:i/>
+                  <w:iCs/>
+                  <w:sz w:val="22"/>
+                </w:rPr>
+              </m:ctrlPr>
             </m:fPr>
             <m:num>
               <m:r>
-                <m:rPr/>
+                <w:rPr>
+                  <w:rFonts w:ascii="Cambria Math" w:hAnsi="Cambria Math"/>
+                  <w:sz w:val="22"/>
+                </w:rPr>
                 <m:t>1</m:t>
               </m:r>
             </m:num>
             <m:den>
               <m:r>
-                <m:rPr/>
-                <m:t>1 + </m:t>
+                <w:rPr>
+                  <w:rFonts w:ascii="Cambria Math" w:hAnsi="Cambria Math"/>
+                  <w:sz w:val="22"/>
+                </w:rPr>
+                <m:t xml:space="preserve">1 + </m:t>
               </m:r>
               <m:sSup>
+                <m:sSupPr>
+                  <m:ctrlPr>
+                    <w:rPr>
+                      <w:rFonts w:ascii="Cambria Math" w:hAnsi="Cambria Math"/>
+                      <w:i/>
+                      <w:iCs/>
+                      <w:sz w:val="22"/>
+                    </w:rPr>
+                  </m:ctrlPr>
+                </m:sSupPr>
                 <m:e>
                   <m:r>
-                    <m:rPr/>
+                    <w:rPr>
+                      <w:rFonts w:ascii="Cambria Math" w:hAnsi="Cambria Math"/>
+                      <w:sz w:val="22"/>
+                    </w:rPr>
                     <m:t>10</m:t>
                   </m:r>
                 </m:e>
                 <m:sup>
                   <m:f>
                     <m:fPr>
-                      <m:type m:val="bar"/>
+                      <m:ctrlPr>
+                        <w:rPr>
+                          <w:rFonts w:ascii="Cambria Math" w:hAnsi="Cambria Math"/>
+                          <w:i/>
+                          <w:iCs/>
+                          <w:sz w:val="22"/>
+                        </w:rPr>
+                      </m:ctrlPr>
                     </m:fPr>
                     <m:num>
                       <m:sSub>
+                        <m:sSubPr>
+                          <m:ctrlPr>
+                            <w:rPr>
+                              <w:rFonts w:ascii="Cambria Math" w:hAnsi="Cambria Math"/>
+                              <w:i/>
+                              <w:iCs/>
+                              <w:sz w:val="22"/>
+                            </w:rPr>
+                          </m:ctrlPr>
+                        </m:sSubPr>
                         <m:e>
                           <m:r>
-                            <m:rPr/>
+                            <w:rPr>
+                              <w:rFonts w:ascii="Cambria Math" w:hAnsi="Cambria Math"/>
+                              <w:sz w:val="22"/>
+                            </w:rPr>
                             <m:t>ELO</m:t>
                           </m:r>
                         </m:e>
                         <m:sub>
                           <m:r>
-                            <m:rPr/>
+                            <w:rPr>
+                              <w:rFonts w:ascii="Cambria Math" w:hAnsi="Cambria Math"/>
+                              <w:sz w:val="22"/>
+                            </w:rPr>
                             <m:t>B</m:t>
                           </m:r>
                         </m:sub>
                       </m:sSub>
                       <m:r>
-                        <m:rPr/>
-                        <m:t> − </m:t>
+                        <w:rPr>
+                          <w:rFonts w:ascii="Cambria Math" w:hAnsi="Cambria Math"/>
+                          <w:sz w:val="22"/>
+                        </w:rPr>
+                        <m:t xml:space="preserve"> - </m:t>
                       </m:r>
                       <m:sSub>
+                        <m:sSubPr>
+                          <m:ctrlPr>
+                            <w:rPr>
+                              <w:rFonts w:ascii="Cambria Math" w:hAnsi="Cambria Math"/>
+                              <w:i/>
+                              <w:iCs/>
+                              <w:sz w:val="22"/>
+                            </w:rPr>
+                          </m:ctrlPr>
+                        </m:sSubPr>
                         <m:e>
                           <m:r>
-                            <m:rPr/>
+                            <w:rPr>
+                              <w:rFonts w:ascii="Cambria Math" w:hAnsi="Cambria Math"/>
+                              <w:sz w:val="22"/>
+                            </w:rPr>
                             <m:t>ELO</m:t>
                           </m:r>
                         </m:e>
                         <m:sub>
                           <m:r>
-                            <m:rPr/>
+                            <w:rPr>
+                              <w:rFonts w:ascii="Cambria Math" w:hAnsi="Cambria Math"/>
+                              <w:sz w:val="22"/>
+                            </w:rPr>
                             <m:t>A</m:t>
                           </m:r>
                         </m:sub>
@@ -2785,7 +2959,10 @@
                     </m:num>
                     <m:den>
                       <m:r>
-                        <m:rPr/>
+                        <w:rPr>
+                          <w:rFonts w:ascii="Cambria Math" w:hAnsi="Cambria Math"/>
+                          <w:sz w:val="22"/>
+                        </w:rPr>
                         <m:t>400</m:t>
                       </m:r>
                     </m:den>
@@ -2798,149 +2975,384 @@
       </m:oMathPara>
     </w:p>
     <w:p>
-      <w:r>
+      <w:pPr>
+        <w:ind w:left="360"/>
+        <w:rPr>
+          <w:i/>
+          <w:iCs/>
+          <w:sz w:val="22"/>
+          <w:lang w:val="ru-RU"/>
+        </w:rPr>
+      </w:pPr>
+      <w:r>
+        <w:rPr>
+          <w:i/>
+          <w:iCs/>
+          <w:sz w:val="22"/>
+          <w:lang w:val="ru-RU"/>
+        </w:rPr>
         <w:t>После матча рейтинг обновляется по формуле:</w:t>
       </w:r>
     </w:p>
     <w:p>
       <w:pPr>
+        <w:spacing w:before="80" w:after="80"/>
+        <w:ind w:left="360"/>
         <w:jc w:val="center"/>
-        <w:spacing w:before="80" w:after="80"/>
+        <w:rPr>
+          <w:i/>
+          <w:iCs/>
+          <w:sz w:val="22"/>
+        </w:rPr>
       </w:pPr>
       <m:oMathPara>
         <m:oMath>
           <m:sSub>
+            <m:sSubPr>
+              <m:ctrlPr>
+                <w:rPr>
+                  <w:rFonts w:ascii="Cambria Math" w:hAnsi="Cambria Math"/>
+                  <w:i/>
+                  <w:iCs/>
+                  <w:sz w:val="22"/>
+                </w:rPr>
+              </m:ctrlPr>
+            </m:sSubPr>
             <m:e>
               <m:r>
-                <m:rPr/>
+                <w:rPr>
+                  <w:rFonts w:ascii="Cambria Math" w:hAnsi="Cambria Math"/>
+                  <w:sz w:val="22"/>
+                </w:rPr>
                 <m:t>ELO</m:t>
               </m:r>
             </m:e>
             <m:sub>
               <m:r>
-                <m:rPr/>
+                <w:rPr>
+                  <w:rFonts w:ascii="Cambria Math" w:hAnsi="Cambria Math"/>
+                  <w:sz w:val="22"/>
+                </w:rPr>
                 <m:t>A,new</m:t>
               </m:r>
             </m:sub>
           </m:sSub>
           <m:r>
-            <m:rPr/>
-            <m:t> = </m:t>
+            <w:rPr>
+              <w:rFonts w:ascii="Cambria Math" w:hAnsi="Cambria Math"/>
+              <w:sz w:val="22"/>
+            </w:rPr>
+            <m:t xml:space="preserve"> = </m:t>
           </m:r>
           <m:sSub>
+            <m:sSubPr>
+              <m:ctrlPr>
+                <w:rPr>
+                  <w:rFonts w:ascii="Cambria Math" w:hAnsi="Cambria Math"/>
+                  <w:i/>
+                  <w:iCs/>
+                  <w:sz w:val="22"/>
+                </w:rPr>
+              </m:ctrlPr>
+            </m:sSubPr>
             <m:e>
               <m:r>
-                <m:rPr/>
+                <w:rPr>
+                  <w:rFonts w:ascii="Cambria Math" w:hAnsi="Cambria Math"/>
+                  <w:sz w:val="22"/>
+                </w:rPr>
                 <m:t>ELO</m:t>
               </m:r>
             </m:e>
             <m:sub>
               <m:r>
-                <m:rPr/>
+                <w:rPr>
+                  <w:rFonts w:ascii="Cambria Math" w:hAnsi="Cambria Math"/>
+                  <w:sz w:val="22"/>
+                </w:rPr>
                 <m:t>A</m:t>
               </m:r>
             </m:sub>
           </m:sSub>
           <m:r>
-            <m:rPr/>
-            <m:t> + K × (</m:t>
+            <w:rPr>
+              <w:rFonts w:ascii="Cambria Math" w:hAnsi="Cambria Math"/>
+              <w:sz w:val="22"/>
+            </w:rPr>
+            <m:t xml:space="preserve"> + K × (</m:t>
           </m:r>
           <m:sSub>
+            <m:sSubPr>
+              <m:ctrlPr>
+                <w:rPr>
+                  <w:rFonts w:ascii="Cambria Math" w:hAnsi="Cambria Math"/>
+                  <w:i/>
+                  <w:iCs/>
+                  <w:sz w:val="22"/>
+                </w:rPr>
+              </m:ctrlPr>
+            </m:sSubPr>
             <m:e>
               <m:r>
-                <m:rPr/>
+                <w:rPr>
+                  <w:rFonts w:ascii="Cambria Math" w:hAnsi="Cambria Math"/>
+                  <w:sz w:val="22"/>
+                </w:rPr>
                 <m:t>S</m:t>
               </m:r>
             </m:e>
             <m:sub>
               <m:r>
-                <m:rPr/>
+                <w:rPr>
+                  <w:rFonts w:ascii="Cambria Math" w:hAnsi="Cambria Math"/>
+                  <w:sz w:val="22"/>
+                </w:rPr>
                 <m:t>A</m:t>
               </m:r>
             </m:sub>
           </m:sSub>
           <m:r>
-            <m:rPr/>
-            <m:t> − P(A))</m:t>
+            <w:rPr>
+              <w:rFonts w:ascii="Cambria Math" w:hAnsi="Cambria Math"/>
+              <w:sz w:val="22"/>
+            </w:rPr>
+            <m:t xml:space="preserve"> - P(A))</m:t>
           </m:r>
         </m:oMath>
       </m:oMathPara>
     </w:p>
     <w:p>
-      <w:r>
-        <w:t>Здесь S_A равно 1 при победе игрока A и 0 при поражении, а K задает силу изменения рейтинга. Победа над более сильным соперником дает больший прирост, чем ожидаемая победа над более слабым. В проекте ELO считается строго по хронологии матчей.</w:t>
+      <w:pPr>
+        <w:ind w:left="360"/>
+        <w:rPr>
+          <w:i/>
+          <w:iCs/>
+          <w:sz w:val="22"/>
+          <w:lang w:val="ru-RU"/>
+        </w:rPr>
+      </w:pPr>
+      <w:r>
+        <w:rPr>
+          <w:i/>
+          <w:iCs/>
+          <w:sz w:val="22"/>
+          <w:lang w:val="ru-RU"/>
+        </w:rPr>
+        <w:t xml:space="preserve">Здесь </w:t>
+      </w:r>
+      <w:r>
+        <w:rPr>
+          <w:i/>
+          <w:iCs/>
+          <w:sz w:val="22"/>
+        </w:rPr>
+        <w:t>S</w:t>
+      </w:r>
+      <w:r>
+        <w:rPr>
+          <w:i/>
+          <w:iCs/>
+          <w:sz w:val="22"/>
+          <w:lang w:val="ru-RU"/>
+        </w:rPr>
+        <w:t>_</w:t>
+      </w:r>
+      <w:r>
+        <w:rPr>
+          <w:i/>
+          <w:iCs/>
+          <w:sz w:val="22"/>
+        </w:rPr>
+        <w:t>A</w:t>
+      </w:r>
+      <w:r>
+        <w:rPr>
+          <w:i/>
+          <w:iCs/>
+          <w:sz w:val="22"/>
+          <w:lang w:val="ru-RU"/>
+        </w:rPr>
+        <w:t xml:space="preserve"> равно 1 при победе игрока </w:t>
+      </w:r>
+      <w:r>
+        <w:rPr>
+          <w:i/>
+          <w:iCs/>
+          <w:sz w:val="22"/>
+        </w:rPr>
+        <w:t>A</w:t>
+      </w:r>
+      <w:r>
+        <w:rPr>
+          <w:i/>
+          <w:iCs/>
+          <w:sz w:val="22"/>
+          <w:lang w:val="ru-RU"/>
+        </w:rPr>
+        <w:t xml:space="preserve"> и 0 при поражении, а </w:t>
+      </w:r>
+      <w:r>
+        <w:rPr>
+          <w:i/>
+          <w:iCs/>
+          <w:sz w:val="22"/>
+        </w:rPr>
+        <w:t>K</w:t>
+      </w:r>
+      <w:r>
+        <w:rPr>
+          <w:i/>
+          <w:iCs/>
+          <w:sz w:val="22"/>
+          <w:lang w:val="ru-RU"/>
+        </w:rPr>
+        <w:t xml:space="preserve"> задает силу изменения рейтинга.</w:t>
       </w:r>
     </w:p>
     <w:p>
       <w:pPr>
-        <w:rPr>
-          <w:lang w:val="ru-RU"/>
-        </w:rPr>
-      </w:pPr>
-      <w:r>
-        <w:rPr>
-          <w:lang w:val="ru-RU"/>
-        </w:rPr>
-        <w:t>Недавняя форма в панели прогноза считается как доля побед игрока в последних 5 и 10 матчах до выбранной даты (</w:t>
-      </w:r>
-      <w:r>
-        <w:t>Form</w:t>
-      </w:r>
-      <w:r>
-        <w:rPr>
-          <w:lang w:val="ru-RU"/>
-        </w:rPr>
-        <w:t xml:space="preserve"> 5 и </w:t>
-      </w:r>
-      <w:r>
-        <w:t>Form</w:t>
-      </w:r>
-      <w:r>
-        <w:rPr>
-          <w:lang w:val="ru-RU"/>
-        </w:rPr>
-        <w:t xml:space="preserve"> 10). Текущий и будущие матчи в этот расчет не попадают.</w:t>
+        <w:ind w:left="360"/>
+        <w:rPr>
+          <w:i/>
+          <w:iCs/>
+          <w:sz w:val="22"/>
+          <w:lang w:val="ru-RU"/>
+        </w:rPr>
+      </w:pPr>
+      <w:r>
+        <w:rPr>
+          <w:i/>
+          <w:iCs/>
+          <w:sz w:val="22"/>
+          <w:lang w:val="ru-RU"/>
+        </w:rPr>
+        <w:t xml:space="preserve">Победа над более сильным соперником дает больший прирост, чем ожидаемая победа над более слабым. В проекте </w:t>
+      </w:r>
+      <w:r>
+        <w:rPr>
+          <w:i/>
+          <w:iCs/>
+          <w:sz w:val="22"/>
+        </w:rPr>
+        <w:t>ELO</w:t>
+      </w:r>
+      <w:r>
+        <w:rPr>
+          <w:i/>
+          <w:iCs/>
+          <w:sz w:val="22"/>
+          <w:lang w:val="ru-RU"/>
+        </w:rPr>
+        <w:t xml:space="preserve"> считается строго по хронологии матчей.</w:t>
       </w:r>
     </w:p>
     <w:p>
       <w:pPr>
-        <w:rPr>
-          <w:lang w:val="ru-RU"/>
-        </w:rPr>
-      </w:pPr>
-      <w:r>
-        <w:rPr>
-          <w:lang w:val="ru-RU"/>
-        </w:rPr>
-        <w:t xml:space="preserve">Для каждого матча признаки рассчитываются до обновления истории текущим результатом. Такой порядок защищает от </w:t>
-      </w:r>
-      <w:r>
-        <w:t>data</w:t>
-      </w:r>
-      <w:r>
-        <w:rPr>
-          <w:lang w:val="ru-RU"/>
-        </w:rPr>
-        <w:t xml:space="preserve"> </w:t>
-      </w:r>
-      <w:r>
-        <w:t>leakage</w:t>
-      </w:r>
-      <w:r>
-        <w:rPr>
-          <w:lang w:val="ru-RU"/>
-        </w:rPr>
-        <w:t xml:space="preserve"> и делает тестирование похожим на реальный сценарий: сначала прогноз, потом появление результата.</w:t>
+        <w:ind w:left="360"/>
+        <w:rPr>
+          <w:i/>
+          <w:iCs/>
+          <w:sz w:val="22"/>
+          <w:lang w:val="ru-RU"/>
+        </w:rPr>
+      </w:pPr>
+      <w:r>
+        <w:rPr>
+          <w:i/>
+          <w:iCs/>
+          <w:sz w:val="22"/>
+          <w:lang w:val="ru-RU"/>
+        </w:rPr>
+        <w:t>Недавняя форма в панели прогноза считается как доля побед игрока в последних 5 и 10 матчах до выбранной даты (</w:t>
+      </w:r>
+      <w:r>
+        <w:rPr>
+          <w:i/>
+          <w:iCs/>
+          <w:sz w:val="22"/>
+        </w:rPr>
+        <w:t>Form</w:t>
+      </w:r>
+      <w:r>
+        <w:rPr>
+          <w:i/>
+          <w:iCs/>
+          <w:sz w:val="22"/>
+          <w:lang w:val="ru-RU"/>
+        </w:rPr>
+        <w:t xml:space="preserve"> 5 и </w:t>
+      </w:r>
+      <w:r>
+        <w:rPr>
+          <w:i/>
+          <w:iCs/>
+          <w:sz w:val="22"/>
+        </w:rPr>
+        <w:t>Form</w:t>
+      </w:r>
+      <w:r>
+        <w:rPr>
+          <w:i/>
+          <w:iCs/>
+          <w:sz w:val="22"/>
+          <w:lang w:val="ru-RU"/>
+        </w:rPr>
+        <w:t xml:space="preserve"> 10). Текущий и будущие матчи в этот расчет не попадают.</w:t>
       </w:r>
     </w:p>
     <w:p>
       <w:pPr>
+        <w:jc w:val="both"/>
+        <w:rPr>
+          <w:lang w:val="ru-RU"/>
+        </w:rPr>
+      </w:pPr>
+      <w:r>
+        <w:rPr>
+          <w:lang w:val="ru-RU"/>
+        </w:rPr>
+        <w:t xml:space="preserve">Для каждого матча признаки рассчитываются до обновления истории текущим результатом. Такой порядок защищает от </w:t>
+      </w:r>
+      <w:r>
+        <w:t>data</w:t>
+      </w:r>
+      <w:r>
+        <w:rPr>
+          <w:lang w:val="ru-RU"/>
+        </w:rPr>
+        <w:t xml:space="preserve"> </w:t>
+      </w:r>
+      <w:r>
+        <w:t>leakage</w:t>
+      </w:r>
+      <w:r>
+        <w:rPr>
+          <w:lang w:val="ru-RU"/>
+        </w:rPr>
+        <w:t xml:space="preserve"> и делает тестирование похожим на реальный</w:t>
+      </w:r>
+      <w:r>
+        <w:rPr>
+          <w:lang w:val="ru-RU"/>
+        </w:rPr>
+        <w:t xml:space="preserve"> </w:t>
+      </w:r>
+      <w:r>
+        <w:rPr>
+          <w:lang w:val="ru-RU"/>
+        </w:rPr>
+        <w:t>сценарий: сначала прогноз, потом появление результата.</w:t>
+      </w:r>
+    </w:p>
+    <w:p>
+      <w:pPr>
         <w:pStyle w:val="1"/>
-        <w:rPr>
-          <w:lang w:val="ru-RU"/>
-        </w:rPr>
-      </w:pPr>
-      <w:bookmarkStart w:id="4" w:name="_Toc229557930"/>
+        <w:spacing w:after="240"/>
+        <w:rPr>
+          <w:lang w:val="ru-RU"/>
+        </w:rPr>
+      </w:pPr>
+      <w:bookmarkStart w:id="4" w:name="_Toc229559703"/>
       <w:r>
         <w:rPr>
           <w:lang w:val="ru-RU"/>
@@ -2951,6 +3363,7 @@
     </w:p>
     <w:p>
       <w:pPr>
+        <w:jc w:val="both"/>
         <w:rPr>
           <w:lang w:val="ru-RU"/>
         </w:rPr>
@@ -3004,47 +3417,7 @@
         <w:rPr>
           <w:lang w:val="ru-RU"/>
         </w:rPr>
-        <w:t xml:space="preserve"> выполнено по времени, а не случайным образом. В актуальном обучении тестовая часть содержит последние три месяца матчей: при периоде данных с 02.03.2025 по 11.05.2026 граница разделения приходится на 11.02.2026. В </w:t>
-      </w:r>
-      <w:r>
-        <w:t>train</w:t>
-      </w:r>
-      <w:r>
-        <w:rPr>
-          <w:lang w:val="ru-RU"/>
-        </w:rPr>
-        <w:t xml:space="preserve"> вошло 6326 матчей, в </w:t>
-      </w:r>
-      <w:r>
-        <w:t>test</w:t>
-      </w:r>
-      <w:r>
-        <w:rPr>
-          <w:lang w:val="ru-RU"/>
-        </w:rPr>
-        <w:t xml:space="preserve"> — 1233 матча. Такой подход ближе к реальному применению, потому что модель всегда прогнозирует будущие матчи по прошлой истории.</w:t>
-      </w:r>
-    </w:p>
-    <w:p>
-      <w:pPr>
-        <w:rPr>
-          <w:lang w:val="ru-RU"/>
-        </w:rPr>
-      </w:pPr>
-      <w:r>
-        <w:rPr>
-          <w:lang w:val="ru-RU"/>
-        </w:rPr>
-        <w:t xml:space="preserve">Ниже показано это разделение в компактном виде. Таблица отделена от описания, чтобы было видно: </w:t>
-      </w:r>
-      <w:r>
-        <w:t>test</w:t>
-      </w:r>
-      <w:r>
-        <w:rPr>
-          <w:lang w:val="ru-RU"/>
-        </w:rPr>
-        <w:t xml:space="preserve"> используется не для обучения, а только для честной проверки качества на более поздних матчах.</w:t>
+        <w:t xml:space="preserve"> выполнено по времени, а не случайным образом. В актуальном обучении тестовая часть содержит последние три месяца матчей:</w:t>
       </w:r>
     </w:p>
     <w:tbl>
@@ -3054,15 +3427,15 @@
         <w:tblLook w:val="04A0" w:firstRow="1" w:lastRow="0" w:firstColumn="1" w:lastColumn="0" w:noHBand="0" w:noVBand="1"/>
       </w:tblPr>
       <w:tblGrid>
-        <w:gridCol w:w="2412"/>
-        <w:gridCol w:w="2412"/>
+        <w:gridCol w:w="1242"/>
+        <w:gridCol w:w="3582"/>
         <w:gridCol w:w="2412"/>
         <w:gridCol w:w="2412"/>
       </w:tblGrid>
       <w:tr>
         <w:tc>
           <w:tcPr>
-            <w:tcW w:w="2412" w:type="dxa"/>
+            <w:tcW w:w="1242" w:type="dxa"/>
           </w:tcPr>
           <w:p>
             <w:proofErr w:type="spellStart"/>
@@ -3073,6 +3446,19 @@
               <w:t>Часть</w:t>
             </w:r>
             <w:proofErr w:type="spellEnd"/>
+          </w:p>
+        </w:tc>
+        <w:tc>
+          <w:tcPr>
+            <w:tcW w:w="3582" w:type="dxa"/>
+          </w:tcPr>
+          <w:p>
+            <w:r>
+              <w:rPr>
+                <w:b/>
+              </w:rPr>
+              <w:t>Период</w:t>
+            </w:r>
           </w:p>
         </w:tc>
         <w:tc>
@@ -3084,7 +3470,7 @@
               <w:rPr>
                 <w:b/>
               </w:rPr>
-              <w:t>Период</w:t>
+              <w:t>Матчей</w:t>
             </w:r>
           </w:p>
         </w:tc>
@@ -3097,7 +3483,29 @@
               <w:rPr>
                 <w:b/>
               </w:rPr>
-              <w:t>Матчей</w:t>
+              <w:t>Long-format строк</w:t>
+            </w:r>
+          </w:p>
+        </w:tc>
+      </w:tr>
+      <w:tr>
+        <w:tc>
+          <w:tcPr>
+            <w:tcW w:w="1242" w:type="dxa"/>
+          </w:tcPr>
+          <w:p>
+            <w:r>
+              <w:t>Train</w:t>
+            </w:r>
+          </w:p>
+        </w:tc>
+        <w:tc>
+          <w:tcPr>
+            <w:tcW w:w="3582" w:type="dxa"/>
+          </w:tcPr>
+          <w:p>
+            <w:r>
+              <w:t>02.03.2025 — 10.02.2026</w:t>
             </w:r>
           </w:p>
         </w:tc>
@@ -3107,22 +3515,7 @@
           </w:tcPr>
           <w:p>
             <w:r>
-              <w:rPr>
-                <w:b/>
-              </w:rPr>
-              <w:t>Long-format строк</w:t>
-            </w:r>
-          </w:p>
-        </w:tc>
-      </w:tr>
-      <w:tr>
-        <w:tc>
-          <w:tcPr>
-            <w:tcW w:w="2412" w:type="dxa"/>
-          </w:tcPr>
-          <w:p>
-            <w:r>
-              <w:t>Train</w:t>
+              <w:t>6 326</w:t>
             </w:r>
           </w:p>
         </w:tc>
@@ -3132,7 +3525,29 @@
           </w:tcPr>
           <w:p>
             <w:r>
-              <w:t>02.03.2025 — 10.02.2026</w:t>
+              <w:t>12 652</w:t>
+            </w:r>
+          </w:p>
+        </w:tc>
+      </w:tr>
+      <w:tr>
+        <w:tc>
+          <w:tcPr>
+            <w:tcW w:w="1242" w:type="dxa"/>
+          </w:tcPr>
+          <w:p>
+            <w:r>
+              <w:t>Test</w:t>
+            </w:r>
+          </w:p>
+        </w:tc>
+        <w:tc>
+          <w:tcPr>
+            <w:tcW w:w="3582" w:type="dxa"/>
+          </w:tcPr>
+          <w:p>
+            <w:r>
+              <w:t>11.02.2026 — 11.05.2026</w:t>
             </w:r>
           </w:p>
         </w:tc>
@@ -3142,7 +3557,7 @@
           </w:tcPr>
           <w:p>
             <w:r>
-              <w:t>6 326</w:t>
+              <w:t>1 233</w:t>
             </w:r>
           </w:p>
         </w:tc>
@@ -3152,48 +3567,6 @@
           </w:tcPr>
           <w:p>
             <w:r>
-              <w:t>12 652</w:t>
-            </w:r>
-          </w:p>
-        </w:tc>
-      </w:tr>
-      <w:tr>
-        <w:tc>
-          <w:tcPr>
-            <w:tcW w:w="2412" w:type="dxa"/>
-          </w:tcPr>
-          <w:p>
-            <w:r>
-              <w:t>Test</w:t>
-            </w:r>
-          </w:p>
-        </w:tc>
-        <w:tc>
-          <w:tcPr>
-            <w:tcW w:w="2412" w:type="dxa"/>
-          </w:tcPr>
-          <w:p>
-            <w:r>
-              <w:t>11.02.2026 — 11.05.2026</w:t>
-            </w:r>
-          </w:p>
-        </w:tc>
-        <w:tc>
-          <w:tcPr>
-            <w:tcW w:w="2412" w:type="dxa"/>
-          </w:tcPr>
-          <w:p>
-            <w:r>
-              <w:t>1 233</w:t>
-            </w:r>
-          </w:p>
-        </w:tc>
-        <w:tc>
-          <w:tcPr>
-            <w:tcW w:w="2412" w:type="dxa"/>
-          </w:tcPr>
-          <w:p>
-            <w:r>
               <w:t>2 466</w:t>
             </w:r>
           </w:p>
@@ -3206,12 +3579,6 @@
           <w:lang w:val="ru-RU"/>
         </w:rPr>
       </w:pPr>
-      <w:r>
-        <w:rPr>
-          <w:lang w:val="ru-RU"/>
-        </w:rPr>
-        <w:t>Такое разделение защищает от завышенной оценки качества: модель учится на прошлом и проверяется на матчах, которые для нее находятся в будущем.</w:t>
-      </w:r>
     </w:p>
     <w:p>
       <w:pPr>
@@ -3223,31 +3590,33 @@
         <w:rPr>
           <w:lang w:val="ru-RU"/>
         </w:rPr>
-        <w:lastRenderedPageBreak/>
-        <w:t>Для сравнения использовались несколько уровней решений:</w:t>
+        <w:br w:type="page"/>
       </w:r>
     </w:p>
     <w:p>
       <w:pPr>
-        <w:pStyle w:val="a0"/>
-        <w:rPr>
-          <w:lang w:val="ru-RU"/>
-        </w:rPr>
-      </w:pPr>
-      <w:r>
-        <w:rPr>
-          <w:lang w:val="ru-RU"/>
-        </w:rPr>
-        <w:t xml:space="preserve">простые однофакторные ориентиры: официальный рейтинг, скорректированный рейтинг, относительный рейтинг и </w:t>
-      </w:r>
-      <w:r>
-        <w:t>ELO</w:t>
-      </w:r>
-      <w:r>
-        <w:rPr>
-          <w:lang w:val="ru-RU"/>
-        </w:rPr>
-        <w:t>;</w:t>
+        <w:rPr>
+          <w:lang w:val="ru-RU"/>
+        </w:rPr>
+      </w:pPr>
+      <w:r>
+        <w:rPr>
+          <w:lang w:val="ru-RU"/>
+        </w:rPr>
+        <w:lastRenderedPageBreak/>
+        <w:t>Для сравнения</w:t>
+      </w:r>
+      <w:r>
+        <w:rPr>
+          <w:lang w:val="ru-RU"/>
+        </w:rPr>
+        <w:t xml:space="preserve"> результатов</w:t>
+      </w:r>
+      <w:r>
+        <w:rPr>
+          <w:lang w:val="ru-RU"/>
+        </w:rPr>
+        <w:t xml:space="preserve"> использовались несколько уровней решений:</w:t>
       </w:r>
     </w:p>
     <w:p>
@@ -3261,25 +3630,7 @@
         <w:rPr>
           <w:lang w:val="ru-RU"/>
         </w:rPr>
-        <w:t xml:space="preserve">компактный </w:t>
-      </w:r>
-      <w:r>
-        <w:t>baseline</w:t>
-      </w:r>
-      <w:r>
-        <w:rPr>
-          <w:lang w:val="ru-RU"/>
-        </w:rPr>
-        <w:t xml:space="preserve"> </w:t>
-      </w:r>
-      <w:r>
-        <w:t>rating</w:t>
-      </w:r>
-      <w:r>
-        <w:rPr>
-          <w:lang w:val="ru-RU"/>
-        </w:rPr>
-        <w:t xml:space="preserve"> + </w:t>
+        <w:t xml:space="preserve">простые однофакторные ориентиры: официальный рейтинг, скорректированный рейтинг, относительный рейтинг и </w:t>
       </w:r>
       <w:r>
         <w:t>ELO</w:t>
@@ -3288,7 +3639,7 @@
         <w:rPr>
           <w:lang w:val="ru-RU"/>
         </w:rPr>
-        <w:t>, который проверяет качество простого рейтингового подхода;</w:t>
+        <w:t>;</w:t>
       </w:r>
     </w:p>
     <w:p>
@@ -3302,10 +3653,10 @@
         <w:rPr>
           <w:lang w:val="ru-RU"/>
         </w:rPr>
-        <w:t xml:space="preserve">основные модели на полном наборе признаков: </w:t>
-      </w:r>
-      <w:r>
-        <w:t>Gradient</w:t>
+        <w:t xml:space="preserve">компактный </w:t>
+      </w:r>
+      <w:r>
+        <w:t>baseline</w:t>
       </w:r>
       <w:r>
         <w:rPr>
@@ -3314,74 +3665,122 @@
         <w:t xml:space="preserve"> </w:t>
       </w:r>
       <w:r>
-        <w:t>Boosting</w:t>
-      </w:r>
-      <w:r>
-        <w:rPr>
-          <w:lang w:val="ru-RU"/>
-        </w:rPr>
-        <w:t xml:space="preserve">, </w:t>
-      </w:r>
-      <w:proofErr w:type="spellStart"/>
-      <w:r>
-        <w:t>CatBoost</w:t>
-      </w:r>
-      <w:proofErr w:type="spellEnd"/>
-      <w:r>
-        <w:rPr>
-          <w:lang w:val="ru-RU"/>
-        </w:rPr>
-        <w:t xml:space="preserve"> и </w:t>
-      </w:r>
-      <w:r>
-        <w:t>Random</w:t>
-      </w:r>
-      <w:r>
-        <w:rPr>
-          <w:lang w:val="ru-RU"/>
-        </w:rPr>
-        <w:t xml:space="preserve"> </w:t>
-      </w:r>
-      <w:r>
-        <w:t>Forest</w:t>
-      </w:r>
-      <w:r>
-        <w:rPr>
-          <w:lang w:val="ru-RU"/>
-        </w:rPr>
-        <w:t>.</w:t>
+        <w:t>rating</w:t>
+      </w:r>
+      <w:r>
+        <w:rPr>
+          <w:lang w:val="ru-RU"/>
+        </w:rPr>
+        <w:t xml:space="preserve"> + </w:t>
+      </w:r>
+      <w:r>
+        <w:t>ELO</w:t>
+      </w:r>
+      <w:r>
+        <w:rPr>
+          <w:lang w:val="ru-RU"/>
+        </w:rPr>
+        <w:t>, который проверяет качество простого рейтингового подхода;</w:t>
       </w:r>
     </w:p>
     <w:p>
       <w:pPr>
-        <w:rPr>
-          <w:lang w:val="ru-RU"/>
-        </w:rPr>
-      </w:pPr>
-      <w:r>
-        <w:rPr>
-          <w:lang w:val="ru-RU"/>
-        </w:rPr>
-        <w:t xml:space="preserve">После оценки качества дополнительно обучается </w:t>
-      </w:r>
-      <w:r>
-        <w:t>production</w:t>
-      </w:r>
-      <w:r>
-        <w:rPr>
-          <w:lang w:val="ru-RU"/>
-        </w:rPr>
-        <w:t>-версия модели на всех доступных данных. Она используется для пользовательского прогноза конкретного матча, чтобы учитывать максимально свежую историю игроков.</w:t>
+        <w:pStyle w:val="a0"/>
+        <w:rPr>
+          <w:lang w:val="ru-RU"/>
+        </w:rPr>
+      </w:pPr>
+      <w:r>
+        <w:rPr>
+          <w:lang w:val="ru-RU"/>
+        </w:rPr>
+        <w:t xml:space="preserve">основные модели на полном наборе признаков: </w:t>
+      </w:r>
+      <w:r>
+        <w:t>Gradient</w:t>
+      </w:r>
+      <w:r>
+        <w:rPr>
+          <w:lang w:val="ru-RU"/>
+        </w:rPr>
+        <w:t xml:space="preserve"> </w:t>
+      </w:r>
+      <w:r>
+        <w:t>Boosting</w:t>
+      </w:r>
+      <w:r>
+        <w:rPr>
+          <w:lang w:val="ru-RU"/>
+        </w:rPr>
+        <w:t xml:space="preserve">, </w:t>
+      </w:r>
+      <w:proofErr w:type="spellStart"/>
+      <w:r>
+        <w:t>CatBoost</w:t>
+      </w:r>
+      <w:proofErr w:type="spellEnd"/>
+      <w:r>
+        <w:rPr>
+          <w:lang w:val="ru-RU"/>
+        </w:rPr>
+        <w:t xml:space="preserve"> и </w:t>
+      </w:r>
+      <w:r>
+        <w:t>Random</w:t>
+      </w:r>
+      <w:r>
+        <w:rPr>
+          <w:lang w:val="ru-RU"/>
+        </w:rPr>
+        <w:t xml:space="preserve"> </w:t>
+      </w:r>
+      <w:r>
+        <w:t>Forest</w:t>
+      </w:r>
+      <w:r>
+        <w:rPr>
+          <w:lang w:val="ru-RU"/>
+        </w:rPr>
+        <w:t>.</w:t>
       </w:r>
     </w:p>
     <w:p>
       <w:pPr>
+        <w:jc w:val="both"/>
+        <w:rPr>
+          <w:lang w:val="ru-RU"/>
+        </w:rPr>
+      </w:pPr>
+      <w:r>
+        <w:rPr>
+          <w:lang w:val="ru-RU"/>
+        </w:rPr>
+        <w:t xml:space="preserve">После оценки качества дополнительно обучается </w:t>
+      </w:r>
+      <w:r>
+        <w:t>production</w:t>
+      </w:r>
+      <w:r>
+        <w:rPr>
+          <w:lang w:val="ru-RU"/>
+        </w:rPr>
+        <w:t>-версия модели на всех доступных данных. Она используется для пользовательского прогноза конкретного матча, чтобы учитывать максимально свежую историю игроков.</w:t>
+      </w:r>
+    </w:p>
+    <w:p>
+      <w:pPr/>
+      <w:r>
+        <w:t>Production-модель выбирается в два шага. Сначала на временном test-периоде сравниваются основные кандидаты (Gradient Boosting, CatBoost, Random Forest) и baseline-модели. Приоритет имеют метрики качества вероятностного прогноза — LogLoss и Brier score; дополнительно проверяются ROC-AUC, Accuracy и разрыв train/test как индикатор переобучения. После выбора лучшей архитектуры по этим показателям такая же модель переобучается на всех доступных исторических данных и используется в панели прогноза.</w:t>
+      </w:r>
+    </w:p>
+    <w:p>
+      <w:pPr>
         <w:pStyle w:val="1"/>
         <w:rPr>
           <w:lang w:val="ru-RU"/>
         </w:rPr>
       </w:pPr>
-      <w:bookmarkStart w:id="5" w:name="_Toc229557931"/>
+      <w:bookmarkStart w:id="5" w:name="_Toc229559704"/>
       <w:r>
         <w:rPr>
           <w:lang w:val="ru-RU"/>
@@ -4277,7 +4676,7 @@
           <w:lang w:val="ru-RU"/>
         </w:rPr>
       </w:pPr>
-      <w:bookmarkStart w:id="6" w:name="_Toc229557932"/>
+      <w:bookmarkStart w:id="6" w:name="_Toc229559705"/>
       <w:r>
         <w:rPr>
           <w:lang w:val="ru-RU"/>
@@ -4341,7 +4740,7 @@
           <w:lang w:val="ru-RU"/>
         </w:rPr>
       </w:pPr>
-      <w:bookmarkStart w:id="7" w:name="_Toc229557933"/>
+      <w:bookmarkStart w:id="7" w:name="_Toc229559706"/>
       <w:r>
         <w:rPr>
           <w:lang w:val="ru-RU"/>
@@ -4454,7 +4853,7 @@
       <w:pPr>
         <w:pStyle w:val="1"/>
       </w:pPr>
-      <w:bookmarkStart w:id="8" w:name="_Toc229557934"/>
+      <w:bookmarkStart w:id="8" w:name="_Toc229559707"/>
       <w:r>
         <w:lastRenderedPageBreak/>
         <w:t>9. Ограничения проекта</w:t>
@@ -4588,7 +4987,7 @@
           <w:lang w:val="ru-RU"/>
         </w:rPr>
       </w:pPr>
-      <w:bookmarkStart w:id="9" w:name="_Toc229557935"/>
+      <w:bookmarkStart w:id="9" w:name="_Toc229559708"/>
       <w:r>
         <w:rPr>
           <w:lang w:val="ru-RU"/>
@@ -4813,7 +5212,7 @@
       <w:pPr>
         <w:pStyle w:val="1"/>
       </w:pPr>
-      <w:bookmarkStart w:id="10" w:name="_Toc229557936"/>
+      <w:bookmarkStart w:id="10" w:name="_Toc229559709"/>
       <w:r>
         <w:lastRenderedPageBreak/>
         <w:t>11. Источники</w:t>

</xml_diff>

<commit_message>
Specify production model selection criteria
</commit_message>
<xml_diff>
--- a/docs/Пояснительная_записка_RTT_tennis_predictor_updated_v14.docx
+++ b/docs/Пояснительная_записка_RTT_tennis_predictor_updated_v14.docx
@@ -395,7 +395,7 @@
           <w:r>
             <w:fldChar w:fldCharType="separate"/>
           </w:r>
-          <w:hyperlink w:anchor="_Toc229559699" w:history="1">
+          <w:hyperlink w:anchor="_Toc229562875" w:history="1">
             <w:r>
               <w:rPr>
                 <w:rStyle w:val="aff8"/>
@@ -423,7 +423,7 @@
                 <w:noProof/>
                 <w:webHidden/>
               </w:rPr>
-              <w:instrText xml:space="preserve"> PAGEREF _Toc229559699 \h </w:instrText>
+              <w:instrText xml:space="preserve"> PAGEREF _Toc229562875 \h </w:instrText>
             </w:r>
             <w:r>
               <w:rPr>
@@ -469,7 +469,7 @@
               <w14:ligatures w14:val="standardContextual"/>
             </w:rPr>
           </w:pPr>
-          <w:hyperlink w:anchor="_Toc229559700" w:history="1">
+          <w:hyperlink w:anchor="_Toc229562876" w:history="1">
             <w:r>
               <w:rPr>
                 <w:rStyle w:val="aff8"/>
@@ -497,7 +497,7 @@
                 <w:noProof/>
                 <w:webHidden/>
               </w:rPr>
-              <w:instrText xml:space="preserve"> PAGEREF _Toc229559700 \h </w:instrText>
+              <w:instrText xml:space="preserve"> PAGEREF _Toc229562876 \h </w:instrText>
             </w:r>
             <w:r>
               <w:rPr>
@@ -543,7 +543,7 @@
               <w14:ligatures w14:val="standardContextual"/>
             </w:rPr>
           </w:pPr>
-          <w:hyperlink w:anchor="_Toc229559701" w:history="1">
+          <w:hyperlink w:anchor="_Toc229562877" w:history="1">
             <w:r>
               <w:rPr>
                 <w:rStyle w:val="aff8"/>
@@ -571,7 +571,7 @@
                 <w:noProof/>
                 <w:webHidden/>
               </w:rPr>
-              <w:instrText xml:space="preserve"> PAGEREF _Toc229559701 \h </w:instrText>
+              <w:instrText xml:space="preserve"> PAGEREF _Toc229562877 \h </w:instrText>
             </w:r>
             <w:r>
               <w:rPr>
@@ -617,7 +617,7 @@
               <w14:ligatures w14:val="standardContextual"/>
             </w:rPr>
           </w:pPr>
-          <w:hyperlink w:anchor="_Toc229559702" w:history="1">
+          <w:hyperlink w:anchor="_Toc229562878" w:history="1">
             <w:r>
               <w:rPr>
                 <w:rStyle w:val="aff8"/>
@@ -645,7 +645,7 @@
                 <w:noProof/>
                 <w:webHidden/>
               </w:rPr>
-              <w:instrText xml:space="preserve"> PAGEREF _Toc229559702 \h </w:instrText>
+              <w:instrText xml:space="preserve"> PAGEREF _Toc229562878 \h </w:instrText>
             </w:r>
             <w:r>
               <w:rPr>
@@ -691,7 +691,7 @@
               <w14:ligatures w14:val="standardContextual"/>
             </w:rPr>
           </w:pPr>
-          <w:hyperlink w:anchor="_Toc229559703" w:history="1">
+          <w:hyperlink w:anchor="_Toc229562879" w:history="1">
             <w:r>
               <w:rPr>
                 <w:rStyle w:val="aff8"/>
@@ -719,7 +719,7 @@
                 <w:noProof/>
                 <w:webHidden/>
               </w:rPr>
-              <w:instrText xml:space="preserve"> PAGEREF _Toc229559703 \h </w:instrText>
+              <w:instrText xml:space="preserve"> PAGEREF _Toc229562879 \h </w:instrText>
             </w:r>
             <w:r>
               <w:rPr>
@@ -765,7 +765,7 @@
               <w14:ligatures w14:val="standardContextual"/>
             </w:rPr>
           </w:pPr>
-          <w:hyperlink w:anchor="_Toc229559704" w:history="1">
+          <w:hyperlink w:anchor="_Toc229562880" w:history="1">
             <w:r>
               <w:rPr>
                 <w:rStyle w:val="aff8"/>
@@ -793,7 +793,7 @@
                 <w:noProof/>
                 <w:webHidden/>
               </w:rPr>
-              <w:instrText xml:space="preserve"> PAGEREF _Toc229559704 \h </w:instrText>
+              <w:instrText xml:space="preserve"> PAGEREF _Toc229562880 \h </w:instrText>
             </w:r>
             <w:r>
               <w:rPr>
@@ -839,7 +839,7 @@
               <w14:ligatures w14:val="standardContextual"/>
             </w:rPr>
           </w:pPr>
-          <w:hyperlink w:anchor="_Toc229559705" w:history="1">
+          <w:hyperlink w:anchor="_Toc229562881" w:history="1">
             <w:r>
               <w:rPr>
                 <w:rStyle w:val="aff8"/>
@@ -867,7 +867,7 @@
                 <w:noProof/>
                 <w:webHidden/>
               </w:rPr>
-              <w:instrText xml:space="preserve"> PAGEREF _Toc229559705 \h </w:instrText>
+              <w:instrText xml:space="preserve"> PAGEREF _Toc229562881 \h </w:instrText>
             </w:r>
             <w:r>
               <w:rPr>
@@ -913,7 +913,7 @@
               <w14:ligatures w14:val="standardContextual"/>
             </w:rPr>
           </w:pPr>
-          <w:hyperlink w:anchor="_Toc229559706" w:history="1">
+          <w:hyperlink w:anchor="_Toc229562882" w:history="1">
             <w:r>
               <w:rPr>
                 <w:rStyle w:val="aff8"/>
@@ -941,7 +941,7 @@
                 <w:noProof/>
                 <w:webHidden/>
               </w:rPr>
-              <w:instrText xml:space="preserve"> PAGEREF _Toc229559706 \h </w:instrText>
+              <w:instrText xml:space="preserve"> PAGEREF _Toc229562882 \h </w:instrText>
             </w:r>
             <w:r>
               <w:rPr>
@@ -987,7 +987,7 @@
               <w14:ligatures w14:val="standardContextual"/>
             </w:rPr>
           </w:pPr>
-          <w:hyperlink w:anchor="_Toc229559707" w:history="1">
+          <w:hyperlink w:anchor="_Toc229562883" w:history="1">
             <w:r>
               <w:rPr>
                 <w:rStyle w:val="aff8"/>
@@ -1014,7 +1014,7 @@
                 <w:noProof/>
                 <w:webHidden/>
               </w:rPr>
-              <w:instrText xml:space="preserve"> PAGEREF _Toc229559707 \h </w:instrText>
+              <w:instrText xml:space="preserve"> PAGEREF _Toc229562883 \h </w:instrText>
             </w:r>
             <w:r>
               <w:rPr>
@@ -1060,7 +1060,7 @@
               <w14:ligatures w14:val="standardContextual"/>
             </w:rPr>
           </w:pPr>
-          <w:hyperlink w:anchor="_Toc229559708" w:history="1">
+          <w:hyperlink w:anchor="_Toc229562884" w:history="1">
             <w:r>
               <w:rPr>
                 <w:rStyle w:val="aff8"/>
@@ -1088,7 +1088,7 @@
                 <w:noProof/>
                 <w:webHidden/>
               </w:rPr>
-              <w:instrText xml:space="preserve"> PAGEREF _Toc229559708 \h </w:instrText>
+              <w:instrText xml:space="preserve"> PAGEREF _Toc229562884 \h </w:instrText>
             </w:r>
             <w:r>
               <w:rPr>
@@ -1134,7 +1134,7 @@
               <w14:ligatures w14:val="standardContextual"/>
             </w:rPr>
           </w:pPr>
-          <w:hyperlink w:anchor="_Toc229559709" w:history="1">
+          <w:hyperlink w:anchor="_Toc229562885" w:history="1">
             <w:r>
               <w:rPr>
                 <w:rStyle w:val="aff8"/>
@@ -1161,7 +1161,7 @@
                 <w:noProof/>
                 <w:webHidden/>
               </w:rPr>
-              <w:instrText xml:space="preserve"> PAGEREF _Toc229559709 \h </w:instrText>
+              <w:instrText xml:space="preserve"> PAGEREF _Toc229562885 \h </w:instrText>
             </w:r>
             <w:r>
               <w:rPr>
@@ -1224,7 +1224,7 @@
           <w:lang w:val="ru-RU"/>
         </w:rPr>
       </w:pPr>
-      <w:bookmarkStart w:id="0" w:name="_Toc229559699"/>
+      <w:bookmarkStart w:id="0" w:name="_Toc229562875"/>
       <w:r>
         <w:rPr>
           <w:lang w:val="ru-RU"/>
@@ -1328,7 +1328,7 @@
           <w:lang w:val="ru-RU"/>
         </w:rPr>
       </w:pPr>
-      <w:bookmarkStart w:id="1" w:name="_Toc229559700"/>
+      <w:bookmarkStart w:id="1" w:name="_Toc229562876"/>
       <w:r>
         <w:rPr>
           <w:lang w:val="ru-RU"/>
@@ -1780,7 +1780,7 @@
           <w:lang w:val="ru-RU"/>
         </w:rPr>
       </w:pPr>
-      <w:bookmarkStart w:id="2" w:name="_Toc229559701"/>
+      <w:bookmarkStart w:id="2" w:name="_Toc229562877"/>
       <w:r>
         <w:rPr>
           <w:lang w:val="ru-RU"/>
@@ -2559,7 +2559,7 @@
           <w:lang w:val="ru-RU"/>
         </w:rPr>
       </w:pPr>
-      <w:bookmarkStart w:id="3" w:name="_Toc229559702"/>
+      <w:bookmarkStart w:id="3" w:name="_Toc229562878"/>
       <w:r>
         <w:rPr>
           <w:lang w:val="ru-RU"/>
@@ -3352,7 +3352,7 @@
           <w:lang w:val="ru-RU"/>
         </w:rPr>
       </w:pPr>
-      <w:bookmarkStart w:id="4" w:name="_Toc229559703"/>
+      <w:bookmarkStart w:id="4" w:name="_Toc229562879"/>
       <w:r>
         <w:rPr>
           <w:lang w:val="ru-RU"/>
@@ -3391,6 +3391,7 @@
     </w:p>
     <w:p>
       <w:pPr>
+        <w:jc w:val="both"/>
         <w:rPr>
           <w:lang w:val="ru-RU"/>
         </w:rPr>
@@ -3768,19 +3769,39 @@
       </w:r>
     </w:p>
     <w:p>
-      <w:pPr/>
-      <w:r>
-        <w:t>Production-модель выбирается в два шага. Сначала на временном test-периоде сравниваются основные кандидаты (Gradient Boosting, CatBoost, Random Forest) и baseline-модели. Приоритет имеют метрики качества вероятностного прогноза — LogLoss и Brier score; дополнительно проверяются ROC-AUC, Accuracy и разрыв train/test как индикатор переобучения. После выбора лучшей архитектуры по этим показателям такая же модель переобучается на всех доступных исторических данных и используется в панели прогноза.</w:t>
+      <w:pPr>
+        <w:jc w:val="both"/>
+        <w:rPr>
+          <w:lang w:val="ru-RU"/>
+        </w:rPr>
+      </w:pPr>
+      <w:r>
+        <w:t>Production-модель выбирается не вручную, а по фиксированному правилу. После обучения сравниваются только основные кандидаты на полном наборе признаков: Gradient Boosting, CatBoost и Random Forest. Для выбора используются прогнозы на уровне реального матча после симметризации вероятностей, потому что именно в таком виде работает пользовательский прогноз: одна итоговая вероятность победы первого игрока над вторым.</w:t>
       </w:r>
     </w:p>
     <w:p>
+      <w:r>
+        <w:t>Правило выбора детерминированное: сначала модели сортируются по test LogLoss по возрастанию (чем меньше, тем лучше); при близком LogLoss вторым критерием выступает test Brier score по возрастанию; третьим критерием является test ROC-AUC по убыванию. Accuracy и разрыв между train/test LogLoss не участвуют в автоматической сортировке, но используются как обязательная диагностика: Accuracy показывает понятную долю верных выборов победителя, а большой train/test-gap указывает на риск переобучения.</w:t>
+      </w:r>
+    </w:p>
+    <w:p>
+      <w:r>
+        <w:t>В актуальном запуске на test-периоде из 1 233 матчей результаты основных моделей следующие: Gradient Boosting — LogLoss 0,4557, Brier 0,1498, ROC-AUC 0,8658, Accuracy 78,1%; CatBoost — LogLoss 0,4561, Brier 0,1501, ROC-AUC 0,8653, Accuracy 78,3%; Random Forest — LogLoss 0,4621, Brier 0,1518, ROC-AUC 0,8621, Accuracy 77,2%. Поэтому production-архитектурой выбран Gradient Boosting: он дает минимальный LogLoss и минимальный Brier score при сопоставимом ROC-AUC.</w:t>
+      </w:r>
+    </w:p>
+    <w:p>
+      <w:r>
+        <w:t>После выбора архитектуры модель для практического прогноза переобучается уже на всех доступных исторических матчах: 15 118 строк long-format, 7 559 уникальных матчей, период с 02.03.2025 по 11.05.2026. Такой порядок сохраняет честную оценку качества на отложенном test-периоде и одновременно позволяет production-модели учитывать максимум актуальных данных.</w:t>
+      </w:r>
+    </w:p>
+    <w:p>
       <w:pPr>
         <w:pStyle w:val="1"/>
         <w:rPr>
           <w:lang w:val="ru-RU"/>
         </w:rPr>
       </w:pPr>
-      <w:bookmarkStart w:id="5" w:name="_Toc229559704"/>
+      <w:bookmarkStart w:id="5" w:name="_Toc229562880"/>
       <w:r>
         <w:rPr>
           <w:lang w:val="ru-RU"/>
@@ -4445,6 +4466,7 @@
       </w:pPr>
       <w:proofErr w:type="spellStart"/>
       <w:r>
+        <w:lastRenderedPageBreak/>
         <w:t>CatBoost</w:t>
       </w:r>
       <w:proofErr w:type="spellEnd"/>
@@ -4656,7 +4678,6 @@
         <w:rPr>
           <w:lang w:val="ru-RU"/>
         </w:rPr>
-        <w:lastRenderedPageBreak/>
         <w:t xml:space="preserve">В целом результаты можно считать устойчивыми для учебного проекта: модель уверенно превосходит простые рейтинговые ориентиры, а качество оценивается на временном </w:t>
       </w:r>
       <w:r>
@@ -4676,7 +4697,7 @@
           <w:lang w:val="ru-RU"/>
         </w:rPr>
       </w:pPr>
-      <w:bookmarkStart w:id="6" w:name="_Toc229559705"/>
+      <w:bookmarkStart w:id="6" w:name="_Toc229562881"/>
       <w:r>
         <w:rPr>
           <w:lang w:val="ru-RU"/>
@@ -4740,7 +4761,7 @@
           <w:lang w:val="ru-RU"/>
         </w:rPr>
       </w:pPr>
-      <w:bookmarkStart w:id="7" w:name="_Toc229559706"/>
+      <w:bookmarkStart w:id="7" w:name="_Toc229562882"/>
       <w:r>
         <w:rPr>
           <w:lang w:val="ru-RU"/>
@@ -4833,6 +4854,7 @@
         <w:rPr>
           <w:lang w:val="ru-RU"/>
         </w:rPr>
+        <w:lastRenderedPageBreak/>
         <w:t>Выявление расхождений между официальным рейтингом и фактической игровой силой, например у игроков с малым числом турниров или резким изменением результатов.</w:t>
       </w:r>
     </w:p>
@@ -4853,9 +4875,8 @@
       <w:pPr>
         <w:pStyle w:val="1"/>
       </w:pPr>
-      <w:bookmarkStart w:id="8" w:name="_Toc229559707"/>
-      <w:r>
-        <w:lastRenderedPageBreak/>
+      <w:bookmarkStart w:id="8" w:name="_Toc229562883"/>
+      <w:r>
         <w:t>9. Ограничения проекта</w:t>
       </w:r>
       <w:bookmarkEnd w:id="8"/>
@@ -4987,7 +5008,7 @@
           <w:lang w:val="ru-RU"/>
         </w:rPr>
       </w:pPr>
-      <w:bookmarkStart w:id="9" w:name="_Toc229559708"/>
+      <w:bookmarkStart w:id="9" w:name="_Toc229562884"/>
       <w:r>
         <w:rPr>
           <w:lang w:val="ru-RU"/>
@@ -5177,6 +5198,7 @@
         <w:rPr>
           <w:lang w:val="ru-RU"/>
         </w:rPr>
+        <w:lastRenderedPageBreak/>
         <w:t>улучшить калибровку вероятностей и отдельно контролировать качество на разных возрастных группах;</w:t>
       </w:r>
     </w:p>
@@ -5212,9 +5234,8 @@
       <w:pPr>
         <w:pStyle w:val="1"/>
       </w:pPr>
-      <w:bookmarkStart w:id="10" w:name="_Toc229559709"/>
-      <w:r>
-        <w:lastRenderedPageBreak/>
+      <w:bookmarkStart w:id="10" w:name="_Toc229562885"/>
+      <w:r>
         <w:t>11. Источники</w:t>
       </w:r>
       <w:bookmarkEnd w:id="10"/>

</xml_diff>

<commit_message>
Describe production model selection algorithm
</commit_message>
<xml_diff>
--- a/docs/Пояснительная_записка_RTT_tennis_predictor_updated_v14.docx
+++ b/docs/Пояснительная_записка_RTT_tennis_predictor_updated_v14.docx
@@ -3769,29 +3769,43 @@
       </w:r>
     </w:p>
     <w:p>
-      <w:pPr>
-        <w:jc w:val="both"/>
-        <w:rPr>
-          <w:lang w:val="ru-RU"/>
-        </w:rPr>
-      </w:pPr>
-      <w:r>
-        <w:t>Production-модель выбирается не вручную, а по фиксированному правилу. После обучения сравниваются только основные кандидаты на полном наборе признаков: Gradient Boosting, CatBoost и Random Forest. Для выбора используются прогнозы на уровне реального матча после симметризации вероятностей, потому что именно в таком виде работает пользовательский прогноз: одна итоговая вероятность победы первого игрока над вторым.</w:t>
+      <w:r>
+        <w:t>Production-модель выбирается по детерминированному алгоритму, который повторяет логику скрипта обучения. Production-модель не выбирается отдельно вручную: сначала на test-периоде выбирается лучшая архитектура, а затем модель того же типа переобучается на всех доступных исторических данных.</w:t>
       </w:r>
     </w:p>
     <w:p>
       <w:r>
-        <w:t>Правило выбора детерминированное: сначала модели сортируются по test LogLoss по возрастанию (чем меньше, тем лучше); при близком LogLoss вторым критерием выступает test Brier score по возрастанию; третьим критерием является test ROC-AUC по убыванию. Accuracy и разрыв между train/test LogLoss не участвуют в автоматической сортировке, но используются как обязательная диагностика: Accuracy показывает понятную долю верных выборов победителя, а большой train/test-gap указывает на риск переобучения.</w:t>
+        <w:t>Схема выбора production-архитектуры:</w:t>
       </w:r>
     </w:p>
     <w:p>
       <w:r>
-        <w:t>В актуальном запуске на test-периоде из 1 233 матчей результаты основных моделей следующие: Gradient Boosting — LogLoss 0,4557, Brier 0,1498, ROC-AUC 0,8658, Accuracy 78,1%; CatBoost — LogLoss 0,4561, Brier 0,1501, ROC-AUC 0,8653, Accuracy 78,3%; Random Forest — LogLoss 0,4621, Brier 0,1518, ROC-AUC 0,8621, Accuracy 77,2%. Поэтому production-архитектурой выбран Gradient Boosting: он дает минимальный LogLoss и минимальный Brier score при сопоставимом ROC-AUC.</w:t>
+        <w:t>1. Из общей таблицы метрик берутся только строки, соответствующие основным моделям на полном наборе признаков: final_gbm, final_catboost и final_random_forest.</w:t>
       </w:r>
     </w:p>
     <w:p>
       <w:r>
-        <w:t>После выбора архитектуры модель для практического прогноза переобучается уже на всех доступных исторических матчах: 15 118 строк long-format, 7 559 уникальных матчей, период с 02.03.2025 по 11.05.2026. Такой порядок сохраняет честную оценку качества на отложенном test-периоде и одновременно позволяет production-модели учитывать максимум актуальных данных.</w:t>
+        <w:t>2. Из этих строк оставляются только оценки уровня реального матча: level = match и aggregation = symmetrized. Это важно, потому что пользовательский прогноз тоже выдается как одна симметризованная вероятность победы одного игрока над другим.</w:t>
+      </w:r>
+    </w:p>
+    <w:p>
+      <w:r>
+        <w:t>3. Оставшаяся таблица сортируется строго по трем ключам: сначала по test LogLoss по возрастанию, затем по test Brier score по возрастанию, затем по test ROC-AUC по убыванию. В алгоритме нет порога «близости» метрик: если LogLoss различается, порядок определяется им; Brier score и ROC-AUC работают как последующие ключи сортировки.</w:t>
+      </w:r>
+    </w:p>
+    <w:p>
+      <w:r>
+        <w:t>4. Лучшей основной моделью считается первая строка после такой сортировки. В коде это эквивалентно выбору best_main_model_name из первой строки таблицы best_main_model_selection_table.</w:t>
+      </w:r>
+    </w:p>
+    <w:p>
+      <w:r>
+        <w:t>5. После выбора архитектуры вызывается переобучение модели того же типа на всех доступных строках обучающего датасета. Именно эта переобученная версия сохраняется в prediction bundle и используется в панели прогноза конкретного матча.</w:t>
+      </w:r>
+    </w:p>
+    <w:p>
+      <w:r>
+        <w:t>Accuracy и разрыв между train/test LogLoss не входят в автоматическое правило сортировки. Они используются как диагностические показатели: Accuracy показывает долю верно выбранных победителей, а большой train/test-gap указывает на риск переобучения.</w:t>
       </w:r>
     </w:p>
     <w:p>

</xml_diff>

<commit_message>
Document CatBoost mode selection
</commit_message>
<xml_diff>
--- a/docs/Пояснительная_записка_RTT_tennis_predictor_updated_v14.docx
+++ b/docs/Пояснительная_записка_RTT_tennis_predictor_updated_v14.docx
@@ -3770,42 +3770,72 @@
     </w:p>
     <w:p>
       <w:r>
-        <w:t>Production-модель выбирается по детерминированному алгоритму, который повторяет логику скрипта обучения. Production-модель не выбирается отдельно вручную: сначала на test-периоде выбирается лучшая архитектура, а затем модель того же типа переобучается на всех доступных исторических данных.</w:t>
+        <w:t>Production-модель выбирается по детерминированному алгоритму, который повторяет логику скрипта обучения. Выбор идет в два уровня: сначала внутри CatBoost выбирается режим обучения, после этого готовая CatBoost-модель участвует в общем сравнении с Gradient Boosting и Random Forest.</w:t>
       </w:r>
     </w:p>
     <w:p>
       <w:r>
-        <w:t>Схема выбора production-архитектуры:</w:t>
+        <w:t>Уровень 1. Выбор режима CatBoost.</w:t>
       </w:r>
     </w:p>
     <w:p>
       <w:r>
-        <w:t>1. Из общей таблицы метрик берутся только строки, соответствующие основным моделям на полном наборе признаков: final_gbm, final_catboost и final_random_forest.</w:t>
+        <w:t>1. На внутренней validation-выборке обучаются три режима CatBoost: light, balanced и power. Они отличаются сложностью: числом итераций, learning rate, глубиной деревьев, регуляризацией и параметрами early stopping.</w:t>
       </w:r>
     </w:p>
     <w:p>
       <w:r>
-        <w:t>2. Из этих строк оставляются только оценки уровня реального матча: level = match и aggregation = symmetrized. Это важно, потому что пользовательский прогноз тоже выдается как одна симметризованная вероятность победы одного игрока над другим.</w:t>
+        <w:t>2. Для каждого режима считается validation LogLoss, train LogLoss и разрыв train_valid_logloss_gap = validation LogLoss - train LogLoss.</w:t>
       </w:r>
     </w:p>
     <w:p>
       <w:r>
-        <w:t>3. Оставшаяся таблица сортируется строго по трем ключам: сначала по test LogLoss по возрастанию, затем по test Brier score по возрастанию, затем по test ROC-AUC по убыванию. В алгоритме нет порога «близости» метрик: если LogLoss различается, порядок определяется им; Brier score и ROC-AUC работают как последующие ключи сортировки.</w:t>
+        <w:t>3. Находится минимальный validation LogLoss среди трех режимов. После этого отбираются все режимы, у которых validation LogLoss не хуже минимума более чем на 0,0025. Это значение соответствует параметру MODEL_SELECTION_VALID_TOLERANCE в коде.</w:t>
       </w:r>
     </w:p>
     <w:p>
       <w:r>
-        <w:t>4. Лучшей основной моделью считается первая строка после такой сортировки. В коде это эквивалентно выбору best_main_model_name из первой строки таблицы best_main_model_selection_table.</w:t>
+        <w:t>4. Среди отобранных режимов выполняется сортировка по трем ключам: train_valid_logloss_gap по возрастанию, затем validation LogLoss по возрастанию, затем complexity_rank по возрастанию. То есть при практически сопоставимом LogLoss выбирается режим с меньшим признаком переобучения, а при полном равенстве — более простой режим.</w:t>
       </w:r>
     </w:p>
     <w:p>
       <w:r>
-        <w:t>5. После выбора архитектуры вызывается переобучение модели того же типа на всех доступных строках обучающего датасета. Именно эта переобученная версия сохраняется в prediction bundle и используется в панели прогноза конкретного матча.</w:t>
+        <w:t>5. Выбранный режим и найденное best_iteration используются для обучения final_catboost на полном train-периоде.</w:t>
       </w:r>
     </w:p>
     <w:p>
       <w:r>
-        <w:t>Accuracy и разрыв между train/test LogLoss не входят в автоматическое правило сортировки. Они используются как диагностические показатели: Accuracy показывает долю верно выбранных победителей, а большой train/test-gap указывает на риск переобучения.</w:t>
+        <w:t>Уровень 2. Выбор production-архитектуры.</w:t>
+      </w:r>
+    </w:p>
+    <w:p>
+      <w:r>
+        <w:t>1. В общее сравнение попадают три основные модели на полном наборе признаков: final_gbm, final_catboost и final_random_forest.</w:t>
+      </w:r>
+    </w:p>
+    <w:p>
+      <w:r>
+        <w:t>2. Из общей таблицы метрик берутся только строки уровня реального матча: level = match и aggregation = symmetrized. Это важно, потому что пользовательский прогноз тоже выдается как одна симметризованная вероятность победы одного игрока над другим.</w:t>
+      </w:r>
+    </w:p>
+    <w:p>
+      <w:r>
+        <w:t>3. Оставшаяся таблица сортируется строго по трем ключам: test LogLoss по возрастанию, затем test Brier score по возрастанию, затем test ROC-AUC по убыванию.</w:t>
+      </w:r>
+    </w:p>
+    <w:p>
+      <w:r>
+        <w:t>4. Лучшей основной моделью считается первая строка после такой сортировки. В коде это соответствует выбору best_main_model_name из первой строки таблицы best_main_model_selection_table.</w:t>
+      </w:r>
+    </w:p>
+    <w:p>
+      <w:r>
+        <w:t>5. После выбора архитектуры модель того же типа переобучается на всех доступных исторических данных. Именно эта переобученная версия сохраняется в prediction bundle и используется в панели прогноза конкретного матча.</w:t>
+      </w:r>
+    </w:p>
+    <w:p>
+      <w:r>
+        <w:t>Таким образом, контроль переобучения заложен в процедуру выбора режима CatBoost через train-valid gap и в итоговую проверку всех основных моделей на отложенном test-периоде. Для выбора production-архитектуры train/test gap и Accuracy остаются диагностическими показателями: они помогают интерпретировать результат, но не меняют порядок сортировки основных моделей.</w:t>
       </w:r>
     </w:p>
     <w:p>

</xml_diff>

<commit_message>
Explain CatBoost training modes
</commit_message>
<xml_diff>
--- a/docs/Пояснительная_записка_RTT_tennis_predictor_updated_v14.docx
+++ b/docs/Пояснительная_записка_RTT_tennis_predictor_updated_v14.docx
@@ -3801,6 +3801,11 @@
     <w:p>
       <w:r>
         <w:t>5. Выбранный режим и найденное best_iteration используются для обучения final_catboost на полном train-периоде.</w:t>
+      </w:r>
+    </w:p>
+    <w:p>
+      <w:r>
+        <w:t>Подрежимы введены именно для CatBoost, потому что эта модель сильнее зависит от настроек сложности и early stopping; GBM и Random Forest используются как фиксированные альтернативные архитектуры для итогового сравнения.</w:t>
       </w:r>
     </w:p>
     <w:p>

</xml_diff>

<commit_message>
Explain baseline rating ELO benchmark
</commit_message>
<xml_diff>
--- a/docs/Пояснительная_записка_RTT_tennis_predictor_updated_v14.docx
+++ b/docs/Пояснительная_записка_RTT_tennis_predictor_updated_v14.docx
@@ -395,7 +395,7 @@
           <w:r>
             <w:fldChar w:fldCharType="separate"/>
           </w:r>
-          <w:hyperlink w:anchor="_Toc229562875" w:history="1">
+          <w:hyperlink w:anchor="_Toc229564918" w:history="1">
             <w:r>
               <w:rPr>
                 <w:rStyle w:val="aff8"/>
@@ -423,7 +423,7 @@
                 <w:noProof/>
                 <w:webHidden/>
               </w:rPr>
-              <w:instrText xml:space="preserve"> PAGEREF _Toc229562875 \h </w:instrText>
+              <w:instrText xml:space="preserve"> PAGEREF _Toc229564918 \h </w:instrText>
             </w:r>
             <w:r>
               <w:rPr>
@@ -469,7 +469,7 @@
               <w14:ligatures w14:val="standardContextual"/>
             </w:rPr>
           </w:pPr>
-          <w:hyperlink w:anchor="_Toc229562876" w:history="1">
+          <w:hyperlink w:anchor="_Toc229564919" w:history="1">
             <w:r>
               <w:rPr>
                 <w:rStyle w:val="aff8"/>
@@ -497,7 +497,7 @@
                 <w:noProof/>
                 <w:webHidden/>
               </w:rPr>
-              <w:instrText xml:space="preserve"> PAGEREF _Toc229562876 \h </w:instrText>
+              <w:instrText xml:space="preserve"> PAGEREF _Toc229564919 \h </w:instrText>
             </w:r>
             <w:r>
               <w:rPr>
@@ -543,7 +543,7 @@
               <w14:ligatures w14:val="standardContextual"/>
             </w:rPr>
           </w:pPr>
-          <w:hyperlink w:anchor="_Toc229562877" w:history="1">
+          <w:hyperlink w:anchor="_Toc229564920" w:history="1">
             <w:r>
               <w:rPr>
                 <w:rStyle w:val="aff8"/>
@@ -571,7 +571,7 @@
                 <w:noProof/>
                 <w:webHidden/>
               </w:rPr>
-              <w:instrText xml:space="preserve"> PAGEREF _Toc229562877 \h </w:instrText>
+              <w:instrText xml:space="preserve"> PAGEREF _Toc229564920 \h </w:instrText>
             </w:r>
             <w:r>
               <w:rPr>
@@ -617,7 +617,7 @@
               <w14:ligatures w14:val="standardContextual"/>
             </w:rPr>
           </w:pPr>
-          <w:hyperlink w:anchor="_Toc229562878" w:history="1">
+          <w:hyperlink w:anchor="_Toc229564921" w:history="1">
             <w:r>
               <w:rPr>
                 <w:rStyle w:val="aff8"/>
@@ -645,7 +645,7 @@
                 <w:noProof/>
                 <w:webHidden/>
               </w:rPr>
-              <w:instrText xml:space="preserve"> PAGEREF _Toc229562878 \h </w:instrText>
+              <w:instrText xml:space="preserve"> PAGEREF _Toc229564921 \h </w:instrText>
             </w:r>
             <w:r>
               <w:rPr>
@@ -691,7 +691,7 @@
               <w14:ligatures w14:val="standardContextual"/>
             </w:rPr>
           </w:pPr>
-          <w:hyperlink w:anchor="_Toc229562879" w:history="1">
+          <w:hyperlink w:anchor="_Toc229564922" w:history="1">
             <w:r>
               <w:rPr>
                 <w:rStyle w:val="aff8"/>
@@ -719,7 +719,7 @@
                 <w:noProof/>
                 <w:webHidden/>
               </w:rPr>
-              <w:instrText xml:space="preserve"> PAGEREF _Toc229562879 \h </w:instrText>
+              <w:instrText xml:space="preserve"> PAGEREF _Toc229564922 \h </w:instrText>
             </w:r>
             <w:r>
               <w:rPr>
@@ -765,7 +765,7 @@
               <w14:ligatures w14:val="standardContextual"/>
             </w:rPr>
           </w:pPr>
-          <w:hyperlink w:anchor="_Toc229562880" w:history="1">
+          <w:hyperlink w:anchor="_Toc229564923" w:history="1">
             <w:r>
               <w:rPr>
                 <w:rStyle w:val="aff8"/>
@@ -793,7 +793,7 @@
                 <w:noProof/>
                 <w:webHidden/>
               </w:rPr>
-              <w:instrText xml:space="preserve"> PAGEREF _Toc229562880 \h </w:instrText>
+              <w:instrText xml:space="preserve"> PAGEREF _Toc229564923 \h </w:instrText>
             </w:r>
             <w:r>
               <w:rPr>
@@ -813,7 +813,7 @@
                 <w:noProof/>
                 <w:webHidden/>
               </w:rPr>
-              <w:t>7</w:t>
+              <w:t>8</w:t>
             </w:r>
             <w:r>
               <w:rPr>
@@ -839,7 +839,7 @@
               <w14:ligatures w14:val="standardContextual"/>
             </w:rPr>
           </w:pPr>
-          <w:hyperlink w:anchor="_Toc229562881" w:history="1">
+          <w:hyperlink w:anchor="_Toc229564924" w:history="1">
             <w:r>
               <w:rPr>
                 <w:rStyle w:val="aff8"/>
@@ -867,7 +867,7 @@
                 <w:noProof/>
                 <w:webHidden/>
               </w:rPr>
-              <w:instrText xml:space="preserve"> PAGEREF _Toc229562881 \h </w:instrText>
+              <w:instrText xml:space="preserve"> PAGEREF _Toc229564924 \h </w:instrText>
             </w:r>
             <w:r>
               <w:rPr>
@@ -887,7 +887,7 @@
                 <w:noProof/>
                 <w:webHidden/>
               </w:rPr>
-              <w:t>8</w:t>
+              <w:t>9</w:t>
             </w:r>
             <w:r>
               <w:rPr>
@@ -913,7 +913,7 @@
               <w14:ligatures w14:val="standardContextual"/>
             </w:rPr>
           </w:pPr>
-          <w:hyperlink w:anchor="_Toc229562882" w:history="1">
+          <w:hyperlink w:anchor="_Toc229564925" w:history="1">
             <w:r>
               <w:rPr>
                 <w:rStyle w:val="aff8"/>
@@ -941,7 +941,7 @@
                 <w:noProof/>
                 <w:webHidden/>
               </w:rPr>
-              <w:instrText xml:space="preserve"> PAGEREF _Toc229562882 \h </w:instrText>
+              <w:instrText xml:space="preserve"> PAGEREF _Toc229564925 \h </w:instrText>
             </w:r>
             <w:r>
               <w:rPr>
@@ -961,7 +961,7 @@
                 <w:noProof/>
                 <w:webHidden/>
               </w:rPr>
-              <w:t>8</w:t>
+              <w:t>9</w:t>
             </w:r>
             <w:r>
               <w:rPr>
@@ -987,7 +987,7 @@
               <w14:ligatures w14:val="standardContextual"/>
             </w:rPr>
           </w:pPr>
-          <w:hyperlink w:anchor="_Toc229562883" w:history="1">
+          <w:hyperlink w:anchor="_Toc229564926" w:history="1">
             <w:r>
               <w:rPr>
                 <w:rStyle w:val="aff8"/>
@@ -1014,7 +1014,7 @@
                 <w:noProof/>
                 <w:webHidden/>
               </w:rPr>
-              <w:instrText xml:space="preserve"> PAGEREF _Toc229562883 \h </w:instrText>
+              <w:instrText xml:space="preserve"> PAGEREF _Toc229564926 \h </w:instrText>
             </w:r>
             <w:r>
               <w:rPr>
@@ -1034,7 +1034,7 @@
                 <w:noProof/>
                 <w:webHidden/>
               </w:rPr>
-              <w:t>9</w:t>
+              <w:t>10</w:t>
             </w:r>
             <w:r>
               <w:rPr>
@@ -1060,7 +1060,7 @@
               <w14:ligatures w14:val="standardContextual"/>
             </w:rPr>
           </w:pPr>
-          <w:hyperlink w:anchor="_Toc229562884" w:history="1">
+          <w:hyperlink w:anchor="_Toc229564927" w:history="1">
             <w:r>
               <w:rPr>
                 <w:rStyle w:val="aff8"/>
@@ -1088,7 +1088,7 @@
                 <w:noProof/>
                 <w:webHidden/>
               </w:rPr>
-              <w:instrText xml:space="preserve"> PAGEREF _Toc229562884 \h </w:instrText>
+              <w:instrText xml:space="preserve"> PAGEREF _Toc229564927 \h </w:instrText>
             </w:r>
             <w:r>
               <w:rPr>
@@ -1108,7 +1108,7 @@
                 <w:noProof/>
                 <w:webHidden/>
               </w:rPr>
-              <w:t>9</w:t>
+              <w:t>10</w:t>
             </w:r>
             <w:r>
               <w:rPr>
@@ -1134,7 +1134,7 @@
               <w14:ligatures w14:val="standardContextual"/>
             </w:rPr>
           </w:pPr>
-          <w:hyperlink w:anchor="_Toc229562885" w:history="1">
+          <w:hyperlink w:anchor="_Toc229564928" w:history="1">
             <w:r>
               <w:rPr>
                 <w:rStyle w:val="aff8"/>
@@ -1161,7 +1161,7 @@
                 <w:noProof/>
                 <w:webHidden/>
               </w:rPr>
-              <w:instrText xml:space="preserve"> PAGEREF _Toc229562885 \h </w:instrText>
+              <w:instrText xml:space="preserve"> PAGEREF _Toc229564928 \h </w:instrText>
             </w:r>
             <w:r>
               <w:rPr>
@@ -1181,7 +1181,7 @@
                 <w:noProof/>
                 <w:webHidden/>
               </w:rPr>
-              <w:t>10</w:t>
+              <w:t>11</w:t>
             </w:r>
             <w:r>
               <w:rPr>
@@ -1224,7 +1224,7 @@
           <w:lang w:val="ru-RU"/>
         </w:rPr>
       </w:pPr>
-      <w:bookmarkStart w:id="0" w:name="_Toc229562875"/>
+      <w:bookmarkStart w:id="0" w:name="_Toc229564918"/>
       <w:r>
         <w:rPr>
           <w:lang w:val="ru-RU"/>
@@ -1328,7 +1328,7 @@
           <w:lang w:val="ru-RU"/>
         </w:rPr>
       </w:pPr>
-      <w:bookmarkStart w:id="1" w:name="_Toc229562876"/>
+      <w:bookmarkStart w:id="1" w:name="_Toc229564919"/>
       <w:r>
         <w:rPr>
           <w:lang w:val="ru-RU"/>
@@ -1780,7 +1780,7 @@
           <w:lang w:val="ru-RU"/>
         </w:rPr>
       </w:pPr>
-      <w:bookmarkStart w:id="2" w:name="_Toc229562877"/>
+      <w:bookmarkStart w:id="2" w:name="_Toc229564920"/>
       <w:r>
         <w:rPr>
           <w:lang w:val="ru-RU"/>
@@ -2559,7 +2559,7 @@
           <w:lang w:val="ru-RU"/>
         </w:rPr>
       </w:pPr>
-      <w:bookmarkStart w:id="3" w:name="_Toc229562878"/>
+      <w:bookmarkStart w:id="3" w:name="_Toc229564921"/>
       <w:r>
         <w:rPr>
           <w:lang w:val="ru-RU"/>
@@ -3352,7 +3352,7 @@
           <w:lang w:val="ru-RU"/>
         </w:rPr>
       </w:pPr>
-      <w:bookmarkStart w:id="4" w:name="_Toc229562879"/>
+      <w:bookmarkStart w:id="4" w:name="_Toc229564922"/>
       <w:r>
         <w:rPr>
           <w:lang w:val="ru-RU"/>
@@ -3769,98 +3769,1083 @@
       </w:r>
     </w:p>
     <w:p>
-      <w:r>
-        <w:t>Production-модель выбирается по детерминированному алгоритму, который повторяет логику скрипта обучения. Выбор идет в два уровня: сначала внутри CatBoost выбирается режим обучения, после этого готовая CatBoost-модель участвует в общем сравнении с Gradient Boosting и Random Forest.</w:t>
+      <w:pPr>
+        <w:jc w:val="both"/>
+        <w:rPr>
+          <w:lang w:val="ru-RU"/>
+        </w:rPr>
+      </w:pPr>
+      <w:r>
+        <w:t>Production</w:t>
+      </w:r>
+      <w:r>
+        <w:rPr>
+          <w:lang w:val="ru-RU"/>
+        </w:rPr>
+        <w:t xml:space="preserve">-модель выбирается </w:t>
+      </w:r>
+      <w:r>
+        <w:rPr>
+          <w:lang w:val="ru-RU"/>
+        </w:rPr>
+        <w:t xml:space="preserve">не вручную, а </w:t>
+      </w:r>
+      <w:r>
+        <w:rPr>
+          <w:lang w:val="ru-RU"/>
+        </w:rPr>
+        <w:t>по детерминированному алгоритму</w:t>
+      </w:r>
+      <w:r>
+        <w:rPr>
+          <w:lang w:val="ru-RU"/>
+        </w:rPr>
+        <w:t xml:space="preserve">. </w:t>
+      </w:r>
+      <w:r>
+        <w:rPr>
+          <w:lang w:val="ru-RU"/>
+        </w:rPr>
+        <w:t xml:space="preserve">Выбор идет в два уровня: сначала внутри </w:t>
+      </w:r>
+      <w:proofErr w:type="spellStart"/>
+      <w:r>
+        <w:t>CatBoost</w:t>
+      </w:r>
+      <w:proofErr w:type="spellEnd"/>
+      <w:r>
+        <w:rPr>
+          <w:lang w:val="ru-RU"/>
+        </w:rPr>
+        <w:t xml:space="preserve"> выбирается режим обучения, после этого готовая </w:t>
+      </w:r>
+      <w:proofErr w:type="spellStart"/>
+      <w:r>
+        <w:t>CatBoost</w:t>
+      </w:r>
+      <w:proofErr w:type="spellEnd"/>
+      <w:r>
+        <w:rPr>
+          <w:lang w:val="ru-RU"/>
+        </w:rPr>
+        <w:t xml:space="preserve">-модель участвует в общем сравнении с </w:t>
+      </w:r>
+      <w:r>
+        <w:t>Gradient</w:t>
+      </w:r>
+      <w:r>
+        <w:rPr>
+          <w:lang w:val="ru-RU"/>
+        </w:rPr>
+        <w:t xml:space="preserve"> </w:t>
+      </w:r>
+      <w:r>
+        <w:t>Boosting</w:t>
+      </w:r>
+      <w:r>
+        <w:rPr>
+          <w:lang w:val="ru-RU"/>
+        </w:rPr>
+        <w:t xml:space="preserve"> и </w:t>
+      </w:r>
+      <w:r>
+        <w:t>Random</w:t>
+      </w:r>
+      <w:r>
+        <w:rPr>
+          <w:lang w:val="ru-RU"/>
+        </w:rPr>
+        <w:t xml:space="preserve"> </w:t>
+      </w:r>
+      <w:r>
+        <w:t>Forest</w:t>
+      </w:r>
+      <w:r>
+        <w:rPr>
+          <w:lang w:val="ru-RU"/>
+        </w:rPr>
+        <w:t>.</w:t>
       </w:r>
     </w:p>
     <w:p>
-      <w:r>
-        <w:t>Уровень 1. Выбор режима CatBoost.</w:t>
+      <w:pPr>
+        <w:jc w:val="both"/>
+        <w:rPr>
+          <w:b/>
+          <w:bCs/>
+          <w:lang w:val="ru-RU"/>
+        </w:rPr>
+      </w:pPr>
+      <w:r>
+        <w:rPr>
+          <w:b/>
+          <w:bCs/>
+          <w:lang w:val="ru-RU"/>
+        </w:rPr>
+        <w:t xml:space="preserve">Уровень 1. Выбор режима </w:t>
+      </w:r>
+      <w:proofErr w:type="spellStart"/>
+      <w:r>
+        <w:rPr>
+          <w:b/>
+          <w:bCs/>
+        </w:rPr>
+        <w:t>CatBoost</w:t>
+      </w:r>
+      <w:proofErr w:type="spellEnd"/>
+      <w:r>
+        <w:rPr>
+          <w:b/>
+          <w:bCs/>
+          <w:lang w:val="ru-RU"/>
+        </w:rPr>
+        <w:t>.</w:t>
       </w:r>
     </w:p>
     <w:p>
-      <w:r>
-        <w:t>1. На внутренней validation-выборке обучаются три режима CatBoost: light, balanced и power. Они отличаются сложностью: числом итераций, learning rate, глубиной деревьев, регуляризацией и параметрами early stopping.</w:t>
+      <w:pPr>
+        <w:jc w:val="both"/>
+        <w:rPr>
+          <w:lang w:val="ru-RU"/>
+        </w:rPr>
+      </w:pPr>
+      <w:r>
+        <w:rPr>
+          <w:lang w:val="ru-RU"/>
+        </w:rPr>
+        <w:t xml:space="preserve">1. На внутренней </w:t>
+      </w:r>
+      <w:r>
+        <w:t>validation</w:t>
+      </w:r>
+      <w:r>
+        <w:rPr>
+          <w:lang w:val="ru-RU"/>
+        </w:rPr>
+        <w:t xml:space="preserve">-выборке обучаются три режима </w:t>
+      </w:r>
+      <w:proofErr w:type="spellStart"/>
+      <w:r>
+        <w:t>CatBoost</w:t>
+      </w:r>
+      <w:proofErr w:type="spellEnd"/>
+      <w:r>
+        <w:rPr>
+          <w:lang w:val="ru-RU"/>
+        </w:rPr>
+        <w:t xml:space="preserve">: </w:t>
+      </w:r>
+      <w:r>
+        <w:t>light</w:t>
+      </w:r>
+      <w:r>
+        <w:rPr>
+          <w:lang w:val="ru-RU"/>
+        </w:rPr>
+        <w:t xml:space="preserve">, </w:t>
+      </w:r>
+      <w:r>
+        <w:t>balanced</w:t>
+      </w:r>
+      <w:r>
+        <w:rPr>
+          <w:lang w:val="ru-RU"/>
+        </w:rPr>
+        <w:t xml:space="preserve"> и </w:t>
+      </w:r>
+      <w:r>
+        <w:t>power</w:t>
+      </w:r>
+      <w:r>
+        <w:rPr>
+          <w:lang w:val="ru-RU"/>
+        </w:rPr>
+        <w:t xml:space="preserve">. Они отличаются сложностью: числом итераций, </w:t>
+      </w:r>
+      <w:r>
+        <w:t>learning</w:t>
+      </w:r>
+      <w:r>
+        <w:rPr>
+          <w:lang w:val="ru-RU"/>
+        </w:rPr>
+        <w:t xml:space="preserve"> </w:t>
+      </w:r>
+      <w:r>
+        <w:t>rate</w:t>
+      </w:r>
+      <w:r>
+        <w:rPr>
+          <w:lang w:val="ru-RU"/>
+        </w:rPr>
+        <w:t xml:space="preserve">, глубиной деревьев, регуляризацией и параметрами </w:t>
+      </w:r>
+      <w:r>
+        <w:t>early</w:t>
+      </w:r>
+      <w:r>
+        <w:rPr>
+          <w:lang w:val="ru-RU"/>
+        </w:rPr>
+        <w:t xml:space="preserve"> </w:t>
+      </w:r>
+      <w:r>
+        <w:t>stopping</w:t>
+      </w:r>
+      <w:r>
+        <w:rPr>
+          <w:lang w:val="ru-RU"/>
+        </w:rPr>
+        <w:t>.</w:t>
       </w:r>
     </w:p>
     <w:p>
-      <w:r>
-        <w:t>2. Для каждого режима считается validation LogLoss, train LogLoss и разрыв train_valid_logloss_gap = validation LogLoss - train LogLoss.</w:t>
+      <w:pPr>
+        <w:jc w:val="both"/>
+      </w:pPr>
+      <w:r>
+        <w:t xml:space="preserve">2. </w:t>
+      </w:r>
+      <w:proofErr w:type="spellStart"/>
+      <w:r>
+        <w:t>Для</w:t>
+      </w:r>
+      <w:proofErr w:type="spellEnd"/>
+      <w:r>
+        <w:t xml:space="preserve"> </w:t>
+      </w:r>
+      <w:proofErr w:type="spellStart"/>
+      <w:r>
+        <w:t>каждого</w:t>
+      </w:r>
+      <w:proofErr w:type="spellEnd"/>
+      <w:r>
+        <w:t xml:space="preserve"> </w:t>
+      </w:r>
+      <w:proofErr w:type="spellStart"/>
+      <w:r>
+        <w:t>режима</w:t>
+      </w:r>
+      <w:proofErr w:type="spellEnd"/>
+      <w:r>
+        <w:t xml:space="preserve"> </w:t>
+      </w:r>
+      <w:proofErr w:type="spellStart"/>
+      <w:r>
+        <w:t>считается</w:t>
+      </w:r>
+      <w:proofErr w:type="spellEnd"/>
+      <w:r>
+        <w:t xml:space="preserve"> validation LogLoss, train LogLoss и разрыв train_valid_logloss_gap = validation LogLoss - train LogLoss.</w:t>
       </w:r>
     </w:p>
     <w:p>
-      <w:r>
-        <w:t>3. Находится минимальный validation LogLoss среди трех режимов. После этого отбираются все режимы, у которых validation LogLoss не хуже минимума более чем на 0,0025. Это значение соответствует параметру MODEL_SELECTION_VALID_TOLERANCE в коде.</w:t>
+      <w:pPr>
+        <w:jc w:val="both"/>
+        <w:rPr>
+          <w:lang w:val="ru-RU"/>
+        </w:rPr>
+      </w:pPr>
+      <w:r>
+        <w:rPr>
+          <w:lang w:val="ru-RU"/>
+        </w:rPr>
+        <w:t xml:space="preserve">3. Находится минимальный </w:t>
+      </w:r>
+      <w:r>
+        <w:t>validation</w:t>
+      </w:r>
+      <w:r>
+        <w:rPr>
+          <w:lang w:val="ru-RU"/>
+        </w:rPr>
+        <w:t xml:space="preserve"> </w:t>
+      </w:r>
+      <w:proofErr w:type="spellStart"/>
+      <w:r>
+        <w:t>LogLoss</w:t>
+      </w:r>
+      <w:proofErr w:type="spellEnd"/>
+      <w:r>
+        <w:rPr>
+          <w:lang w:val="ru-RU"/>
+        </w:rPr>
+        <w:t xml:space="preserve"> среди трех режимов. После этого отбираются все режимы, у которых </w:t>
+      </w:r>
+      <w:r>
+        <w:t>validation</w:t>
+      </w:r>
+      <w:r>
+        <w:rPr>
+          <w:lang w:val="ru-RU"/>
+        </w:rPr>
+        <w:t xml:space="preserve"> </w:t>
+      </w:r>
+      <w:proofErr w:type="spellStart"/>
+      <w:r>
+        <w:t>LogLoss</w:t>
+      </w:r>
+      <w:proofErr w:type="spellEnd"/>
+      <w:r>
+        <w:rPr>
+          <w:lang w:val="ru-RU"/>
+        </w:rPr>
+        <w:t xml:space="preserve"> не хуже минимума более чем на 0,0025</w:t>
+      </w:r>
+      <w:r>
+        <w:rPr>
+          <w:lang w:val="ru-RU"/>
+        </w:rPr>
+        <w:t xml:space="preserve"> (настраиваемый параметр)</w:t>
+      </w:r>
+      <w:r>
+        <w:rPr>
+          <w:lang w:val="ru-RU"/>
+        </w:rPr>
+        <w:t>.</w:t>
       </w:r>
     </w:p>
     <w:p>
-      <w:r>
-        <w:t>4. Среди отобранных режимов выполняется сортировка по трем ключам: train_valid_logloss_gap по возрастанию, затем validation LogLoss по возрастанию, затем complexity_rank по возрастанию. То есть при практически сопоставимом LogLoss выбирается режим с меньшим признаком переобучения, а при полном равенстве — более простой режим.</w:t>
+      <w:pPr>
+        <w:jc w:val="both"/>
+        <w:rPr>
+          <w:lang w:val="ru-RU"/>
+        </w:rPr>
+      </w:pPr>
+      <w:r>
+        <w:rPr>
+          <w:lang w:val="ru-RU"/>
+        </w:rPr>
+        <w:t xml:space="preserve">4. </w:t>
+      </w:r>
+      <w:r>
+        <w:rPr>
+          <w:lang w:val="ru-RU"/>
+        </w:rPr>
+        <w:t xml:space="preserve">Среди режимов, прошедших допуск по </w:t>
+      </w:r>
+      <w:proofErr w:type="spellStart"/>
+      <w:r>
+        <w:rPr>
+          <w:lang w:val="ru-RU"/>
+        </w:rPr>
+        <w:t>validation</w:t>
+      </w:r>
+      <w:proofErr w:type="spellEnd"/>
+      <w:r>
+        <w:rPr>
+          <w:lang w:val="ru-RU"/>
+        </w:rPr>
+        <w:t xml:space="preserve"> </w:t>
+      </w:r>
+      <w:proofErr w:type="spellStart"/>
+      <w:r>
+        <w:rPr>
+          <w:lang w:val="ru-RU"/>
+        </w:rPr>
+        <w:t>LogLoss</w:t>
+      </w:r>
+      <w:proofErr w:type="spellEnd"/>
+      <w:r>
+        <w:rPr>
+          <w:lang w:val="ru-RU"/>
+        </w:rPr>
+        <w:t xml:space="preserve">, приоритет получает минимальный </w:t>
+      </w:r>
+      <w:proofErr w:type="spellStart"/>
+      <w:r>
+        <w:rPr>
+          <w:lang w:val="ru-RU"/>
+        </w:rPr>
+        <w:t>train-valid</w:t>
+      </w:r>
+      <w:proofErr w:type="spellEnd"/>
+      <w:r>
+        <w:rPr>
+          <w:lang w:val="ru-RU"/>
+        </w:rPr>
+        <w:t xml:space="preserve"> </w:t>
+      </w:r>
+      <w:proofErr w:type="spellStart"/>
+      <w:r>
+        <w:rPr>
+          <w:lang w:val="ru-RU"/>
+        </w:rPr>
+        <w:t>gap</w:t>
+      </w:r>
+      <w:proofErr w:type="spellEnd"/>
+      <w:r>
+        <w:rPr>
+          <w:lang w:val="ru-RU"/>
+        </w:rPr>
+        <w:t xml:space="preserve">. Если </w:t>
+      </w:r>
+      <w:proofErr w:type="spellStart"/>
+      <w:r>
+        <w:rPr>
+          <w:lang w:val="ru-RU"/>
+        </w:rPr>
+        <w:t>gap</w:t>
+      </w:r>
+      <w:proofErr w:type="spellEnd"/>
+      <w:r>
+        <w:rPr>
+          <w:lang w:val="ru-RU"/>
+        </w:rPr>
+        <w:t xml:space="preserve"> совпадает, выбирается режим с меньшим </w:t>
+      </w:r>
+      <w:proofErr w:type="spellStart"/>
+      <w:r>
+        <w:rPr>
+          <w:lang w:val="ru-RU"/>
+        </w:rPr>
+        <w:t>validation</w:t>
+      </w:r>
+      <w:proofErr w:type="spellEnd"/>
+      <w:r>
+        <w:rPr>
+          <w:lang w:val="ru-RU"/>
+        </w:rPr>
+        <w:t xml:space="preserve"> </w:t>
+      </w:r>
+      <w:proofErr w:type="spellStart"/>
+      <w:r>
+        <w:rPr>
+          <w:lang w:val="ru-RU"/>
+        </w:rPr>
+        <w:t>LogLoss</w:t>
+      </w:r>
+      <w:proofErr w:type="spellEnd"/>
+      <w:r>
+        <w:rPr>
+          <w:lang w:val="ru-RU"/>
+        </w:rPr>
+        <w:t xml:space="preserve">; если совпадает и он, выбирается более простой режим по </w:t>
+      </w:r>
+      <w:proofErr w:type="spellStart"/>
+      <w:r>
+        <w:rPr>
+          <w:lang w:val="ru-RU"/>
+        </w:rPr>
+        <w:t>complexity_rank</w:t>
+      </w:r>
+      <w:proofErr w:type="spellEnd"/>
+      <w:r>
+        <w:rPr>
+          <w:lang w:val="ru-RU"/>
+        </w:rPr>
+        <w:t xml:space="preserve"> (1, 2 или 3 соответствует режимам </w:t>
+      </w:r>
+      <w:r>
+        <w:t>light</w:t>
+      </w:r>
+      <w:r>
+        <w:rPr>
+          <w:lang w:val="ru-RU"/>
+        </w:rPr>
+        <w:t xml:space="preserve">, </w:t>
+      </w:r>
+      <w:r>
+        <w:t>balanced</w:t>
+      </w:r>
+      <w:r>
+        <w:rPr>
+          <w:lang w:val="ru-RU"/>
+        </w:rPr>
+        <w:t xml:space="preserve"> и </w:t>
+      </w:r>
+      <w:r>
+        <w:t>power</w:t>
+      </w:r>
+      <w:r>
+        <w:rPr>
+          <w:lang w:val="ru-RU"/>
+        </w:rPr>
+        <w:t>)</w:t>
+      </w:r>
+      <w:r>
+        <w:rPr>
+          <w:lang w:val="ru-RU"/>
+        </w:rPr>
+        <w:t>.</w:t>
       </w:r>
     </w:p>
     <w:p>
-      <w:r>
-        <w:t>5. Выбранный режим и найденное best_iteration используются для обучения final_catboost на полном train-периоде.</w:t>
+      <w:pPr>
+        <w:jc w:val="both"/>
+        <w:rPr>
+          <w:lang w:val="ru-RU"/>
+        </w:rPr>
+      </w:pPr>
+      <w:r>
+        <w:rPr>
+          <w:lang w:val="ru-RU"/>
+        </w:rPr>
+        <w:t xml:space="preserve">5. Выбранный режим и найденное </w:t>
+      </w:r>
+      <w:r>
+        <w:t>best</w:t>
+      </w:r>
+      <w:r>
+        <w:rPr>
+          <w:lang w:val="ru-RU"/>
+        </w:rPr>
+        <w:t>_</w:t>
+      </w:r>
+      <w:r>
+        <w:t>iteration</w:t>
+      </w:r>
+      <w:r>
+        <w:rPr>
+          <w:lang w:val="ru-RU"/>
+        </w:rPr>
+        <w:t xml:space="preserve"> используются для обучения </w:t>
+      </w:r>
+      <w:r>
+        <w:t>final</w:t>
+      </w:r>
+      <w:r>
+        <w:rPr>
+          <w:lang w:val="ru-RU"/>
+        </w:rPr>
+        <w:t>_</w:t>
+      </w:r>
+      <w:proofErr w:type="spellStart"/>
+      <w:r>
+        <w:t>catboost</w:t>
+      </w:r>
+      <w:proofErr w:type="spellEnd"/>
+      <w:r>
+        <w:rPr>
+          <w:lang w:val="ru-RU"/>
+        </w:rPr>
+        <w:t xml:space="preserve"> на полном </w:t>
+      </w:r>
+      <w:r>
+        <w:t>train</w:t>
+      </w:r>
+      <w:r>
+        <w:rPr>
+          <w:lang w:val="ru-RU"/>
+        </w:rPr>
+        <w:t>-периоде.</w:t>
       </w:r>
     </w:p>
     <w:p>
-      <w:r>
-        <w:t>Подрежимы введены именно для CatBoost, потому что эта модель сильнее зависит от настроек сложности и early stopping; GBM и Random Forest используются как фиксированные альтернативные архитектуры для итогового сравнения.</w:t>
+      <w:pPr>
+        <w:jc w:val="both"/>
+        <w:rPr>
+          <w:lang w:val="ru-RU"/>
+        </w:rPr>
+      </w:pPr>
+      <w:proofErr w:type="spellStart"/>
+      <w:r>
+        <w:rPr>
+          <w:lang w:val="ru-RU"/>
+        </w:rPr>
+        <w:t>Подрежимы</w:t>
+      </w:r>
+      <w:proofErr w:type="spellEnd"/>
+      <w:r>
+        <w:rPr>
+          <w:lang w:val="ru-RU"/>
+        </w:rPr>
+        <w:t xml:space="preserve"> введены именно для </w:t>
+      </w:r>
+      <w:proofErr w:type="spellStart"/>
+      <w:r>
+        <w:t>CatBoost</w:t>
+      </w:r>
+      <w:proofErr w:type="spellEnd"/>
+      <w:r>
+        <w:rPr>
+          <w:lang w:val="ru-RU"/>
+        </w:rPr>
+        <w:t xml:space="preserve">, потому что эта модель сильнее зависит от настроек сложности и </w:t>
+      </w:r>
+      <w:r>
+        <w:t>early</w:t>
+      </w:r>
+      <w:r>
+        <w:rPr>
+          <w:lang w:val="ru-RU"/>
+        </w:rPr>
+        <w:t xml:space="preserve"> </w:t>
+      </w:r>
+      <w:r>
+        <w:t>stopping</w:t>
+      </w:r>
+      <w:r>
+        <w:rPr>
+          <w:lang w:val="ru-RU"/>
+        </w:rPr>
+        <w:t xml:space="preserve">; </w:t>
+      </w:r>
+      <w:r>
+        <w:t>GBM</w:t>
+      </w:r>
+      <w:r>
+        <w:rPr>
+          <w:lang w:val="ru-RU"/>
+        </w:rPr>
+        <w:t xml:space="preserve"> и </w:t>
+      </w:r>
+      <w:r>
+        <w:t>Random</w:t>
+      </w:r>
+      <w:r>
+        <w:rPr>
+          <w:lang w:val="ru-RU"/>
+        </w:rPr>
+        <w:t xml:space="preserve"> </w:t>
+      </w:r>
+      <w:r>
+        <w:t>Forest</w:t>
+      </w:r>
+      <w:r>
+        <w:rPr>
+          <w:lang w:val="ru-RU"/>
+        </w:rPr>
+        <w:t xml:space="preserve"> используются как фиксированные альтернативные архитектуры для итогового сравнения.</w:t>
       </w:r>
     </w:p>
     <w:p>
-      <w:r>
-        <w:t>Уровень 2. Выбор production-архитектуры.</w:t>
+      <w:pPr>
+        <w:rPr>
+          <w:lang w:val="ru-RU"/>
+        </w:rPr>
+      </w:pPr>
+      <w:r>
+        <w:rPr>
+          <w:lang w:val="ru-RU"/>
+        </w:rPr>
+        <w:br w:type="page"/>
       </w:r>
     </w:p>
     <w:p>
-      <w:r>
-        <w:t>1. В общее сравнение попадают три основные модели на полном наборе признаков: final_gbm, final_catboost и final_random_forest.</w:t>
+      <w:pPr>
+        <w:jc w:val="both"/>
+        <w:rPr>
+          <w:b/>
+          <w:bCs/>
+          <w:lang w:val="ru-RU"/>
+        </w:rPr>
+      </w:pPr>
+      <w:r>
+        <w:rPr>
+          <w:b/>
+          <w:bCs/>
+          <w:lang w:val="ru-RU"/>
+        </w:rPr>
+        <w:lastRenderedPageBreak/>
+        <w:t xml:space="preserve">Уровень 2. Выбор </w:t>
+      </w:r>
+      <w:r>
+        <w:rPr>
+          <w:b/>
+          <w:bCs/>
+        </w:rPr>
+        <w:t>production</w:t>
+      </w:r>
+      <w:r>
+        <w:rPr>
+          <w:b/>
+          <w:bCs/>
+          <w:lang w:val="ru-RU"/>
+        </w:rPr>
+        <w:t>-архитектуры.</w:t>
       </w:r>
     </w:p>
     <w:p>
-      <w:r>
-        <w:t>2. Из общей таблицы метрик берутся только строки уровня реального матча: level = match и aggregation = symmetrized. Это важно, потому что пользовательский прогноз тоже выдается как одна симметризованная вероятность победы одного игрока над другим.</w:t>
+      <w:pPr>
+        <w:jc w:val="both"/>
+        <w:rPr>
+          <w:lang w:val="ru-RU"/>
+        </w:rPr>
+      </w:pPr>
+      <w:r>
+        <w:rPr>
+          <w:lang w:val="ru-RU"/>
+        </w:rPr>
+        <w:t xml:space="preserve">1. В общее сравнение попадают три основные модели на полном наборе признаков: </w:t>
+      </w:r>
+      <w:r>
+        <w:t>final</w:t>
+      </w:r>
+      <w:r>
+        <w:rPr>
+          <w:lang w:val="ru-RU"/>
+        </w:rPr>
+        <w:t>_</w:t>
+      </w:r>
+      <w:proofErr w:type="spellStart"/>
+      <w:r>
+        <w:t>gbm</w:t>
+      </w:r>
+      <w:proofErr w:type="spellEnd"/>
+      <w:r>
+        <w:rPr>
+          <w:lang w:val="ru-RU"/>
+        </w:rPr>
+        <w:t xml:space="preserve">, </w:t>
+      </w:r>
+      <w:r>
+        <w:t>final</w:t>
+      </w:r>
+      <w:r>
+        <w:rPr>
+          <w:lang w:val="ru-RU"/>
+        </w:rPr>
+        <w:t>_</w:t>
+      </w:r>
+      <w:proofErr w:type="spellStart"/>
+      <w:r>
+        <w:t>catboost</w:t>
+      </w:r>
+      <w:proofErr w:type="spellEnd"/>
+      <w:r>
+        <w:rPr>
+          <w:lang w:val="ru-RU"/>
+        </w:rPr>
+        <w:t xml:space="preserve"> и </w:t>
+      </w:r>
+      <w:r>
+        <w:t>final</w:t>
+      </w:r>
+      <w:r>
+        <w:rPr>
+          <w:lang w:val="ru-RU"/>
+        </w:rPr>
+        <w:t>_</w:t>
+      </w:r>
+      <w:r>
+        <w:t>random</w:t>
+      </w:r>
+      <w:r>
+        <w:rPr>
+          <w:lang w:val="ru-RU"/>
+        </w:rPr>
+        <w:t>_</w:t>
+      </w:r>
+      <w:r>
+        <w:t>forest</w:t>
+      </w:r>
+      <w:r>
+        <w:rPr>
+          <w:lang w:val="ru-RU"/>
+        </w:rPr>
+        <w:t>.</w:t>
       </w:r>
     </w:p>
     <w:p>
-      <w:r>
-        <w:t>3. Оставшаяся таблица сортируется строго по трем ключам: test LogLoss по возрастанию, затем test Brier score по возрастанию, затем test ROC-AUC по убыванию.</w:t>
+      <w:pPr>
+        <w:jc w:val="both"/>
+        <w:rPr>
+          <w:lang w:val="ru-RU"/>
+        </w:rPr>
+      </w:pPr>
+      <w:r>
+        <w:rPr>
+          <w:lang w:val="ru-RU"/>
+        </w:rPr>
+        <w:t xml:space="preserve">2. Из общей таблицы метрик берутся только строки уровня реального матча: </w:t>
+      </w:r>
+      <w:r>
+        <w:t>level</w:t>
+      </w:r>
+      <w:r>
+        <w:rPr>
+          <w:lang w:val="ru-RU"/>
+        </w:rPr>
+        <w:t xml:space="preserve"> = </w:t>
+      </w:r>
+      <w:r>
+        <w:t>match</w:t>
+      </w:r>
+      <w:r>
+        <w:rPr>
+          <w:lang w:val="ru-RU"/>
+        </w:rPr>
+        <w:t xml:space="preserve"> и </w:t>
+      </w:r>
+      <w:r>
+        <w:t>aggregation</w:t>
+      </w:r>
+      <w:r>
+        <w:rPr>
+          <w:lang w:val="ru-RU"/>
+        </w:rPr>
+        <w:t xml:space="preserve"> = </w:t>
+      </w:r>
+      <w:r>
+        <w:t>symmetrized</w:t>
+      </w:r>
+      <w:r>
+        <w:rPr>
+          <w:lang w:val="ru-RU"/>
+        </w:rPr>
+        <w:t xml:space="preserve">. Это важно, потому что пользовательский прогноз тоже выдается как одна </w:t>
+      </w:r>
+      <w:proofErr w:type="spellStart"/>
+      <w:r>
+        <w:rPr>
+          <w:lang w:val="ru-RU"/>
+        </w:rPr>
+        <w:t>симметризованная</w:t>
+      </w:r>
+      <w:proofErr w:type="spellEnd"/>
+      <w:r>
+        <w:rPr>
+          <w:lang w:val="ru-RU"/>
+        </w:rPr>
+        <w:t xml:space="preserve"> вероятность победы одного игрока над другим.</w:t>
       </w:r>
     </w:p>
     <w:p>
-      <w:r>
-        <w:t>4. Лучшей основной моделью считается первая строка после такой сортировки. В коде это соответствует выбору best_main_model_name из первой строки таблицы best_main_model_selection_table.</w:t>
+      <w:pPr>
+        <w:jc w:val="both"/>
+        <w:rPr>
+          <w:lang w:val="ru-RU"/>
+        </w:rPr>
+      </w:pPr>
+      <w:r>
+        <w:rPr>
+          <w:lang w:val="ru-RU"/>
+        </w:rPr>
+        <w:t xml:space="preserve">3. Оставшаяся таблица сортируется строго по трем ключам: </w:t>
+      </w:r>
+      <w:r>
+        <w:t>test</w:t>
+      </w:r>
+      <w:r>
+        <w:rPr>
+          <w:lang w:val="ru-RU"/>
+        </w:rPr>
+        <w:t xml:space="preserve"> </w:t>
+      </w:r>
+      <w:proofErr w:type="spellStart"/>
+      <w:r>
+        <w:t>LogLoss</w:t>
+      </w:r>
+      <w:proofErr w:type="spellEnd"/>
+      <w:r>
+        <w:rPr>
+          <w:lang w:val="ru-RU"/>
+        </w:rPr>
+        <w:t xml:space="preserve"> по возрастанию, затем </w:t>
+      </w:r>
+      <w:r>
+        <w:t>test</w:t>
+      </w:r>
+      <w:r>
+        <w:rPr>
+          <w:lang w:val="ru-RU"/>
+        </w:rPr>
+        <w:t xml:space="preserve"> </w:t>
+      </w:r>
+      <w:r>
+        <w:t>Brier</w:t>
+      </w:r>
+      <w:r>
+        <w:rPr>
+          <w:lang w:val="ru-RU"/>
+        </w:rPr>
+        <w:t xml:space="preserve"> </w:t>
+      </w:r>
+      <w:r>
+        <w:t>score</w:t>
+      </w:r>
+      <w:r>
+        <w:rPr>
+          <w:lang w:val="ru-RU"/>
+        </w:rPr>
+        <w:t xml:space="preserve"> по возрастанию, затем </w:t>
+      </w:r>
+      <w:r>
+        <w:t>test</w:t>
+      </w:r>
+      <w:r>
+        <w:rPr>
+          <w:lang w:val="ru-RU"/>
+        </w:rPr>
+        <w:t xml:space="preserve"> </w:t>
+      </w:r>
+      <w:r>
+        <w:t>ROC</w:t>
+      </w:r>
+      <w:r>
+        <w:rPr>
+          <w:lang w:val="ru-RU"/>
+        </w:rPr>
+        <w:t>-</w:t>
+      </w:r>
+      <w:r>
+        <w:t>AUC</w:t>
+      </w:r>
+      <w:r>
+        <w:rPr>
+          <w:lang w:val="ru-RU"/>
+        </w:rPr>
+        <w:t xml:space="preserve"> по убыванию.</w:t>
       </w:r>
     </w:p>
     <w:p>
-      <w:r>
-        <w:t>5. После выбора архитектуры модель того же типа переобучается на всех доступных исторических данных. Именно эта переобученная версия сохраняется в prediction bundle и используется в панели прогноза конкретного матча.</w:t>
+      <w:pPr>
+        <w:jc w:val="both"/>
+      </w:pPr>
+      <w:r>
+        <w:rPr>
+          <w:lang w:val="ru-RU"/>
+        </w:rPr>
+        <w:t xml:space="preserve">4. Лучшей основной моделью считается первая строка после такой сортировки. </w:t>
+      </w:r>
+      <w:r>
+        <w:rPr>
+          <w:lang w:val="ru-RU"/>
+        </w:rPr>
+        <w:t xml:space="preserve">То есть основной критерий </w:t>
+      </w:r>
+      <w:r>
+        <w:rPr>
+          <w:lang w:val="ru-RU"/>
+        </w:rPr>
+        <w:t xml:space="preserve">– именно </w:t>
+      </w:r>
+      <w:r>
+        <w:t xml:space="preserve">test </w:t>
+      </w:r>
+      <w:proofErr w:type="spellStart"/>
+      <w:r>
+        <w:t>LogLoss</w:t>
+      </w:r>
+      <w:proofErr w:type="spellEnd"/>
+      <w:r>
+        <w:t>.</w:t>
       </w:r>
     </w:p>
     <w:p>
-      <w:r>
-        <w:t>Таким образом, контроль переобучения заложен в процедуру выбора режима CatBoost через train-valid gap и в итоговую проверку всех основных моделей на отложенном test-периоде. Для выбора production-архитектуры train/test gap и Accuracy остаются диагностическими показателями: они помогают интерпретировать результат, но не меняют порядок сортировки основных моделей.</w:t>
+      <w:pPr>
+        <w:jc w:val="both"/>
+        <w:rPr>
+          <w:lang w:val="ru-RU"/>
+        </w:rPr>
+      </w:pPr>
+      <w:r>
+        <w:rPr>
+          <w:lang w:val="ru-RU"/>
+        </w:rPr>
+        <w:t xml:space="preserve">5. После выбора архитектуры модель того же типа переобучается на всех доступных исторических данных. Именно эта переобученная версия сохраняется в </w:t>
+      </w:r>
+      <w:r>
+        <w:t>prediction</w:t>
+      </w:r>
+      <w:r>
+        <w:rPr>
+          <w:lang w:val="ru-RU"/>
+        </w:rPr>
+        <w:t xml:space="preserve"> </w:t>
+      </w:r>
+      <w:r>
+        <w:t>bundle</w:t>
+      </w:r>
+      <w:r>
+        <w:rPr>
+          <w:lang w:val="ru-RU"/>
+        </w:rPr>
+        <w:t xml:space="preserve"> и используется в панели прогноза конкретного матча.</w:t>
       </w:r>
     </w:p>
     <w:p>
       <w:pPr>
+        <w:jc w:val="both"/>
+      </w:pPr>
+      <w:r>
+        <w:rPr>
+          <w:lang w:val="ru-RU"/>
+        </w:rPr>
+        <w:t xml:space="preserve">Таким образом, контроль переобучения заложен в процедуру выбора режима </w:t>
+      </w:r>
+      <w:proofErr w:type="spellStart"/>
+      <w:r>
+        <w:t>CatBoost</w:t>
+      </w:r>
+      <w:proofErr w:type="spellEnd"/>
+      <w:r>
+        <w:rPr>
+          <w:lang w:val="ru-RU"/>
+        </w:rPr>
+        <w:t xml:space="preserve"> через </w:t>
+      </w:r>
+      <w:r>
+        <w:t>train</w:t>
+      </w:r>
+      <w:r>
+        <w:rPr>
+          <w:lang w:val="ru-RU"/>
+        </w:rPr>
+        <w:t>-</w:t>
+      </w:r>
+      <w:r>
+        <w:t>valid</w:t>
+      </w:r>
+      <w:r>
+        <w:rPr>
+          <w:lang w:val="ru-RU"/>
+        </w:rPr>
+        <w:t xml:space="preserve"> </w:t>
+      </w:r>
+      <w:r>
+        <w:t>gap</w:t>
+      </w:r>
+      <w:r>
+        <w:rPr>
+          <w:lang w:val="ru-RU"/>
+        </w:rPr>
+        <w:t xml:space="preserve"> и в итоговую проверку всех основных моделей на отложенном </w:t>
+      </w:r>
+      <w:r>
+        <w:t>test</w:t>
+      </w:r>
+      <w:r>
+        <w:rPr>
+          <w:lang w:val="ru-RU"/>
+        </w:rPr>
+        <w:t>-периоде.</w:t>
+      </w:r>
+    </w:p>
+    <w:p>
+      <w:pPr>
         <w:pStyle w:val="1"/>
-        <w:rPr>
-          <w:lang w:val="ru-RU"/>
-        </w:rPr>
-      </w:pPr>
-      <w:bookmarkStart w:id="5" w:name="_Toc229562880"/>
-      <w:r>
-        <w:rPr>
-          <w:lang w:val="ru-RU"/>
-        </w:rPr>
-        <w:t>6. Качество построенных моделей машинного обучения</w:t>
+        <w:spacing w:after="240"/>
+        <w:jc w:val="both"/>
+        <w:rPr>
+          <w:lang w:val="ru-RU"/>
+        </w:rPr>
+      </w:pPr>
+      <w:bookmarkStart w:id="5" w:name="_Toc229564923"/>
+      <w:r>
+        <w:rPr>
+          <w:lang w:val="ru-RU"/>
+        </w:rPr>
+        <w:t xml:space="preserve">6. </w:t>
+      </w:r>
+      <w:r>
+        <w:rPr>
+          <w:lang w:val="ru-RU"/>
+        </w:rPr>
+        <w:t>Оценка качества</w:t>
+      </w:r>
+      <w:r>
+        <w:rPr>
+          <w:lang w:val="ru-RU"/>
+        </w:rPr>
+        <w:t xml:space="preserve"> построенных моделей машинного обучения</w:t>
       </w:r>
       <w:bookmarkEnd w:id="5"/>
     </w:p>
     <w:p>
       <w:pPr>
+        <w:jc w:val="both"/>
         <w:rPr>
           <w:lang w:val="ru-RU"/>
         </w:rPr>
@@ -3873,6 +4858,10 @@
       </w:r>
       <w:proofErr w:type="spellStart"/>
       <w:r>
+        <w:rPr>
+          <w:b/>
+          <w:bCs/>
+        </w:rPr>
         <w:t>LogLoss</w:t>
       </w:r>
       <w:proofErr w:type="spellEnd"/>
@@ -3925,8 +4914,16 @@
         <w:rPr>
           <w:lang w:val="ru-RU"/>
         </w:rPr>
-        <w:t xml:space="preserve">. </w:t>
-      </w:r>
+        <w:t>.</w:t>
+      </w:r>
+    </w:p>
+    <w:p>
+      <w:pPr>
+        <w:jc w:val="both"/>
+        <w:rPr>
+          <w:lang w:val="ru-RU"/>
+        </w:rPr>
+      </w:pPr>
       <w:r>
         <w:t>Brier</w:t>
       </w:r>
@@ -4345,43 +5342,8 @@
       </w:tr>
     </w:tbl>
     <w:p>
-      <w:pPr>
-        <w:rPr>
-          <w:lang w:val="ru-RU"/>
-        </w:rPr>
-      </w:pPr>
-      <w:r>
-        <w:rPr>
-          <w:lang w:val="ru-RU"/>
-        </w:rPr>
-        <w:t xml:space="preserve">Эта таблица показывает не только абсолютное качество итоговой модели, но и ее предиктивную силу относительно простого рейтингового подхода: модель на полном наборе признаков дает более качественные вероятности, чем </w:t>
-      </w:r>
-      <w:r>
-        <w:t>baseline</w:t>
-      </w:r>
-      <w:r>
-        <w:rPr>
-          <w:lang w:val="ru-RU"/>
-        </w:rPr>
-        <w:t xml:space="preserve"> </w:t>
-      </w:r>
-      <w:r>
-        <w:t>rating</w:t>
-      </w:r>
-      <w:r>
-        <w:rPr>
-          <w:lang w:val="ru-RU"/>
-        </w:rPr>
-        <w:t xml:space="preserve"> + </w:t>
-      </w:r>
-      <w:r>
-        <w:t>ELO</w:t>
-      </w:r>
-      <w:r>
-        <w:rPr>
-          <w:lang w:val="ru-RU"/>
-        </w:rPr>
-        <w:t>.</w:t>
+      <w:r>
+        <w:t>Baseline rating + ELO — это контрольная модель для сравнения с основной моделью, а не отдельная production-архитектура. Она считается как Logistic Regression на ограниченном наборе рейтингово-ELO признаков: разнице ELO, ELO-вероятности победы, разнице официального ранга и рейтинговых очков перед матчем, а также индикаторах отсутствующих рейтинговых данных. Пропуски заполняются медианой, признаки стандартизируются, после чего логистическая регрессия выдает вероятность победы. Такой baseline показывает, насколько полная модель добавляет качество сверх простого рейтингового подхода.</w:t>
       </w:r>
     </w:p>
     <w:p>
@@ -4394,21 +5356,10 @@
         <w:rPr>
           <w:lang w:val="ru-RU"/>
         </w:rPr>
-        <w:t xml:space="preserve">Лучшей основной моделью по </w:t>
-      </w:r>
-      <w:proofErr w:type="spellStart"/>
-      <w:r>
-        <w:t>LogLoss</w:t>
-      </w:r>
-      <w:proofErr w:type="spellEnd"/>
-      <w:r>
-        <w:rPr>
-          <w:lang w:val="ru-RU"/>
-        </w:rPr>
-        <w:t xml:space="preserve"> стала </w:t>
-      </w:r>
-      <w:r>
-        <w:t>Gradient</w:t>
+        <w:t xml:space="preserve">Эта таблица показывает не только абсолютное качество итоговой модели, но и ее предиктивную силу относительно простого рейтингового подхода: модель на полном наборе признаков дает более качественные вероятности, чем </w:t>
+      </w:r>
+      <w:r>
+        <w:t>baseline</w:t>
       </w:r>
       <w:r>
         <w:rPr>
@@ -4417,67 +5368,6 @@
         <w:t xml:space="preserve"> </w:t>
       </w:r>
       <w:r>
-        <w:t>Boosting</w:t>
-      </w:r>
-      <w:r>
-        <w:rPr>
-          <w:lang w:val="ru-RU"/>
-        </w:rPr>
-        <w:t xml:space="preserve">. Она показала </w:t>
-      </w:r>
-      <w:proofErr w:type="spellStart"/>
-      <w:r>
-        <w:t>LogLoss</w:t>
-      </w:r>
-      <w:proofErr w:type="spellEnd"/>
-      <w:r>
-        <w:rPr>
-          <w:lang w:val="ru-RU"/>
-        </w:rPr>
-        <w:t xml:space="preserve"> 0.4557 и </w:t>
-      </w:r>
-      <w:r>
-        <w:t>ROC</w:t>
-      </w:r>
-      <w:r>
-        <w:rPr>
-          <w:lang w:val="ru-RU"/>
-        </w:rPr>
-        <w:t>-</w:t>
-      </w:r>
-      <w:r>
-        <w:t>AUC</w:t>
-      </w:r>
-      <w:r>
-        <w:rPr>
-          <w:lang w:val="ru-RU"/>
-        </w:rPr>
-        <w:t xml:space="preserve"> 0.8658 на уровне </w:t>
-      </w:r>
-      <w:proofErr w:type="spellStart"/>
-      <w:r>
-        <w:rPr>
-          <w:lang w:val="ru-RU"/>
-        </w:rPr>
-        <w:t>симметризованного</w:t>
-      </w:r>
-      <w:proofErr w:type="spellEnd"/>
-      <w:r>
-        <w:rPr>
-          <w:lang w:val="ru-RU"/>
-        </w:rPr>
-        <w:t xml:space="preserve"> матча. По сравнению с </w:t>
-      </w:r>
-      <w:r>
-        <w:t>baseline</w:t>
-      </w:r>
-      <w:r>
-        <w:rPr>
-          <w:lang w:val="ru-RU"/>
-        </w:rPr>
-        <w:t xml:space="preserve"> </w:t>
-      </w:r>
-      <w:r>
         <w:t>rating</w:t>
       </w:r>
       <w:r>
@@ -4493,18 +5383,7 @@
         <w:rPr>
           <w:lang w:val="ru-RU"/>
         </w:rPr>
-        <w:t xml:space="preserve"> снижение </w:t>
-      </w:r>
-      <w:proofErr w:type="spellStart"/>
-      <w:r>
-        <w:t>LogLoss</w:t>
-      </w:r>
-      <w:proofErr w:type="spellEnd"/>
-      <w:r>
-        <w:rPr>
-          <w:lang w:val="ru-RU"/>
-        </w:rPr>
-        <w:t xml:space="preserve"> составляет около 7.8%, что подтверждает добавленную ценность расширенного набора признаков.</w:t>
+        <w:t>.</w:t>
       </w:r>
     </w:p>
     <w:p>
@@ -4513,17 +5392,23 @@
           <w:lang w:val="ru-RU"/>
         </w:rPr>
       </w:pPr>
+      <w:r>
+        <w:rPr>
+          <w:lang w:val="ru-RU"/>
+        </w:rPr>
+        <w:lastRenderedPageBreak/>
+        <w:t xml:space="preserve">Лучшей основной моделью по </w:t>
+      </w:r>
       <w:proofErr w:type="spellStart"/>
       <w:r>
-        <w:lastRenderedPageBreak/>
-        <w:t>CatBoost</w:t>
+        <w:t>LogLoss</w:t>
       </w:r>
       <w:proofErr w:type="spellEnd"/>
       <w:r>
         <w:rPr>
           <w:lang w:val="ru-RU"/>
         </w:rPr>
-        <w:t xml:space="preserve"> оказался очень близок к </w:t>
+        <w:t xml:space="preserve"> стала </w:t>
       </w:r>
       <w:r>
         <w:t>Gradient</w:t>
@@ -4541,19 +5426,53 @@
         <w:rPr>
           <w:lang w:val="ru-RU"/>
         </w:rPr>
-        <w:t xml:space="preserve"> и даже немного выше по </w:t>
-      </w:r>
-      <w:r>
-        <w:t>Accuracy</w:t>
-      </w:r>
-      <w:r>
-        <w:rPr>
-          <w:lang w:val="ru-RU"/>
-        </w:rPr>
-        <w:t xml:space="preserve">, однако итоговый выбор сделан в пользу </w:t>
-      </w:r>
-      <w:r>
-        <w:t>Gradient</w:t>
+        <w:t xml:space="preserve">. Она показала </w:t>
+      </w:r>
+      <w:proofErr w:type="spellStart"/>
+      <w:r>
+        <w:t>LogLoss</w:t>
+      </w:r>
+      <w:proofErr w:type="spellEnd"/>
+      <w:r>
+        <w:rPr>
+          <w:lang w:val="ru-RU"/>
+        </w:rPr>
+        <w:t xml:space="preserve"> 0.4557 и </w:t>
+      </w:r>
+      <w:r>
+        <w:t>ROC</w:t>
+      </w:r>
+      <w:r>
+        <w:rPr>
+          <w:lang w:val="ru-RU"/>
+        </w:rPr>
+        <w:t>-</w:t>
+      </w:r>
+      <w:r>
+        <w:t>AUC</w:t>
+      </w:r>
+      <w:r>
+        <w:rPr>
+          <w:lang w:val="ru-RU"/>
+        </w:rPr>
+        <w:t xml:space="preserve"> 0.8658 на уровне </w:t>
+      </w:r>
+      <w:proofErr w:type="spellStart"/>
+      <w:r>
+        <w:rPr>
+          <w:lang w:val="ru-RU"/>
+        </w:rPr>
+        <w:t>симметризованного</w:t>
+      </w:r>
+      <w:proofErr w:type="spellEnd"/>
+      <w:r>
+        <w:rPr>
+          <w:lang w:val="ru-RU"/>
+        </w:rPr>
+        <w:t xml:space="preserve"> матча. По сравнению с </w:t>
+      </w:r>
+      <w:r>
+        <w:t>baseline</w:t>
       </w:r>
       <w:r>
         <w:rPr>
@@ -4562,13 +5481,22 @@
         <w:t xml:space="preserve"> </w:t>
       </w:r>
       <w:r>
-        <w:t>Boosting</w:t>
-      </w:r>
-      <w:r>
-        <w:rPr>
-          <w:lang w:val="ru-RU"/>
-        </w:rPr>
-        <w:t xml:space="preserve"> из-за лучшего </w:t>
+        <w:t>rating</w:t>
+      </w:r>
+      <w:r>
+        <w:rPr>
+          <w:lang w:val="ru-RU"/>
+        </w:rPr>
+        <w:t xml:space="preserve"> + </w:t>
+      </w:r>
+      <w:r>
+        <w:t>ELO</w:t>
+      </w:r>
+      <w:r>
+        <w:rPr>
+          <w:lang w:val="ru-RU"/>
+        </w:rPr>
+        <w:t xml:space="preserve"> снижение </w:t>
       </w:r>
       <w:proofErr w:type="spellStart"/>
       <w:r>
@@ -4579,34 +5507,7 @@
         <w:rPr>
           <w:lang w:val="ru-RU"/>
         </w:rPr>
-        <w:t xml:space="preserve"> и </w:t>
-      </w:r>
-      <w:r>
-        <w:t>Brier</w:t>
-      </w:r>
-      <w:r>
-        <w:rPr>
-          <w:lang w:val="ru-RU"/>
-        </w:rPr>
-        <w:t xml:space="preserve"> </w:t>
-      </w:r>
-      <w:r>
-        <w:t>score</w:t>
-      </w:r>
-      <w:r>
-        <w:rPr>
-          <w:lang w:val="ru-RU"/>
-        </w:rPr>
-        <w:t xml:space="preserve">. Для вероятностного прогноза эти метрики важнее, чем небольшая разница в </w:t>
-      </w:r>
-      <w:r>
-        <w:t>Accuracy</w:t>
-      </w:r>
-      <w:r>
-        <w:rPr>
-          <w:lang w:val="ru-RU"/>
-        </w:rPr>
-        <w:t>.</w:t>
+        <w:t xml:space="preserve"> составляет около 7.8%, что подтверждает добавленную ценность расширенного набора признаков.</w:t>
       </w:r>
     </w:p>
     <w:p>
@@ -4615,8 +5516,19 @@
           <w:lang w:val="ru-RU"/>
         </w:rPr>
       </w:pPr>
-      <w:r>
-        <w:t>Random</w:t>
+      <w:proofErr w:type="spellStart"/>
+      <w:r>
+        <w:t>CatBoost</w:t>
+      </w:r>
+      <w:proofErr w:type="spellEnd"/>
+      <w:r>
+        <w:rPr>
+          <w:lang w:val="ru-RU"/>
+        </w:rPr>
+        <w:t xml:space="preserve"> оказался очень близок к </w:t>
+      </w:r>
+      <w:r>
+        <w:t>Gradient</w:t>
       </w:r>
       <w:r>
         <w:rPr>
@@ -4625,43 +5537,25 @@
         <w:t xml:space="preserve"> </w:t>
       </w:r>
       <w:r>
-        <w:t>Forest</w:t>
-      </w:r>
-      <w:r>
-        <w:rPr>
-          <w:lang w:val="ru-RU"/>
-        </w:rPr>
-        <w:t xml:space="preserve"> показал сопоставимое качество на </w:t>
-      </w:r>
-      <w:r>
-        <w:t>test</w:t>
-      </w:r>
-      <w:r>
-        <w:rPr>
-          <w:lang w:val="ru-RU"/>
-        </w:rPr>
-        <w:t xml:space="preserve">, но заметно сильнее подстроился под </w:t>
-      </w:r>
-      <w:r>
-        <w:t>train</w:t>
-      </w:r>
-      <w:r>
-        <w:rPr>
-          <w:lang w:val="ru-RU"/>
-        </w:rPr>
-        <w:t xml:space="preserve">: разрыв </w:t>
-      </w:r>
-      <w:r>
-        <w:t>train</w:t>
-      </w:r>
-      <w:r>
-        <w:rPr>
-          <w:lang w:val="ru-RU"/>
-        </w:rPr>
-        <w:t>/</w:t>
-      </w:r>
-      <w:r>
-        <w:t>test</w:t>
+        <w:t>Boosting</w:t>
+      </w:r>
+      <w:r>
+        <w:rPr>
+          <w:lang w:val="ru-RU"/>
+        </w:rPr>
+        <w:t xml:space="preserve"> и даже немного выше по </w:t>
+      </w:r>
+      <w:r>
+        <w:t>Accuracy</w:t>
+      </w:r>
+      <w:r>
+        <w:rPr>
+          <w:lang w:val="ru-RU"/>
+        </w:rPr>
+        <w:t xml:space="preserve">, однако итоговый выбор сделан в пользу </w:t>
+      </w:r>
+      <w:r>
+        <w:t>Gradient</w:t>
       </w:r>
       <w:r>
         <w:rPr>
@@ -4669,6 +5563,15 @@
         </w:rPr>
         <w:t xml:space="preserve"> </w:t>
       </w:r>
+      <w:r>
+        <w:t>Boosting</w:t>
+      </w:r>
+      <w:r>
+        <w:rPr>
+          <w:lang w:val="ru-RU"/>
+        </w:rPr>
+        <w:t xml:space="preserve"> из-за лучшего </w:t>
+      </w:r>
       <w:proofErr w:type="spellStart"/>
       <w:r>
         <w:t>LogLoss</w:t>
@@ -4678,10 +5581,10 @@
         <w:rPr>
           <w:lang w:val="ru-RU"/>
         </w:rPr>
-        <w:t xml:space="preserve"> у него существенно выше, чем у </w:t>
-      </w:r>
-      <w:r>
-        <w:t>Gradient</w:t>
+        <w:t xml:space="preserve"> и </w:t>
+      </w:r>
+      <w:r>
+        <w:t>Brier</w:t>
       </w:r>
       <w:r>
         <w:rPr>
@@ -4690,31 +5593,22 @@
         <w:t xml:space="preserve"> </w:t>
       </w:r>
       <w:r>
-        <w:t>Boosting</w:t>
-      </w:r>
-      <w:r>
-        <w:rPr>
-          <w:lang w:val="ru-RU"/>
-        </w:rPr>
-        <w:t xml:space="preserve">. Поэтому </w:t>
-      </w:r>
-      <w:r>
-        <w:t>Random</w:t>
-      </w:r>
-      <w:r>
-        <w:rPr>
-          <w:lang w:val="ru-RU"/>
-        </w:rPr>
-        <w:t xml:space="preserve"> </w:t>
-      </w:r>
-      <w:r>
-        <w:t>Forest</w:t>
-      </w:r>
-      <w:r>
-        <w:rPr>
-          <w:lang w:val="ru-RU"/>
-        </w:rPr>
-        <w:t xml:space="preserve"> не был выбран как основная модель.</w:t>
+        <w:t>score</w:t>
+      </w:r>
+      <w:r>
+        <w:rPr>
+          <w:lang w:val="ru-RU"/>
+        </w:rPr>
+        <w:t xml:space="preserve">. Для вероятностного прогноза эти метрики важнее, чем небольшая разница в </w:t>
+      </w:r>
+      <w:r>
+        <w:t>Accuracy</w:t>
+      </w:r>
+      <w:r>
+        <w:rPr>
+          <w:lang w:val="ru-RU"/>
+        </w:rPr>
+        <w:t>.</w:t>
       </w:r>
     </w:p>
     <w:p>
@@ -4724,10 +5618,22 @@
         </w:rPr>
       </w:pPr>
       <w:r>
-        <w:rPr>
-          <w:lang w:val="ru-RU"/>
-        </w:rPr>
-        <w:t xml:space="preserve">В целом результаты можно считать устойчивыми для учебного проекта: модель уверенно превосходит простые рейтинговые ориентиры, а качество оценивается на временном </w:t>
+        <w:t>Random</w:t>
+      </w:r>
+      <w:r>
+        <w:rPr>
+          <w:lang w:val="ru-RU"/>
+        </w:rPr>
+        <w:t xml:space="preserve"> </w:t>
+      </w:r>
+      <w:r>
+        <w:t>Forest</w:t>
+      </w:r>
+      <w:r>
+        <w:rPr>
+          <w:lang w:val="ru-RU"/>
+        </w:rPr>
+        <w:t xml:space="preserve"> показал сопоставимое качество на </w:t>
       </w:r>
       <w:r>
         <w:t>test</w:t>
@@ -4736,17 +5642,113 @@
         <w:rPr>
           <w:lang w:val="ru-RU"/>
         </w:rPr>
-        <w:t>-периоде, который имитирует прогнозирование будущих матчей.</w:t>
+        <w:t xml:space="preserve">, но заметно сильнее подстроился под </w:t>
+      </w:r>
+      <w:r>
+        <w:t>train</w:t>
+      </w:r>
+      <w:r>
+        <w:rPr>
+          <w:lang w:val="ru-RU"/>
+        </w:rPr>
+        <w:t xml:space="preserve">: разрыв </w:t>
+      </w:r>
+      <w:r>
+        <w:t>train</w:t>
+      </w:r>
+      <w:r>
+        <w:rPr>
+          <w:lang w:val="ru-RU"/>
+        </w:rPr>
+        <w:t>/</w:t>
+      </w:r>
+      <w:r>
+        <w:t>test</w:t>
+      </w:r>
+      <w:r>
+        <w:rPr>
+          <w:lang w:val="ru-RU"/>
+        </w:rPr>
+        <w:t xml:space="preserve"> </w:t>
+      </w:r>
+      <w:proofErr w:type="spellStart"/>
+      <w:r>
+        <w:t>LogLoss</w:t>
+      </w:r>
+      <w:proofErr w:type="spellEnd"/>
+      <w:r>
+        <w:rPr>
+          <w:lang w:val="ru-RU"/>
+        </w:rPr>
+        <w:t xml:space="preserve"> у него существенно выше, чем у </w:t>
+      </w:r>
+      <w:r>
+        <w:t>Gradient</w:t>
+      </w:r>
+      <w:r>
+        <w:rPr>
+          <w:lang w:val="ru-RU"/>
+        </w:rPr>
+        <w:t xml:space="preserve"> </w:t>
+      </w:r>
+      <w:r>
+        <w:t>Boosting</w:t>
+      </w:r>
+      <w:r>
+        <w:rPr>
+          <w:lang w:val="ru-RU"/>
+        </w:rPr>
+        <w:t xml:space="preserve">. Поэтому </w:t>
+      </w:r>
+      <w:r>
+        <w:t>Random</w:t>
+      </w:r>
+      <w:r>
+        <w:rPr>
+          <w:lang w:val="ru-RU"/>
+        </w:rPr>
+        <w:t xml:space="preserve"> </w:t>
+      </w:r>
+      <w:r>
+        <w:t>Forest</w:t>
+      </w:r>
+      <w:r>
+        <w:rPr>
+          <w:lang w:val="ru-RU"/>
+        </w:rPr>
+        <w:t xml:space="preserve"> не был выбран как основная модель.</w:t>
       </w:r>
     </w:p>
     <w:p>
       <w:pPr>
+        <w:rPr>
+          <w:lang w:val="ru-RU"/>
+        </w:rPr>
+      </w:pPr>
+      <w:r>
+        <w:rPr>
+          <w:lang w:val="ru-RU"/>
+        </w:rPr>
+        <w:t xml:space="preserve">В целом результаты можно считать устойчивыми для учебного проекта: модель уверенно превосходит простые рейтинговые ориентиры, а качество оценивается на временном </w:t>
+      </w:r>
+      <w:r>
+        <w:t>test</w:t>
+      </w:r>
+      <w:r>
+        <w:rPr>
+          <w:lang w:val="ru-RU"/>
+        </w:rPr>
+        <w:t>-периоде, который имитирует прогнозирование будущих матчей.</w:t>
+      </w:r>
+    </w:p>
+    <w:p>
+      <w:pPr>
         <w:pStyle w:val="1"/>
         <w:rPr>
           <w:lang w:val="ru-RU"/>
         </w:rPr>
       </w:pPr>
-      <w:bookmarkStart w:id="6" w:name="_Toc229562881"/>
+      <w:bookmarkStart w:id="6" w:name="_Toc229564924"/>
       <w:r>
         <w:rPr>
           <w:lang w:val="ru-RU"/>
@@ -4810,7 +5812,7 @@
           <w:lang w:val="ru-RU"/>
         </w:rPr>
       </w:pPr>
-      <w:bookmarkStart w:id="7" w:name="_Toc229562882"/>
+      <w:bookmarkStart w:id="7" w:name="_Toc229564925"/>
       <w:r>
         <w:rPr>
           <w:lang w:val="ru-RU"/>
@@ -4866,6 +5868,7 @@
         <w:rPr>
           <w:lang w:val="ru-RU"/>
         </w:rPr>
+        <w:lastRenderedPageBreak/>
         <w:t>Планирование календаря: предварительная оценка сложности турнира, потенциальных соперников и уровня сетки.</w:t>
       </w:r>
     </w:p>
@@ -4903,7 +5906,6 @@
         <w:rPr>
           <w:lang w:val="ru-RU"/>
         </w:rPr>
-        <w:lastRenderedPageBreak/>
         <w:t>Выявление расхождений между официальным рейтингом и фактической игровой силой, например у игроков с малым числом турниров или резким изменением результатов.</w:t>
       </w:r>
     </w:p>
@@ -4924,7 +5926,7 @@
       <w:pPr>
         <w:pStyle w:val="1"/>
       </w:pPr>
-      <w:bookmarkStart w:id="8" w:name="_Toc229562883"/>
+      <w:bookmarkStart w:id="8" w:name="_Toc229564926"/>
       <w:r>
         <w:t>9. Ограничения проекта</w:t>
       </w:r>
@@ -5057,7 +6059,7 @@
           <w:lang w:val="ru-RU"/>
         </w:rPr>
       </w:pPr>
-      <w:bookmarkStart w:id="9" w:name="_Toc229562884"/>
+      <w:bookmarkStart w:id="9" w:name="_Toc229564927"/>
       <w:r>
         <w:rPr>
           <w:lang w:val="ru-RU"/>
@@ -5173,6 +6175,7 @@
     <w:p>
       <w:proofErr w:type="spellStart"/>
       <w:r>
+        <w:lastRenderedPageBreak/>
         <w:t>Возможные</w:t>
       </w:r>
       <w:proofErr w:type="spellEnd"/>
@@ -5247,7 +6250,6 @@
         <w:rPr>
           <w:lang w:val="ru-RU"/>
         </w:rPr>
-        <w:lastRenderedPageBreak/>
         <w:t>улучшить калибровку вероятностей и отдельно контролировать качество на разных возрастных группах;</w:t>
       </w:r>
     </w:p>
@@ -5283,7 +6285,7 @@
       <w:pPr>
         <w:pStyle w:val="1"/>
       </w:pPr>
-      <w:bookmarkStart w:id="10" w:name="_Toc229562885"/>
+      <w:bookmarkStart w:id="10" w:name="_Toc229564928"/>
       <w:r>
         <w:t>11. Источники</w:t>
       </w:r>

</xml_diff>

<commit_message>
Add feature importance ranking to note
</commit_message>
<xml_diff>
--- a/docs/Пояснительная_записка_RTT_tennis_predictor_updated_v14.docx
+++ b/docs/Пояснительная_записка_RTT_tennis_predictor_updated_v14.docx
@@ -375,6 +375,7 @@
           <w:pPr>
             <w:pStyle w:val="14"/>
             <w:tabs>
+              <w:tab w:val="left" w:pos="480"/>
               <w:tab w:val="right" w:leader="dot" w:pos="9638"/>
             </w:tabs>
             <w:rPr>
@@ -395,14 +396,33 @@
           <w:r>
             <w:fldChar w:fldCharType="separate"/>
           </w:r>
-          <w:hyperlink w:anchor="_Toc229564918" w:history="1">
+          <w:hyperlink w:anchor="_Toc229570916" w:history="1">
             <w:r>
               <w:rPr>
                 <w:rStyle w:val="aff8"/>
                 <w:noProof/>
                 <w:lang w:val="ru-RU"/>
               </w:rPr>
-              <w:t>1. Введение и постановка задачи</w:t>
+              <w:t>1.</w:t>
+            </w:r>
+            <w:r>
+              <w:rPr>
+                <w:rFonts w:asciiTheme="minorHAnsi" w:hAnsiTheme="minorHAnsi"/>
+                <w:noProof/>
+                <w:kern w:val="2"/>
+                <w:szCs w:val="24"/>
+                <w:lang w:val="ru-RU" w:eastAsia="ru-RU"/>
+                <w14:ligatures w14:val="standardContextual"/>
+              </w:rPr>
+              <w:tab/>
+            </w:r>
+            <w:r>
+              <w:rPr>
+                <w:rStyle w:val="aff8"/>
+                <w:noProof/>
+                <w:lang w:val="ru-RU"/>
+              </w:rPr>
+              <w:t>Введение и постановка задачи</w:t>
             </w:r>
             <w:r>
               <w:rPr>
@@ -423,7 +443,7 @@
                 <w:noProof/>
                 <w:webHidden/>
               </w:rPr>
-              <w:instrText xml:space="preserve"> PAGEREF _Toc229564918 \h </w:instrText>
+              <w:instrText xml:space="preserve"> PAGEREF _Toc229570916 \h </w:instrText>
             </w:r>
             <w:r>
               <w:rPr>
@@ -458,6 +478,7 @@
           <w:pPr>
             <w:pStyle w:val="14"/>
             <w:tabs>
+              <w:tab w:val="left" w:pos="480"/>
               <w:tab w:val="right" w:leader="dot" w:pos="9638"/>
             </w:tabs>
             <w:rPr>
@@ -469,14 +490,33 @@
               <w14:ligatures w14:val="standardContextual"/>
             </w:rPr>
           </w:pPr>
-          <w:hyperlink w:anchor="_Toc229564919" w:history="1">
+          <w:hyperlink w:anchor="_Toc229570917" w:history="1">
             <w:r>
               <w:rPr>
                 <w:rStyle w:val="aff8"/>
                 <w:noProof/>
                 <w:lang w:val="ru-RU"/>
               </w:rPr>
-              <w:t>2. Реализованный функционал проекта</w:t>
+              <w:t>2.</w:t>
+            </w:r>
+            <w:r>
+              <w:rPr>
+                <w:rFonts w:asciiTheme="minorHAnsi" w:hAnsiTheme="minorHAnsi"/>
+                <w:noProof/>
+                <w:kern w:val="2"/>
+                <w:szCs w:val="24"/>
+                <w:lang w:val="ru-RU" w:eastAsia="ru-RU"/>
+                <w14:ligatures w14:val="standardContextual"/>
+              </w:rPr>
+              <w:tab/>
+            </w:r>
+            <w:r>
+              <w:rPr>
+                <w:rStyle w:val="aff8"/>
+                <w:noProof/>
+                <w:lang w:val="ru-RU"/>
+              </w:rPr>
+              <w:t>Реализованный функционал проекта</w:t>
             </w:r>
             <w:r>
               <w:rPr>
@@ -497,7 +537,7 @@
                 <w:noProof/>
                 <w:webHidden/>
               </w:rPr>
-              <w:instrText xml:space="preserve"> PAGEREF _Toc229564919 \h </w:instrText>
+              <w:instrText xml:space="preserve"> PAGEREF _Toc229570917 \h </w:instrText>
             </w:r>
             <w:r>
               <w:rPr>
@@ -532,6 +572,7 @@
           <w:pPr>
             <w:pStyle w:val="14"/>
             <w:tabs>
+              <w:tab w:val="left" w:pos="480"/>
               <w:tab w:val="right" w:leader="dot" w:pos="9638"/>
             </w:tabs>
             <w:rPr>
@@ -543,14 +584,33 @@
               <w14:ligatures w14:val="standardContextual"/>
             </w:rPr>
           </w:pPr>
-          <w:hyperlink w:anchor="_Toc229564920" w:history="1">
+          <w:hyperlink w:anchor="_Toc229570918" w:history="1">
             <w:r>
               <w:rPr>
                 <w:rStyle w:val="aff8"/>
                 <w:noProof/>
                 <w:lang w:val="ru-RU"/>
               </w:rPr>
-              <w:t>3. Данные и качество подготовки датасета</w:t>
+              <w:t>3.</w:t>
+            </w:r>
+            <w:r>
+              <w:rPr>
+                <w:rFonts w:asciiTheme="minorHAnsi" w:hAnsiTheme="minorHAnsi"/>
+                <w:noProof/>
+                <w:kern w:val="2"/>
+                <w:szCs w:val="24"/>
+                <w:lang w:val="ru-RU" w:eastAsia="ru-RU"/>
+                <w14:ligatures w14:val="standardContextual"/>
+              </w:rPr>
+              <w:tab/>
+            </w:r>
+            <w:r>
+              <w:rPr>
+                <w:rStyle w:val="aff8"/>
+                <w:noProof/>
+                <w:lang w:val="ru-RU"/>
+              </w:rPr>
+              <w:t>Данные и качество подготовки датасета</w:t>
             </w:r>
             <w:r>
               <w:rPr>
@@ -571,7 +631,7 @@
                 <w:noProof/>
                 <w:webHidden/>
               </w:rPr>
-              <w:instrText xml:space="preserve"> PAGEREF _Toc229564920 \h </w:instrText>
+              <w:instrText xml:space="preserve"> PAGEREF _Toc229570918 \h </w:instrText>
             </w:r>
             <w:r>
               <w:rPr>
@@ -606,6 +666,7 @@
           <w:pPr>
             <w:pStyle w:val="14"/>
             <w:tabs>
+              <w:tab w:val="left" w:pos="480"/>
               <w:tab w:val="right" w:leader="dot" w:pos="9638"/>
             </w:tabs>
             <w:rPr>
@@ -617,14 +678,33 @@
               <w14:ligatures w14:val="standardContextual"/>
             </w:rPr>
           </w:pPr>
-          <w:hyperlink w:anchor="_Toc229564921" w:history="1">
+          <w:hyperlink w:anchor="_Toc229570919" w:history="1">
             <w:r>
               <w:rPr>
                 <w:rStyle w:val="aff8"/>
                 <w:noProof/>
                 <w:lang w:val="ru-RU"/>
               </w:rPr>
-              <w:t>4. Признаки и предотвращение утечки будущей информации</w:t>
+              <w:t>4.</w:t>
+            </w:r>
+            <w:r>
+              <w:rPr>
+                <w:rFonts w:asciiTheme="minorHAnsi" w:hAnsiTheme="minorHAnsi"/>
+                <w:noProof/>
+                <w:kern w:val="2"/>
+                <w:szCs w:val="24"/>
+                <w:lang w:val="ru-RU" w:eastAsia="ru-RU"/>
+                <w14:ligatures w14:val="standardContextual"/>
+              </w:rPr>
+              <w:tab/>
+            </w:r>
+            <w:r>
+              <w:rPr>
+                <w:rStyle w:val="aff8"/>
+                <w:noProof/>
+                <w:lang w:val="ru-RU"/>
+              </w:rPr>
+              <w:t>Признаки и предотвращение утечки будущей информации</w:t>
             </w:r>
             <w:r>
               <w:rPr>
@@ -645,7 +725,7 @@
                 <w:noProof/>
                 <w:webHidden/>
               </w:rPr>
-              <w:instrText xml:space="preserve"> PAGEREF _Toc229564921 \h </w:instrText>
+              <w:instrText xml:space="preserve"> PAGEREF _Toc229570919 \h </w:instrText>
             </w:r>
             <w:r>
               <w:rPr>
@@ -680,6 +760,7 @@
           <w:pPr>
             <w:pStyle w:val="14"/>
             <w:tabs>
+              <w:tab w:val="left" w:pos="480"/>
               <w:tab w:val="right" w:leader="dot" w:pos="9638"/>
             </w:tabs>
             <w:rPr>
@@ -691,14 +772,33 @@
               <w14:ligatures w14:val="standardContextual"/>
             </w:rPr>
           </w:pPr>
-          <w:hyperlink w:anchor="_Toc229564922" w:history="1">
+          <w:hyperlink w:anchor="_Toc229570920" w:history="1">
             <w:r>
               <w:rPr>
                 <w:rStyle w:val="aff8"/>
                 <w:noProof/>
                 <w:lang w:val="ru-RU"/>
               </w:rPr>
-              <w:t>5. Обучение, тестирование и сравнение моделей</w:t>
+              <w:t>5.</w:t>
+            </w:r>
+            <w:r>
+              <w:rPr>
+                <w:rFonts w:asciiTheme="minorHAnsi" w:hAnsiTheme="minorHAnsi"/>
+                <w:noProof/>
+                <w:kern w:val="2"/>
+                <w:szCs w:val="24"/>
+                <w:lang w:val="ru-RU" w:eastAsia="ru-RU"/>
+                <w14:ligatures w14:val="standardContextual"/>
+              </w:rPr>
+              <w:tab/>
+            </w:r>
+            <w:r>
+              <w:rPr>
+                <w:rStyle w:val="aff8"/>
+                <w:noProof/>
+                <w:lang w:val="ru-RU"/>
+              </w:rPr>
+              <w:t>Обучение, тестирование и сравнение моделей</w:t>
             </w:r>
             <w:r>
               <w:rPr>
@@ -719,7 +819,7 @@
                 <w:noProof/>
                 <w:webHidden/>
               </w:rPr>
-              <w:instrText xml:space="preserve"> PAGEREF _Toc229564922 \h </w:instrText>
+              <w:instrText xml:space="preserve"> PAGEREF _Toc229570920 \h </w:instrText>
             </w:r>
             <w:r>
               <w:rPr>
@@ -754,6 +854,7 @@
           <w:pPr>
             <w:pStyle w:val="14"/>
             <w:tabs>
+              <w:tab w:val="left" w:pos="480"/>
               <w:tab w:val="right" w:leader="dot" w:pos="9638"/>
             </w:tabs>
             <w:rPr>
@@ -765,14 +866,33 @@
               <w14:ligatures w14:val="standardContextual"/>
             </w:rPr>
           </w:pPr>
-          <w:hyperlink w:anchor="_Toc229564923" w:history="1">
+          <w:hyperlink w:anchor="_Toc229570921" w:history="1">
             <w:r>
               <w:rPr>
                 <w:rStyle w:val="aff8"/>
                 <w:noProof/>
                 <w:lang w:val="ru-RU"/>
               </w:rPr>
-              <w:t>6. Качество построенных моделей машинного обучения</w:t>
+              <w:t>6.</w:t>
+            </w:r>
+            <w:r>
+              <w:rPr>
+                <w:rFonts w:asciiTheme="minorHAnsi" w:hAnsiTheme="minorHAnsi"/>
+                <w:noProof/>
+                <w:kern w:val="2"/>
+                <w:szCs w:val="24"/>
+                <w:lang w:val="ru-RU" w:eastAsia="ru-RU"/>
+                <w14:ligatures w14:val="standardContextual"/>
+              </w:rPr>
+              <w:tab/>
+            </w:r>
+            <w:r>
+              <w:rPr>
+                <w:rStyle w:val="aff8"/>
+                <w:noProof/>
+                <w:lang w:val="ru-RU"/>
+              </w:rPr>
+              <w:t>Оценка качества построенных моделей машинного обучения</w:t>
             </w:r>
             <w:r>
               <w:rPr>
@@ -793,7 +913,7 @@
                 <w:noProof/>
                 <w:webHidden/>
               </w:rPr>
-              <w:instrText xml:space="preserve"> PAGEREF _Toc229564923 \h </w:instrText>
+              <w:instrText xml:space="preserve"> PAGEREF _Toc229570921 \h </w:instrText>
             </w:r>
             <w:r>
               <w:rPr>
@@ -828,6 +948,7 @@
           <w:pPr>
             <w:pStyle w:val="14"/>
             <w:tabs>
+              <w:tab w:val="left" w:pos="480"/>
               <w:tab w:val="right" w:leader="dot" w:pos="9638"/>
             </w:tabs>
             <w:rPr>
@@ -839,14 +960,33 @@
               <w14:ligatures w14:val="standardContextual"/>
             </w:rPr>
           </w:pPr>
-          <w:hyperlink w:anchor="_Toc229564924" w:history="1">
+          <w:hyperlink w:anchor="_Toc229570922" w:history="1">
             <w:r>
               <w:rPr>
                 <w:rStyle w:val="aff8"/>
                 <w:noProof/>
                 <w:lang w:val="ru-RU"/>
               </w:rPr>
-              <w:t>7. Интерпретация факторов прогноза</w:t>
+              <w:t>7.</w:t>
+            </w:r>
+            <w:r>
+              <w:rPr>
+                <w:rFonts w:asciiTheme="minorHAnsi" w:hAnsiTheme="minorHAnsi"/>
+                <w:noProof/>
+                <w:kern w:val="2"/>
+                <w:szCs w:val="24"/>
+                <w:lang w:val="ru-RU" w:eastAsia="ru-RU"/>
+                <w14:ligatures w14:val="standardContextual"/>
+              </w:rPr>
+              <w:tab/>
+            </w:r>
+            <w:r>
+              <w:rPr>
+                <w:rStyle w:val="aff8"/>
+                <w:noProof/>
+                <w:lang w:val="ru-RU"/>
+              </w:rPr>
+              <w:t>Интерпретация факторов прогноза</w:t>
             </w:r>
             <w:r>
               <w:rPr>
@@ -867,7 +1007,7 @@
                 <w:noProof/>
                 <w:webHidden/>
               </w:rPr>
-              <w:instrText xml:space="preserve"> PAGEREF _Toc229564924 \h </w:instrText>
+              <w:instrText xml:space="preserve"> PAGEREF _Toc229570922 \h </w:instrText>
             </w:r>
             <w:r>
               <w:rPr>
@@ -902,6 +1042,7 @@
           <w:pPr>
             <w:pStyle w:val="14"/>
             <w:tabs>
+              <w:tab w:val="left" w:pos="480"/>
               <w:tab w:val="right" w:leader="dot" w:pos="9638"/>
             </w:tabs>
             <w:rPr>
@@ -913,14 +1054,33 @@
               <w14:ligatures w14:val="standardContextual"/>
             </w:rPr>
           </w:pPr>
-          <w:hyperlink w:anchor="_Toc229564925" w:history="1">
+          <w:hyperlink w:anchor="_Toc229570923" w:history="1">
             <w:r>
               <w:rPr>
                 <w:rStyle w:val="aff8"/>
                 <w:noProof/>
                 <w:lang w:val="ru-RU"/>
               </w:rPr>
-              <w:t>8. Практическое применение</w:t>
+              <w:t>8.</w:t>
+            </w:r>
+            <w:r>
+              <w:rPr>
+                <w:rFonts w:asciiTheme="minorHAnsi" w:hAnsiTheme="minorHAnsi"/>
+                <w:noProof/>
+                <w:kern w:val="2"/>
+                <w:szCs w:val="24"/>
+                <w:lang w:val="ru-RU" w:eastAsia="ru-RU"/>
+                <w14:ligatures w14:val="standardContextual"/>
+              </w:rPr>
+              <w:tab/>
+            </w:r>
+            <w:r>
+              <w:rPr>
+                <w:rStyle w:val="aff8"/>
+                <w:noProof/>
+                <w:lang w:val="ru-RU"/>
+              </w:rPr>
+              <w:t>Практическое применение</w:t>
             </w:r>
             <w:r>
               <w:rPr>
@@ -941,7 +1101,7 @@
                 <w:noProof/>
                 <w:webHidden/>
               </w:rPr>
-              <w:instrText xml:space="preserve"> PAGEREF _Toc229564925 \h </w:instrText>
+              <w:instrText xml:space="preserve"> PAGEREF _Toc229570923 \h </w:instrText>
             </w:r>
             <w:r>
               <w:rPr>
@@ -961,7 +1121,7 @@
                 <w:noProof/>
                 <w:webHidden/>
               </w:rPr>
-              <w:t>9</w:t>
+              <w:t>10</w:t>
             </w:r>
             <w:r>
               <w:rPr>
@@ -976,6 +1136,7 @@
           <w:pPr>
             <w:pStyle w:val="14"/>
             <w:tabs>
+              <w:tab w:val="left" w:pos="480"/>
               <w:tab w:val="right" w:leader="dot" w:pos="9638"/>
             </w:tabs>
             <w:rPr>
@@ -987,13 +1148,31 @@
               <w14:ligatures w14:val="standardContextual"/>
             </w:rPr>
           </w:pPr>
-          <w:hyperlink w:anchor="_Toc229564926" w:history="1">
+          <w:hyperlink w:anchor="_Toc229570924" w:history="1">
             <w:r>
               <w:rPr>
                 <w:rStyle w:val="aff8"/>
                 <w:noProof/>
               </w:rPr>
-              <w:t>9. Ограничения проекта</w:t>
+              <w:t>9.</w:t>
+            </w:r>
+            <w:r>
+              <w:rPr>
+                <w:rFonts w:asciiTheme="minorHAnsi" w:hAnsiTheme="minorHAnsi"/>
+                <w:noProof/>
+                <w:kern w:val="2"/>
+                <w:szCs w:val="24"/>
+                <w:lang w:val="ru-RU" w:eastAsia="ru-RU"/>
+                <w14:ligatures w14:val="standardContextual"/>
+              </w:rPr>
+              <w:tab/>
+            </w:r>
+            <w:r>
+              <w:rPr>
+                <w:rStyle w:val="aff8"/>
+                <w:noProof/>
+              </w:rPr>
+              <w:t>Ограничения проекта</w:t>
             </w:r>
             <w:r>
               <w:rPr>
@@ -1014,7 +1193,7 @@
                 <w:noProof/>
                 <w:webHidden/>
               </w:rPr>
-              <w:instrText xml:space="preserve"> PAGEREF _Toc229564926 \h </w:instrText>
+              <w:instrText xml:space="preserve"> PAGEREF _Toc229570924 \h </w:instrText>
             </w:r>
             <w:r>
               <w:rPr>
@@ -1049,6 +1228,7 @@
           <w:pPr>
             <w:pStyle w:val="14"/>
             <w:tabs>
+              <w:tab w:val="left" w:pos="720"/>
               <w:tab w:val="right" w:leader="dot" w:pos="9638"/>
             </w:tabs>
             <w:rPr>
@@ -1060,14 +1240,31 @@
               <w14:ligatures w14:val="standardContextual"/>
             </w:rPr>
           </w:pPr>
-          <w:hyperlink w:anchor="_Toc229564927" w:history="1">
+          <w:hyperlink w:anchor="_Toc229570925" w:history="1">
             <w:r>
               <w:rPr>
                 <w:rStyle w:val="aff8"/>
                 <w:noProof/>
-                <w:lang w:val="ru-RU"/>
               </w:rPr>
-              <w:t>10. Заключение и направления развития</w:t>
+              <w:t>10.</w:t>
+            </w:r>
+            <w:r>
+              <w:rPr>
+                <w:rFonts w:asciiTheme="minorHAnsi" w:hAnsiTheme="minorHAnsi"/>
+                <w:noProof/>
+                <w:kern w:val="2"/>
+                <w:szCs w:val="24"/>
+                <w:lang w:val="ru-RU" w:eastAsia="ru-RU"/>
+                <w14:ligatures w14:val="standardContextual"/>
+              </w:rPr>
+              <w:tab/>
+            </w:r>
+            <w:r>
+              <w:rPr>
+                <w:rStyle w:val="aff8"/>
+                <w:noProof/>
+              </w:rPr>
+              <w:t>Заключение и направления развития</w:t>
             </w:r>
             <w:r>
               <w:rPr>
@@ -1088,7 +1285,7 @@
                 <w:noProof/>
                 <w:webHidden/>
               </w:rPr>
-              <w:instrText xml:space="preserve"> PAGEREF _Toc229564927 \h </w:instrText>
+              <w:instrText xml:space="preserve"> PAGEREF _Toc229570925 \h </w:instrText>
             </w:r>
             <w:r>
               <w:rPr>
@@ -1123,6 +1320,7 @@
           <w:pPr>
             <w:pStyle w:val="14"/>
             <w:tabs>
+              <w:tab w:val="left" w:pos="720"/>
               <w:tab w:val="right" w:leader="dot" w:pos="9638"/>
             </w:tabs>
             <w:rPr>
@@ -1134,13 +1332,31 @@
               <w14:ligatures w14:val="standardContextual"/>
             </w:rPr>
           </w:pPr>
-          <w:hyperlink w:anchor="_Toc229564928" w:history="1">
+          <w:hyperlink w:anchor="_Toc229570926" w:history="1">
             <w:r>
               <w:rPr>
                 <w:rStyle w:val="aff8"/>
                 <w:noProof/>
               </w:rPr>
-              <w:t>11. Источники</w:t>
+              <w:t>11.</w:t>
+            </w:r>
+            <w:r>
+              <w:rPr>
+                <w:rFonts w:asciiTheme="minorHAnsi" w:hAnsiTheme="minorHAnsi"/>
+                <w:noProof/>
+                <w:kern w:val="2"/>
+                <w:szCs w:val="24"/>
+                <w:lang w:val="ru-RU" w:eastAsia="ru-RU"/>
+                <w14:ligatures w14:val="standardContextual"/>
+              </w:rPr>
+              <w:tab/>
+            </w:r>
+            <w:r>
+              <w:rPr>
+                <w:rStyle w:val="aff8"/>
+                <w:noProof/>
+              </w:rPr>
+              <w:t>Источники</w:t>
             </w:r>
             <w:r>
               <w:rPr>
@@ -1161,7 +1377,7 @@
                 <w:noProof/>
                 <w:webHidden/>
               </w:rPr>
-              <w:instrText xml:space="preserve"> PAGEREF _Toc229564928 \h </w:instrText>
+              <w:instrText xml:space="preserve"> PAGEREF _Toc229570926 \h </w:instrText>
             </w:r>
             <w:r>
               <w:rPr>
@@ -1219,18 +1435,22 @@
     <w:p>
       <w:pPr>
         <w:pStyle w:val="1"/>
+        <w:numPr>
+          <w:ilvl w:val="0"/>
+          <w:numId w:val="11"/>
+        </w:numPr>
         <w:spacing w:after="240"/>
         <w:rPr>
           <w:lang w:val="ru-RU"/>
         </w:rPr>
       </w:pPr>
-      <w:bookmarkStart w:id="0" w:name="_Toc229564918"/>
+      <w:bookmarkStart w:id="0" w:name="_Toc229570916"/>
       <w:r>
         <w:rPr>
           <w:lang w:val="ru-RU"/>
         </w:rPr>
         <w:lastRenderedPageBreak/>
-        <w:t>1. Введение и постановка задачи</w:t>
+        <w:t>Введение и постановка задачи</w:t>
       </w:r>
       <w:bookmarkEnd w:id="0"/>
     </w:p>
@@ -1323,17 +1543,21 @@
     <w:p>
       <w:pPr>
         <w:pStyle w:val="1"/>
+        <w:numPr>
+          <w:ilvl w:val="0"/>
+          <w:numId w:val="11"/>
+        </w:numPr>
         <w:spacing w:after="240"/>
         <w:rPr>
           <w:lang w:val="ru-RU"/>
         </w:rPr>
       </w:pPr>
-      <w:bookmarkStart w:id="1" w:name="_Toc229564919"/>
-      <w:r>
-        <w:rPr>
-          <w:lang w:val="ru-RU"/>
-        </w:rPr>
-        <w:t>2. Реализованный функционал проекта</w:t>
+      <w:bookmarkStart w:id="1" w:name="_Toc229570917"/>
+      <w:r>
+        <w:rPr>
+          <w:lang w:val="ru-RU"/>
+        </w:rPr>
+        <w:t>Реализованный функционал проекта</w:t>
       </w:r>
       <w:bookmarkEnd w:id="1"/>
     </w:p>
@@ -1775,17 +1999,21 @@
     <w:p>
       <w:pPr>
         <w:pStyle w:val="1"/>
+        <w:numPr>
+          <w:ilvl w:val="0"/>
+          <w:numId w:val="11"/>
+        </w:numPr>
         <w:spacing w:after="240"/>
         <w:rPr>
           <w:lang w:val="ru-RU"/>
         </w:rPr>
       </w:pPr>
-      <w:bookmarkStart w:id="2" w:name="_Toc229564920"/>
-      <w:r>
-        <w:rPr>
-          <w:lang w:val="ru-RU"/>
-        </w:rPr>
-        <w:t>3. Данные и качество подготовки датасета</w:t>
+      <w:bookmarkStart w:id="2" w:name="_Toc229570918"/>
+      <w:r>
+        <w:rPr>
+          <w:lang w:val="ru-RU"/>
+        </w:rPr>
+        <w:t>Данные и качество подготовки датасета</w:t>
       </w:r>
       <w:bookmarkEnd w:id="2"/>
     </w:p>
@@ -2554,17 +2782,21 @@
     <w:p>
       <w:pPr>
         <w:pStyle w:val="1"/>
+        <w:numPr>
+          <w:ilvl w:val="0"/>
+          <w:numId w:val="11"/>
+        </w:numPr>
         <w:spacing w:after="240"/>
         <w:rPr>
           <w:lang w:val="ru-RU"/>
         </w:rPr>
       </w:pPr>
-      <w:bookmarkStart w:id="3" w:name="_Toc229564921"/>
-      <w:r>
-        <w:rPr>
-          <w:lang w:val="ru-RU"/>
-        </w:rPr>
-        <w:t>4. Признаки и предотвращение утечки будущей информации</w:t>
+      <w:bookmarkStart w:id="3" w:name="_Toc229570919"/>
+      <w:r>
+        <w:rPr>
+          <w:lang w:val="ru-RU"/>
+        </w:rPr>
+        <w:t>Признаки и предотвращение утечки будущей информации</w:t>
       </w:r>
       <w:bookmarkEnd w:id="3"/>
     </w:p>
@@ -3347,17 +3579,21 @@
     <w:p>
       <w:pPr>
         <w:pStyle w:val="1"/>
+        <w:numPr>
+          <w:ilvl w:val="0"/>
+          <w:numId w:val="11"/>
+        </w:numPr>
         <w:spacing w:after="240"/>
         <w:rPr>
           <w:lang w:val="ru-RU"/>
         </w:rPr>
       </w:pPr>
-      <w:bookmarkStart w:id="4" w:name="_Toc229564922"/>
-      <w:r>
-        <w:rPr>
-          <w:lang w:val="ru-RU"/>
-        </w:rPr>
-        <w:t>5. Обучение, тестирование и сравнение моделей</w:t>
+      <w:bookmarkStart w:id="4" w:name="_Toc229570920"/>
+      <w:r>
+        <w:rPr>
+          <w:lang w:val="ru-RU"/>
+        </w:rPr>
+        <w:t>Обучение, тестирование и сравнение моделей</w:t>
       </w:r>
       <w:bookmarkEnd w:id="4"/>
     </w:p>
@@ -4692,6 +4928,9 @@
     <w:p>
       <w:pPr>
         <w:jc w:val="both"/>
+        <w:rPr>
+          <w:lang w:val="ru-RU"/>
+        </w:rPr>
       </w:pPr>
       <w:r>
         <w:rPr>
@@ -4712,7 +4951,13 @@
         <w:t xml:space="preserve">– именно </w:t>
       </w:r>
       <w:r>
-        <w:t xml:space="preserve">test </w:t>
+        <w:t>test</w:t>
+      </w:r>
+      <w:r>
+        <w:rPr>
+          <w:lang w:val="ru-RU"/>
+        </w:rPr>
+        <w:t xml:space="preserve"> </w:t>
       </w:r>
       <w:proofErr w:type="spellStart"/>
       <w:r>
@@ -4720,6 +4965,9 @@
       </w:r>
       <w:proofErr w:type="spellEnd"/>
       <w:r>
+        <w:rPr>
+          <w:lang w:val="ru-RU"/>
+        </w:rPr>
         <w:t>.</w:t>
       </w:r>
     </w:p>
@@ -4758,6 +5006,9 @@
     <w:p>
       <w:pPr>
         <w:jc w:val="both"/>
+        <w:rPr>
+          <w:lang w:val="ru-RU"/>
+        </w:rPr>
       </w:pPr>
       <w:r>
         <w:rPr>
@@ -4816,19 +5067,17 @@
     <w:p>
       <w:pPr>
         <w:pStyle w:val="1"/>
+        <w:numPr>
+          <w:ilvl w:val="0"/>
+          <w:numId w:val="11"/>
+        </w:numPr>
         <w:spacing w:after="240"/>
         <w:jc w:val="both"/>
         <w:rPr>
           <w:lang w:val="ru-RU"/>
         </w:rPr>
       </w:pPr>
-      <w:bookmarkStart w:id="5" w:name="_Toc229564923"/>
-      <w:r>
-        <w:rPr>
-          <w:lang w:val="ru-RU"/>
-        </w:rPr>
-        <w:t xml:space="preserve">6. </w:t>
-      </w:r>
+      <w:bookmarkStart w:id="5" w:name="_Toc229570921"/>
       <w:r>
         <w:rPr>
           <w:lang w:val="ru-RU"/>
@@ -4940,38 +5189,72 @@
         <w:rPr>
           <w:lang w:val="ru-RU"/>
         </w:rPr>
-        <w:t xml:space="preserve"> показывает среднюю ошибку вероятностного прогноза, </w:t>
-      </w:r>
-      <w:r>
-        <w:t>ROC</w:t>
-      </w:r>
-      <w:r>
-        <w:rPr>
-          <w:lang w:val="ru-RU"/>
-        </w:rPr>
-        <w:t>-</w:t>
-      </w:r>
-      <w:r>
-        <w:t>AUC</w:t>
-      </w:r>
-      <w:r>
-        <w:rPr>
-          <w:lang w:val="ru-RU"/>
-        </w:rPr>
-        <w:t xml:space="preserve"> оценивает способность модели ранжировать победы выше поражений, а </w:t>
-      </w:r>
-      <w:r>
-        <w:t>Accuracy</w:t>
-      </w:r>
-      <w:r>
-        <w:rPr>
-          <w:lang w:val="ru-RU"/>
-        </w:rPr>
-        <w:t xml:space="preserve"> дает привычную долю правильных классификаций при пороге 0.5.</w:t>
+        <w:t xml:space="preserve"> показывает среднюю ошибку вероятностного прогноза</w:t>
+      </w:r>
+      <w:r>
+        <w:rPr>
+          <w:lang w:val="ru-RU"/>
+        </w:rPr>
+        <w:t>;</w:t>
       </w:r>
     </w:p>
     <w:p>
       <w:pPr>
+        <w:jc w:val="both"/>
+        <w:rPr>
+          <w:lang w:val="ru-RU"/>
+        </w:rPr>
+      </w:pPr>
+      <w:r>
+        <w:t>ROC</w:t>
+      </w:r>
+      <w:r>
+        <w:rPr>
+          <w:lang w:val="ru-RU"/>
+        </w:rPr>
+        <w:t>-</w:t>
+      </w:r>
+      <w:r>
+        <w:t>AUC</w:t>
+      </w:r>
+      <w:r>
+        <w:rPr>
+          <w:lang w:val="ru-RU"/>
+        </w:rPr>
+        <w:t xml:space="preserve"> оценивает способность модели ранжировать победы выше поражений</w:t>
+      </w:r>
+      <w:r>
+        <w:rPr>
+          <w:lang w:val="ru-RU"/>
+        </w:rPr>
+        <w:t>;</w:t>
+      </w:r>
+    </w:p>
+    <w:p>
+      <w:pPr>
+        <w:jc w:val="both"/>
+        <w:rPr>
+          <w:lang w:val="ru-RU"/>
+        </w:rPr>
+      </w:pPr>
+      <w:r>
+        <w:rPr>
+          <w:lang w:val="ru-RU"/>
+        </w:rPr>
+        <w:t xml:space="preserve">а </w:t>
+      </w:r>
+      <w:r>
+        <w:t>Accuracy</w:t>
+      </w:r>
+      <w:r>
+        <w:rPr>
+          <w:lang w:val="ru-RU"/>
+        </w:rPr>
+        <w:t xml:space="preserve"> дает привычную долю правильных классификаций при пороге 0.5.</w:t>
+      </w:r>
+    </w:p>
+    <w:p>
+      <w:pPr>
         <w:rPr>
           <w:lang w:val="ru-RU"/>
         </w:rPr>
@@ -4989,7 +5272,13 @@
         <w:rPr>
           <w:lang w:val="ru-RU"/>
         </w:rPr>
-        <w:t>-периоде приведены ниже.</w:t>
+        <w:t>-периоде приведены ниже</w:t>
+      </w:r>
+      <w:r>
+        <w:rPr>
+          <w:lang w:val="ru-RU"/>
+        </w:rPr>
+        <w:t>:</w:t>
       </w:r>
     </w:p>
     <w:tbl>
@@ -5342,12 +5631,219 @@
       </w:tr>
     </w:tbl>
     <w:p>
-      <w:r>
-        <w:t>Baseline rating + ELO — это контрольная модель для сравнения с основной моделью, а не отдельная production-архитектура. Она считается как Logistic Regression на ограниченном наборе рейтингово-ELO признаков: разнице ELO, ELO-вероятности победы, разнице официального ранга и рейтинговых очков перед матчем, а также индикаторах отсутствующих рейтинговых данных. Пропуски заполняются медианой, признаки стандартизируются, после чего логистическая регрессия выдает вероятность победы. Такой baseline показывает, насколько полная модель добавляет качество сверх простого рейтингового подхода.</w:t>
+      <w:pPr>
+        <w:jc w:val="both"/>
+        <w:rPr>
+          <w:i/>
+          <w:iCs/>
+          <w:sz w:val="22"/>
+          <w:lang w:val="ru-RU"/>
+        </w:rPr>
+      </w:pPr>
+      <w:r>
+        <w:rPr>
+          <w:i/>
+          <w:iCs/>
+          <w:sz w:val="22"/>
+        </w:rPr>
+        <w:t>Baseline</w:t>
+      </w:r>
+      <w:r>
+        <w:rPr>
+          <w:i/>
+          <w:iCs/>
+          <w:sz w:val="22"/>
+          <w:lang w:val="ru-RU"/>
+        </w:rPr>
+        <w:t xml:space="preserve"> </w:t>
+      </w:r>
+      <w:r>
+        <w:rPr>
+          <w:i/>
+          <w:iCs/>
+          <w:sz w:val="22"/>
+        </w:rPr>
+        <w:t>rating</w:t>
+      </w:r>
+      <w:r>
+        <w:rPr>
+          <w:i/>
+          <w:iCs/>
+          <w:sz w:val="22"/>
+          <w:lang w:val="ru-RU"/>
+        </w:rPr>
+        <w:t xml:space="preserve"> + </w:t>
+      </w:r>
+      <w:r>
+        <w:rPr>
+          <w:i/>
+          <w:iCs/>
+          <w:sz w:val="22"/>
+        </w:rPr>
+        <w:t>ELO</w:t>
+      </w:r>
+      <w:r>
+        <w:rPr>
+          <w:i/>
+          <w:iCs/>
+          <w:sz w:val="22"/>
+          <w:lang w:val="ru-RU"/>
+        </w:rPr>
+        <w:t xml:space="preserve"> — это контрольная модель для сравнения с основной моделью, а не отдельная </w:t>
+      </w:r>
+      <w:r>
+        <w:rPr>
+          <w:i/>
+          <w:iCs/>
+          <w:sz w:val="22"/>
+        </w:rPr>
+        <w:t>production</w:t>
+      </w:r>
+      <w:r>
+        <w:rPr>
+          <w:i/>
+          <w:iCs/>
+          <w:sz w:val="22"/>
+          <w:lang w:val="ru-RU"/>
+        </w:rPr>
+        <w:t xml:space="preserve">-архитектура. Она считается как </w:t>
+      </w:r>
+      <w:r>
+        <w:rPr>
+          <w:i/>
+          <w:iCs/>
+          <w:sz w:val="22"/>
+        </w:rPr>
+        <w:t>Logistic</w:t>
+      </w:r>
+      <w:r>
+        <w:rPr>
+          <w:i/>
+          <w:iCs/>
+          <w:sz w:val="22"/>
+          <w:lang w:val="ru-RU"/>
+        </w:rPr>
+        <w:t xml:space="preserve"> </w:t>
+      </w:r>
+      <w:r>
+        <w:rPr>
+          <w:i/>
+          <w:iCs/>
+          <w:sz w:val="22"/>
+        </w:rPr>
+        <w:t>Regression</w:t>
+      </w:r>
+      <w:r>
+        <w:rPr>
+          <w:i/>
+          <w:iCs/>
+          <w:sz w:val="22"/>
+          <w:lang w:val="ru-RU"/>
+        </w:rPr>
+        <w:t xml:space="preserve"> на ограниченном наборе </w:t>
+      </w:r>
+      <w:proofErr w:type="spellStart"/>
+      <w:r>
+        <w:rPr>
+          <w:i/>
+          <w:iCs/>
+          <w:sz w:val="22"/>
+          <w:lang w:val="ru-RU"/>
+        </w:rPr>
+        <w:t>рейтингово</w:t>
+      </w:r>
+      <w:proofErr w:type="spellEnd"/>
+      <w:r>
+        <w:rPr>
+          <w:i/>
+          <w:iCs/>
+          <w:sz w:val="22"/>
+          <w:lang w:val="ru-RU"/>
+        </w:rPr>
+        <w:t>-</w:t>
+      </w:r>
+      <w:r>
+        <w:rPr>
+          <w:i/>
+          <w:iCs/>
+          <w:sz w:val="22"/>
+        </w:rPr>
+        <w:t>ELO</w:t>
+      </w:r>
+      <w:r>
+        <w:rPr>
+          <w:i/>
+          <w:iCs/>
+          <w:sz w:val="22"/>
+          <w:lang w:val="ru-RU"/>
+        </w:rPr>
+        <w:t xml:space="preserve"> признаков: разнице </w:t>
+      </w:r>
+      <w:r>
+        <w:rPr>
+          <w:i/>
+          <w:iCs/>
+          <w:sz w:val="22"/>
+        </w:rPr>
+        <w:t>ELO</w:t>
+      </w:r>
+      <w:r>
+        <w:rPr>
+          <w:i/>
+          <w:iCs/>
+          <w:sz w:val="22"/>
+          <w:lang w:val="ru-RU"/>
+        </w:rPr>
+        <w:t xml:space="preserve">, </w:t>
+      </w:r>
+      <w:r>
+        <w:rPr>
+          <w:i/>
+          <w:iCs/>
+          <w:sz w:val="22"/>
+        </w:rPr>
+        <w:t>ELO</w:t>
+      </w:r>
+      <w:r>
+        <w:rPr>
+          <w:i/>
+          <w:iCs/>
+          <w:sz w:val="22"/>
+          <w:lang w:val="ru-RU"/>
+        </w:rPr>
+        <w:t xml:space="preserve">-вероятности победы, разнице официального ранга и рейтинговых очков перед матчем, а также индикаторах отсутствующих рейтинговых данных. Пропуски </w:t>
+      </w:r>
+      <w:r>
+        <w:rPr>
+          <w:i/>
+          <w:iCs/>
+          <w:sz w:val="22"/>
+          <w:lang w:val="ru-RU"/>
+        </w:rPr>
+        <w:lastRenderedPageBreak/>
+        <w:t xml:space="preserve">заполняются медианой, признаки стандартизируются, после чего логистическая регрессия выдает вероятность победы. Такой </w:t>
+      </w:r>
+      <w:r>
+        <w:rPr>
+          <w:i/>
+          <w:iCs/>
+          <w:sz w:val="22"/>
+        </w:rPr>
+        <w:t>baseline</w:t>
+      </w:r>
+      <w:r>
+        <w:rPr>
+          <w:i/>
+          <w:iCs/>
+          <w:sz w:val="22"/>
+          <w:lang w:val="ru-RU"/>
+        </w:rPr>
+        <w:t xml:space="preserve"> показывает, насколько полная модель добавляет качество сверх простого рейтингового подхода.</w:t>
       </w:r>
     </w:p>
     <w:p>
       <w:pPr>
+        <w:jc w:val="both"/>
         <w:rPr>
           <w:lang w:val="ru-RU"/>
         </w:rPr>
@@ -5388,15 +5884,15 @@
     </w:p>
     <w:p>
       <w:pPr>
-        <w:rPr>
-          <w:lang w:val="ru-RU"/>
-        </w:rPr>
-      </w:pPr>
-      <w:r>
-        <w:rPr>
-          <w:lang w:val="ru-RU"/>
-        </w:rPr>
-        <w:lastRenderedPageBreak/>
+        <w:jc w:val="both"/>
+        <w:rPr>
+          <w:lang w:val="ru-RU"/>
+        </w:rPr>
+      </w:pPr>
+      <w:r>
+        <w:rPr>
+          <w:lang w:val="ru-RU"/>
+        </w:rPr>
         <w:t xml:space="preserve">Лучшей основной моделью по </w:t>
       </w:r>
       <w:proofErr w:type="spellStart"/>
@@ -5512,6 +6008,7 @@
     </w:p>
     <w:p>
       <w:pPr>
+        <w:jc w:val="both"/>
         <w:rPr>
           <w:lang w:val="ru-RU"/>
         </w:rPr>
@@ -5613,6 +6110,7 @@
     </w:p>
     <w:p>
       <w:pPr>
+        <w:jc w:val="both"/>
         <w:rPr>
           <w:lang w:val="ru-RU"/>
         </w:rPr>
@@ -5721,6 +6219,7 @@
     </w:p>
     <w:p>
       <w:pPr>
+        <w:jc w:val="both"/>
         <w:rPr>
           <w:lang w:val="ru-RU"/>
         </w:rPr>
@@ -5744,21 +6243,27 @@
     <w:p>
       <w:pPr>
         <w:pStyle w:val="1"/>
-        <w:rPr>
-          <w:lang w:val="ru-RU"/>
-        </w:rPr>
-      </w:pPr>
-      <w:bookmarkStart w:id="6" w:name="_Toc229564924"/>
-      <w:r>
-        <w:rPr>
-          <w:lang w:val="ru-RU"/>
-        </w:rPr>
-        <w:t>7. Интерпретация факторов прогноза</w:t>
+        <w:numPr>
+          <w:ilvl w:val="0"/>
+          <w:numId w:val="11"/>
+        </w:numPr>
+        <w:spacing w:after="240"/>
+        <w:rPr>
+          <w:lang w:val="ru-RU"/>
+        </w:rPr>
+      </w:pPr>
+      <w:bookmarkStart w:id="6" w:name="_Toc229570922"/>
+      <w:r>
+        <w:rPr>
+          <w:lang w:val="ru-RU"/>
+        </w:rPr>
+        <w:t>Интерпретация факторов прогноза</w:t>
       </w:r>
       <w:bookmarkEnd w:id="6"/>
     </w:p>
     <w:p>
       <w:pPr>
+        <w:jc w:val="both"/>
         <w:rPr>
           <w:lang w:val="ru-RU"/>
         </w:rPr>
@@ -5772,6 +6277,7 @@
     </w:p>
     <w:p>
       <w:pPr>
+        <w:jc w:val="both"/>
         <w:rPr>
           <w:lang w:val="ru-RU"/>
         </w:rPr>
@@ -5793,36 +6299,420 @@
       </w:r>
     </w:p>
     <w:p>
-      <w:pPr>
-        <w:rPr>
-          <w:lang w:val="ru-RU"/>
-        </w:rPr>
-      </w:pPr>
-      <w:r>
-        <w:rPr>
-          <w:lang w:val="ru-RU"/>
-        </w:rPr>
-        <w:t>Локальная интерпретация в панели прогноза показывает, какие признаки работали в пользу первого игрока, а какие — в пользу соперника. Такой формат не является строгим причинным объяснением, но помогает пользователю проверить, почему модель оценила конкретный матч именно так.</w:t>
+      <w:r>
+        <w:t>Таблица. Топ признаков по важности для основных моделей.</w:t>
       </w:r>
     </w:p>
     <w:p>
+      <w:r>
+        <w:t>В таблице ниже показан порядок наиболее значимых признаков внутри каждой основной модели. Значения важности сопоставимы только внутри одного столбца: для CatBoost используется mean abs SHAP, для Gradient Boosting и Random Forest — встроенная tree feature importance.</w:t>
+      </w:r>
+    </w:p>
+    <w:tbl>
+      <w:tblPr>
+        <w:tblStyle w:val="aff0"/>
+        <w:tblW w:type="auto" w:w="0"/>
+        <w:tblLook w:firstColumn="1" w:firstRow="1" w:lastColumn="0" w:lastRow="0" w:noHBand="0" w:noVBand="1" w:val="04A0"/>
+      </w:tblPr>
+      <w:tblGrid>
+        <w:gridCol w:w="2412"/>
+        <w:gridCol w:w="2412"/>
+        <w:gridCol w:w="2412"/>
+        <w:gridCol w:w="2412"/>
+      </w:tblGrid>
+      <w:tr>
+        <w:tc>
+          <w:tcPr>
+            <w:tcW w:type="dxa" w:w="2412"/>
+          </w:tcPr>
+          <w:p>
+            <w:r>
+              <w:rPr>
+                <w:b/>
+              </w:rPr>
+              <w:t>Ранг</w:t>
+            </w:r>
+          </w:p>
+        </w:tc>
+        <w:tc>
+          <w:tcPr>
+            <w:tcW w:type="dxa" w:w="2412"/>
+          </w:tcPr>
+          <w:p>
+            <w:r>
+              <w:rPr>
+                <w:b/>
+              </w:rPr>
+              <w:t>Gradient Boosting</w:t>
+            </w:r>
+          </w:p>
+        </w:tc>
+        <w:tc>
+          <w:tcPr>
+            <w:tcW w:type="dxa" w:w="2412"/>
+          </w:tcPr>
+          <w:p>
+            <w:r>
+              <w:rPr>
+                <w:b/>
+              </w:rPr>
+              <w:t>CatBoost</w:t>
+            </w:r>
+          </w:p>
+        </w:tc>
+        <w:tc>
+          <w:tcPr>
+            <w:tcW w:type="dxa" w:w="2412"/>
+          </w:tcPr>
+          <w:p>
+            <w:r>
+              <w:rPr>
+                <w:b/>
+              </w:rPr>
+              <w:t>Random Forest</w:t>
+            </w:r>
+          </w:p>
+        </w:tc>
+      </w:tr>
+      <w:tr>
+        <w:tc>
+          <w:tcPr>
+            <w:tcW w:type="dxa" w:w="2412"/>
+          </w:tcPr>
+          <w:p>
+            <w:r>
+              <w:t>1</w:t>
+            </w:r>
+          </w:p>
+        </w:tc>
+        <w:tc>
+          <w:tcPr>
+            <w:tcW w:type="dxa" w:w="2412"/>
+          </w:tcPr>
+          <w:p>
+            <w:r>
+              <w:t>Относит. разница очков на зач. турнир (0,541)</w:t>
+            </w:r>
+          </w:p>
+        </w:tc>
+        <w:tc>
+          <w:tcPr>
+            <w:tcW w:type="dxa" w:w="2412"/>
+          </w:tcPr>
+          <w:p>
+            <w:r>
+              <w:t>Относит. разница очков на зач. турнир (0,533)</w:t>
+            </w:r>
+          </w:p>
+        </w:tc>
+        <w:tc>
+          <w:tcPr>
+            <w:tcW w:type="dxa" w:w="2412"/>
+          </w:tcPr>
+          <w:p>
+            <w:r>
+              <w:t>Относит. разница очков на зач. турнир (0,128)</w:t>
+            </w:r>
+          </w:p>
+        </w:tc>
+      </w:tr>
+      <w:tr>
+        <w:tc>
+          <w:tcPr>
+            <w:tcW w:type="dxa" w:w="2412"/>
+          </w:tcPr>
+          <w:p>
+            <w:r>
+              <w:t>2</w:t>
+            </w:r>
+          </w:p>
+        </w:tc>
+        <w:tc>
+          <w:tcPr>
+            <w:tcW w:type="dxa" w:w="2412"/>
+          </w:tcPr>
+          <w:p>
+            <w:r>
+              <w:t>ELO-вероятность победы (0,092)</w:t>
+            </w:r>
+          </w:p>
+        </w:tc>
+        <w:tc>
+          <w:tcPr>
+            <w:tcW w:type="dxa" w:w="2412"/>
+          </w:tcPr>
+          <w:p>
+            <w:r>
+              <w:t>Разница ELO (0,470)</w:t>
+            </w:r>
+          </w:p>
+        </w:tc>
+        <w:tc>
+          <w:tcPr>
+            <w:tcW w:type="dxa" w:w="2412"/>
+          </w:tcPr>
+          <w:p>
+            <w:r>
+              <w:t>Разница очков на зач. турнир (0,110)</w:t>
+            </w:r>
+          </w:p>
+        </w:tc>
+      </w:tr>
+      <w:tr>
+        <w:tc>
+          <w:tcPr>
+            <w:tcW w:type="dxa" w:w="2412"/>
+          </w:tcPr>
+          <w:p>
+            <w:r>
+              <w:t>3</w:t>
+            </w:r>
+          </w:p>
+        </w:tc>
+        <w:tc>
+          <w:tcPr>
+            <w:tcW w:type="dxa" w:w="2412"/>
+          </w:tcPr>
+          <w:p>
+            <w:r>
+              <w:t>Относит. разница рейтинговых очков (0,090)</w:t>
+            </w:r>
+          </w:p>
+        </w:tc>
+        <w:tc>
+          <w:tcPr>
+            <w:tcW w:type="dxa" w:w="2412"/>
+          </w:tcPr>
+          <w:p>
+            <w:r>
+              <w:t>ELO-вероятность победы (0,420)</w:t>
+            </w:r>
+          </w:p>
+        </w:tc>
+        <w:tc>
+          <w:tcPr>
+            <w:tcW w:type="dxa" w:w="2412"/>
+          </w:tcPr>
+          <w:p>
+            <w:r>
+              <w:t>Относит. разница рейтинговых очков (0,094)</w:t>
+            </w:r>
+          </w:p>
+        </w:tc>
+      </w:tr>
+      <w:tr>
+        <w:tc>
+          <w:tcPr>
+            <w:tcW w:type="dxa" w:w="2412"/>
+          </w:tcPr>
+          <w:p>
+            <w:r>
+              <w:t>4</w:t>
+            </w:r>
+          </w:p>
+        </w:tc>
+        <w:tc>
+          <w:tcPr>
+            <w:tcW w:type="dxa" w:w="2412"/>
+          </w:tcPr>
+          <w:p>
+            <w:r>
+              <w:t>Разница ELO (0,083)</w:t>
+            </w:r>
+          </w:p>
+        </w:tc>
+        <w:tc>
+          <w:tcPr>
+            <w:tcW w:type="dxa" w:w="2412"/>
+          </w:tcPr>
+          <w:p>
+            <w:r>
+              <w:t>Разница ранга РТТ (0,289)</w:t>
+            </w:r>
+          </w:p>
+        </w:tc>
+        <w:tc>
+          <w:tcPr>
+            <w:tcW w:type="dxa" w:w="2412"/>
+          </w:tcPr>
+          <w:p>
+            <w:r>
+              <w:t>Разница рейтинговых очков (0,084)</w:t>
+            </w:r>
+          </w:p>
+        </w:tc>
+      </w:tr>
+      <w:tr>
+        <w:tc>
+          <w:tcPr>
+            <w:tcW w:type="dxa" w:w="2412"/>
+          </w:tcPr>
+          <w:p>
+            <w:r>
+              <w:t>5</w:t>
+            </w:r>
+          </w:p>
+        </w:tc>
+        <w:tc>
+          <w:tcPr>
+            <w:tcW w:type="dxa" w:w="2412"/>
+          </w:tcPr>
+          <w:p>
+            <w:r>
+              <w:t>Разница очков на зач. турнир (0,024)</w:t>
+            </w:r>
+          </w:p>
+        </w:tc>
+        <w:tc>
+          <w:tcPr>
+            <w:tcW w:type="dxa" w:w="2412"/>
+          </w:tcPr>
+          <w:p>
+            <w:r>
+              <w:t>Разница очков на зач. турнир (0,205)</w:t>
+            </w:r>
+          </w:p>
+        </w:tc>
+        <w:tc>
+          <w:tcPr>
+            <w:tcW w:type="dxa" w:w="2412"/>
+          </w:tcPr>
+          <w:p>
+            <w:r>
+              <w:t>Разница ранга РТТ (0,078)</w:t>
+            </w:r>
+          </w:p>
+        </w:tc>
+      </w:tr>
+      <w:tr>
+        <w:tc>
+          <w:tcPr>
+            <w:tcW w:type="dxa" w:w="2412"/>
+          </w:tcPr>
+          <w:p>
+            <w:r>
+              <w:t>6</w:t>
+            </w:r>
+          </w:p>
+        </w:tc>
+        <w:tc>
+          <w:tcPr>
+            <w:tcW w:type="dxa" w:w="2412"/>
+          </w:tcPr>
+          <w:p>
+            <w:r>
+              <w:t>Разница ранга РТТ (0,015)</w:t>
+            </w:r>
+          </w:p>
+        </w:tc>
+        <w:tc>
+          <w:tcPr>
+            <w:tcW w:type="dxa" w:w="2412"/>
+          </w:tcPr>
+          <w:p>
+            <w:r>
+              <w:t>Относит. разница рейтинговых очков (0,121)</w:t>
+            </w:r>
+          </w:p>
+        </w:tc>
+        <w:tc>
+          <w:tcPr>
+            <w:tcW w:type="dxa" w:w="2412"/>
+          </w:tcPr>
+          <w:p>
+            <w:r>
+              <w:t>ELO-вероятность победы (0,077)</w:t>
+            </w:r>
+          </w:p>
+        </w:tc>
+      </w:tr>
+      <w:tr>
+        <w:tc>
+          <w:tcPr>
+            <w:tcW w:type="dxa" w:w="2412"/>
+          </w:tcPr>
+          <w:p>
+            <w:r>
+              <w:t>7</w:t>
+            </w:r>
+          </w:p>
+        </w:tc>
+        <w:tc>
+          <w:tcPr>
+            <w:tcW w:type="dxa" w:w="2412"/>
+          </w:tcPr>
+          <w:p>
+            <w:r>
+              <w:t>Средний ELO последних 5 соперников (0,015)</w:t>
+            </w:r>
+          </w:p>
+        </w:tc>
+        <w:tc>
+          <w:tcPr>
+            <w:tcW w:type="dxa" w:w="2412"/>
+          </w:tcPr>
+          <w:p>
+            <w:r>
+              <w:t>Средний ELO последних 5 соперников (0,098)</w:t>
+            </w:r>
+          </w:p>
+        </w:tc>
+        <w:tc>
+          <w:tcPr>
+            <w:tcW w:type="dxa" w:w="2412"/>
+          </w:tcPr>
+          <w:p>
+            <w:r>
+              <w:t>Разница ELO (0,076)</w:t>
+            </w:r>
+          </w:p>
+        </w:tc>
+      </w:tr>
+    </w:tbl>
+    <w:p>
+      <w:r>
+        <w:t>Ранжирование подтверждает, что основные модели опираются прежде всего на скорректированные рейтинговые показатели и ELO. Это согласуется с предметной логикой задачи: важна не только позиция в официальном рейтинге, но и динамическая сила игрока, качество набора очков и уровень предыдущих соперников.</w:t>
+      </w:r>
+    </w:p>
+    <w:p>
+      <w:pPr>
+        <w:jc w:val="both"/>
+        <w:rPr>
+          <w:lang w:val="ru-RU"/>
+        </w:rPr>
+      </w:pPr>
+      <w:r>
+        <w:rPr>
+          <w:lang w:val="ru-RU"/>
+        </w:rPr>
+        <w:t>Локальная интерпретация в панели прогноза показывает, какие признаки работали в пользу первого игрока, а какие — в пользу соперника. Такой формат не является строгим причинным объяснением, но помогает пользователю проверить, почему модель оценила конкретный матч именно так.</w:t>
+      </w:r>
+    </w:p>
+    <w:p>
       <w:pPr>
         <w:pStyle w:val="1"/>
-        <w:rPr>
-          <w:lang w:val="ru-RU"/>
-        </w:rPr>
-      </w:pPr>
-      <w:bookmarkStart w:id="7" w:name="_Toc229564925"/>
-      <w:r>
-        <w:rPr>
-          <w:lang w:val="ru-RU"/>
-        </w:rPr>
-        <w:t>8. Практическое применение</w:t>
+        <w:numPr>
+          <w:ilvl w:val="0"/>
+          <w:numId w:val="11"/>
+        </w:numPr>
+        <w:spacing w:after="240"/>
+        <w:rPr>
+          <w:lang w:val="ru-RU"/>
+        </w:rPr>
+      </w:pPr>
+      <w:bookmarkStart w:id="7" w:name="_Toc229570923"/>
+      <w:r>
+        <w:rPr>
+          <w:lang w:val="ru-RU"/>
+        </w:rPr>
+        <w:lastRenderedPageBreak/>
+        <w:t>Практическое применение</w:t>
       </w:r>
       <w:bookmarkEnd w:id="7"/>
     </w:p>
     <w:p>
       <w:pPr>
+        <w:jc w:val="both"/>
         <w:rPr>
           <w:lang w:val="ru-RU"/>
         </w:rPr>
@@ -5868,7 +6758,6 @@
         <w:rPr>
           <w:lang w:val="ru-RU"/>
         </w:rPr>
-        <w:lastRenderedPageBreak/>
         <w:t>Планирование календаря: предварительная оценка сложности турнира, потенциальных соперников и уровня сетки.</w:t>
       </w:r>
     </w:p>
@@ -5911,6 +6800,7 @@
     </w:p>
     <w:p>
       <w:pPr>
+        <w:jc w:val="both"/>
         <w:rPr>
           <w:lang w:val="ru-RU"/>
         </w:rPr>
@@ -5925,12 +6815,28 @@
     <w:p>
       <w:pPr>
         <w:pStyle w:val="1"/>
-      </w:pPr>
-      <w:bookmarkStart w:id="8" w:name="_Toc229564926"/>
-      <w:r>
-        <w:t>9. Ограничения проекта</w:t>
+        <w:numPr>
+          <w:ilvl w:val="0"/>
+          <w:numId w:val="11"/>
+        </w:numPr>
+        <w:spacing w:after="240"/>
+        <w:ind w:left="714" w:hanging="357"/>
+      </w:pPr>
+      <w:bookmarkStart w:id="8" w:name="_Toc229570924"/>
+      <w:proofErr w:type="spellStart"/>
+      <w:r>
+        <w:t>Ограничения</w:t>
+      </w:r>
+      <w:proofErr w:type="spellEnd"/>
+      <w:r>
+        <w:t xml:space="preserve"> </w:t>
+      </w:r>
+      <w:proofErr w:type="spellStart"/>
+      <w:r>
+        <w:t>проекта</w:t>
       </w:r>
       <w:bookmarkEnd w:id="8"/>
+      <w:proofErr w:type="spellEnd"/>
     </w:p>
     <w:p>
       <w:pPr>
@@ -5985,56 +6891,114 @@
     </w:p>
     <w:p>
       <w:pPr>
-        <w:pStyle w:val="a0"/>
-        <w:rPr>
-          <w:lang w:val="ru-RU"/>
-        </w:rPr>
-      </w:pPr>
-      <w:r>
-        <w:rPr>
-          <w:lang w:val="ru-RU"/>
-        </w:rPr>
-        <w:t>Сопоставление игроков по имени может быть неоднозначным, поэтому для снижения риска используется РНИ и проверки качества сопоставления.</w:t>
-      </w:r>
+        <w:pStyle w:val="1"/>
+        <w:numPr>
+          <w:ilvl w:val="0"/>
+          <w:numId w:val="11"/>
+        </w:numPr>
+        <w:spacing w:after="240"/>
+        <w:ind w:left="714" w:hanging="357"/>
+      </w:pPr>
+      <w:bookmarkStart w:id="9" w:name="_Toc229570925"/>
+      <w:proofErr w:type="spellStart"/>
+      <w:r>
+        <w:t>Заключение</w:t>
+      </w:r>
+      <w:proofErr w:type="spellEnd"/>
+      <w:r>
+        <w:t xml:space="preserve"> и </w:t>
+      </w:r>
+      <w:proofErr w:type="spellStart"/>
+      <w:r>
+        <w:t>направления</w:t>
+      </w:r>
+      <w:proofErr w:type="spellEnd"/>
+      <w:r>
+        <w:t xml:space="preserve"> </w:t>
+      </w:r>
+      <w:proofErr w:type="spellStart"/>
+      <w:r>
+        <w:t>развития</w:t>
+      </w:r>
+      <w:bookmarkEnd w:id="9"/>
+      <w:proofErr w:type="spellEnd"/>
     </w:p>
     <w:p>
       <w:pPr>
-        <w:pStyle w:val="a0"/>
-        <w:rPr>
-          <w:lang w:val="ru-RU"/>
-        </w:rPr>
-      </w:pPr>
-      <w:r>
-        <w:rPr>
-          <w:lang w:val="ru-RU"/>
-        </w:rPr>
-        <w:t xml:space="preserve">Метрики получены на историческом </w:t>
-      </w:r>
-      <w:r>
-        <w:t>test</w:t>
-      </w:r>
-      <w:r>
-        <w:rPr>
-          <w:lang w:val="ru-RU"/>
-        </w:rPr>
-        <w:t>-периоде и не гарантируют идентичное качество на будущих данных.</w:t>
+        <w:jc w:val="both"/>
+        <w:rPr>
+          <w:lang w:val="ru-RU"/>
+        </w:rPr>
+      </w:pPr>
+      <w:r>
+        <w:rPr>
+          <w:lang w:val="ru-RU"/>
+        </w:rPr>
+        <w:t xml:space="preserve">В проекте реализован полный цикл </w:t>
+      </w:r>
+      <w:r>
+        <w:t>ML</w:t>
+      </w:r>
+      <w:r>
+        <w:rPr>
+          <w:lang w:val="ru-RU"/>
+        </w:rPr>
+        <w:t>-решения: автоматизированный сбор данных, подготовка датасета, построение исторических признаков без утечки будущей информации, обучение нескольких моделей, оценка качества и интерактивный прогноз конкретного матча.</w:t>
       </w:r>
     </w:p>
     <w:p>
       <w:pPr>
-        <w:pStyle w:val="a0"/>
-        <w:rPr>
-          <w:lang w:val="ru-RU"/>
-        </w:rPr>
-      </w:pPr>
-      <w:r>
-        <w:rPr>
-          <w:lang w:val="ru-RU"/>
-        </w:rPr>
-        <w:t xml:space="preserve">Для промышленного применения нужны регулярный мониторинг качества, </w:t>
-      </w:r>
-      <w:r>
-        <w:t>rolling</w:t>
+        <w:jc w:val="both"/>
+        <w:rPr>
+          <w:lang w:val="ru-RU"/>
+        </w:rPr>
+      </w:pPr>
+      <w:r>
+        <w:rPr>
+          <w:lang w:val="ru-RU"/>
+        </w:rPr>
+        <w:t xml:space="preserve">Полученные результаты подтверждают исходную гипотезу: для прогноза матчей РТТ полезно использовать не только официальный рейтинг, но и динамическую силу игрока, качество предыдущих соперников, опыт, отдых, историю побед и результаты против общих соперников. Итоговая </w:t>
+      </w:r>
+      <w:r>
+        <w:t>Gradient</w:t>
+      </w:r>
+      <w:r>
+        <w:rPr>
+          <w:lang w:val="ru-RU"/>
+        </w:rPr>
+        <w:t xml:space="preserve"> </w:t>
+      </w:r>
+      <w:r>
+        <w:t>Boosting</w:t>
+      </w:r>
+      <w:r>
+        <w:rPr>
+          <w:lang w:val="ru-RU"/>
+        </w:rPr>
+        <w:t xml:space="preserve"> модель превосходит простые </w:t>
+      </w:r>
+      <w:r>
+        <w:t>benchmark</w:t>
+      </w:r>
+      <w:r>
+        <w:rPr>
+          <w:lang w:val="ru-RU"/>
+        </w:rPr>
+        <w:t xml:space="preserve">-модели по </w:t>
+      </w:r>
+      <w:proofErr w:type="spellStart"/>
+      <w:r>
+        <w:t>LogLoss</w:t>
+      </w:r>
+      <w:proofErr w:type="spellEnd"/>
+      <w:r>
+        <w:rPr>
+          <w:lang w:val="ru-RU"/>
+        </w:rPr>
+        <w:t xml:space="preserve"> и </w:t>
+      </w:r>
+      <w:r>
+        <w:t>ROC</w:t>
       </w:r>
       <w:r>
         <w:rPr>
@@ -6043,105 +7007,117 @@
         <w:t>-</w:t>
       </w:r>
       <w:r>
-        <w:t>validation</w:t>
-      </w:r>
-      <w:r>
-        <w:rPr>
-          <w:lang w:val="ru-RU"/>
-        </w:rPr>
-        <w:t xml:space="preserve"> на нескольких временных окнах и контроль стабильности вероятностной калибровки.</w:t>
+        <w:t>AUC</w:t>
+      </w:r>
+      <w:r>
+        <w:rPr>
+          <w:lang w:val="ru-RU"/>
+        </w:rPr>
+        <w:t>.</w:t>
       </w:r>
     </w:p>
     <w:p>
       <w:pPr>
-        <w:pStyle w:val="1"/>
-        <w:rPr>
-          <w:lang w:val="ru-RU"/>
-        </w:rPr>
-      </w:pPr>
-      <w:bookmarkStart w:id="9" w:name="_Toc229564927"/>
-      <w:r>
-        <w:rPr>
-          <w:lang w:val="ru-RU"/>
-        </w:rPr>
-        <w:t>10. Заключение и направления развития</w:t>
-      </w:r>
-      <w:bookmarkEnd w:id="9"/>
+        <w:jc w:val="both"/>
+        <w:rPr>
+          <w:lang w:val="ru-RU"/>
+        </w:rPr>
+      </w:pPr>
+      <w:r>
+        <w:rPr>
+          <w:lang w:val="ru-RU"/>
+        </w:rPr>
+        <w:lastRenderedPageBreak/>
+        <w:t>Главная ценность проекта — не только числовой прогноз, но и аналитическая панель, которая показывает состояние данных, дает прогноз по выбранной паре игроков и помогает интерпретировать, какие факторы сильнее всего повлияли на вероятность победы.</w:t>
+      </w:r>
     </w:p>
     <w:p>
       <w:pPr>
         <w:rPr>
-          <w:lang w:val="ru-RU"/>
-        </w:rPr>
-      </w:pPr>
-      <w:r>
-        <w:rPr>
-          <w:lang w:val="ru-RU"/>
-        </w:rPr>
-        <w:t xml:space="preserve">В проекте реализован полный цикл </w:t>
-      </w:r>
-      <w:r>
-        <w:t>ML</w:t>
-      </w:r>
-      <w:r>
-        <w:rPr>
-          <w:lang w:val="ru-RU"/>
-        </w:rPr>
-        <w:t>-решения: автоматизированный сбор данных, подготовка датасета, построение исторических признаков без утечки будущей информации, обучение нескольких моделей, оценка качества и интерактивный прогноз конкретного матча.</w:t>
+          <w:b/>
+          <w:bCs/>
+        </w:rPr>
+      </w:pPr>
+      <w:proofErr w:type="spellStart"/>
+      <w:r>
+        <w:rPr>
+          <w:b/>
+          <w:bCs/>
+        </w:rPr>
+        <w:t>Возможные</w:t>
+      </w:r>
+      <w:proofErr w:type="spellEnd"/>
+      <w:r>
+        <w:rPr>
+          <w:b/>
+          <w:bCs/>
+        </w:rPr>
+        <w:t xml:space="preserve"> </w:t>
+      </w:r>
+      <w:proofErr w:type="spellStart"/>
+      <w:r>
+        <w:rPr>
+          <w:b/>
+          <w:bCs/>
+        </w:rPr>
+        <w:t>направления</w:t>
+      </w:r>
+      <w:proofErr w:type="spellEnd"/>
+      <w:r>
+        <w:rPr>
+          <w:b/>
+          <w:bCs/>
+        </w:rPr>
+        <w:t xml:space="preserve"> </w:t>
+      </w:r>
+      <w:proofErr w:type="spellStart"/>
+      <w:r>
+        <w:rPr>
+          <w:b/>
+          <w:bCs/>
+        </w:rPr>
+        <w:t>дальнейшего</w:t>
+      </w:r>
+      <w:proofErr w:type="spellEnd"/>
+      <w:r>
+        <w:rPr>
+          <w:b/>
+          <w:bCs/>
+        </w:rPr>
+        <w:t xml:space="preserve"> </w:t>
+      </w:r>
+      <w:proofErr w:type="spellStart"/>
+      <w:r>
+        <w:rPr>
+          <w:b/>
+          <w:bCs/>
+        </w:rPr>
+        <w:t>развития</w:t>
+      </w:r>
+      <w:proofErr w:type="spellEnd"/>
+      <w:r>
+        <w:rPr>
+          <w:b/>
+          <w:bCs/>
+        </w:rPr>
+        <w:t>:</w:t>
       </w:r>
     </w:p>
     <w:p>
       <w:pPr>
-        <w:rPr>
-          <w:lang w:val="ru-RU"/>
-        </w:rPr>
-      </w:pPr>
-      <w:r>
-        <w:rPr>
-          <w:lang w:val="ru-RU"/>
-        </w:rPr>
-        <w:t xml:space="preserve">Полученные результаты подтверждают исходную гипотезу: для прогноза матчей РТТ полезно использовать не только официальный рейтинг, но и динамическую силу игрока, качество предыдущих соперников, опыт, отдых, историю побед и результаты против общих соперников. Итоговая </w:t>
-      </w:r>
-      <w:r>
-        <w:t>Gradient</w:t>
-      </w:r>
-      <w:r>
-        <w:rPr>
-          <w:lang w:val="ru-RU"/>
-        </w:rPr>
-        <w:t xml:space="preserve"> </w:t>
-      </w:r>
-      <w:r>
-        <w:t>Boosting</w:t>
-      </w:r>
-      <w:r>
-        <w:rPr>
-          <w:lang w:val="ru-RU"/>
-        </w:rPr>
-        <w:t xml:space="preserve"> модель превосходит простые </w:t>
-      </w:r>
-      <w:r>
-        <w:t>benchmark</w:t>
-      </w:r>
-      <w:r>
-        <w:rPr>
-          <w:lang w:val="ru-RU"/>
-        </w:rPr>
-        <w:t xml:space="preserve">-модели по </w:t>
-      </w:r>
-      <w:proofErr w:type="spellStart"/>
-      <w:r>
-        <w:t>LogLoss</w:t>
-      </w:r>
-      <w:proofErr w:type="spellEnd"/>
-      <w:r>
-        <w:rPr>
-          <w:lang w:val="ru-RU"/>
-        </w:rPr>
-        <w:t xml:space="preserve"> и </w:t>
-      </w:r>
-      <w:r>
-        <w:t>ROC</w:t>
+        <w:pStyle w:val="a0"/>
+        <w:rPr>
+          <w:lang w:val="ru-RU"/>
+        </w:rPr>
+      </w:pPr>
+      <w:r>
+        <w:rPr>
+          <w:lang w:val="ru-RU"/>
+        </w:rPr>
+        <w:t xml:space="preserve">добавить регулярную </w:t>
+      </w:r>
+      <w:r>
+        <w:t>rolling</w:t>
       </w:r>
       <w:r>
         <w:rPr>
@@ -6150,94 +7126,60 @@
         <w:t>-</w:t>
       </w:r>
       <w:r>
-        <w:t>AUC</w:t>
-      </w:r>
-      <w:r>
-        <w:rPr>
-          <w:lang w:val="ru-RU"/>
-        </w:rPr>
-        <w:t>.</w:t>
+        <w:t>validation</w:t>
+      </w:r>
+      <w:r>
+        <w:rPr>
+          <w:lang w:val="ru-RU"/>
+        </w:rPr>
+        <w:t xml:space="preserve"> и мониторинг качества после каждого обновления данных;</w:t>
       </w:r>
     </w:p>
     <w:p>
       <w:pPr>
-        <w:rPr>
-          <w:lang w:val="ru-RU"/>
-        </w:rPr>
-      </w:pPr>
-      <w:r>
-        <w:rPr>
-          <w:lang w:val="ru-RU"/>
-        </w:rPr>
-        <w:t>Главная ценность проекта — не только числовой прогноз, но и аналитическая панель, которая показывает состояние данных, дает прогноз по выбранной паре игроков и помогает интерпретировать, какие факторы сильнее всего повлияли на вероятность победы.</w:t>
+        <w:pStyle w:val="a0"/>
+        <w:rPr>
+          <w:lang w:val="ru-RU"/>
+        </w:rPr>
+      </w:pPr>
+      <w:r>
+        <w:rPr>
+          <w:lang w:val="ru-RU"/>
+        </w:rPr>
+        <w:t>расширить признаки при появлении новых данных: покрытие, город, длительность турнира, сетка, травмы или снятия;</w:t>
       </w:r>
     </w:p>
     <w:p>
-      <w:proofErr w:type="spellStart"/>
-      <w:r>
-        <w:lastRenderedPageBreak/>
-        <w:t>Возможные</w:t>
-      </w:r>
-      <w:proofErr w:type="spellEnd"/>
-      <w:r>
-        <w:t xml:space="preserve"> </w:t>
-      </w:r>
-      <w:proofErr w:type="spellStart"/>
-      <w:r>
-        <w:t>направления</w:t>
-      </w:r>
-      <w:proofErr w:type="spellEnd"/>
-      <w:r>
-        <w:t xml:space="preserve"> </w:t>
-      </w:r>
-      <w:proofErr w:type="spellStart"/>
-      <w:r>
-        <w:t>дальнейшего</w:t>
-      </w:r>
-      <w:proofErr w:type="spellEnd"/>
-      <w:r>
-        <w:t xml:space="preserve"> </w:t>
-      </w:r>
-      <w:proofErr w:type="spellStart"/>
-      <w:r>
-        <w:t>развития</w:t>
-      </w:r>
-      <w:proofErr w:type="spellEnd"/>
-      <w:r>
-        <w:t>:</w:t>
+      <w:pPr>
+        <w:pStyle w:val="a0"/>
+        <w:rPr>
+          <w:lang w:val="ru-RU"/>
+        </w:rPr>
+      </w:pPr>
+      <w:r>
+        <w:rPr>
+          <w:lang w:val="ru-RU"/>
+        </w:rPr>
+        <w:t>развить пользовательский интерфейс панели и добавить экспорт отчетов по матчу или игроку.</w:t>
       </w:r>
     </w:p>
     <w:p>
       <w:pPr>
-        <w:pStyle w:val="a0"/>
-        <w:rPr>
-          <w:lang w:val="ru-RU"/>
-        </w:rPr>
-      </w:pPr>
-      <w:r>
-        <w:rPr>
-          <w:lang w:val="ru-RU"/>
-        </w:rPr>
-        <w:t xml:space="preserve">добавить регулярную </w:t>
-      </w:r>
-      <w:r>
-        <w:t>rolling</w:t>
-      </w:r>
-      <w:r>
-        <w:rPr>
-          <w:lang w:val="ru-RU"/>
-        </w:rPr>
-        <w:t>-</w:t>
-      </w:r>
-      <w:r>
-        <w:t>validation</w:t>
-      </w:r>
-      <w:r>
-        <w:rPr>
-          <w:lang w:val="ru-RU"/>
-        </w:rPr>
-        <w:t xml:space="preserve"> и мониторинг качества после каждого обновления данных;</w:t>
-      </w:r>
+        <w:pStyle w:val="1"/>
+        <w:numPr>
+          <w:ilvl w:val="0"/>
+          <w:numId w:val="11"/>
+        </w:numPr>
+        <w:spacing w:after="240"/>
+        <w:ind w:left="714" w:hanging="357"/>
+      </w:pPr>
+      <w:bookmarkStart w:id="10" w:name="_Toc229570926"/>
+      <w:proofErr w:type="spellStart"/>
+      <w:r>
+        <w:t>Источники</w:t>
+      </w:r>
+      <w:bookmarkEnd w:id="10"/>
+      <w:proofErr w:type="spellEnd"/>
     </w:p>
     <w:p>
       <w:pPr>
@@ -6250,171 +7192,36 @@
         <w:rPr>
           <w:lang w:val="ru-RU"/>
         </w:rPr>
-        <w:t>улучшить калибровку вероятностей и отдельно контролировать качество на разных возрастных группах;</w:t>
+        <w:t>Публичные страницы Российского теннисного тура: календарь турниров, страницы матчей и рейтинги игроков.</w:t>
       </w:r>
     </w:p>
     <w:p>
       <w:pPr>
         <w:pStyle w:val="a0"/>
-        <w:rPr>
-          <w:lang w:val="ru-RU"/>
-        </w:rPr>
-      </w:pPr>
-      <w:r>
-        <w:rPr>
-          <w:lang w:val="ru-RU"/>
-        </w:rPr>
-        <w:t>расширить признаки при появлении новых данных: покрытие, город, длительность турнира, сетка, травмы или снятия;</w:t>
-      </w:r>
-    </w:p>
-    <w:p>
-      <w:pPr>
-        <w:pStyle w:val="a0"/>
-        <w:rPr>
-          <w:lang w:val="ru-RU"/>
-        </w:rPr>
-      </w:pPr>
-      <w:r>
-        <w:rPr>
-          <w:lang w:val="ru-RU"/>
-        </w:rPr>
-        <w:t>развить пользовательский интерфейс панели и добавить экспорт отчетов по матчу или игроку.</w:t>
-      </w:r>
-    </w:p>
-    <w:p>
-      <w:pPr>
-        <w:pStyle w:val="1"/>
-      </w:pPr>
-      <w:bookmarkStart w:id="10" w:name="_Toc229564928"/>
-      <w:r>
-        <w:t>11. Источники</w:t>
-      </w:r>
-      <w:bookmarkEnd w:id="10"/>
-    </w:p>
-    <w:p>
-      <w:pPr>
-        <w:pStyle w:val="a0"/>
-        <w:rPr>
-          <w:lang w:val="ru-RU"/>
-        </w:rPr>
-      </w:pPr>
-      <w:r>
-        <w:rPr>
-          <w:lang w:val="ru-RU"/>
-        </w:rPr>
-        <w:t>Публичные страницы Российского теннисного тура: календарь турниров, страницы матчей и рейтинги игроков.</w:t>
-      </w:r>
-    </w:p>
-    <w:p>
-      <w:pPr>
-        <w:pStyle w:val="a0"/>
-        <w:rPr>
-          <w:lang w:val="ru-RU"/>
-        </w:rPr>
-      </w:pPr>
-      <w:r>
-        <w:rPr>
-          <w:lang w:val="ru-RU"/>
-        </w:rPr>
-        <w:t xml:space="preserve">Репозиторий проекта на </w:t>
-      </w:r>
-      <w:r>
-        <w:t>GitHub</w:t>
-      </w:r>
-      <w:r>
-        <w:rPr>
-          <w:lang w:val="ru-RU"/>
-        </w:rPr>
-        <w:t xml:space="preserve">: </w:t>
-      </w:r>
-      <w:r>
-        <w:t>https</w:t>
-      </w:r>
-      <w:r>
-        <w:rPr>
-          <w:lang w:val="ru-RU"/>
-        </w:rPr>
-        <w:t>://</w:t>
-      </w:r>
+      </w:pPr>
       <w:proofErr w:type="spellStart"/>
       <w:r>
-        <w:t>github</w:t>
+        <w:t>Документация</w:t>
       </w:r>
       <w:proofErr w:type="spellEnd"/>
       <w:r>
-        <w:rPr>
-          <w:lang w:val="ru-RU"/>
-        </w:rPr>
-        <w:t>.</w:t>
-      </w:r>
-      <w:r>
-        <w:t>com</w:t>
-      </w:r>
-      <w:r>
-        <w:rPr>
-          <w:lang w:val="ru-RU"/>
-        </w:rPr>
-        <w:t>/</w:t>
+        <w:t xml:space="preserve"> scikit-learn: </w:t>
       </w:r>
       <w:proofErr w:type="spellStart"/>
       <w:r>
-        <w:t>PnL</w:t>
+        <w:t>GradientBoostingClassifier</w:t>
       </w:r>
       <w:proofErr w:type="spellEnd"/>
       <w:r>
-        <w:rPr>
-          <w:lang w:val="ru-RU"/>
-        </w:rPr>
-        <w:t>-</w:t>
-      </w:r>
-      <w:r>
-        <w:t>One</w:t>
-      </w:r>
-      <w:r>
-        <w:rPr>
-          <w:lang w:val="ru-RU"/>
-        </w:rPr>
-        <w:t>/</w:t>
+        <w:t xml:space="preserve">, </w:t>
       </w:r>
       <w:proofErr w:type="spellStart"/>
       <w:r>
-        <w:t>rtt</w:t>
+        <w:t>RandomForestClassifier</w:t>
       </w:r>
       <w:proofErr w:type="spellEnd"/>
       <w:r>
-        <w:rPr>
-          <w:lang w:val="ru-RU"/>
-        </w:rPr>
-        <w:t>-</w:t>
-      </w:r>
-      <w:r>
-        <w:t>tennis</w:t>
-      </w:r>
-      <w:r>
-        <w:rPr>
-          <w:lang w:val="ru-RU"/>
-        </w:rPr>
-        <w:t>-</w:t>
-      </w:r>
-      <w:r>
-        <w:t>match</w:t>
-      </w:r>
-      <w:r>
-        <w:rPr>
-          <w:lang w:val="ru-RU"/>
-        </w:rPr>
-        <w:t>-</w:t>
-      </w:r>
-      <w:r>
-        <w:t>predictor</w:t>
-      </w:r>
-    </w:p>
-    <w:p>
-      <w:pPr>
-        <w:pStyle w:val="a0"/>
-      </w:pPr>
-      <w:r>
-        <w:t>Документация scikit-learn: GradientBoostingClassifier, RandomForestClassifier, LogisticRegression, Pipeline, SimpleImputer и метрики классификации.</w:t>
+        <w:t>, LogisticRegression, Pipeline, SimpleImputer и метрики классификации.</w:t>
       </w:r>
     </w:p>
     <w:p>
@@ -6614,6 +7421,181 @@
       <w:rPr>
         <w:rFonts w:ascii="Symbol" w:hAnsi="Symbol" w:hint="default"/>
       </w:rPr>
+    </w:lvl>
+  </w:abstractNum>
+  <w:abstractNum w:abstractNumId="9" w15:restartNumberingAfterBreak="0">
+    <w:nsid w:val="698015EE"/>
+    <w:multiLevelType w:val="hybridMultilevel"/>
+    <w:tmpl w:val="E7EE2B5C"/>
+    <w:lvl w:ilvl="0" w:tplc="0419000F">
+      <w:start w:val="1"/>
+      <w:numFmt w:val="decimal"/>
+      <w:lvlText w:val="%1."/>
+      <w:lvlJc w:val="left"/>
+      <w:pPr>
+        <w:ind w:left="720" w:hanging="360"/>
+      </w:pPr>
+    </w:lvl>
+    <w:lvl w:ilvl="1" w:tplc="04190019" w:tentative="1">
+      <w:start w:val="1"/>
+      <w:numFmt w:val="lowerLetter"/>
+      <w:lvlText w:val="%2."/>
+      <w:lvlJc w:val="left"/>
+      <w:pPr>
+        <w:ind w:left="1440" w:hanging="360"/>
+      </w:pPr>
+    </w:lvl>
+    <w:lvl w:ilvl="2" w:tplc="0419001B" w:tentative="1">
+      <w:start w:val="1"/>
+      <w:numFmt w:val="lowerRoman"/>
+      <w:lvlText w:val="%3."/>
+      <w:lvlJc w:val="right"/>
+      <w:pPr>
+        <w:ind w:left="2160" w:hanging="180"/>
+      </w:pPr>
+    </w:lvl>
+    <w:lvl w:ilvl="3" w:tplc="0419000F" w:tentative="1">
+      <w:start w:val="1"/>
+      <w:numFmt w:val="decimal"/>
+      <w:lvlText w:val="%4."/>
+      <w:lvlJc w:val="left"/>
+      <w:pPr>
+        <w:ind w:left="2880" w:hanging="360"/>
+      </w:pPr>
+    </w:lvl>
+    <w:lvl w:ilvl="4" w:tplc="04190019" w:tentative="1">
+      <w:start w:val="1"/>
+      <w:numFmt w:val="lowerLetter"/>
+      <w:lvlText w:val="%5."/>
+      <w:lvlJc w:val="left"/>
+      <w:pPr>
+        <w:ind w:left="3600" w:hanging="360"/>
+      </w:pPr>
+    </w:lvl>
+    <w:lvl w:ilvl="5" w:tplc="0419001B" w:tentative="1">
+      <w:start w:val="1"/>
+      <w:numFmt w:val="lowerRoman"/>
+      <w:lvlText w:val="%6."/>
+      <w:lvlJc w:val="right"/>
+      <w:pPr>
+        <w:ind w:left="4320" w:hanging="180"/>
+      </w:pPr>
+    </w:lvl>
+    <w:lvl w:ilvl="6" w:tplc="0419000F" w:tentative="1">
+      <w:start w:val="1"/>
+      <w:numFmt w:val="decimal"/>
+      <w:lvlText w:val="%7."/>
+      <w:lvlJc w:val="left"/>
+      <w:pPr>
+        <w:ind w:left="5040" w:hanging="360"/>
+      </w:pPr>
+    </w:lvl>
+    <w:lvl w:ilvl="7" w:tplc="04190019" w:tentative="1">
+      <w:start w:val="1"/>
+      <w:numFmt w:val="lowerLetter"/>
+      <w:lvlText w:val="%8."/>
+      <w:lvlJc w:val="left"/>
+      <w:pPr>
+        <w:ind w:left="5760" w:hanging="360"/>
+      </w:pPr>
+    </w:lvl>
+    <w:lvl w:ilvl="8" w:tplc="0419001B" w:tentative="1">
+      <w:start w:val="1"/>
+      <w:numFmt w:val="lowerRoman"/>
+      <w:lvlText w:val="%9."/>
+      <w:lvlJc w:val="right"/>
+      <w:pPr>
+        <w:ind w:left="6480" w:hanging="180"/>
+      </w:pPr>
+    </w:lvl>
+  </w:abstractNum>
+  <w:abstractNum w:abstractNumId="10" w15:restartNumberingAfterBreak="0">
+    <w:nsid w:val="709E3BF3"/>
+    <w:multiLevelType w:val="hybridMultilevel"/>
+    <w:tmpl w:val="1DC8F898"/>
+    <w:lvl w:ilvl="0" w:tplc="0419000F">
+      <w:start w:val="1"/>
+      <w:numFmt w:val="decimal"/>
+      <w:lvlText w:val="%1."/>
+      <w:lvlJc w:val="left"/>
+      <w:pPr>
+        <w:ind w:left="720" w:hanging="360"/>
+      </w:pPr>
+      <w:rPr>
+        <w:rFonts w:hint="default"/>
+      </w:rPr>
+    </w:lvl>
+    <w:lvl w:ilvl="1" w:tplc="04190019" w:tentative="1">
+      <w:start w:val="1"/>
+      <w:numFmt w:val="lowerLetter"/>
+      <w:lvlText w:val="%2."/>
+      <w:lvlJc w:val="left"/>
+      <w:pPr>
+        <w:ind w:left="1440" w:hanging="360"/>
+      </w:pPr>
+    </w:lvl>
+    <w:lvl w:ilvl="2" w:tplc="0419001B" w:tentative="1">
+      <w:start w:val="1"/>
+      <w:numFmt w:val="lowerRoman"/>
+      <w:lvlText w:val="%3."/>
+      <w:lvlJc w:val="right"/>
+      <w:pPr>
+        <w:ind w:left="2160" w:hanging="180"/>
+      </w:pPr>
+    </w:lvl>
+    <w:lvl w:ilvl="3" w:tplc="0419000F" w:tentative="1">
+      <w:start w:val="1"/>
+      <w:numFmt w:val="decimal"/>
+      <w:lvlText w:val="%4."/>
+      <w:lvlJc w:val="left"/>
+      <w:pPr>
+        <w:ind w:left="2880" w:hanging="360"/>
+      </w:pPr>
+    </w:lvl>
+    <w:lvl w:ilvl="4" w:tplc="04190019" w:tentative="1">
+      <w:start w:val="1"/>
+      <w:numFmt w:val="lowerLetter"/>
+      <w:lvlText w:val="%5."/>
+      <w:lvlJc w:val="left"/>
+      <w:pPr>
+        <w:ind w:left="3600" w:hanging="360"/>
+      </w:pPr>
+    </w:lvl>
+    <w:lvl w:ilvl="5" w:tplc="0419001B" w:tentative="1">
+      <w:start w:val="1"/>
+      <w:numFmt w:val="lowerRoman"/>
+      <w:lvlText w:val="%6."/>
+      <w:lvlJc w:val="right"/>
+      <w:pPr>
+        <w:ind w:left="4320" w:hanging="180"/>
+      </w:pPr>
+    </w:lvl>
+    <w:lvl w:ilvl="6" w:tplc="0419000F" w:tentative="1">
+      <w:start w:val="1"/>
+      <w:numFmt w:val="decimal"/>
+      <w:lvlText w:val="%7."/>
+      <w:lvlJc w:val="left"/>
+      <w:pPr>
+        <w:ind w:left="5040" w:hanging="360"/>
+      </w:pPr>
+    </w:lvl>
+    <w:lvl w:ilvl="7" w:tplc="04190019" w:tentative="1">
+      <w:start w:val="1"/>
+      <w:numFmt w:val="lowerLetter"/>
+      <w:lvlText w:val="%8."/>
+      <w:lvlJc w:val="left"/>
+      <w:pPr>
+        <w:ind w:left="5760" w:hanging="360"/>
+      </w:pPr>
+    </w:lvl>
+    <w:lvl w:ilvl="8" w:tplc="0419001B" w:tentative="1">
+      <w:start w:val="1"/>
+      <w:numFmt w:val="lowerRoman"/>
+      <w:lvlText w:val="%9."/>
+      <w:lvlJc w:val="right"/>
+      <w:pPr>
+        <w:ind w:left="6480" w:hanging="180"/>
+      </w:pPr>
     </w:lvl>
   </w:abstractNum>
   <w:num w:numId="1" w16cid:durableId="160433216">
@@ -6642,6 +7624,12 @@
   </w:num>
   <w:num w:numId="9" w16cid:durableId="720979019">
     <w:abstractNumId w:val="0"/>
+  </w:num>
+  <w:num w:numId="10" w16cid:durableId="1514682097">
+    <w:abstractNumId w:val="9"/>
+  </w:num>
+  <w:num w:numId="11" w16cid:durableId="772549665">
+    <w:abstractNumId w:val="10"/>
   </w:num>
 </w:numbering>
 </file>

</xml_diff>

<commit_message>
Finalize note and update presentation
</commit_message>
<xml_diff>
--- a/docs/Пояснительная_записка_RTT_tennis_predictor_updated_v14.docx
+++ b/docs/Пояснительная_записка_RTT_tennis_predictor_updated_v14.docx
@@ -396,7 +396,7 @@
           <w:r>
             <w:fldChar w:fldCharType="separate"/>
           </w:r>
-          <w:hyperlink w:anchor="_Toc229570916" w:history="1">
+          <w:hyperlink w:anchor="_Toc229571879" w:history="1">
             <w:r>
               <w:rPr>
                 <w:rStyle w:val="aff8"/>
@@ -443,7 +443,7 @@
                 <w:noProof/>
                 <w:webHidden/>
               </w:rPr>
-              <w:instrText xml:space="preserve"> PAGEREF _Toc229570916 \h </w:instrText>
+              <w:instrText xml:space="preserve"> PAGEREF _Toc229571879 \h </w:instrText>
             </w:r>
             <w:r>
               <w:rPr>
@@ -490,7 +490,7 @@
               <w14:ligatures w14:val="standardContextual"/>
             </w:rPr>
           </w:pPr>
-          <w:hyperlink w:anchor="_Toc229570917" w:history="1">
+          <w:hyperlink w:anchor="_Toc229571880" w:history="1">
             <w:r>
               <w:rPr>
                 <w:rStyle w:val="aff8"/>
@@ -537,7 +537,7 @@
                 <w:noProof/>
                 <w:webHidden/>
               </w:rPr>
-              <w:instrText xml:space="preserve"> PAGEREF _Toc229570917 \h </w:instrText>
+              <w:instrText xml:space="preserve"> PAGEREF _Toc229571880 \h </w:instrText>
             </w:r>
             <w:r>
               <w:rPr>
@@ -584,7 +584,7 @@
               <w14:ligatures w14:val="standardContextual"/>
             </w:rPr>
           </w:pPr>
-          <w:hyperlink w:anchor="_Toc229570918" w:history="1">
+          <w:hyperlink w:anchor="_Toc229571881" w:history="1">
             <w:r>
               <w:rPr>
                 <w:rStyle w:val="aff8"/>
@@ -631,7 +631,7 @@
                 <w:noProof/>
                 <w:webHidden/>
               </w:rPr>
-              <w:instrText xml:space="preserve"> PAGEREF _Toc229570918 \h </w:instrText>
+              <w:instrText xml:space="preserve"> PAGEREF _Toc229571881 \h </w:instrText>
             </w:r>
             <w:r>
               <w:rPr>
@@ -678,7 +678,7 @@
               <w14:ligatures w14:val="standardContextual"/>
             </w:rPr>
           </w:pPr>
-          <w:hyperlink w:anchor="_Toc229570919" w:history="1">
+          <w:hyperlink w:anchor="_Toc229571882" w:history="1">
             <w:r>
               <w:rPr>
                 <w:rStyle w:val="aff8"/>
@@ -725,7 +725,7 @@
                 <w:noProof/>
                 <w:webHidden/>
               </w:rPr>
-              <w:instrText xml:space="preserve"> PAGEREF _Toc229570919 \h </w:instrText>
+              <w:instrText xml:space="preserve"> PAGEREF _Toc229571882 \h </w:instrText>
             </w:r>
             <w:r>
               <w:rPr>
@@ -772,7 +772,7 @@
               <w14:ligatures w14:val="standardContextual"/>
             </w:rPr>
           </w:pPr>
-          <w:hyperlink w:anchor="_Toc229570920" w:history="1">
+          <w:hyperlink w:anchor="_Toc229571883" w:history="1">
             <w:r>
               <w:rPr>
                 <w:rStyle w:val="aff8"/>
@@ -819,7 +819,7 @@
                 <w:noProof/>
                 <w:webHidden/>
               </w:rPr>
-              <w:instrText xml:space="preserve"> PAGEREF _Toc229570920 \h </w:instrText>
+              <w:instrText xml:space="preserve"> PAGEREF _Toc229571883 \h </w:instrText>
             </w:r>
             <w:r>
               <w:rPr>
@@ -866,7 +866,7 @@
               <w14:ligatures w14:val="standardContextual"/>
             </w:rPr>
           </w:pPr>
-          <w:hyperlink w:anchor="_Toc229570921" w:history="1">
+          <w:hyperlink w:anchor="_Toc229571884" w:history="1">
             <w:r>
               <w:rPr>
                 <w:rStyle w:val="aff8"/>
@@ -913,7 +913,7 @@
                 <w:noProof/>
                 <w:webHidden/>
               </w:rPr>
-              <w:instrText xml:space="preserve"> PAGEREF _Toc229570921 \h </w:instrText>
+              <w:instrText xml:space="preserve"> PAGEREF _Toc229571884 \h </w:instrText>
             </w:r>
             <w:r>
               <w:rPr>
@@ -960,7 +960,7 @@
               <w14:ligatures w14:val="standardContextual"/>
             </w:rPr>
           </w:pPr>
-          <w:hyperlink w:anchor="_Toc229570922" w:history="1">
+          <w:hyperlink w:anchor="_Toc229571885" w:history="1">
             <w:r>
               <w:rPr>
                 <w:rStyle w:val="aff8"/>
@@ -1007,7 +1007,7 @@
                 <w:noProof/>
                 <w:webHidden/>
               </w:rPr>
-              <w:instrText xml:space="preserve"> PAGEREF _Toc229570922 \h </w:instrText>
+              <w:instrText xml:space="preserve"> PAGEREF _Toc229571885 \h </w:instrText>
             </w:r>
             <w:r>
               <w:rPr>
@@ -1054,7 +1054,7 @@
               <w14:ligatures w14:val="standardContextual"/>
             </w:rPr>
           </w:pPr>
-          <w:hyperlink w:anchor="_Toc229570923" w:history="1">
+          <w:hyperlink w:anchor="_Toc229571886" w:history="1">
             <w:r>
               <w:rPr>
                 <w:rStyle w:val="aff8"/>
@@ -1101,7 +1101,7 @@
                 <w:noProof/>
                 <w:webHidden/>
               </w:rPr>
-              <w:instrText xml:space="preserve"> PAGEREF _Toc229570923 \h </w:instrText>
+              <w:instrText xml:space="preserve"> PAGEREF _Toc229571886 \h </w:instrText>
             </w:r>
             <w:r>
               <w:rPr>
@@ -1148,7 +1148,7 @@
               <w14:ligatures w14:val="standardContextual"/>
             </w:rPr>
           </w:pPr>
-          <w:hyperlink w:anchor="_Toc229570924" w:history="1">
+          <w:hyperlink w:anchor="_Toc229571887" w:history="1">
             <w:r>
               <w:rPr>
                 <w:rStyle w:val="aff8"/>
@@ -1193,7 +1193,7 @@
                 <w:noProof/>
                 <w:webHidden/>
               </w:rPr>
-              <w:instrText xml:space="preserve"> PAGEREF _Toc229570924 \h </w:instrText>
+              <w:instrText xml:space="preserve"> PAGEREF _Toc229571887 \h </w:instrText>
             </w:r>
             <w:r>
               <w:rPr>
@@ -1213,7 +1213,7 @@
                 <w:noProof/>
                 <w:webHidden/>
               </w:rPr>
-              <w:t>10</w:t>
+              <w:t>11</w:t>
             </w:r>
             <w:r>
               <w:rPr>
@@ -1240,7 +1240,7 @@
               <w14:ligatures w14:val="standardContextual"/>
             </w:rPr>
           </w:pPr>
-          <w:hyperlink w:anchor="_Toc229570925" w:history="1">
+          <w:hyperlink w:anchor="_Toc229571888" w:history="1">
             <w:r>
               <w:rPr>
                 <w:rStyle w:val="aff8"/>
@@ -1285,7 +1285,7 @@
                 <w:noProof/>
                 <w:webHidden/>
               </w:rPr>
-              <w:instrText xml:space="preserve"> PAGEREF _Toc229570925 \h </w:instrText>
+              <w:instrText xml:space="preserve"> PAGEREF _Toc229571888 \h </w:instrText>
             </w:r>
             <w:r>
               <w:rPr>
@@ -1305,7 +1305,7 @@
                 <w:noProof/>
                 <w:webHidden/>
               </w:rPr>
-              <w:t>10</w:t>
+              <w:t>11</w:t>
             </w:r>
             <w:r>
               <w:rPr>
@@ -1332,7 +1332,7 @@
               <w14:ligatures w14:val="standardContextual"/>
             </w:rPr>
           </w:pPr>
-          <w:hyperlink w:anchor="_Toc229570926" w:history="1">
+          <w:hyperlink w:anchor="_Toc229571889" w:history="1">
             <w:r>
               <w:rPr>
                 <w:rStyle w:val="aff8"/>
@@ -1377,7 +1377,7 @@
                 <w:noProof/>
                 <w:webHidden/>
               </w:rPr>
-              <w:instrText xml:space="preserve"> PAGEREF _Toc229570926 \h </w:instrText>
+              <w:instrText xml:space="preserve"> PAGEREF _Toc229571889 \h </w:instrText>
             </w:r>
             <w:r>
               <w:rPr>
@@ -1397,7 +1397,7 @@
                 <w:noProof/>
                 <w:webHidden/>
               </w:rPr>
-              <w:t>11</w:t>
+              <w:t>12</w:t>
             </w:r>
             <w:r>
               <w:rPr>
@@ -1444,7 +1444,7 @@
           <w:lang w:val="ru-RU"/>
         </w:rPr>
       </w:pPr>
-      <w:bookmarkStart w:id="0" w:name="_Toc229570916"/>
+      <w:bookmarkStart w:id="0" w:name="_Toc229571879"/>
       <w:r>
         <w:rPr>
           <w:lang w:val="ru-RU"/>
@@ -1552,7 +1552,7 @@
           <w:lang w:val="ru-RU"/>
         </w:rPr>
       </w:pPr>
-      <w:bookmarkStart w:id="1" w:name="_Toc229570917"/>
+      <w:bookmarkStart w:id="1" w:name="_Toc229571880"/>
       <w:r>
         <w:rPr>
           <w:lang w:val="ru-RU"/>
@@ -2008,7 +2008,7 @@
           <w:lang w:val="ru-RU"/>
         </w:rPr>
       </w:pPr>
-      <w:bookmarkStart w:id="2" w:name="_Toc229570918"/>
+      <w:bookmarkStart w:id="2" w:name="_Toc229571881"/>
       <w:r>
         <w:rPr>
           <w:lang w:val="ru-RU"/>
@@ -2791,7 +2791,7 @@
           <w:lang w:val="ru-RU"/>
         </w:rPr>
       </w:pPr>
-      <w:bookmarkStart w:id="3" w:name="_Toc229570919"/>
+      <w:bookmarkStart w:id="3" w:name="_Toc229571882"/>
       <w:r>
         <w:rPr>
           <w:lang w:val="ru-RU"/>
@@ -3588,7 +3588,7 @@
           <w:lang w:val="ru-RU"/>
         </w:rPr>
       </w:pPr>
-      <w:bookmarkStart w:id="4" w:name="_Toc229570920"/>
+      <w:bookmarkStart w:id="4" w:name="_Toc229571883"/>
       <w:r>
         <w:rPr>
           <w:lang w:val="ru-RU"/>
@@ -5077,7 +5077,7 @@
           <w:lang w:val="ru-RU"/>
         </w:rPr>
       </w:pPr>
-      <w:bookmarkStart w:id="5" w:name="_Toc229570921"/>
+      <w:bookmarkStart w:id="5" w:name="_Toc229571884"/>
       <w:r>
         <w:rPr>
           <w:lang w:val="ru-RU"/>
@@ -6252,7 +6252,7 @@
           <w:lang w:val="ru-RU"/>
         </w:rPr>
       </w:pPr>
-      <w:bookmarkStart w:id="6" w:name="_Toc229570922"/>
+      <w:bookmarkStart w:id="6" w:name="_Toc229571885"/>
       <w:r>
         <w:rPr>
           <w:lang w:val="ru-RU"/>
@@ -6299,44 +6299,178 @@
       </w:r>
     </w:p>
     <w:p>
-      <w:r>
-        <w:t>Таблица. Топ признаков по важности для основных моделей.</w:t>
+      <w:pPr>
+        <w:jc w:val="both"/>
+        <w:rPr>
+          <w:lang w:val="ru-RU"/>
+        </w:rPr>
+      </w:pPr>
+      <w:r>
+        <w:rPr>
+          <w:lang w:val="ru-RU"/>
+        </w:rPr>
+        <w:t xml:space="preserve">В таблице ниже показан порядок наиболее значимых признаков внутри каждой основной модели. Значения важности сопоставимы только внутри одного столбца: для </w:t>
+      </w:r>
+      <w:proofErr w:type="spellStart"/>
+      <w:r>
+        <w:t>CatBoost</w:t>
+      </w:r>
+      <w:proofErr w:type="spellEnd"/>
+      <w:r>
+        <w:rPr>
+          <w:lang w:val="ru-RU"/>
+        </w:rPr>
+        <w:t xml:space="preserve"> используется </w:t>
+      </w:r>
+      <w:r>
+        <w:t>mean</w:t>
+      </w:r>
+      <w:r>
+        <w:rPr>
+          <w:lang w:val="ru-RU"/>
+        </w:rPr>
+        <w:t xml:space="preserve"> </w:t>
+      </w:r>
+      <w:r>
+        <w:t>abs</w:t>
+      </w:r>
+      <w:r>
+        <w:rPr>
+          <w:lang w:val="ru-RU"/>
+        </w:rPr>
+        <w:t xml:space="preserve"> </w:t>
+      </w:r>
+      <w:r>
+        <w:t>SHAP</w:t>
+      </w:r>
+      <w:r>
+        <w:rPr>
+          <w:lang w:val="ru-RU"/>
+        </w:rPr>
+        <w:t xml:space="preserve">, для </w:t>
+      </w:r>
+      <w:r>
+        <w:t>Gradient</w:t>
+      </w:r>
+      <w:r>
+        <w:rPr>
+          <w:lang w:val="ru-RU"/>
+        </w:rPr>
+        <w:t xml:space="preserve"> </w:t>
+      </w:r>
+      <w:r>
+        <w:t>Boosting</w:t>
+      </w:r>
+      <w:r>
+        <w:rPr>
+          <w:lang w:val="ru-RU"/>
+        </w:rPr>
+        <w:t xml:space="preserve"> и </w:t>
+      </w:r>
+      <w:r>
+        <w:t>Random</w:t>
+      </w:r>
+      <w:r>
+        <w:rPr>
+          <w:lang w:val="ru-RU"/>
+        </w:rPr>
+        <w:t xml:space="preserve"> </w:t>
+      </w:r>
+      <w:r>
+        <w:t>Forest</w:t>
+      </w:r>
+      <w:r>
+        <w:rPr>
+          <w:lang w:val="ru-RU"/>
+        </w:rPr>
+        <w:t xml:space="preserve"> — встроенная </w:t>
+      </w:r>
+      <w:r>
+        <w:t>tree</w:t>
+      </w:r>
+      <w:r>
+        <w:rPr>
+          <w:lang w:val="ru-RU"/>
+        </w:rPr>
+        <w:t xml:space="preserve"> </w:t>
+      </w:r>
+      <w:r>
+        <w:t>feature</w:t>
+      </w:r>
+      <w:r>
+        <w:rPr>
+          <w:lang w:val="ru-RU"/>
+        </w:rPr>
+        <w:t xml:space="preserve"> </w:t>
+      </w:r>
+      <w:r>
+        <w:t>importance</w:t>
+      </w:r>
+      <w:r>
+        <w:rPr>
+          <w:lang w:val="ru-RU"/>
+        </w:rPr>
+        <w:t>.</w:t>
       </w:r>
     </w:p>
     <w:p>
-      <w:r>
-        <w:t>В таблице ниже показан порядок наиболее значимых признаков внутри каждой основной модели. Значения важности сопоставимы только внутри одного столбца: для CatBoost используется mean abs SHAP, для Gradient Boosting и Random Forest — встроенная tree feature importance.</w:t>
+      <w:pPr>
+        <w:rPr>
+          <w:lang w:val="ru-RU"/>
+        </w:rPr>
+      </w:pPr>
+      <w:r>
+        <w:rPr>
+          <w:lang w:val="ru-RU"/>
+        </w:rPr>
+        <w:br w:type="page"/>
+      </w:r>
+    </w:p>
+    <w:p>
+      <w:pPr>
+        <w:rPr>
+          <w:lang w:val="ru-RU"/>
+        </w:rPr>
+      </w:pPr>
+      <w:r>
+        <w:rPr>
+          <w:lang w:val="ru-RU"/>
+        </w:rPr>
+        <w:lastRenderedPageBreak/>
+        <w:t>Таблица. Топ признаков по важности для основных моделей.</w:t>
       </w:r>
     </w:p>
     <w:tbl>
       <w:tblPr>
         <w:tblStyle w:val="aff0"/>
-        <w:tblW w:type="auto" w:w="0"/>
-        <w:tblLook w:firstColumn="1" w:firstRow="1" w:lastColumn="0" w:lastRow="0" w:noHBand="0" w:noVBand="1" w:val="04A0"/>
+        <w:tblW w:w="0" w:type="auto"/>
+        <w:tblLook w:val="04A0" w:firstRow="1" w:lastRow="0" w:firstColumn="1" w:lastColumn="0" w:noHBand="0" w:noVBand="1"/>
       </w:tblPr>
       <w:tblGrid>
-        <w:gridCol w:w="2412"/>
-        <w:gridCol w:w="2412"/>
-        <w:gridCol w:w="2412"/>
+        <w:gridCol w:w="959"/>
+        <w:gridCol w:w="2977"/>
+        <w:gridCol w:w="3300"/>
         <w:gridCol w:w="2412"/>
       </w:tblGrid>
       <w:tr>
         <w:tc>
           <w:tcPr>
-            <w:tcW w:type="dxa" w:w="2412"/>
+            <w:tcW w:w="959" w:type="dxa"/>
           </w:tcPr>
           <w:p>
+            <w:proofErr w:type="spellStart"/>
             <w:r>
               <w:rPr>
                 <w:b/>
               </w:rPr>
               <w:t>Ранг</w:t>
             </w:r>
+            <w:proofErr w:type="spellEnd"/>
           </w:p>
         </w:tc>
         <w:tc>
           <w:tcPr>
-            <w:tcW w:type="dxa" w:w="2412"/>
+            <w:tcW w:w="2977" w:type="dxa"/>
           </w:tcPr>
           <w:p>
             <w:r>
@@ -6349,7 +6483,7 @@
         </w:tc>
         <w:tc>
           <w:tcPr>
-            <w:tcW w:type="dxa" w:w="2412"/>
+            <w:tcW w:w="3300" w:type="dxa"/>
           </w:tcPr>
           <w:p>
             <w:r>
@@ -6362,7 +6496,7 @@
         </w:tc>
         <w:tc>
           <w:tcPr>
-            <w:tcW w:type="dxa" w:w="2412"/>
+            <w:tcW w:w="2412" w:type="dxa"/>
           </w:tcPr>
           <w:p>
             <w:r>
@@ -6377,7 +6511,7 @@
       <w:tr>
         <w:tc>
           <w:tcPr>
-            <w:tcW w:type="dxa" w:w="2412"/>
+            <w:tcW w:w="959" w:type="dxa"/>
           </w:tcPr>
           <w:p>
             <w:r>
@@ -6387,31 +6521,97 @@
         </w:tc>
         <w:tc>
           <w:tcPr>
-            <w:tcW w:type="dxa" w:w="2412"/>
+            <w:tcW w:w="2977" w:type="dxa"/>
           </w:tcPr>
           <w:p>
-            <w:r>
-              <w:t>Относит. разница очков на зач. турнир (0,541)</w:t>
+            <w:pPr>
+              <w:rPr>
+                <w:lang w:val="ru-RU"/>
+              </w:rPr>
+            </w:pPr>
+            <w:r>
+              <w:rPr>
+                <w:lang w:val="ru-RU"/>
+              </w:rPr>
+              <w:t xml:space="preserve">Относит. разница очков на </w:t>
+            </w:r>
+            <w:proofErr w:type="spellStart"/>
+            <w:r>
+              <w:rPr>
+                <w:lang w:val="ru-RU"/>
+              </w:rPr>
+              <w:t>зач</w:t>
+            </w:r>
+            <w:proofErr w:type="spellEnd"/>
+            <w:r>
+              <w:rPr>
+                <w:lang w:val="ru-RU"/>
+              </w:rPr>
+              <w:t>. турнир (0,541)</w:t>
             </w:r>
           </w:p>
         </w:tc>
         <w:tc>
           <w:tcPr>
-            <w:tcW w:type="dxa" w:w="2412"/>
+            <w:tcW w:w="3300" w:type="dxa"/>
           </w:tcPr>
           <w:p>
-            <w:r>
-              <w:t>Относит. разница очков на зач. турнир (0,533)</w:t>
+            <w:pPr>
+              <w:rPr>
+                <w:lang w:val="ru-RU"/>
+              </w:rPr>
+            </w:pPr>
+            <w:r>
+              <w:rPr>
+                <w:lang w:val="ru-RU"/>
+              </w:rPr>
+              <w:t xml:space="preserve">Относит. разница очков на </w:t>
+            </w:r>
+            <w:proofErr w:type="spellStart"/>
+            <w:r>
+              <w:rPr>
+                <w:lang w:val="ru-RU"/>
+              </w:rPr>
+              <w:t>зач</w:t>
+            </w:r>
+            <w:proofErr w:type="spellEnd"/>
+            <w:r>
+              <w:rPr>
+                <w:lang w:val="ru-RU"/>
+              </w:rPr>
+              <w:t>. турнир (0,533)</w:t>
             </w:r>
           </w:p>
         </w:tc>
         <w:tc>
           <w:tcPr>
-            <w:tcW w:type="dxa" w:w="2412"/>
+            <w:tcW w:w="2412" w:type="dxa"/>
           </w:tcPr>
           <w:p>
-            <w:r>
-              <w:t>Относит. разница очков на зач. турнир (0,128)</w:t>
+            <w:pPr>
+              <w:rPr>
+                <w:lang w:val="ru-RU"/>
+              </w:rPr>
+            </w:pPr>
+            <w:r>
+              <w:rPr>
+                <w:lang w:val="ru-RU"/>
+              </w:rPr>
+              <w:t xml:space="preserve">Относит. разница очков на </w:t>
+            </w:r>
+            <w:proofErr w:type="spellStart"/>
+            <w:r>
+              <w:rPr>
+                <w:lang w:val="ru-RU"/>
+              </w:rPr>
+              <w:t>зач</w:t>
+            </w:r>
+            <w:proofErr w:type="spellEnd"/>
+            <w:r>
+              <w:rPr>
+                <w:lang w:val="ru-RU"/>
+              </w:rPr>
+              <w:t>. турнир (0,128)</w:t>
             </w:r>
           </w:p>
         </w:tc>
@@ -6419,7 +6619,7 @@
       <w:tr>
         <w:tc>
           <w:tcPr>
-            <w:tcW w:type="dxa" w:w="2412"/>
+            <w:tcW w:w="959" w:type="dxa"/>
           </w:tcPr>
           <w:p>
             <w:r>
@@ -6429,7 +6629,7 @@
         </w:tc>
         <w:tc>
           <w:tcPr>
-            <w:tcW w:type="dxa" w:w="2412"/>
+            <w:tcW w:w="2977" w:type="dxa"/>
           </w:tcPr>
           <w:p>
             <w:r>
@@ -6439,7 +6639,7 @@
         </w:tc>
         <w:tc>
           <w:tcPr>
-            <w:tcW w:type="dxa" w:w="2412"/>
+            <w:tcW w:w="3300" w:type="dxa"/>
           </w:tcPr>
           <w:p>
             <w:r>
@@ -6449,11 +6649,33 @@
         </w:tc>
         <w:tc>
           <w:tcPr>
-            <w:tcW w:type="dxa" w:w="2412"/>
+            <w:tcW w:w="2412" w:type="dxa"/>
           </w:tcPr>
           <w:p>
-            <w:r>
-              <w:t>Разница очков на зач. турнир (0,110)</w:t>
+            <w:pPr>
+              <w:rPr>
+                <w:lang w:val="ru-RU"/>
+              </w:rPr>
+            </w:pPr>
+            <w:r>
+              <w:rPr>
+                <w:lang w:val="ru-RU"/>
+              </w:rPr>
+              <w:t xml:space="preserve">Разница очков на </w:t>
+            </w:r>
+            <w:proofErr w:type="spellStart"/>
+            <w:r>
+              <w:rPr>
+                <w:lang w:val="ru-RU"/>
+              </w:rPr>
+              <w:t>зач</w:t>
+            </w:r>
+            <w:proofErr w:type="spellEnd"/>
+            <w:r>
+              <w:rPr>
+                <w:lang w:val="ru-RU"/>
+              </w:rPr>
+              <w:t>. турнир (0,110)</w:t>
             </w:r>
           </w:p>
         </w:tc>
@@ -6461,7 +6683,7 @@
       <w:tr>
         <w:tc>
           <w:tcPr>
-            <w:tcW w:type="dxa" w:w="2412"/>
+            <w:tcW w:w="959" w:type="dxa"/>
           </w:tcPr>
           <w:p>
             <w:r>
@@ -6471,7 +6693,7 @@
         </w:tc>
         <w:tc>
           <w:tcPr>
-            <w:tcW w:type="dxa" w:w="2412"/>
+            <w:tcW w:w="2977" w:type="dxa"/>
           </w:tcPr>
           <w:p>
             <w:r>
@@ -6481,7 +6703,7 @@
         </w:tc>
         <w:tc>
           <w:tcPr>
-            <w:tcW w:type="dxa" w:w="2412"/>
+            <w:tcW w:w="3300" w:type="dxa"/>
           </w:tcPr>
           <w:p>
             <w:r>
@@ -6491,7 +6713,7 @@
         </w:tc>
         <w:tc>
           <w:tcPr>
-            <w:tcW w:type="dxa" w:w="2412"/>
+            <w:tcW w:w="2412" w:type="dxa"/>
           </w:tcPr>
           <w:p>
             <w:r>
@@ -6503,7 +6725,7 @@
       <w:tr>
         <w:tc>
           <w:tcPr>
-            <w:tcW w:type="dxa" w:w="2412"/>
+            <w:tcW w:w="959" w:type="dxa"/>
           </w:tcPr>
           <w:p>
             <w:r>
@@ -6513,7 +6735,7 @@
         </w:tc>
         <w:tc>
           <w:tcPr>
-            <w:tcW w:type="dxa" w:w="2412"/>
+            <w:tcW w:w="2977" w:type="dxa"/>
           </w:tcPr>
           <w:p>
             <w:r>
@@ -6523,7 +6745,7 @@
         </w:tc>
         <w:tc>
           <w:tcPr>
-            <w:tcW w:type="dxa" w:w="2412"/>
+            <w:tcW w:w="3300" w:type="dxa"/>
           </w:tcPr>
           <w:p>
             <w:r>
@@ -6533,7 +6755,7 @@
         </w:tc>
         <w:tc>
           <w:tcPr>
-            <w:tcW w:type="dxa" w:w="2412"/>
+            <w:tcW w:w="2412" w:type="dxa"/>
           </w:tcPr>
           <w:p>
             <w:r>
@@ -6545,7 +6767,7 @@
       <w:tr>
         <w:tc>
           <w:tcPr>
-            <w:tcW w:type="dxa" w:w="2412"/>
+            <w:tcW w:w="959" w:type="dxa"/>
           </w:tcPr>
           <w:p>
             <w:r>
@@ -6555,31 +6777,88 @@
         </w:tc>
         <w:tc>
           <w:tcPr>
-            <w:tcW w:type="dxa" w:w="2412"/>
+            <w:tcW w:w="2977" w:type="dxa"/>
           </w:tcPr>
           <w:p>
-            <w:r>
-              <w:t>Разница очков на зач. турнир (0,024)</w:t>
+            <w:pPr>
+              <w:rPr>
+                <w:lang w:val="ru-RU"/>
+              </w:rPr>
+            </w:pPr>
+            <w:r>
+              <w:rPr>
+                <w:lang w:val="ru-RU"/>
+              </w:rPr>
+              <w:t xml:space="preserve">Разница очков на </w:t>
+            </w:r>
+            <w:proofErr w:type="spellStart"/>
+            <w:r>
+              <w:rPr>
+                <w:lang w:val="ru-RU"/>
+              </w:rPr>
+              <w:t>зач</w:t>
+            </w:r>
+            <w:proofErr w:type="spellEnd"/>
+            <w:r>
+              <w:rPr>
+                <w:lang w:val="ru-RU"/>
+              </w:rPr>
+              <w:t>. турнир (0,024)</w:t>
             </w:r>
           </w:p>
         </w:tc>
         <w:tc>
           <w:tcPr>
-            <w:tcW w:type="dxa" w:w="2412"/>
+            <w:tcW w:w="3300" w:type="dxa"/>
           </w:tcPr>
           <w:p>
-            <w:r>
-              <w:t>Разница очков на зач. турнир (0,205)</w:t>
+            <w:pPr>
+              <w:rPr>
+                <w:lang w:val="ru-RU"/>
+              </w:rPr>
+            </w:pPr>
+            <w:r>
+              <w:rPr>
+                <w:lang w:val="ru-RU"/>
+              </w:rPr>
+              <w:t xml:space="preserve">Разница очков на </w:t>
+            </w:r>
+            <w:proofErr w:type="spellStart"/>
+            <w:r>
+              <w:rPr>
+                <w:lang w:val="ru-RU"/>
+              </w:rPr>
+              <w:t>зач</w:t>
+            </w:r>
+            <w:proofErr w:type="spellEnd"/>
+            <w:r>
+              <w:rPr>
+                <w:lang w:val="ru-RU"/>
+              </w:rPr>
+              <w:t>. турнир (0,205)</w:t>
             </w:r>
           </w:p>
         </w:tc>
         <w:tc>
           <w:tcPr>
-            <w:tcW w:type="dxa" w:w="2412"/>
+            <w:tcW w:w="2412" w:type="dxa"/>
           </w:tcPr>
           <w:p>
-            <w:r>
-              <w:t>Разница ранга РТТ (0,078)</w:t>
+            <w:proofErr w:type="spellStart"/>
+            <w:r>
+              <w:t>Разница</w:t>
+            </w:r>
+            <w:proofErr w:type="spellEnd"/>
+            <w:r>
+              <w:t xml:space="preserve"> </w:t>
+            </w:r>
+            <w:proofErr w:type="spellStart"/>
+            <w:r>
+              <w:t>ранга</w:t>
+            </w:r>
+            <w:proofErr w:type="spellEnd"/>
+            <w:r>
+              <w:t xml:space="preserve"> РТТ (0,078)</w:t>
             </w:r>
           </w:p>
         </w:tc>
@@ -6587,7 +6866,7 @@
       <w:tr>
         <w:tc>
           <w:tcPr>
-            <w:tcW w:type="dxa" w:w="2412"/>
+            <w:tcW w:w="959" w:type="dxa"/>
           </w:tcPr>
           <w:p>
             <w:r>
@@ -6597,7 +6876,7 @@
         </w:tc>
         <w:tc>
           <w:tcPr>
-            <w:tcW w:type="dxa" w:w="2412"/>
+            <w:tcW w:w="2977" w:type="dxa"/>
           </w:tcPr>
           <w:p>
             <w:r>
@@ -6607,7 +6886,7 @@
         </w:tc>
         <w:tc>
           <w:tcPr>
-            <w:tcW w:type="dxa" w:w="2412"/>
+            <w:tcW w:w="3300" w:type="dxa"/>
           </w:tcPr>
           <w:p>
             <w:r>
@@ -6617,7 +6896,7 @@
         </w:tc>
         <w:tc>
           <w:tcPr>
-            <w:tcW w:type="dxa" w:w="2412"/>
+            <w:tcW w:w="2412" w:type="dxa"/>
           </w:tcPr>
           <w:p>
             <w:r>
@@ -6629,7 +6908,7 @@
       <w:tr>
         <w:tc>
           <w:tcPr>
-            <w:tcW w:type="dxa" w:w="2412"/>
+            <w:tcW w:w="959" w:type="dxa"/>
           </w:tcPr>
           <w:p>
             <w:r>
@@ -6639,7 +6918,7 @@
         </w:tc>
         <w:tc>
           <w:tcPr>
-            <w:tcW w:type="dxa" w:w="2412"/>
+            <w:tcW w:w="2977" w:type="dxa"/>
           </w:tcPr>
           <w:p>
             <w:r>
@@ -6649,7 +6928,7 @@
         </w:tc>
         <w:tc>
           <w:tcPr>
-            <w:tcW w:type="dxa" w:w="2412"/>
+            <w:tcW w:w="3300" w:type="dxa"/>
           </w:tcPr>
           <w:p>
             <w:r>
@@ -6659,7 +6938,7 @@
         </w:tc>
         <w:tc>
           <w:tcPr>
-            <w:tcW w:type="dxa" w:w="2412"/>
+            <w:tcW w:w="2412" w:type="dxa"/>
           </w:tcPr>
           <w:p>
             <w:r>
@@ -6670,8 +6949,33 @@
       </w:tr>
     </w:tbl>
     <w:p>
-      <w:r>
-        <w:t>Ранжирование подтверждает, что основные модели опираются прежде всего на скорректированные рейтинговые показатели и ELO. Это согласуется с предметной логикой задачи: важна не только позиция в официальном рейтинге, но и динамическая сила игрока, качество набора очков и уровень предыдущих соперников.</w:t>
+      <w:pPr>
+        <w:rPr>
+          <w:lang w:val="ru-RU"/>
+        </w:rPr>
+      </w:pPr>
+    </w:p>
+    <w:p>
+      <w:pPr>
+        <w:jc w:val="both"/>
+        <w:rPr>
+          <w:lang w:val="ru-RU"/>
+        </w:rPr>
+      </w:pPr>
+      <w:r>
+        <w:rPr>
+          <w:lang w:val="ru-RU"/>
+        </w:rPr>
+        <w:t xml:space="preserve">Ранжирование подтверждает, что основные модели опираются прежде всего на скорректированные рейтинговые показатели и </w:t>
+      </w:r>
+      <w:r>
+        <w:t>ELO</w:t>
+      </w:r>
+      <w:r>
+        <w:rPr>
+          <w:lang w:val="ru-RU"/>
+        </w:rPr>
+        <w:t>. Это согласуется с предметной логикой задачи: важна не только позиция в официальном рейтинге, но и динамическая сила игрока, качество набора очков и уровень предыдущих соперников.</w:t>
       </w:r>
     </w:p>
     <w:p>
@@ -6700,12 +7004,11 @@
           <w:lang w:val="ru-RU"/>
         </w:rPr>
       </w:pPr>
-      <w:bookmarkStart w:id="7" w:name="_Toc229570923"/>
-      <w:r>
-        <w:rPr>
-          <w:lang w:val="ru-RU"/>
-        </w:rPr>
-        <w:lastRenderedPageBreak/>
+      <w:bookmarkStart w:id="7" w:name="_Toc229571886"/>
+      <w:r>
+        <w:rPr>
+          <w:lang w:val="ru-RU"/>
+        </w:rPr>
         <w:t>Практическое применение</w:t>
       </w:r>
       <w:bookmarkEnd w:id="7"/>
@@ -6795,6 +7098,7 @@
         <w:rPr>
           <w:lang w:val="ru-RU"/>
         </w:rPr>
+        <w:lastRenderedPageBreak/>
         <w:t>Выявление расхождений между официальным рейтингом и фактической игровой силой, например у игроков с малым числом турниров или резким изменением результатов.</w:t>
       </w:r>
     </w:p>
@@ -6822,7 +7126,7 @@
         <w:spacing w:after="240"/>
         <w:ind w:left="714" w:hanging="357"/>
       </w:pPr>
-      <w:bookmarkStart w:id="8" w:name="_Toc229570924"/>
+      <w:bookmarkStart w:id="8" w:name="_Toc229571887"/>
       <w:proofErr w:type="spellStart"/>
       <w:r>
         <w:t>Ограничения</w:t>
@@ -6899,7 +7203,7 @@
         <w:spacing w:after="240"/>
         <w:ind w:left="714" w:hanging="357"/>
       </w:pPr>
-      <w:bookmarkStart w:id="9" w:name="_Toc229570925"/>
+      <w:bookmarkStart w:id="9" w:name="_Toc229571888"/>
       <w:proofErr w:type="spellStart"/>
       <w:r>
         <w:t>Заключение</w:t>
@@ -7027,7 +7331,6 @@
         <w:rPr>
           <w:lang w:val="ru-RU"/>
         </w:rPr>
-        <w:lastRenderedPageBreak/>
         <w:t>Главная ценность проекта — не только числовой прогноз, но и аналитическая панель, которая показывает состояние данных, дает прогноз по выбранной паре игроков и помогает интерпретировать, какие факторы сильнее всего повлияли на вероятность победы.</w:t>
       </w:r>
     </w:p>
@@ -7173,9 +7476,10 @@
         <w:spacing w:after="240"/>
         <w:ind w:left="714" w:hanging="357"/>
       </w:pPr>
-      <w:bookmarkStart w:id="10" w:name="_Toc229570926"/>
+      <w:bookmarkStart w:id="10" w:name="_Toc229571889"/>
       <w:proofErr w:type="spellStart"/>
       <w:r>
+        <w:lastRenderedPageBreak/>
         <w:t>Источники</w:t>
       </w:r>
       <w:bookmarkEnd w:id="10"/>

</xml_diff>

<commit_message>
Finalize explanatory note text
</commit_message>
<xml_diff>
--- a/docs/Пояснительная_записка_RTT_tennis_predictor_updated_v14.docx
+++ b/docs/Пояснительная_записка_RTT_tennis_predictor_updated_v14.docx
@@ -3372,13 +3372,46 @@
         </w:rPr>
         <w:t xml:space="preserve">Здесь </w:t>
       </w:r>
+      <m:oMath>
+        <m:sSub>
+          <m:sSubPr>
+            <m:ctrlPr>
+              <w:rPr>
+                <w:rFonts w:ascii="Cambria Math" w:hAnsi="Cambria Math"/>
+                <w:i/>
+                <w:iCs/>
+                <w:sz w:val="22"/>
+              </w:rPr>
+            </m:ctrlPr>
+          </m:sSubPr>
+          <m:e>
+            <m:r>
+              <w:rPr>
+                <w:rFonts w:ascii="Cambria Math" w:hAnsi="Cambria Math"/>
+                <w:sz w:val="22"/>
+              </w:rPr>
+              <m:t>S</m:t>
+            </m:r>
+          </m:e>
+          <m:sub>
+            <m:r>
+              <w:rPr>
+                <w:rFonts w:ascii="Cambria Math" w:hAnsi="Cambria Math"/>
+                <w:sz w:val="22"/>
+              </w:rPr>
+              <m:t>A</m:t>
+            </m:r>
+          </m:sub>
+        </m:sSub>
+      </m:oMath>
       <w:r>
         <w:rPr>
           <w:i/>
           <w:iCs/>
           <w:sz w:val="22"/>
-        </w:rPr>
-        <w:t>S</w:t>
+          <w:lang w:val="ru-RU"/>
+        </w:rPr>
+        <w:t xml:space="preserve"> </w:t>
       </w:r>
       <w:r>
         <w:rPr>
@@ -3387,7 +3420,7 @@
           <w:sz w:val="22"/>
           <w:lang w:val="ru-RU"/>
         </w:rPr>
-        <w:t>_</w:t>
+        <w:t xml:space="preserve">равно 1 при победе игрока </w:t>
       </w:r>
       <w:r>
         <w:rPr>
@@ -3404,7 +3437,7 @@
           <w:sz w:val="22"/>
           <w:lang w:val="ru-RU"/>
         </w:rPr>
-        <w:t xml:space="preserve"> равно 1 при победе игрока </w:t>
+        <w:t xml:space="preserve"> и 0 при поражении, а </w:t>
       </w:r>
       <w:r>
         <w:rPr>
@@ -3412,7 +3445,7 @@
           <w:iCs/>
           <w:sz w:val="22"/>
         </w:rPr>
-        <w:t>A</w:t>
+        <w:t>K</w:t>
       </w:r>
       <w:r>
         <w:rPr>
@@ -3421,16 +3454,19 @@
           <w:sz w:val="22"/>
           <w:lang w:val="ru-RU"/>
         </w:rPr>
-        <w:t xml:space="preserve"> и 0 при поражении, а </w:t>
-      </w:r>
-      <w:r>
+        <w:t xml:space="preserve"> задает силу изменения рейтинга.</w:t>
+      </w:r>
+    </w:p>
+    <w:p>
+      <w:pPr>
+        <w:ind w:left="360"/>
         <w:rPr>
           <w:i/>
           <w:iCs/>
           <w:sz w:val="22"/>
-        </w:rPr>
-        <w:t>K</w:t>
-      </w:r>
+          <w:lang w:val="ru-RU"/>
+        </w:rPr>
+      </w:pPr>
       <w:r>
         <w:rPr>
           <w:i/>
@@ -3438,19 +3474,16 @@
           <w:sz w:val="22"/>
           <w:lang w:val="ru-RU"/>
         </w:rPr>
-        <w:t xml:space="preserve"> задает силу изменения рейтинга.</w:t>
-      </w:r>
-    </w:p>
-    <w:p>
-      <w:pPr>
-        <w:ind w:left="360"/>
+        <w:t xml:space="preserve">Победа над более сильным соперником дает больший прирост, чем ожидаемая победа над более слабым. В проекте </w:t>
+      </w:r>
+      <w:r>
         <w:rPr>
           <w:i/>
           <w:iCs/>
           <w:sz w:val="22"/>
-          <w:lang w:val="ru-RU"/>
-        </w:rPr>
-      </w:pPr>
+        </w:rPr>
+        <w:t>ELO</w:t>
+      </w:r>
       <w:r>
         <w:rPr>
           <w:i/>
@@ -3458,16 +3491,19 @@
           <w:sz w:val="22"/>
           <w:lang w:val="ru-RU"/>
         </w:rPr>
-        <w:t xml:space="preserve">Победа над более сильным соперником дает больший прирост, чем ожидаемая победа над более слабым. В проекте </w:t>
-      </w:r>
-      <w:r>
+        <w:t xml:space="preserve"> считается строго по хронологии матчей.</w:t>
+      </w:r>
+    </w:p>
+    <w:p>
+      <w:pPr>
+        <w:ind w:left="360"/>
         <w:rPr>
           <w:i/>
           <w:iCs/>
           <w:sz w:val="22"/>
-        </w:rPr>
-        <w:t>ELO</w:t>
-      </w:r>
+          <w:lang w:val="ru-RU"/>
+        </w:rPr>
+      </w:pPr>
       <w:r>
         <w:rPr>
           <w:i/>
@@ -3475,61 +3511,7 @@
           <w:sz w:val="22"/>
           <w:lang w:val="ru-RU"/>
         </w:rPr>
-        <w:t xml:space="preserve"> считается строго по хронологии матчей.</w:t>
-      </w:r>
-    </w:p>
-    <w:p>
-      <w:pPr>
-        <w:ind w:left="360"/>
-        <w:rPr>
-          <w:i/>
-          <w:iCs/>
-          <w:sz w:val="22"/>
-          <w:lang w:val="ru-RU"/>
-        </w:rPr>
-      </w:pPr>
-      <w:r>
-        <w:rPr>
-          <w:i/>
-          <w:iCs/>
-          <w:sz w:val="22"/>
-          <w:lang w:val="ru-RU"/>
-        </w:rPr>
-        <w:t>Недавняя форма в панели прогноза считается как доля побед игрока в последних 5 и 10 матчах до выбранной даты (</w:t>
-      </w:r>
-      <w:r>
-        <w:rPr>
-          <w:i/>
-          <w:iCs/>
-          <w:sz w:val="22"/>
-        </w:rPr>
-        <w:t>Form</w:t>
-      </w:r>
-      <w:r>
-        <w:rPr>
-          <w:i/>
-          <w:iCs/>
-          <w:sz w:val="22"/>
-          <w:lang w:val="ru-RU"/>
-        </w:rPr>
-        <w:t xml:space="preserve"> 5 и </w:t>
-      </w:r>
-      <w:r>
-        <w:rPr>
-          <w:i/>
-          <w:iCs/>
-          <w:sz w:val="22"/>
-        </w:rPr>
-        <w:t>Form</w:t>
-      </w:r>
-      <w:r>
-        <w:rPr>
-          <w:i/>
-          <w:iCs/>
-          <w:sz w:val="22"/>
-          <w:lang w:val="ru-RU"/>
-        </w:rPr>
-        <w:t xml:space="preserve"> 10). Текущий и будущие матчи в этот расчет не попадают.</w:t>
+        <w:t>Недавняя форма в панели прогноза считается как доля побед игрока в последних 5 и 10 матчах до выбранной даты. Текущий и будущие матчи в этот расчет не попадают.</w:t>
       </w:r>
     </w:p>
     <w:p>

</xml_diff>